<commit_message>
chore: atualizacao automatica 2026-07-23
</commit_message>
<xml_diff>
--- a/relatorio_executivo.docx
+++ b/relatorio_executivo.docx
@@ -46,7 +46,7 @@
           <w:sz w:val="17"/>
           <w:szCs w:val="17"/>
         </w:rPr>
-        <w:t xml:space="preserve">Equipe de Planejamento, Controle e Pesquisa Florestal  ·  Referência: Jul/2026  ·  Gerado em 23/07/2026, 12:39:59</w:t>
+        <w:t xml:space="preserve">Equipe de Planejamento, Controle e Pesquisa Florestal  ·  Referência: Jul/2026  ·  Gerado em 23/07/2026, 13:06:10</w:t>
       </w:r>
     </w:p>
     <w:p>
@@ -91,7 +91,7 @@
           <w:sz w:val="19"/>
           <w:szCs w:val="19"/>
         </w:rPr>
-        <w:t xml:space="preserve">O dólar está em R$ 5,06 (-2,5%) e a soja CEPEA em R$ 137,84/saca. </w:t>
+        <w:t xml:space="preserve">O dólar está em R$ 5,06 (0,0%) e a soja CEPEA em R$ 137,84/saca. </w:t>
       </w:r>
       <w:r>
         <w:rPr>
@@ -893,11 +893,11 @@
               <w:rPr>
                 <w:b/>
                 <w:bCs/>
-                <w:color w:val="2F8A5F"/>
-                <w:sz w:val="18"/>
-                <w:szCs w:val="18"/>
-              </w:rPr>
-              <w:t xml:space="preserve">+1,6%</w:t>
+                <w:color w:val="6B7585"/>
+                <w:sz w:val="18"/>
+                <w:szCs w:val="18"/>
+              </w:rPr>
+              <w:t xml:space="preserve">0,0%</w:t>
             </w:r>
           </w:p>
         </w:tc>
@@ -1018,11 +1018,11 @@
               <w:rPr>
                 <w:b/>
                 <w:bCs/>
-                <w:color w:val="2F8A5F"/>
-                <w:sz w:val="18"/>
-                <w:szCs w:val="18"/>
-              </w:rPr>
-              <w:t xml:space="preserve">+1,8%</w:t>
+                <w:color w:val="6B7585"/>
+                <w:sz w:val="18"/>
+                <w:szCs w:val="18"/>
+              </w:rPr>
+              <w:t xml:space="preserve">0,0%</w:t>
             </w:r>
           </w:p>
         </w:tc>
@@ -1143,11 +1143,11 @@
               <w:rPr>
                 <w:b/>
                 <w:bCs/>
-                <w:color w:val="2F8A5F"/>
-                <w:sz w:val="18"/>
-                <w:szCs w:val="18"/>
-              </w:rPr>
-              <w:t xml:space="preserve">-8,6%</w:t>
+                <w:color w:val="6B7585"/>
+                <w:sz w:val="18"/>
+                <w:szCs w:val="18"/>
+              </w:rPr>
+              <w:t xml:space="preserve">0,0%</w:t>
             </w:r>
           </w:p>
         </w:tc>
@@ -1177,7 +1177,7 @@
                 <w:sz w:val="17"/>
                 <w:szCs w:val="17"/>
               </w:rPr>
-              <w:t xml:space="preserve">Melhora</w:t>
+              <w:t xml:space="preserve">Piora</w:t>
             </w:r>
           </w:p>
         </w:tc>
@@ -1557,11 +1557,11 @@
               <w:rPr>
                 <w:b/>
                 <w:bCs/>
-                <w:color w:val="2F8A5F"/>
-                <w:sz w:val="18"/>
-                <w:szCs w:val="18"/>
-              </w:rPr>
-              <w:t xml:space="preserve">-2,5%</w:t>
+                <w:color w:val="6B7585"/>
+                <w:sz w:val="18"/>
+                <w:szCs w:val="18"/>
+              </w:rPr>
+              <w:t xml:space="preserve">0,0%</w:t>
             </w:r>
           </w:p>
         </w:tc>
@@ -1807,11 +1807,11 @@
               <w:rPr>
                 <w:b/>
                 <w:bCs/>
-                <w:color w:val="B23636"/>
-                <w:sz w:val="18"/>
-                <w:szCs w:val="18"/>
-              </w:rPr>
-              <w:t xml:space="preserve">+1,7%</w:t>
+                <w:color w:val="6B7585"/>
+                <w:sz w:val="18"/>
+                <w:szCs w:val="18"/>
+              </w:rPr>
+              <w:t xml:space="preserve">0,0%</w:t>
             </w:r>
           </w:p>
         </w:tc>
@@ -2001,45 +2001,10 @@
       </w:pPr>
       <w:r>
         <w:rPr>
-          <w:b/>
-          <w:bCs/>
           <w:sz w:val="18"/>
           <w:szCs w:val="18"/>
         </w:rPr>
-        <w:t xml:space="preserve">Dólar: </w:t>
-      </w:r>
-      <w:r>
-        <w:rPr>
-          <w:sz w:val="18"/>
-          <w:szCs w:val="18"/>
-        </w:rPr>
-        <w:t xml:space="preserve">queda de -2,5% no período.</w:t>
-      </w:r>
-    </w:p>
-    <w:p>
-      <w:pPr>
-        <w:pStyle w:val="ListParagraph"/>
-        <w:numPr>
-          <w:ilvl w:val="0"/>
-          <w:numId w:val="2"/>
-        </w:numPr>
-        <w:spacing w:after="70"/>
-      </w:pPr>
-      <w:r>
-        <w:rPr>
-          <w:b/>
-          <w:bCs/>
-          <w:sz w:val="18"/>
-          <w:szCs w:val="18"/>
-        </w:rPr>
-        <w:t xml:space="preserve">BDI: </w:t>
-      </w:r>
-      <w:r>
-        <w:rPr>
-          <w:sz w:val="18"/>
-          <w:szCs w:val="18"/>
-        </w:rPr>
-        <w:t xml:space="preserve">alta de +1,7% no período.</w:t>
+        <w:t xml:space="preserve">Período sem variações relevantes (todas abaixo de 0,5%).</w:t>
       </w:r>
     </w:p>
     <w:p>
@@ -2085,7 +2050,7 @@
           <w:sz w:val="15"/>
           <w:szCs w:val="15"/>
         </w:rPr>
-        <w:t xml:space="preserve">Fontes automáticas: AwesomeAPI (câmbio), CEPEA/ESALQ (soja), ANP (diesel), stooq (BDI). Fertilizantes e gás natural: override manual (fertilizers-override.json). Status desta execução: {"sojaRegional":"ok (Oeste da Bahia/BA (AIBA))","soja":"ok (Noticias Agricolas / CEPEA-PR 22/07/2026)","bdi":"ok (HANDYBULK, 22/07/2026)","cambio":"ok (BCB PTAX)","diesel":"falha: Petrobras: HTTP 403 | PortalCanaa: HTTP 403","_comexRetry":"aguardando 15s apos HTTP 429 (tentativa 2)","_comexPeriodo":"nenhum periodo retornou dados (ultimo: vazio para 2025-06 a 2026-05 (ncm como texto))","ureia":"falha: vazio para 2025-06 a 2026-05 (ncm como texto)","map":"falha: vazio para 2025-06 a 2026-05 (ncm como texto)","kcl":"falha: vazio para 2025-06 a 2026-05 (ncm como texto)","gas":"falha stooq: valor implausivel :: resposta=\"&lt;!DOCTYPE html&gt;&lt;html&gt;&lt;head&gt;&lt;meta charset=\"utf-8\"&gt;&lt;meta name=\"robots\" content=\"noindex,nofollow\"&gt;&lt;/head&gt;&lt;body&gt;&lt;noscript&gt;T\""}.</w:t>
+        <w:t xml:space="preserve">Fontes automáticas: AwesomeAPI (câmbio), CEPEA/ESALQ (soja), ANP (diesel), stooq (BDI). Fertilizantes e gás natural: override manual (fertilizers-override.json). Status desta execução: {"sojaRegional":"ok (Oeste da Bahia/BA (AIBA))","cambio":"ok (BCB PTAX)","bdi":"ok (HANDYBULK, 22/07/2026)","soja":"ok (Noticias Agricolas / CEPEA-PR 22/07/2026)","diesel":"falha: Petrobras: HTTP 403 | PortalCanaa: HTTP 403","_comexRetry":"aguardando 30s apos 429 (heading, tentativa 3)","_comexDiag":"vazio: ncm-numero 2025-07..2026-06 :: {\"data\":{\"list\":[]},\"success\":true,\"message\":null,\"processo_info\":null,\"language\":\"pt\"}","ureia":"falha: vazio (heading, 2025-05 a 2026-04)","map":"falha: vazio (heading, 2025-05 a 2026-04)","kcl":"falha: vazio (heading, 2025-05 a 2026-04)","gas":"SEM EIA_API_KEY configurada | falha stooq: valor implausivel :: resposta=\"&lt;!DOCTYPE html&gt;&lt;html&gt;&lt;head&gt;&lt;meta charset=\"utf-8\"&gt;&lt;meta name=\"robots\" content=\"noindex,nofollow\"&gt;&lt;/head&gt;&lt;body&gt;&lt;noscript&gt;T\""}.</w:t>
       </w:r>
     </w:p>
     <w:p>

</xml_diff>

<commit_message>
chore: atualizacao automatica 2026-07-27
</commit_message>
<xml_diff>
--- a/relatorio_executivo.docx
+++ b/relatorio_executivo.docx
@@ -46,7 +46,7 @@
           <w:sz w:val="17"/>
           <w:szCs w:val="17"/>
         </w:rPr>
-        <w:t xml:space="preserve">Equipe de Planejamento, Controle e Pesquisa Florestal  ·  Referência: Jul/2026  ·  Gerado em 23/07/2026, 19:12:30</w:t>
+        <w:t xml:space="preserve">Equipe de Planejamento, Controle e Pesquisa Florestal  ·  Referência: Jul/2026  ·  Gerado em 27/07/2026, 12:17:33</w:t>
       </w:r>
     </w:p>
     <w:p>
@@ -91,14 +91,14 @@
           <w:sz w:val="19"/>
           <w:szCs w:val="19"/>
         </w:rPr>
-        <w:t xml:space="preserve">O dólar está em R$ 5,08 (0,0%) e a soja CEPEA em R$ 137,84/saca. </w:t>
+        <w:t xml:space="preserve">O dólar está em R$ 5,07 (-0,2%) e a soja CEPEA em R$ 140,26/saca. </w:t>
       </w:r>
       <w:r>
         <w:rPr>
           <w:sz w:val="19"/>
           <w:szCs w:val="19"/>
         </w:rPr>
-        <w:t xml:space="preserve">A relação de troca soja/MAP é de 32,0 sacas/t.</w:t>
+        <w:t xml:space="preserve">A relação de troca soja/MAP é de 31,4 sacas/t.</w:t>
       </w:r>
     </w:p>
     <w:p>
@@ -864,7 +864,7 @@
                 <w:sz w:val="18"/>
                 <w:szCs w:val="18"/>
               </w:rPr>
-              <w:t xml:space="preserve">R$ 137,84/sc</w:t>
+              <w:t xml:space="preserve">R$ 140,26/sc</w:t>
             </w:r>
           </w:p>
         </w:tc>
@@ -893,11 +893,11 @@
               <w:rPr>
                 <w:b/>
                 <w:bCs/>
-                <w:color w:val="6B7585"/>
-                <w:sz w:val="18"/>
-                <w:szCs w:val="18"/>
-              </w:rPr>
-              <w:t xml:space="preserve">0,0%</w:t>
+                <w:color w:val="2F8A5F"/>
+                <w:sz w:val="18"/>
+                <w:szCs w:val="18"/>
+              </w:rPr>
+              <w:t xml:space="preserve">+1,8%</w:t>
             </w:r>
           </w:p>
         </w:tc>
@@ -989,7 +989,7 @@
                 <w:sz w:val="18"/>
                 <w:szCs w:val="18"/>
               </w:rPr>
-              <w:t xml:space="preserve">R$ 132,25/sc</w:t>
+              <w:t xml:space="preserve">R$ 134,38/sc</w:t>
             </w:r>
           </w:p>
         </w:tc>
@@ -1018,11 +1018,11 @@
               <w:rPr>
                 <w:b/>
                 <w:bCs/>
-                <w:color w:val="6B7585"/>
-                <w:sz w:val="18"/>
-                <w:szCs w:val="18"/>
-              </w:rPr>
-              <w:t xml:space="preserve">0,0%</w:t>
+                <w:color w:val="2F8A5F"/>
+                <w:sz w:val="18"/>
+                <w:szCs w:val="18"/>
+              </w:rPr>
+              <w:t xml:space="preserve">+1,6%</w:t>
             </w:r>
           </w:p>
         </w:tc>
@@ -1114,7 +1114,7 @@
                 <w:sz w:val="18"/>
                 <w:szCs w:val="18"/>
               </w:rPr>
-              <w:t xml:space="preserve">32,0 sc/t</w:t>
+              <w:t xml:space="preserve">31,4 sc/t</w:t>
             </w:r>
           </w:p>
         </w:tc>
@@ -1143,11 +1143,11 @@
               <w:rPr>
                 <w:b/>
                 <w:bCs/>
-                <w:color w:val="6B7585"/>
-                <w:sz w:val="18"/>
-                <w:szCs w:val="18"/>
-              </w:rPr>
-              <w:t xml:space="preserve">0,0%</w:t>
+                <w:color w:val="2F8A5F"/>
+                <w:sz w:val="18"/>
+                <w:szCs w:val="18"/>
+              </w:rPr>
+              <w:t xml:space="preserve">-1,9%</w:t>
             </w:r>
           </w:p>
         </w:tc>
@@ -1177,7 +1177,7 @@
                 <w:sz w:val="17"/>
                 <w:szCs w:val="17"/>
               </w:rPr>
-              <w:t xml:space="preserve">Piora</w:t>
+              <w:t xml:space="preserve">Melhora</w:t>
             </w:r>
           </w:p>
         </w:tc>
@@ -1239,7 +1239,7 @@
                 <w:sz w:val="18"/>
                 <w:szCs w:val="18"/>
               </w:rPr>
-              <w:t xml:space="preserve">22,3 sc/t</w:t>
+              <w:t xml:space="preserve">21,8 sc/t</w:t>
             </w:r>
           </w:p>
         </w:tc>
@@ -1528,7 +1528,7 @@
                 <w:sz w:val="18"/>
                 <w:szCs w:val="18"/>
               </w:rPr>
-              <w:t xml:space="preserve">5,08</w:t>
+              <w:t xml:space="preserve">5,07</w:t>
             </w:r>
           </w:p>
         </w:tc>
@@ -1561,7 +1561,7 @@
                 <w:sz w:val="18"/>
                 <w:szCs w:val="18"/>
               </w:rPr>
-              <w:t xml:space="preserve">0,0%</w:t>
+              <w:t xml:space="preserve">-0,2%</w:t>
             </w:r>
           </w:p>
         </w:tc>
@@ -1778,7 +1778,7 @@
                 <w:sz w:val="18"/>
                 <w:szCs w:val="18"/>
               </w:rPr>
-              <w:t xml:space="preserve">2.715 pts</w:t>
+              <w:t xml:space="preserve">2.743 pts</w:t>
             </w:r>
           </w:p>
         </w:tc>
@@ -1807,11 +1807,11 @@
               <w:rPr>
                 <w:b/>
                 <w:bCs/>
-                <w:color w:val="6B7585"/>
-                <w:sz w:val="18"/>
-                <w:szCs w:val="18"/>
-              </w:rPr>
-              <w:t xml:space="preserve">0,0%</w:t>
+                <w:color w:val="B23636"/>
+                <w:sz w:val="18"/>
+                <w:szCs w:val="18"/>
+              </w:rPr>
+              <w:t xml:space="preserve">+1,0%</w:t>
             </w:r>
           </w:p>
         </w:tc>
@@ -2001,10 +2001,19 @@
       </w:pPr>
       <w:r>
         <w:rPr>
+          <w:b/>
+          <w:bCs/>
           <w:sz w:val="18"/>
           <w:szCs w:val="18"/>
         </w:rPr>
-        <w:t xml:space="preserve">Período sem variações relevantes (todas abaixo de 0,5%).</w:t>
+        <w:t xml:space="preserve">BDI: </w:t>
+      </w:r>
+      <w:r>
+        <w:rPr>
+          <w:sz w:val="18"/>
+          <w:szCs w:val="18"/>
+        </w:rPr>
+        <w:t xml:space="preserve">alta de +1,0% no período.</w:t>
       </w:r>
     </w:p>
     <w:p>
@@ -2050,7 +2059,7 @@
           <w:sz w:val="15"/>
           <w:szCs w:val="15"/>
         </w:rPr>
-        <w:t xml:space="preserve">Fontes automáticas: AwesomeAPI (câmbio), CEPEA/ESALQ (soja), ANP (diesel), stooq (BDI). Fertilizantes e gás natural: override manual (fertilizers-override.json). Status desta execução: {"soja":"ok (Noticias Agricolas / CEPEA-PR 22/07/2026)","sojaRegional":"ok (Oeste da Bahia/BA (AIBA))","bdi":"ok (HANDYBULK, 22/07/2026)","diesel":"falha: Petrobras: HTTP 403 | PortalCanaa: HTTP 403","cambio":"ok (BCB PTAX)","_comexPeriodo":"com-filtro-ncm | 2026-06 | 4 linhas","_comexNcmsEncontrados":"31042090,31054000,31021010,31042010","ureia":"ok (ComexStat 2026-06)","map":"ok (ComexStat 2026-06)","kcl":"ok (ComexStat 2026-06)","gas":"ok (EIA Henry Hub)"}.</w:t>
+        <w:t xml:space="preserve">Fontes automáticas: AwesomeAPI (câmbio), CEPEA/ESALQ (soja), ANP (diesel), stooq (BDI). Fertilizantes e gás natural: override manual (fertilizers-override.json). Status desta execução: {"bdi":"ok (HANDYBULK, 24/07/2026)","soja":"ok (Noticias Agricolas / CEPEA-PR 24/07/2026)","cambio":"ok (BCB PTAX)","sojaRegional":"ok (Oeste da Bahia/BA (AIBA))","diesel":"falha: Petrobras: HTTP 403 | PortalCanaa: HTTP 403","_comexPeriodo":"com-filtro-ncm | 2026-06 | 4 linhas","_comexNcmsEncontrados":"31042090,31054000,31021010,31042010","ureia":"ok (ComexStat 2026-06)","map":"ok (ComexStat 2026-06)","kcl":"ok (ComexStat 2026-06)","gas":"ok (EIA Henry Hub)"}.</w:t>
       </w:r>
     </w:p>
     <w:p>

</xml_diff>

<commit_message>
chore: atualizacao automatica 2026-07-28
</commit_message>
<xml_diff>
--- a/relatorio_executivo.docx
+++ b/relatorio_executivo.docx
@@ -46,7 +46,7 @@
           <w:sz w:val="17"/>
           <w:szCs w:val="17"/>
         </w:rPr>
-        <w:t xml:space="preserve">Equipe de Planejamento, Controle e Pesquisa Florestal  ·  Referência: Jul/2026  ·  Gerado em 27/07/2026, 12:17:33</w:t>
+        <w:t xml:space="preserve">Equipe de Planejamento, Controle e Pesquisa Florestal  ·  Referência: Jul/2026  ·  Gerado em 28/07/2026, 12:29:03</w:t>
       </w:r>
     </w:p>
     <w:p>
@@ -91,14 +91,14 @@
           <w:sz w:val="19"/>
           <w:szCs w:val="19"/>
         </w:rPr>
-        <w:t xml:space="preserve">O dólar está em R$ 5,07 (-0,2%) e a soja CEPEA em R$ 140,26/saca. </w:t>
+        <w:t xml:space="preserve">O dólar está em R$ 5,10 (+0,6%) e a soja CEPEA em R$ 140,58/saca. </w:t>
       </w:r>
       <w:r>
         <w:rPr>
           <w:sz w:val="19"/>
           <w:szCs w:val="19"/>
         </w:rPr>
-        <w:t xml:space="preserve">A relação de troca soja/MAP é de 31,4 sacas/t.</w:t>
+        <w:t xml:space="preserve">A relação de troca soja/MAP é de 31,5 sacas/t.</w:t>
       </w:r>
     </w:p>
     <w:p>
@@ -864,7 +864,7 @@
                 <w:sz w:val="18"/>
                 <w:szCs w:val="18"/>
               </w:rPr>
-              <w:t xml:space="preserve">R$ 140,26/sc</w:t>
+              <w:t xml:space="preserve">R$ 140,58/sc</w:t>
             </w:r>
           </w:p>
         </w:tc>
@@ -893,11 +893,11 @@
               <w:rPr>
                 <w:b/>
                 <w:bCs/>
-                <w:color w:val="2F8A5F"/>
-                <w:sz w:val="18"/>
-                <w:szCs w:val="18"/>
-              </w:rPr>
-              <w:t xml:space="preserve">+1,8%</w:t>
+                <w:color w:val="6B7585"/>
+                <w:sz w:val="18"/>
+                <w:szCs w:val="18"/>
+              </w:rPr>
+              <w:t xml:space="preserve">+0,2%</w:t>
             </w:r>
           </w:p>
         </w:tc>
@@ -989,7 +989,7 @@
                 <w:sz w:val="18"/>
                 <w:szCs w:val="18"/>
               </w:rPr>
-              <w:t xml:space="preserve">R$ 134,38/sc</w:t>
+              <w:t xml:space="preserve">R$ 134,13/sc</w:t>
             </w:r>
           </w:p>
         </w:tc>
@@ -1018,11 +1018,11 @@
               <w:rPr>
                 <w:b/>
                 <w:bCs/>
-                <w:color w:val="2F8A5F"/>
-                <w:sz w:val="18"/>
-                <w:szCs w:val="18"/>
-              </w:rPr>
-              <w:t xml:space="preserve">+1,6%</w:t>
+                <w:color w:val="6B7585"/>
+                <w:sz w:val="18"/>
+                <w:szCs w:val="18"/>
+              </w:rPr>
+              <w:t xml:space="preserve">-0,2%</w:t>
             </w:r>
           </w:p>
         </w:tc>
@@ -1114,7 +1114,7 @@
                 <w:sz w:val="18"/>
                 <w:szCs w:val="18"/>
               </w:rPr>
-              <w:t xml:space="preserve">31,4 sc/t</w:t>
+              <w:t xml:space="preserve">31,5 sc/t</w:t>
             </w:r>
           </w:p>
         </w:tc>
@@ -1143,11 +1143,11 @@
               <w:rPr>
                 <w:b/>
                 <w:bCs/>
-                <w:color w:val="2F8A5F"/>
-                <w:sz w:val="18"/>
-                <w:szCs w:val="18"/>
-              </w:rPr>
-              <w:t xml:space="preserve">-1,9%</w:t>
+                <w:color w:val="B23636"/>
+                <w:sz w:val="18"/>
+                <w:szCs w:val="18"/>
+              </w:rPr>
+              <w:t xml:space="preserve">+0,3%</w:t>
             </w:r>
           </w:p>
         </w:tc>
@@ -1177,7 +1177,7 @@
                 <w:sz w:val="17"/>
                 <w:szCs w:val="17"/>
               </w:rPr>
-              <w:t xml:space="preserve">Melhora</w:t>
+              <w:t xml:space="preserve">Piora</w:t>
             </w:r>
           </w:p>
         </w:tc>
@@ -1239,7 +1239,7 @@
                 <w:sz w:val="18"/>
                 <w:szCs w:val="18"/>
               </w:rPr>
-              <w:t xml:space="preserve">21,8 sc/t</w:t>
+              <w:t xml:space="preserve">21,9 sc/t</w:t>
             </w:r>
           </w:p>
         </w:tc>
@@ -1528,7 +1528,132 @@
                 <w:sz w:val="18"/>
                 <w:szCs w:val="18"/>
               </w:rPr>
-              <w:t xml:space="preserve">5,07</w:t>
+              <w:t xml:space="preserve">5,10</w:t>
+            </w:r>
+          </w:p>
+        </w:tc>
+        <w:tc>
+          <w:tcPr>
+            <w:tcW w:type="dxa" w:w="1980"/>
+            <w:tcBorders>
+              <w:top w:val="single" w:color="DDDDDD" w:sz="1"/>
+              <w:left w:val="single" w:color="DDDDDD" w:sz="1"/>
+              <w:bottom w:val="single" w:color="DDDDDD" w:sz="1"/>
+              <w:right w:val="single" w:color="DDDDDD" w:sz="1"/>
+            </w:tcBorders>
+            <w:tcMar>
+              <w:top w:type="dxa" w:w="55"/>
+              <w:left w:type="dxa" w:w="110"/>
+              <w:bottom w:type="dxa" w:w="55"/>
+              <w:right w:type="dxa" w:w="110"/>
+            </w:tcMar>
+            <w:vAlign w:val="center"/>
+          </w:tcPr>
+          <w:p>
+            <w:pPr>
+              <w:jc w:val="right"/>
+            </w:pPr>
+            <w:r>
+              <w:rPr>
+                <w:b/>
+                <w:bCs/>
+                <w:color w:val="B23636"/>
+                <w:sz w:val="18"/>
+                <w:szCs w:val="18"/>
+              </w:rPr>
+              <w:t xml:space="preserve">+0,6%</w:t>
+            </w:r>
+          </w:p>
+        </w:tc>
+        <w:tc>
+          <w:tcPr>
+            <w:tcW w:type="dxa" w:w="2000"/>
+            <w:tcBorders>
+              <w:top w:val="single" w:color="DDDDDD" w:sz="1"/>
+              <w:left w:val="single" w:color="DDDDDD" w:sz="1"/>
+              <w:bottom w:val="single" w:color="DDDDDD" w:sz="1"/>
+              <w:right w:val="single" w:color="DDDDDD" w:sz="1"/>
+            </w:tcBorders>
+            <w:tcMar>
+              <w:top w:type="dxa" w:w="55"/>
+              <w:left w:type="dxa" w:w="110"/>
+              <w:bottom w:type="dxa" w:w="55"/>
+              <w:right w:type="dxa" w:w="110"/>
+            </w:tcMar>
+            <w:vAlign w:val="center"/>
+          </w:tcPr>
+          <w:p>
+            <w:pPr>
+              <w:jc w:val="left"/>
+            </w:pPr>
+            <w:r>
+              <w:rPr>
+                <w:sz w:val="17"/>
+                <w:szCs w:val="17"/>
+              </w:rPr>
+              <w:t xml:space="preserve">Custo de importação</w:t>
+            </w:r>
+          </w:p>
+        </w:tc>
+      </w:tr>
+      <w:tr>
+        <w:tc>
+          <w:tcPr>
+            <w:tcW w:type="dxa" w:w="3400"/>
+            <w:tcBorders>
+              <w:top w:val="single" w:color="DDDDDD" w:sz="1"/>
+              <w:left w:val="single" w:color="DDDDDD" w:sz="1"/>
+              <w:bottom w:val="single" w:color="DDDDDD" w:sz="1"/>
+              <w:right w:val="single" w:color="DDDDDD" w:sz="1"/>
+            </w:tcBorders>
+            <w:tcMar>
+              <w:top w:type="dxa" w:w="55"/>
+              <w:left w:type="dxa" w:w="110"/>
+              <w:bottom w:type="dxa" w:w="55"/>
+              <w:right w:type="dxa" w:w="110"/>
+            </w:tcMar>
+            <w:vAlign w:val="center"/>
+          </w:tcPr>
+          <w:p>
+            <w:pPr>
+              <w:jc w:val="left"/>
+            </w:pPr>
+            <w:r>
+              <w:rPr>
+                <w:sz w:val="18"/>
+                <w:szCs w:val="18"/>
+              </w:rPr>
+              <w:t xml:space="preserve">Gás Natural (Henry Hub)</w:t>
+            </w:r>
+          </w:p>
+        </w:tc>
+        <w:tc>
+          <w:tcPr>
+            <w:tcW w:type="dxa" w:w="1980"/>
+            <w:tcBorders>
+              <w:top w:val="single" w:color="DDDDDD" w:sz="1"/>
+              <w:left w:val="single" w:color="DDDDDD" w:sz="1"/>
+              <w:bottom w:val="single" w:color="DDDDDD" w:sz="1"/>
+              <w:right w:val="single" w:color="DDDDDD" w:sz="1"/>
+            </w:tcBorders>
+            <w:tcMar>
+              <w:top w:type="dxa" w:w="55"/>
+              <w:left w:type="dxa" w:w="110"/>
+              <w:bottom w:type="dxa" w:w="55"/>
+              <w:right w:type="dxa" w:w="110"/>
+            </w:tcMar>
+            <w:vAlign w:val="center"/>
+          </w:tcPr>
+          <w:p>
+            <w:pPr>
+              <w:jc w:val="right"/>
+            </w:pPr>
+            <w:r>
+              <w:rPr>
+                <w:sz w:val="18"/>
+                <w:szCs w:val="18"/>
+              </w:rPr>
+              <w:t xml:space="preserve">US$ 2,80</w:t>
             </w:r>
           </w:p>
         </w:tc>
@@ -1561,7 +1686,7 @@
                 <w:sz w:val="18"/>
                 <w:szCs w:val="18"/>
               </w:rPr>
-              <w:t xml:space="preserve">-0,2%</w:t>
+              <w:t xml:space="preserve">0,0%</w:t>
             </w:r>
           </w:p>
         </w:tc>
@@ -1591,7 +1716,7 @@
                 <w:sz w:val="17"/>
                 <w:szCs w:val="17"/>
               </w:rPr>
-              <w:t xml:space="preserve">Custo de importação</w:t>
+              <w:t xml:space="preserve">Pressiona ureia</w:t>
             </w:r>
           </w:p>
         </w:tc>
@@ -1623,7 +1748,7 @@
                 <w:sz w:val="18"/>
                 <w:szCs w:val="18"/>
               </w:rPr>
-              <w:t xml:space="preserve">Gás Natural (Henry Hub)</w:t>
+              <w:t xml:space="preserve">Frete Marítimo (BDI)</w:t>
             </w:r>
           </w:p>
         </w:tc>
@@ -1653,7 +1778,7 @@
                 <w:sz w:val="18"/>
                 <w:szCs w:val="18"/>
               </w:rPr>
-              <w:t xml:space="preserve">US$ 2,80</w:t>
+              <w:t xml:space="preserve">2.696 pts</w:t>
             </w:r>
           </w:p>
         </w:tc>
@@ -1682,136 +1807,11 @@
               <w:rPr>
                 <w:b/>
                 <w:bCs/>
-                <w:color w:val="6B7585"/>
-                <w:sz w:val="18"/>
-                <w:szCs w:val="18"/>
-              </w:rPr>
-              <w:t xml:space="preserve">0,0%</w:t>
-            </w:r>
-          </w:p>
-        </w:tc>
-        <w:tc>
-          <w:tcPr>
-            <w:tcW w:type="dxa" w:w="2000"/>
-            <w:tcBorders>
-              <w:top w:val="single" w:color="DDDDDD" w:sz="1"/>
-              <w:left w:val="single" w:color="DDDDDD" w:sz="1"/>
-              <w:bottom w:val="single" w:color="DDDDDD" w:sz="1"/>
-              <w:right w:val="single" w:color="DDDDDD" w:sz="1"/>
-            </w:tcBorders>
-            <w:tcMar>
-              <w:top w:type="dxa" w:w="55"/>
-              <w:left w:type="dxa" w:w="110"/>
-              <w:bottom w:type="dxa" w:w="55"/>
-              <w:right w:type="dxa" w:w="110"/>
-            </w:tcMar>
-            <w:vAlign w:val="center"/>
-          </w:tcPr>
-          <w:p>
-            <w:pPr>
-              <w:jc w:val="left"/>
-            </w:pPr>
-            <w:r>
-              <w:rPr>
-                <w:sz w:val="17"/>
-                <w:szCs w:val="17"/>
-              </w:rPr>
-              <w:t xml:space="preserve">Pressiona ureia</w:t>
-            </w:r>
-          </w:p>
-        </w:tc>
-      </w:tr>
-      <w:tr>
-        <w:tc>
-          <w:tcPr>
-            <w:tcW w:type="dxa" w:w="3400"/>
-            <w:tcBorders>
-              <w:top w:val="single" w:color="DDDDDD" w:sz="1"/>
-              <w:left w:val="single" w:color="DDDDDD" w:sz="1"/>
-              <w:bottom w:val="single" w:color="DDDDDD" w:sz="1"/>
-              <w:right w:val="single" w:color="DDDDDD" w:sz="1"/>
-            </w:tcBorders>
-            <w:tcMar>
-              <w:top w:type="dxa" w:w="55"/>
-              <w:left w:type="dxa" w:w="110"/>
-              <w:bottom w:type="dxa" w:w="55"/>
-              <w:right w:type="dxa" w:w="110"/>
-            </w:tcMar>
-            <w:vAlign w:val="center"/>
-          </w:tcPr>
-          <w:p>
-            <w:pPr>
-              <w:jc w:val="left"/>
-            </w:pPr>
-            <w:r>
-              <w:rPr>
-                <w:sz w:val="18"/>
-                <w:szCs w:val="18"/>
-              </w:rPr>
-              <w:t xml:space="preserve">Frete Marítimo (BDI)</w:t>
-            </w:r>
-          </w:p>
-        </w:tc>
-        <w:tc>
-          <w:tcPr>
-            <w:tcW w:type="dxa" w:w="1980"/>
-            <w:tcBorders>
-              <w:top w:val="single" w:color="DDDDDD" w:sz="1"/>
-              <w:left w:val="single" w:color="DDDDDD" w:sz="1"/>
-              <w:bottom w:val="single" w:color="DDDDDD" w:sz="1"/>
-              <w:right w:val="single" w:color="DDDDDD" w:sz="1"/>
-            </w:tcBorders>
-            <w:tcMar>
-              <w:top w:type="dxa" w:w="55"/>
-              <w:left w:type="dxa" w:w="110"/>
-              <w:bottom w:type="dxa" w:w="55"/>
-              <w:right w:type="dxa" w:w="110"/>
-            </w:tcMar>
-            <w:vAlign w:val="center"/>
-          </w:tcPr>
-          <w:p>
-            <w:pPr>
-              <w:jc w:val="right"/>
-            </w:pPr>
-            <w:r>
-              <w:rPr>
-                <w:sz w:val="18"/>
-                <w:szCs w:val="18"/>
-              </w:rPr>
-              <w:t xml:space="preserve">2.743 pts</w:t>
-            </w:r>
-          </w:p>
-        </w:tc>
-        <w:tc>
-          <w:tcPr>
-            <w:tcW w:type="dxa" w:w="1980"/>
-            <w:tcBorders>
-              <w:top w:val="single" w:color="DDDDDD" w:sz="1"/>
-              <w:left w:val="single" w:color="DDDDDD" w:sz="1"/>
-              <w:bottom w:val="single" w:color="DDDDDD" w:sz="1"/>
-              <w:right w:val="single" w:color="DDDDDD" w:sz="1"/>
-            </w:tcBorders>
-            <w:tcMar>
-              <w:top w:type="dxa" w:w="55"/>
-              <w:left w:type="dxa" w:w="110"/>
-              <w:bottom w:type="dxa" w:w="55"/>
-              <w:right w:type="dxa" w:w="110"/>
-            </w:tcMar>
-            <w:vAlign w:val="center"/>
-          </w:tcPr>
-          <w:p>
-            <w:pPr>
-              <w:jc w:val="right"/>
-            </w:pPr>
-            <w:r>
-              <w:rPr>
-                <w:b/>
-                <w:bCs/>
-                <w:color w:val="B23636"/>
-                <w:sz w:val="18"/>
-                <w:szCs w:val="18"/>
-              </w:rPr>
-              <w:t xml:space="preserve">+1,0%</w:t>
+                <w:color w:val="2F8A5F"/>
+                <w:sz w:val="18"/>
+                <w:szCs w:val="18"/>
+              </w:rPr>
+              <w:t xml:space="preserve">-1,7%</w:t>
             </w:r>
           </w:p>
         </w:tc>
@@ -2013,7 +2013,33 @@
           <w:sz w:val="18"/>
           <w:szCs w:val="18"/>
         </w:rPr>
-        <w:t xml:space="preserve">alta de +1,0% no período.</w:t>
+        <w:t xml:space="preserve">queda de -1,7% no período.</w:t>
+      </w:r>
+    </w:p>
+    <w:p>
+      <w:pPr>
+        <w:pStyle w:val="ListParagraph"/>
+        <w:numPr>
+          <w:ilvl w:val="0"/>
+          <w:numId w:val="2"/>
+        </w:numPr>
+        <w:spacing w:after="70"/>
+      </w:pPr>
+      <w:r>
+        <w:rPr>
+          <w:b/>
+          <w:bCs/>
+          <w:sz w:val="18"/>
+          <w:szCs w:val="18"/>
+        </w:rPr>
+        <w:t xml:space="preserve">Dólar: </w:t>
+      </w:r>
+      <w:r>
+        <w:rPr>
+          <w:sz w:val="18"/>
+          <w:szCs w:val="18"/>
+        </w:rPr>
+        <w:t xml:space="preserve">alta de +0,6% no período.</w:t>
       </w:r>
     </w:p>
     <w:p>
@@ -2059,7 +2085,7 @@
           <w:sz w:val="15"/>
           <w:szCs w:val="15"/>
         </w:rPr>
-        <w:t xml:space="preserve">Fontes automáticas: AwesomeAPI (câmbio), CEPEA/ESALQ (soja), ANP (diesel), stooq (BDI). Fertilizantes e gás natural: override manual (fertilizers-override.json). Status desta execução: {"bdi":"ok (HANDYBULK, 24/07/2026)","soja":"ok (Noticias Agricolas / CEPEA-PR 24/07/2026)","cambio":"ok (BCB PTAX)","sojaRegional":"ok (Oeste da Bahia/BA (AIBA))","diesel":"falha: Petrobras: HTTP 403 | PortalCanaa: HTTP 403","_comexPeriodo":"com-filtro-ncm | 2026-06 | 4 linhas","_comexNcmsEncontrados":"31042090,31054000,31021010,31042010","ureia":"ok (ComexStat 2026-06)","map":"ok (ComexStat 2026-06)","kcl":"ok (ComexStat 2026-06)","gas":"ok (EIA Henry Hub)"}.</w:t>
+        <w:t xml:space="preserve">Fontes automáticas: AwesomeAPI (câmbio), CEPEA/ESALQ (soja), ANP (diesel), stooq (BDI). Fertilizantes e gás natural: override manual (fertilizers-override.json). Status desta execução: {"bdi":"ok (HANDYBULK, 27/07/2026)","soja":"ok (Noticias Agricolas / CEPEA-PR 27/07/2026)","sojaRegional":"ok (Oeste da Bahia/BA (AIBA))","diesel":"falha: Petrobras: HTTP 403 | PortalCanaa: HTTP 403","cambio":"ok (BCB PTAX)","_comexPeriodo":"com-filtro-ncm | 2026-06 | 4 linhas","_comexNcmsEncontrados":"31042090,31054000,31021010,31042010","ureia":"ok (ComexStat 2026-06)","map":"ok (ComexStat 2026-06)","kcl":"ok (ComexStat 2026-06)","gas":"ok (EIA Henry Hub)"}.</w:t>
       </w:r>
     </w:p>
     <w:p>

</xml_diff>

<commit_message>
chore: atualizacao automatica 2026-08-04
</commit_message>
<xml_diff>
--- a/relatorio_executivo.docx
+++ b/relatorio_executivo.docx
@@ -46,7 +46,7 @@
           <w:sz w:val="17"/>
           <w:szCs w:val="17"/>
         </w:rPr>
-        <w:t xml:space="preserve">Equipe de Planejamento, Controle e Pesquisa Florestal  ·  Referência: Jul/2026  ·  Gerado em 28/07/2026, 12:29:03</w:t>
+        <w:t xml:space="preserve">Equipe de Planejamento, Controle e Pesquisa Florestal  ·  Referência: Ago/2026  ·  Gerado em 04/08/2026, 14:13:33</w:t>
       </w:r>
     </w:p>
     <w:p>
@@ -77,7 +77,7 @@
           <w:sz w:val="19"/>
           <w:szCs w:val="19"/>
         </w:rPr>
-        <w:t xml:space="preserve">Leitura de Jul/2026. </w:t>
+        <w:t xml:space="preserve">Leitura de Ago/2026. </w:t>
       </w:r>
       <w:r>
         <w:rPr>
@@ -91,14 +91,14 @@
           <w:sz w:val="19"/>
           <w:szCs w:val="19"/>
         </w:rPr>
-        <w:t xml:space="preserve">O dólar está em R$ 5,10 (+0,6%) e a soja CEPEA em R$ 140,58/saca. </w:t>
+        <w:t xml:space="preserve">O dólar está em R$ 5,07 (-0,6%) e a soja CEPEA em R$ 136,66/saca. </w:t>
       </w:r>
       <w:r>
         <w:rPr>
           <w:sz w:val="19"/>
           <w:szCs w:val="19"/>
         </w:rPr>
-        <w:t xml:space="preserve">A relação de troca soja/MAP é de 31,5 sacas/t.</w:t>
+        <w:t xml:space="preserve">A relação de troca soja/MAP é de 32,2 sacas/t.</w:t>
       </w:r>
     </w:p>
     <w:p>
@@ -864,257 +864,7 @@
                 <w:sz w:val="18"/>
                 <w:szCs w:val="18"/>
               </w:rPr>
-              <w:t xml:space="preserve">R$ 140,58/sc</w:t>
-            </w:r>
-          </w:p>
-        </w:tc>
-        <w:tc>
-          <w:tcPr>
-            <w:tcW w:type="dxa" w:w="1980"/>
-            <w:tcBorders>
-              <w:top w:val="single" w:color="DDDDDD" w:sz="1"/>
-              <w:left w:val="single" w:color="DDDDDD" w:sz="1"/>
-              <w:bottom w:val="single" w:color="DDDDDD" w:sz="1"/>
-              <w:right w:val="single" w:color="DDDDDD" w:sz="1"/>
-            </w:tcBorders>
-            <w:tcMar>
-              <w:top w:type="dxa" w:w="55"/>
-              <w:left w:type="dxa" w:w="110"/>
-              <w:bottom w:type="dxa" w:w="55"/>
-              <w:right w:type="dxa" w:w="110"/>
-            </w:tcMar>
-            <w:vAlign w:val="center"/>
-          </w:tcPr>
-          <w:p>
-            <w:pPr>
-              <w:jc w:val="right"/>
-            </w:pPr>
-            <w:r>
-              <w:rPr>
-                <w:b/>
-                <w:bCs/>
-                <w:color w:val="6B7585"/>
-                <w:sz w:val="18"/>
-                <w:szCs w:val="18"/>
-              </w:rPr>
-              <w:t xml:space="preserve">+0,2%</w:t>
-            </w:r>
-          </w:p>
-        </w:tc>
-        <w:tc>
-          <w:tcPr>
-            <w:tcW w:type="dxa" w:w="2000"/>
-            <w:tcBorders>
-              <w:top w:val="single" w:color="DDDDDD" w:sz="1"/>
-              <w:left w:val="single" w:color="DDDDDD" w:sz="1"/>
-              <w:bottom w:val="single" w:color="DDDDDD" w:sz="1"/>
-              <w:right w:val="single" w:color="DDDDDD" w:sz="1"/>
-            </w:tcBorders>
-            <w:tcMar>
-              <w:top w:type="dxa" w:w="55"/>
-              <w:left w:type="dxa" w:w="110"/>
-              <w:bottom w:type="dxa" w:w="55"/>
-              <w:right w:type="dxa" w:w="110"/>
-            </w:tcMar>
-            <w:vAlign w:val="center"/>
-          </w:tcPr>
-          <w:p>
-            <w:pPr>
-              <w:jc w:val="left"/>
-            </w:pPr>
-            <w:r>
-              <w:rPr>
-                <w:sz w:val="17"/>
-                <w:szCs w:val="17"/>
-              </w:rPr>
-              <w:t xml:space="preserve">—</w:t>
-            </w:r>
-          </w:p>
-        </w:tc>
-      </w:tr>
-      <w:tr>
-        <w:tc>
-          <w:tcPr>
-            <w:tcW w:type="dxa" w:w="3400"/>
-            <w:tcBorders>
-              <w:top w:val="single" w:color="DDDDDD" w:sz="1"/>
-              <w:left w:val="single" w:color="DDDDDD" w:sz="1"/>
-              <w:bottom w:val="single" w:color="DDDDDD" w:sz="1"/>
-              <w:right w:val="single" w:color="DDDDDD" w:sz="1"/>
-            </w:tcBorders>
-            <w:tcMar>
-              <w:top w:type="dxa" w:w="55"/>
-              <w:left w:type="dxa" w:w="110"/>
-              <w:bottom w:type="dxa" w:w="55"/>
-              <w:right w:type="dxa" w:w="110"/>
-            </w:tcMar>
-            <w:vAlign w:val="center"/>
-          </w:tcPr>
-          <w:p>
-            <w:pPr>
-              <w:jc w:val="left"/>
-            </w:pPr>
-            <w:r>
-              <w:rPr>
-                <w:sz w:val="18"/>
-                <w:szCs w:val="18"/>
-              </w:rPr>
-              <w:t xml:space="preserve">Soja Tocantins (Agrolink)</w:t>
-            </w:r>
-          </w:p>
-        </w:tc>
-        <w:tc>
-          <w:tcPr>
-            <w:tcW w:type="dxa" w:w="1980"/>
-            <w:tcBorders>
-              <w:top w:val="single" w:color="DDDDDD" w:sz="1"/>
-              <w:left w:val="single" w:color="DDDDDD" w:sz="1"/>
-              <w:bottom w:val="single" w:color="DDDDDD" w:sz="1"/>
-              <w:right w:val="single" w:color="DDDDDD" w:sz="1"/>
-            </w:tcBorders>
-            <w:tcMar>
-              <w:top w:type="dxa" w:w="55"/>
-              <w:left w:type="dxa" w:w="110"/>
-              <w:bottom w:type="dxa" w:w="55"/>
-              <w:right w:type="dxa" w:w="110"/>
-            </w:tcMar>
-            <w:vAlign w:val="center"/>
-          </w:tcPr>
-          <w:p>
-            <w:pPr>
-              <w:jc w:val="right"/>
-            </w:pPr>
-            <w:r>
-              <w:rPr>
-                <w:sz w:val="18"/>
-                <w:szCs w:val="18"/>
-              </w:rPr>
-              <w:t xml:space="preserve">R$ 134,13/sc</w:t>
-            </w:r>
-          </w:p>
-        </w:tc>
-        <w:tc>
-          <w:tcPr>
-            <w:tcW w:type="dxa" w:w="1980"/>
-            <w:tcBorders>
-              <w:top w:val="single" w:color="DDDDDD" w:sz="1"/>
-              <w:left w:val="single" w:color="DDDDDD" w:sz="1"/>
-              <w:bottom w:val="single" w:color="DDDDDD" w:sz="1"/>
-              <w:right w:val="single" w:color="DDDDDD" w:sz="1"/>
-            </w:tcBorders>
-            <w:tcMar>
-              <w:top w:type="dxa" w:w="55"/>
-              <w:left w:type="dxa" w:w="110"/>
-              <w:bottom w:type="dxa" w:w="55"/>
-              <w:right w:type="dxa" w:w="110"/>
-            </w:tcMar>
-            <w:vAlign w:val="center"/>
-          </w:tcPr>
-          <w:p>
-            <w:pPr>
-              <w:jc w:val="right"/>
-            </w:pPr>
-            <w:r>
-              <w:rPr>
-                <w:b/>
-                <w:bCs/>
-                <w:color w:val="6B7585"/>
-                <w:sz w:val="18"/>
-                <w:szCs w:val="18"/>
-              </w:rPr>
-              <w:t xml:space="preserve">-0,2%</w:t>
-            </w:r>
-          </w:p>
-        </w:tc>
-        <w:tc>
-          <w:tcPr>
-            <w:tcW w:type="dxa" w:w="2000"/>
-            <w:tcBorders>
-              <w:top w:val="single" w:color="DDDDDD" w:sz="1"/>
-              <w:left w:val="single" w:color="DDDDDD" w:sz="1"/>
-              <w:bottom w:val="single" w:color="DDDDDD" w:sz="1"/>
-              <w:right w:val="single" w:color="DDDDDD" w:sz="1"/>
-            </w:tcBorders>
-            <w:tcMar>
-              <w:top w:type="dxa" w:w="55"/>
-              <w:left w:type="dxa" w:w="110"/>
-              <w:bottom w:type="dxa" w:w="55"/>
-              <w:right w:type="dxa" w:w="110"/>
-            </w:tcMar>
-            <w:vAlign w:val="center"/>
-          </w:tcPr>
-          <w:p>
-            <w:pPr>
-              <w:jc w:val="left"/>
-            </w:pPr>
-            <w:r>
-              <w:rPr>
-                <w:sz w:val="17"/>
-                <w:szCs w:val="17"/>
-              </w:rPr>
-              <w:t xml:space="preserve">Spread regional</w:t>
-            </w:r>
-          </w:p>
-        </w:tc>
-      </w:tr>
-      <w:tr>
-        <w:tc>
-          <w:tcPr>
-            <w:tcW w:type="dxa" w:w="3400"/>
-            <w:tcBorders>
-              <w:top w:val="single" w:color="DDDDDD" w:sz="1"/>
-              <w:left w:val="single" w:color="DDDDDD" w:sz="1"/>
-              <w:bottom w:val="single" w:color="DDDDDD" w:sz="1"/>
-              <w:right w:val="single" w:color="DDDDDD" w:sz="1"/>
-            </w:tcBorders>
-            <w:tcMar>
-              <w:top w:type="dxa" w:w="55"/>
-              <w:left w:type="dxa" w:w="110"/>
-              <w:bottom w:type="dxa" w:w="55"/>
-              <w:right w:type="dxa" w:w="110"/>
-            </w:tcMar>
-            <w:vAlign w:val="center"/>
-          </w:tcPr>
-          <w:p>
-            <w:pPr>
-              <w:jc w:val="left"/>
-            </w:pPr>
-            <w:r>
-              <w:rPr>
-                <w:sz w:val="18"/>
-                <w:szCs w:val="18"/>
-              </w:rPr>
-              <w:t xml:space="preserve">Troca Soja/MAP</w:t>
-            </w:r>
-          </w:p>
-        </w:tc>
-        <w:tc>
-          <w:tcPr>
-            <w:tcW w:type="dxa" w:w="1980"/>
-            <w:tcBorders>
-              <w:top w:val="single" w:color="DDDDDD" w:sz="1"/>
-              <w:left w:val="single" w:color="DDDDDD" w:sz="1"/>
-              <w:bottom w:val="single" w:color="DDDDDD" w:sz="1"/>
-              <w:right w:val="single" w:color="DDDDDD" w:sz="1"/>
-            </w:tcBorders>
-            <w:tcMar>
-              <w:top w:type="dxa" w:w="55"/>
-              <w:left w:type="dxa" w:w="110"/>
-              <w:bottom w:type="dxa" w:w="55"/>
-              <w:right w:type="dxa" w:w="110"/>
-            </w:tcMar>
-            <w:vAlign w:val="center"/>
-          </w:tcPr>
-          <w:p>
-            <w:pPr>
-              <w:jc w:val="right"/>
-            </w:pPr>
-            <w:r>
-              <w:rPr>
-                <w:sz w:val="18"/>
-                <w:szCs w:val="18"/>
-              </w:rPr>
-              <w:t xml:space="preserve">31,5 sc/t</w:t>
+              <w:t xml:space="preserve">R$ 136,66/sc</w:t>
             </w:r>
           </w:p>
         </w:tc>
@@ -1147,7 +897,7 @@
                 <w:sz w:val="18"/>
                 <w:szCs w:val="18"/>
               </w:rPr>
-              <w:t xml:space="preserve">+0,3%</w:t>
+              <w:t xml:space="preserve">-2,8%</w:t>
             </w:r>
           </w:p>
         </w:tc>
@@ -1177,7 +927,7 @@
                 <w:sz w:val="17"/>
                 <w:szCs w:val="17"/>
               </w:rPr>
-              <w:t xml:space="preserve">Piora</w:t>
+              <w:t xml:space="preserve">—</w:t>
             </w:r>
           </w:p>
         </w:tc>
@@ -1209,6 +959,256 @@
                 <w:sz w:val="18"/>
                 <w:szCs w:val="18"/>
               </w:rPr>
+              <w:t xml:space="preserve">Soja Tocantins (Agrolink)</w:t>
+            </w:r>
+          </w:p>
+        </w:tc>
+        <w:tc>
+          <w:tcPr>
+            <w:tcW w:type="dxa" w:w="1980"/>
+            <w:tcBorders>
+              <w:top w:val="single" w:color="DDDDDD" w:sz="1"/>
+              <w:left w:val="single" w:color="DDDDDD" w:sz="1"/>
+              <w:bottom w:val="single" w:color="DDDDDD" w:sz="1"/>
+              <w:right w:val="single" w:color="DDDDDD" w:sz="1"/>
+            </w:tcBorders>
+            <w:tcMar>
+              <w:top w:type="dxa" w:w="55"/>
+              <w:left w:type="dxa" w:w="110"/>
+              <w:bottom w:type="dxa" w:w="55"/>
+              <w:right w:type="dxa" w:w="110"/>
+            </w:tcMar>
+            <w:vAlign w:val="center"/>
+          </w:tcPr>
+          <w:p>
+            <w:pPr>
+              <w:jc w:val="right"/>
+            </w:pPr>
+            <w:r>
+              <w:rPr>
+                <w:sz w:val="18"/>
+                <w:szCs w:val="18"/>
+              </w:rPr>
+              <w:t xml:space="preserve">R$ 128,25/sc</w:t>
+            </w:r>
+          </w:p>
+        </w:tc>
+        <w:tc>
+          <w:tcPr>
+            <w:tcW w:type="dxa" w:w="1980"/>
+            <w:tcBorders>
+              <w:top w:val="single" w:color="DDDDDD" w:sz="1"/>
+              <w:left w:val="single" w:color="DDDDDD" w:sz="1"/>
+              <w:bottom w:val="single" w:color="DDDDDD" w:sz="1"/>
+              <w:right w:val="single" w:color="DDDDDD" w:sz="1"/>
+            </w:tcBorders>
+            <w:tcMar>
+              <w:top w:type="dxa" w:w="55"/>
+              <w:left w:type="dxa" w:w="110"/>
+              <w:bottom w:type="dxa" w:w="55"/>
+              <w:right w:type="dxa" w:w="110"/>
+            </w:tcMar>
+            <w:vAlign w:val="center"/>
+          </w:tcPr>
+          <w:p>
+            <w:pPr>
+              <w:jc w:val="right"/>
+            </w:pPr>
+            <w:r>
+              <w:rPr>
+                <w:b/>
+                <w:bCs/>
+                <w:color w:val="B23636"/>
+                <w:sz w:val="18"/>
+                <w:szCs w:val="18"/>
+              </w:rPr>
+              <w:t xml:space="preserve">-4,4%</w:t>
+            </w:r>
+          </w:p>
+        </w:tc>
+        <w:tc>
+          <w:tcPr>
+            <w:tcW w:type="dxa" w:w="2000"/>
+            <w:tcBorders>
+              <w:top w:val="single" w:color="DDDDDD" w:sz="1"/>
+              <w:left w:val="single" w:color="DDDDDD" w:sz="1"/>
+              <w:bottom w:val="single" w:color="DDDDDD" w:sz="1"/>
+              <w:right w:val="single" w:color="DDDDDD" w:sz="1"/>
+            </w:tcBorders>
+            <w:tcMar>
+              <w:top w:type="dxa" w:w="55"/>
+              <w:left w:type="dxa" w:w="110"/>
+              <w:bottom w:type="dxa" w:w="55"/>
+              <w:right w:type="dxa" w:w="110"/>
+            </w:tcMar>
+            <w:vAlign w:val="center"/>
+          </w:tcPr>
+          <w:p>
+            <w:pPr>
+              <w:jc w:val="left"/>
+            </w:pPr>
+            <w:r>
+              <w:rPr>
+                <w:sz w:val="17"/>
+                <w:szCs w:val="17"/>
+              </w:rPr>
+              <w:t xml:space="preserve">Spread regional</w:t>
+            </w:r>
+          </w:p>
+        </w:tc>
+      </w:tr>
+      <w:tr>
+        <w:tc>
+          <w:tcPr>
+            <w:tcW w:type="dxa" w:w="3400"/>
+            <w:tcBorders>
+              <w:top w:val="single" w:color="DDDDDD" w:sz="1"/>
+              <w:left w:val="single" w:color="DDDDDD" w:sz="1"/>
+              <w:bottom w:val="single" w:color="DDDDDD" w:sz="1"/>
+              <w:right w:val="single" w:color="DDDDDD" w:sz="1"/>
+            </w:tcBorders>
+            <w:tcMar>
+              <w:top w:type="dxa" w:w="55"/>
+              <w:left w:type="dxa" w:w="110"/>
+              <w:bottom w:type="dxa" w:w="55"/>
+              <w:right w:type="dxa" w:w="110"/>
+            </w:tcMar>
+            <w:vAlign w:val="center"/>
+          </w:tcPr>
+          <w:p>
+            <w:pPr>
+              <w:jc w:val="left"/>
+            </w:pPr>
+            <w:r>
+              <w:rPr>
+                <w:sz w:val="18"/>
+                <w:szCs w:val="18"/>
+              </w:rPr>
+              <w:t xml:space="preserve">Troca Soja/MAP</w:t>
+            </w:r>
+          </w:p>
+        </w:tc>
+        <w:tc>
+          <w:tcPr>
+            <w:tcW w:type="dxa" w:w="1980"/>
+            <w:tcBorders>
+              <w:top w:val="single" w:color="DDDDDD" w:sz="1"/>
+              <w:left w:val="single" w:color="DDDDDD" w:sz="1"/>
+              <w:bottom w:val="single" w:color="DDDDDD" w:sz="1"/>
+              <w:right w:val="single" w:color="DDDDDD" w:sz="1"/>
+            </w:tcBorders>
+            <w:tcMar>
+              <w:top w:type="dxa" w:w="55"/>
+              <w:left w:type="dxa" w:w="110"/>
+              <w:bottom w:type="dxa" w:w="55"/>
+              <w:right w:type="dxa" w:w="110"/>
+            </w:tcMar>
+            <w:vAlign w:val="center"/>
+          </w:tcPr>
+          <w:p>
+            <w:pPr>
+              <w:jc w:val="right"/>
+            </w:pPr>
+            <w:r>
+              <w:rPr>
+                <w:sz w:val="18"/>
+                <w:szCs w:val="18"/>
+              </w:rPr>
+              <w:t xml:space="preserve">32,2 sc/t</w:t>
+            </w:r>
+          </w:p>
+        </w:tc>
+        <w:tc>
+          <w:tcPr>
+            <w:tcW w:type="dxa" w:w="1980"/>
+            <w:tcBorders>
+              <w:top w:val="single" w:color="DDDDDD" w:sz="1"/>
+              <w:left w:val="single" w:color="DDDDDD" w:sz="1"/>
+              <w:bottom w:val="single" w:color="DDDDDD" w:sz="1"/>
+              <w:right w:val="single" w:color="DDDDDD" w:sz="1"/>
+            </w:tcBorders>
+            <w:tcMar>
+              <w:top w:type="dxa" w:w="55"/>
+              <w:left w:type="dxa" w:w="110"/>
+              <w:bottom w:type="dxa" w:w="55"/>
+              <w:right w:type="dxa" w:w="110"/>
+            </w:tcMar>
+            <w:vAlign w:val="center"/>
+          </w:tcPr>
+          <w:p>
+            <w:pPr>
+              <w:jc w:val="right"/>
+            </w:pPr>
+            <w:r>
+              <w:rPr>
+                <w:b/>
+                <w:bCs/>
+                <w:color w:val="B23636"/>
+                <w:sz w:val="18"/>
+                <w:szCs w:val="18"/>
+              </w:rPr>
+              <w:t xml:space="preserve">+2,2%</w:t>
+            </w:r>
+          </w:p>
+        </w:tc>
+        <w:tc>
+          <w:tcPr>
+            <w:tcW w:type="dxa" w:w="2000"/>
+            <w:tcBorders>
+              <w:top w:val="single" w:color="DDDDDD" w:sz="1"/>
+              <w:left w:val="single" w:color="DDDDDD" w:sz="1"/>
+              <w:bottom w:val="single" w:color="DDDDDD" w:sz="1"/>
+              <w:right w:val="single" w:color="DDDDDD" w:sz="1"/>
+            </w:tcBorders>
+            <w:tcMar>
+              <w:top w:type="dxa" w:w="55"/>
+              <w:left w:type="dxa" w:w="110"/>
+              <w:bottom w:type="dxa" w:w="55"/>
+              <w:right w:type="dxa" w:w="110"/>
+            </w:tcMar>
+            <w:vAlign w:val="center"/>
+          </w:tcPr>
+          <w:p>
+            <w:pPr>
+              <w:jc w:val="left"/>
+            </w:pPr>
+            <w:r>
+              <w:rPr>
+                <w:sz w:val="17"/>
+                <w:szCs w:val="17"/>
+              </w:rPr>
+              <w:t xml:space="preserve">Piora</w:t>
+            </w:r>
+          </w:p>
+        </w:tc>
+      </w:tr>
+      <w:tr>
+        <w:tc>
+          <w:tcPr>
+            <w:tcW w:type="dxa" w:w="3400"/>
+            <w:tcBorders>
+              <w:top w:val="single" w:color="DDDDDD" w:sz="1"/>
+              <w:left w:val="single" w:color="DDDDDD" w:sz="1"/>
+              <w:bottom w:val="single" w:color="DDDDDD" w:sz="1"/>
+              <w:right w:val="single" w:color="DDDDDD" w:sz="1"/>
+            </w:tcBorders>
+            <w:tcMar>
+              <w:top w:type="dxa" w:w="55"/>
+              <w:left w:type="dxa" w:w="110"/>
+              <w:bottom w:type="dxa" w:w="55"/>
+              <w:right w:type="dxa" w:w="110"/>
+            </w:tcMar>
+            <w:vAlign w:val="center"/>
+          </w:tcPr>
+          <w:p>
+            <w:pPr>
+              <w:jc w:val="left"/>
+            </w:pPr>
+            <w:r>
+              <w:rPr>
+                <w:sz w:val="18"/>
+                <w:szCs w:val="18"/>
+              </w:rPr>
               <w:t xml:space="preserve">Troca Soja/Ureia</w:t>
             </w:r>
           </w:p>
@@ -1239,7 +1239,7 @@
                 <w:sz w:val="18"/>
                 <w:szCs w:val="18"/>
               </w:rPr>
-              <w:t xml:space="preserve">21,9 sc/t</w:t>
+              <w:t xml:space="preserve">22,4 sc/t</w:t>
             </w:r>
           </w:p>
         </w:tc>
@@ -1528,7 +1528,257 @@
                 <w:sz w:val="18"/>
                 <w:szCs w:val="18"/>
               </w:rPr>
-              <w:t xml:space="preserve">5,10</w:t>
+              <w:t xml:space="preserve">5,07</w:t>
+            </w:r>
+          </w:p>
+        </w:tc>
+        <w:tc>
+          <w:tcPr>
+            <w:tcW w:type="dxa" w:w="1980"/>
+            <w:tcBorders>
+              <w:top w:val="single" w:color="DDDDDD" w:sz="1"/>
+              <w:left w:val="single" w:color="DDDDDD" w:sz="1"/>
+              <w:bottom w:val="single" w:color="DDDDDD" w:sz="1"/>
+              <w:right w:val="single" w:color="DDDDDD" w:sz="1"/>
+            </w:tcBorders>
+            <w:tcMar>
+              <w:top w:type="dxa" w:w="55"/>
+              <w:left w:type="dxa" w:w="110"/>
+              <w:bottom w:type="dxa" w:w="55"/>
+              <w:right w:type="dxa" w:w="110"/>
+            </w:tcMar>
+            <w:vAlign w:val="center"/>
+          </w:tcPr>
+          <w:p>
+            <w:pPr>
+              <w:jc w:val="right"/>
+            </w:pPr>
+            <w:r>
+              <w:rPr>
+                <w:b/>
+                <w:bCs/>
+                <w:color w:val="2F8A5F"/>
+                <w:sz w:val="18"/>
+                <w:szCs w:val="18"/>
+              </w:rPr>
+              <w:t xml:space="preserve">-0,6%</w:t>
+            </w:r>
+          </w:p>
+        </w:tc>
+        <w:tc>
+          <w:tcPr>
+            <w:tcW w:type="dxa" w:w="2000"/>
+            <w:tcBorders>
+              <w:top w:val="single" w:color="DDDDDD" w:sz="1"/>
+              <w:left w:val="single" w:color="DDDDDD" w:sz="1"/>
+              <w:bottom w:val="single" w:color="DDDDDD" w:sz="1"/>
+              <w:right w:val="single" w:color="DDDDDD" w:sz="1"/>
+            </w:tcBorders>
+            <w:tcMar>
+              <w:top w:type="dxa" w:w="55"/>
+              <w:left w:type="dxa" w:w="110"/>
+              <w:bottom w:type="dxa" w:w="55"/>
+              <w:right w:type="dxa" w:w="110"/>
+            </w:tcMar>
+            <w:vAlign w:val="center"/>
+          </w:tcPr>
+          <w:p>
+            <w:pPr>
+              <w:jc w:val="left"/>
+            </w:pPr>
+            <w:r>
+              <w:rPr>
+                <w:sz w:val="17"/>
+                <w:szCs w:val="17"/>
+              </w:rPr>
+              <w:t xml:space="preserve">Custo de importação</w:t>
+            </w:r>
+          </w:p>
+        </w:tc>
+      </w:tr>
+      <w:tr>
+        <w:tc>
+          <w:tcPr>
+            <w:tcW w:type="dxa" w:w="3400"/>
+            <w:tcBorders>
+              <w:top w:val="single" w:color="DDDDDD" w:sz="1"/>
+              <w:left w:val="single" w:color="DDDDDD" w:sz="1"/>
+              <w:bottom w:val="single" w:color="DDDDDD" w:sz="1"/>
+              <w:right w:val="single" w:color="DDDDDD" w:sz="1"/>
+            </w:tcBorders>
+            <w:tcMar>
+              <w:top w:type="dxa" w:w="55"/>
+              <w:left w:type="dxa" w:w="110"/>
+              <w:bottom w:type="dxa" w:w="55"/>
+              <w:right w:type="dxa" w:w="110"/>
+            </w:tcMar>
+            <w:vAlign w:val="center"/>
+          </w:tcPr>
+          <w:p>
+            <w:pPr>
+              <w:jc w:val="left"/>
+            </w:pPr>
+            <w:r>
+              <w:rPr>
+                <w:sz w:val="18"/>
+                <w:szCs w:val="18"/>
+              </w:rPr>
+              <w:t xml:space="preserve">Gás Natural (Henry Hub)</w:t>
+            </w:r>
+          </w:p>
+        </w:tc>
+        <w:tc>
+          <w:tcPr>
+            <w:tcW w:type="dxa" w:w="1980"/>
+            <w:tcBorders>
+              <w:top w:val="single" w:color="DDDDDD" w:sz="1"/>
+              <w:left w:val="single" w:color="DDDDDD" w:sz="1"/>
+              <w:bottom w:val="single" w:color="DDDDDD" w:sz="1"/>
+              <w:right w:val="single" w:color="DDDDDD" w:sz="1"/>
+            </w:tcBorders>
+            <w:tcMar>
+              <w:top w:type="dxa" w:w="55"/>
+              <w:left w:type="dxa" w:w="110"/>
+              <w:bottom w:type="dxa" w:w="55"/>
+              <w:right w:type="dxa" w:w="110"/>
+            </w:tcMar>
+            <w:vAlign w:val="center"/>
+          </w:tcPr>
+          <w:p>
+            <w:pPr>
+              <w:jc w:val="right"/>
+            </w:pPr>
+            <w:r>
+              <w:rPr>
+                <w:sz w:val="18"/>
+                <w:szCs w:val="18"/>
+              </w:rPr>
+              <w:t xml:space="preserve">US$ 2,63</w:t>
+            </w:r>
+          </w:p>
+        </w:tc>
+        <w:tc>
+          <w:tcPr>
+            <w:tcW w:type="dxa" w:w="1980"/>
+            <w:tcBorders>
+              <w:top w:val="single" w:color="DDDDDD" w:sz="1"/>
+              <w:left w:val="single" w:color="DDDDDD" w:sz="1"/>
+              <w:bottom w:val="single" w:color="DDDDDD" w:sz="1"/>
+              <w:right w:val="single" w:color="DDDDDD" w:sz="1"/>
+            </w:tcBorders>
+            <w:tcMar>
+              <w:top w:type="dxa" w:w="55"/>
+              <w:left w:type="dxa" w:w="110"/>
+              <w:bottom w:type="dxa" w:w="55"/>
+              <w:right w:type="dxa" w:w="110"/>
+            </w:tcMar>
+            <w:vAlign w:val="center"/>
+          </w:tcPr>
+          <w:p>
+            <w:pPr>
+              <w:jc w:val="right"/>
+            </w:pPr>
+            <w:r>
+              <w:rPr>
+                <w:b/>
+                <w:bCs/>
+                <w:color w:val="2F8A5F"/>
+                <w:sz w:val="18"/>
+                <w:szCs w:val="18"/>
+              </w:rPr>
+              <w:t xml:space="preserve">-6,1%</w:t>
+            </w:r>
+          </w:p>
+        </w:tc>
+        <w:tc>
+          <w:tcPr>
+            <w:tcW w:type="dxa" w:w="2000"/>
+            <w:tcBorders>
+              <w:top w:val="single" w:color="DDDDDD" w:sz="1"/>
+              <w:left w:val="single" w:color="DDDDDD" w:sz="1"/>
+              <w:bottom w:val="single" w:color="DDDDDD" w:sz="1"/>
+              <w:right w:val="single" w:color="DDDDDD" w:sz="1"/>
+            </w:tcBorders>
+            <w:tcMar>
+              <w:top w:type="dxa" w:w="55"/>
+              <w:left w:type="dxa" w:w="110"/>
+              <w:bottom w:type="dxa" w:w="55"/>
+              <w:right w:type="dxa" w:w="110"/>
+            </w:tcMar>
+            <w:vAlign w:val="center"/>
+          </w:tcPr>
+          <w:p>
+            <w:pPr>
+              <w:jc w:val="left"/>
+            </w:pPr>
+            <w:r>
+              <w:rPr>
+                <w:sz w:val="17"/>
+                <w:szCs w:val="17"/>
+              </w:rPr>
+              <w:t xml:space="preserve">Pressiona ureia</w:t>
+            </w:r>
+          </w:p>
+        </w:tc>
+      </w:tr>
+      <w:tr>
+        <w:tc>
+          <w:tcPr>
+            <w:tcW w:type="dxa" w:w="3400"/>
+            <w:tcBorders>
+              <w:top w:val="single" w:color="DDDDDD" w:sz="1"/>
+              <w:left w:val="single" w:color="DDDDDD" w:sz="1"/>
+              <w:bottom w:val="single" w:color="DDDDDD" w:sz="1"/>
+              <w:right w:val="single" w:color="DDDDDD" w:sz="1"/>
+            </w:tcBorders>
+            <w:tcMar>
+              <w:top w:type="dxa" w:w="55"/>
+              <w:left w:type="dxa" w:w="110"/>
+              <w:bottom w:type="dxa" w:w="55"/>
+              <w:right w:type="dxa" w:w="110"/>
+            </w:tcMar>
+            <w:vAlign w:val="center"/>
+          </w:tcPr>
+          <w:p>
+            <w:pPr>
+              <w:jc w:val="left"/>
+            </w:pPr>
+            <w:r>
+              <w:rPr>
+                <w:sz w:val="18"/>
+                <w:szCs w:val="18"/>
+              </w:rPr>
+              <w:t xml:space="preserve">Frete Marítimo (BDI)</w:t>
+            </w:r>
+          </w:p>
+        </w:tc>
+        <w:tc>
+          <w:tcPr>
+            <w:tcW w:type="dxa" w:w="1980"/>
+            <w:tcBorders>
+              <w:top w:val="single" w:color="DDDDDD" w:sz="1"/>
+              <w:left w:val="single" w:color="DDDDDD" w:sz="1"/>
+              <w:bottom w:val="single" w:color="DDDDDD" w:sz="1"/>
+              <w:right w:val="single" w:color="DDDDDD" w:sz="1"/>
+            </w:tcBorders>
+            <w:tcMar>
+              <w:top w:type="dxa" w:w="55"/>
+              <w:left w:type="dxa" w:w="110"/>
+              <w:bottom w:type="dxa" w:w="55"/>
+              <w:right w:type="dxa" w:w="110"/>
+            </w:tcMar>
+            <w:vAlign w:val="center"/>
+          </w:tcPr>
+          <w:p>
+            <w:pPr>
+              <w:jc w:val="right"/>
+            </w:pPr>
+            <w:r>
+              <w:rPr>
+                <w:sz w:val="18"/>
+                <w:szCs w:val="18"/>
+              </w:rPr>
+              <w:t xml:space="preserve">2.843 pts</w:t>
             </w:r>
           </w:p>
         </w:tc>
@@ -1561,257 +1811,7 @@
                 <w:sz w:val="18"/>
                 <w:szCs w:val="18"/>
               </w:rPr>
-              <w:t xml:space="preserve">+0,6%</w:t>
-            </w:r>
-          </w:p>
-        </w:tc>
-        <w:tc>
-          <w:tcPr>
-            <w:tcW w:type="dxa" w:w="2000"/>
-            <w:tcBorders>
-              <w:top w:val="single" w:color="DDDDDD" w:sz="1"/>
-              <w:left w:val="single" w:color="DDDDDD" w:sz="1"/>
-              <w:bottom w:val="single" w:color="DDDDDD" w:sz="1"/>
-              <w:right w:val="single" w:color="DDDDDD" w:sz="1"/>
-            </w:tcBorders>
-            <w:tcMar>
-              <w:top w:type="dxa" w:w="55"/>
-              <w:left w:type="dxa" w:w="110"/>
-              <w:bottom w:type="dxa" w:w="55"/>
-              <w:right w:type="dxa" w:w="110"/>
-            </w:tcMar>
-            <w:vAlign w:val="center"/>
-          </w:tcPr>
-          <w:p>
-            <w:pPr>
-              <w:jc w:val="left"/>
-            </w:pPr>
-            <w:r>
-              <w:rPr>
-                <w:sz w:val="17"/>
-                <w:szCs w:val="17"/>
-              </w:rPr>
-              <w:t xml:space="preserve">Custo de importação</w:t>
-            </w:r>
-          </w:p>
-        </w:tc>
-      </w:tr>
-      <w:tr>
-        <w:tc>
-          <w:tcPr>
-            <w:tcW w:type="dxa" w:w="3400"/>
-            <w:tcBorders>
-              <w:top w:val="single" w:color="DDDDDD" w:sz="1"/>
-              <w:left w:val="single" w:color="DDDDDD" w:sz="1"/>
-              <w:bottom w:val="single" w:color="DDDDDD" w:sz="1"/>
-              <w:right w:val="single" w:color="DDDDDD" w:sz="1"/>
-            </w:tcBorders>
-            <w:tcMar>
-              <w:top w:type="dxa" w:w="55"/>
-              <w:left w:type="dxa" w:w="110"/>
-              <w:bottom w:type="dxa" w:w="55"/>
-              <w:right w:type="dxa" w:w="110"/>
-            </w:tcMar>
-            <w:vAlign w:val="center"/>
-          </w:tcPr>
-          <w:p>
-            <w:pPr>
-              <w:jc w:val="left"/>
-            </w:pPr>
-            <w:r>
-              <w:rPr>
-                <w:sz w:val="18"/>
-                <w:szCs w:val="18"/>
-              </w:rPr>
-              <w:t xml:space="preserve">Gás Natural (Henry Hub)</w:t>
-            </w:r>
-          </w:p>
-        </w:tc>
-        <w:tc>
-          <w:tcPr>
-            <w:tcW w:type="dxa" w:w="1980"/>
-            <w:tcBorders>
-              <w:top w:val="single" w:color="DDDDDD" w:sz="1"/>
-              <w:left w:val="single" w:color="DDDDDD" w:sz="1"/>
-              <w:bottom w:val="single" w:color="DDDDDD" w:sz="1"/>
-              <w:right w:val="single" w:color="DDDDDD" w:sz="1"/>
-            </w:tcBorders>
-            <w:tcMar>
-              <w:top w:type="dxa" w:w="55"/>
-              <w:left w:type="dxa" w:w="110"/>
-              <w:bottom w:type="dxa" w:w="55"/>
-              <w:right w:type="dxa" w:w="110"/>
-            </w:tcMar>
-            <w:vAlign w:val="center"/>
-          </w:tcPr>
-          <w:p>
-            <w:pPr>
-              <w:jc w:val="right"/>
-            </w:pPr>
-            <w:r>
-              <w:rPr>
-                <w:sz w:val="18"/>
-                <w:szCs w:val="18"/>
-              </w:rPr>
-              <w:t xml:space="preserve">US$ 2,80</w:t>
-            </w:r>
-          </w:p>
-        </w:tc>
-        <w:tc>
-          <w:tcPr>
-            <w:tcW w:type="dxa" w:w="1980"/>
-            <w:tcBorders>
-              <w:top w:val="single" w:color="DDDDDD" w:sz="1"/>
-              <w:left w:val="single" w:color="DDDDDD" w:sz="1"/>
-              <w:bottom w:val="single" w:color="DDDDDD" w:sz="1"/>
-              <w:right w:val="single" w:color="DDDDDD" w:sz="1"/>
-            </w:tcBorders>
-            <w:tcMar>
-              <w:top w:type="dxa" w:w="55"/>
-              <w:left w:type="dxa" w:w="110"/>
-              <w:bottom w:type="dxa" w:w="55"/>
-              <w:right w:type="dxa" w:w="110"/>
-            </w:tcMar>
-            <w:vAlign w:val="center"/>
-          </w:tcPr>
-          <w:p>
-            <w:pPr>
-              <w:jc w:val="right"/>
-            </w:pPr>
-            <w:r>
-              <w:rPr>
-                <w:b/>
-                <w:bCs/>
-                <w:color w:val="6B7585"/>
-                <w:sz w:val="18"/>
-                <w:szCs w:val="18"/>
-              </w:rPr>
-              <w:t xml:space="preserve">0,0%</w:t>
-            </w:r>
-          </w:p>
-        </w:tc>
-        <w:tc>
-          <w:tcPr>
-            <w:tcW w:type="dxa" w:w="2000"/>
-            <w:tcBorders>
-              <w:top w:val="single" w:color="DDDDDD" w:sz="1"/>
-              <w:left w:val="single" w:color="DDDDDD" w:sz="1"/>
-              <w:bottom w:val="single" w:color="DDDDDD" w:sz="1"/>
-              <w:right w:val="single" w:color="DDDDDD" w:sz="1"/>
-            </w:tcBorders>
-            <w:tcMar>
-              <w:top w:type="dxa" w:w="55"/>
-              <w:left w:type="dxa" w:w="110"/>
-              <w:bottom w:type="dxa" w:w="55"/>
-              <w:right w:type="dxa" w:w="110"/>
-            </w:tcMar>
-            <w:vAlign w:val="center"/>
-          </w:tcPr>
-          <w:p>
-            <w:pPr>
-              <w:jc w:val="left"/>
-            </w:pPr>
-            <w:r>
-              <w:rPr>
-                <w:sz w:val="17"/>
-                <w:szCs w:val="17"/>
-              </w:rPr>
-              <w:t xml:space="preserve">Pressiona ureia</w:t>
-            </w:r>
-          </w:p>
-        </w:tc>
-      </w:tr>
-      <w:tr>
-        <w:tc>
-          <w:tcPr>
-            <w:tcW w:type="dxa" w:w="3400"/>
-            <w:tcBorders>
-              <w:top w:val="single" w:color="DDDDDD" w:sz="1"/>
-              <w:left w:val="single" w:color="DDDDDD" w:sz="1"/>
-              <w:bottom w:val="single" w:color="DDDDDD" w:sz="1"/>
-              <w:right w:val="single" w:color="DDDDDD" w:sz="1"/>
-            </w:tcBorders>
-            <w:tcMar>
-              <w:top w:type="dxa" w:w="55"/>
-              <w:left w:type="dxa" w:w="110"/>
-              <w:bottom w:type="dxa" w:w="55"/>
-              <w:right w:type="dxa" w:w="110"/>
-            </w:tcMar>
-            <w:vAlign w:val="center"/>
-          </w:tcPr>
-          <w:p>
-            <w:pPr>
-              <w:jc w:val="left"/>
-            </w:pPr>
-            <w:r>
-              <w:rPr>
-                <w:sz w:val="18"/>
-                <w:szCs w:val="18"/>
-              </w:rPr>
-              <w:t xml:space="preserve">Frete Marítimo (BDI)</w:t>
-            </w:r>
-          </w:p>
-        </w:tc>
-        <w:tc>
-          <w:tcPr>
-            <w:tcW w:type="dxa" w:w="1980"/>
-            <w:tcBorders>
-              <w:top w:val="single" w:color="DDDDDD" w:sz="1"/>
-              <w:left w:val="single" w:color="DDDDDD" w:sz="1"/>
-              <w:bottom w:val="single" w:color="DDDDDD" w:sz="1"/>
-              <w:right w:val="single" w:color="DDDDDD" w:sz="1"/>
-            </w:tcBorders>
-            <w:tcMar>
-              <w:top w:type="dxa" w:w="55"/>
-              <w:left w:type="dxa" w:w="110"/>
-              <w:bottom w:type="dxa" w:w="55"/>
-              <w:right w:type="dxa" w:w="110"/>
-            </w:tcMar>
-            <w:vAlign w:val="center"/>
-          </w:tcPr>
-          <w:p>
-            <w:pPr>
-              <w:jc w:val="right"/>
-            </w:pPr>
-            <w:r>
-              <w:rPr>
-                <w:sz w:val="18"/>
-                <w:szCs w:val="18"/>
-              </w:rPr>
-              <w:t xml:space="preserve">2.696 pts</w:t>
-            </w:r>
-          </w:p>
-        </w:tc>
-        <w:tc>
-          <w:tcPr>
-            <w:tcW w:type="dxa" w:w="1980"/>
-            <w:tcBorders>
-              <w:top w:val="single" w:color="DDDDDD" w:sz="1"/>
-              <w:left w:val="single" w:color="DDDDDD" w:sz="1"/>
-              <w:bottom w:val="single" w:color="DDDDDD" w:sz="1"/>
-              <w:right w:val="single" w:color="DDDDDD" w:sz="1"/>
-            </w:tcBorders>
-            <w:tcMar>
-              <w:top w:type="dxa" w:w="55"/>
-              <w:left w:type="dxa" w:w="110"/>
-              <w:bottom w:type="dxa" w:w="55"/>
-              <w:right w:type="dxa" w:w="110"/>
-            </w:tcMar>
-            <w:vAlign w:val="center"/>
-          </w:tcPr>
-          <w:p>
-            <w:pPr>
-              <w:jc w:val="right"/>
-            </w:pPr>
-            <w:r>
-              <w:rPr>
-                <w:b/>
-                <w:bCs/>
-                <w:color w:val="2F8A5F"/>
-                <w:sz w:val="18"/>
-                <w:szCs w:val="18"/>
-              </w:rPr>
-              <w:t xml:space="preserve">-1,7%</w:t>
+              <w:t xml:space="preserve">+5,5%</w:t>
             </w:r>
           </w:p>
         </w:tc>
@@ -2006,14 +2006,40 @@
           <w:sz w:val="18"/>
           <w:szCs w:val="18"/>
         </w:rPr>
-        <w:t xml:space="preserve">BDI: </w:t>
+        <w:t xml:space="preserve">Gás Natural: </w:t>
       </w:r>
       <w:r>
         <w:rPr>
           <w:sz w:val="18"/>
           <w:szCs w:val="18"/>
         </w:rPr>
-        <w:t xml:space="preserve">queda de -1,7% no período.</w:t>
+        <w:t xml:space="preserve">queda de -6,1% no período.</w:t>
+      </w:r>
+    </w:p>
+    <w:p>
+      <w:pPr>
+        <w:pStyle w:val="ListParagraph"/>
+        <w:numPr>
+          <w:ilvl w:val="0"/>
+          <w:numId w:val="2"/>
+        </w:numPr>
+        <w:spacing w:after="70"/>
+      </w:pPr>
+      <w:r>
+        <w:rPr>
+          <w:b/>
+          <w:bCs/>
+          <w:sz w:val="18"/>
+          <w:szCs w:val="18"/>
+        </w:rPr>
+        <w:t xml:space="preserve">BDI: </w:t>
+      </w:r>
+      <w:r>
+        <w:rPr>
+          <w:sz w:val="18"/>
+          <w:szCs w:val="18"/>
+        </w:rPr>
+        <w:t xml:space="preserve">alta de +5,5% no período.</w:t>
       </w:r>
     </w:p>
     <w:p>
@@ -2039,7 +2065,7 @@
           <w:sz w:val="18"/>
           <w:szCs w:val="18"/>
         </w:rPr>
-        <w:t xml:space="preserve">alta de +0,6% no período.</w:t>
+        <w:t xml:space="preserve">queda de -0,6% no período.</w:t>
       </w:r>
     </w:p>
     <w:p>
@@ -2085,7 +2111,7 @@
           <w:sz w:val="15"/>
           <w:szCs w:val="15"/>
         </w:rPr>
-        <w:t xml:space="preserve">Fontes automáticas: AwesomeAPI (câmbio), CEPEA/ESALQ (soja), ANP (diesel), stooq (BDI). Fertilizantes e gás natural: override manual (fertilizers-override.json). Status desta execução: {"bdi":"ok (HANDYBULK, 27/07/2026)","soja":"ok (Noticias Agricolas / CEPEA-PR 27/07/2026)","sojaRegional":"ok (Oeste da Bahia/BA (AIBA))","diesel":"falha: Petrobras: HTTP 403 | PortalCanaa: HTTP 403","cambio":"ok (BCB PTAX)","_comexPeriodo":"com-filtro-ncm | 2026-06 | 4 linhas","_comexNcmsEncontrados":"31042090,31054000,31021010,31042010","ureia":"ok (ComexStat 2026-06)","map":"ok (ComexStat 2026-06)","kcl":"ok (ComexStat 2026-06)","gas":"ok (EIA Henry Hub)"}.</w:t>
+        <w:t xml:space="preserve">Fontes automáticas: AwesomeAPI (câmbio), CEPEA/ESALQ (soja), ANP (diesel), stooq (BDI). Fertilizantes e gás natural: override manual (fertilizers-override.json). Status desta execução: {"sojaRegional":"ok (Oeste da Bahia/BA (AIBA))","soja":"ok (Noticias Agricolas / CEPEA-PR 03/08/2026)","bdi":"ok (HANDYBULK, 03/08/2026)","cambio":"ok (BCB PTAX)","diesel":"falha: Petrobras: HTTP 403 | PortalCanaa: HTTP 403","_comexPeriodo":"com-filtro-ncm | 2026-06 | 4 linhas","_comexNcmsEncontrados":"31042090,31054000,31021010,31042010","ureia":"ok (ComexStat 2026-06)","map":"ok (ComexStat 2026-06)","kcl":"ok (ComexStat 2026-06)","gas":"ok (EIA Henry Hub)"}.</w:t>
       </w:r>
     </w:p>
     <w:p>
@@ -2166,7 +2192,7 @@
         <w:sz w:val="15"/>
         <w:szCs w:val="15"/>
       </w:rPr>
-      <w:t xml:space="preserve">Inteligência de Mercado · Jul/2026  ·  Página </w:t>
+      <w:t xml:space="preserve">Inteligência de Mercado · Ago/2026  ·  Página </w:t>
     </w:r>
     <w:r>
       <w:rPr>

</xml_diff>

<commit_message>
chore: atualizacao automatica 2026-08-10
</commit_message>
<xml_diff>
--- a/relatorio_executivo.docx
+++ b/relatorio_executivo.docx
@@ -46,7 +46,7 @@
           <w:sz w:val="17"/>
           <w:szCs w:val="17"/>
         </w:rPr>
-        <w:t xml:space="preserve">Equipe de Planejamento, Controle e Pesquisa Florestal  ·  Referência: Ago/2026  ·  Gerado em 04/08/2026, 14:13:33</w:t>
+        <w:t xml:space="preserve">Equipe de Planejamento, Controle e Pesquisa Florestal  ·  Referência: Ago/2026  ·  Gerado em 10/08/2026, 12:15:32</w:t>
       </w:r>
     </w:p>
     <w:p>
@@ -84,21 +84,21 @@
           <w:sz w:val="19"/>
           <w:szCs w:val="19"/>
         </w:rPr>
-        <w:t xml:space="preserve">Ureia FOB em US$ 585/t (fechamento jun/26), MAP US$ 844/t e KCl US$ 351/t. </w:t>
+        <w:t xml:space="preserve">Ureia FOB em US$ 418/t (-28,4%), MAP US$ 828/t e KCl US$ 359/t. </w:t>
       </w:r>
       <w:r>
         <w:rPr>
           <w:sz w:val="19"/>
           <w:szCs w:val="19"/>
         </w:rPr>
-        <w:t xml:space="preserve">O dólar está em R$ 5,07 (-0,6%) e a soja CEPEA em R$ 136,66/saca. </w:t>
+        <w:t xml:space="preserve">O dólar está em R$ 5,09 (+0,4%) e a soja CEPEA em R$ 137,33/saca. </w:t>
       </w:r>
       <w:r>
         <w:rPr>
           <w:sz w:val="19"/>
           <w:szCs w:val="19"/>
         </w:rPr>
-        <w:t xml:space="preserve">A relação de troca soja/MAP é de 32,2 sacas/t.</w:t>
+        <w:t xml:space="preserve">A relação de troca soja/MAP é de 31,6 sacas/t.</w:t>
       </w:r>
     </w:p>
     <w:p>
@@ -323,7 +323,7 @@
                 <w:sz w:val="18"/>
                 <w:szCs w:val="18"/>
               </w:rPr>
-              <w:t xml:space="preserve">US$ 585/t</w:t>
+              <w:t xml:space="preserve">US$ 418/t</w:t>
             </w:r>
           </w:p>
         </w:tc>
@@ -352,11 +352,11 @@
               <w:rPr>
                 <w:b/>
                 <w:bCs/>
-                <w:color w:val="6B7585"/>
-                <w:sz w:val="18"/>
-                <w:szCs w:val="18"/>
-              </w:rPr>
-              <w:t xml:space="preserve">—</w:t>
+                <w:color w:val="2F8A5F"/>
+                <w:sz w:val="18"/>
+                <w:szCs w:val="18"/>
+              </w:rPr>
+              <w:t xml:space="preserve">-28,4%</w:t>
             </w:r>
           </w:p>
         </w:tc>
@@ -386,7 +386,7 @@
                 <w:sz w:val="17"/>
                 <w:szCs w:val="17"/>
               </w:rPr>
-              <w:t xml:space="preserve">Fechamento jun/26 (sem novo dado)</w:t>
+              <w:t xml:space="preserve">Nitrogenado · ref. jul/26</w:t>
             </w:r>
           </w:p>
         </w:tc>
@@ -448,7 +448,7 @@
                 <w:sz w:val="18"/>
                 <w:szCs w:val="18"/>
               </w:rPr>
-              <w:t xml:space="preserve">US$ 844/t</w:t>
+              <w:t xml:space="preserve">US$ 828/t</w:t>
             </w:r>
           </w:p>
         </w:tc>
@@ -477,11 +477,11 @@
               <w:rPr>
                 <w:b/>
                 <w:bCs/>
-                <w:color w:val="6B7585"/>
-                <w:sz w:val="18"/>
-                <w:szCs w:val="18"/>
-              </w:rPr>
-              <w:t xml:space="preserve">—</w:t>
+                <w:color w:val="2F8A5F"/>
+                <w:sz w:val="18"/>
+                <w:szCs w:val="18"/>
+              </w:rPr>
+              <w:t xml:space="preserve">-1,9%</w:t>
             </w:r>
           </w:p>
         </w:tc>
@@ -511,7 +511,7 @@
                 <w:sz w:val="17"/>
                 <w:szCs w:val="17"/>
               </w:rPr>
-              <w:t xml:space="preserve">Fechamento jun/26 (sem novo dado)</w:t>
+              <w:t xml:space="preserve">Fosfatado · ref. jul/26</w:t>
             </w:r>
           </w:p>
         </w:tc>
@@ -573,7 +573,7 @@
                 <w:sz w:val="18"/>
                 <w:szCs w:val="18"/>
               </w:rPr>
-              <w:t xml:space="preserve">US$ 351/t</w:t>
+              <w:t xml:space="preserve">US$ 359/t</w:t>
             </w:r>
           </w:p>
         </w:tc>
@@ -602,11 +602,11 @@
               <w:rPr>
                 <w:b/>
                 <w:bCs/>
-                <w:color w:val="6B7585"/>
-                <w:sz w:val="18"/>
-                <w:szCs w:val="18"/>
-              </w:rPr>
-              <w:t xml:space="preserve">—</w:t>
+                <w:color w:val="B23636"/>
+                <w:sz w:val="18"/>
+                <w:szCs w:val="18"/>
+              </w:rPr>
+              <w:t xml:space="preserve">+2,3%</w:t>
             </w:r>
           </w:p>
         </w:tc>
@@ -636,7 +636,7 @@
                 <w:sz w:val="17"/>
                 <w:szCs w:val="17"/>
               </w:rPr>
-              <w:t xml:space="preserve">Fechamento jun/26 (sem novo dado)</w:t>
+              <w:t xml:space="preserve">Potássico · ref. jul/26</w:t>
             </w:r>
           </w:p>
         </w:tc>
@@ -864,7 +864,7 @@
                 <w:sz w:val="18"/>
                 <w:szCs w:val="18"/>
               </w:rPr>
-              <w:t xml:space="preserve">R$ 136,66/sc</w:t>
+              <w:t xml:space="preserve">R$ 137,33/sc</w:t>
             </w:r>
           </w:p>
         </w:tc>
@@ -893,11 +893,11 @@
               <w:rPr>
                 <w:b/>
                 <w:bCs/>
-                <w:color w:val="B23636"/>
-                <w:sz w:val="18"/>
-                <w:szCs w:val="18"/>
-              </w:rPr>
-              <w:t xml:space="preserve">-2,8%</w:t>
+                <w:color w:val="2F8A5F"/>
+                <w:sz w:val="18"/>
+                <w:szCs w:val="18"/>
+              </w:rPr>
+              <w:t xml:space="preserve">+0,5%</w:t>
             </w:r>
           </w:p>
         </w:tc>
@@ -989,7 +989,7 @@
                 <w:sz w:val="18"/>
                 <w:szCs w:val="18"/>
               </w:rPr>
-              <w:t xml:space="preserve">R$ 128,25/sc</w:t>
+              <w:t xml:space="preserve">R$ 129,25/sc</w:t>
             </w:r>
           </w:p>
         </w:tc>
@@ -1018,11 +1018,11 @@
               <w:rPr>
                 <w:b/>
                 <w:bCs/>
-                <w:color w:val="B23636"/>
-                <w:sz w:val="18"/>
-                <w:szCs w:val="18"/>
-              </w:rPr>
-              <w:t xml:space="preserve">-4,4%</w:t>
+                <w:color w:val="2F8A5F"/>
+                <w:sz w:val="18"/>
+                <w:szCs w:val="18"/>
+              </w:rPr>
+              <w:t xml:space="preserve">+0,8%</w:t>
             </w:r>
           </w:p>
         </w:tc>
@@ -1114,7 +1114,7 @@
                 <w:sz w:val="18"/>
                 <w:szCs w:val="18"/>
               </w:rPr>
-              <w:t xml:space="preserve">32,2 sc/t</w:t>
+              <w:t xml:space="preserve">31,6 sc/t</w:t>
             </w:r>
           </w:p>
         </w:tc>
@@ -1143,11 +1143,11 @@
               <w:rPr>
                 <w:b/>
                 <w:bCs/>
-                <w:color w:val="B23636"/>
-                <w:sz w:val="18"/>
-                <w:szCs w:val="18"/>
-              </w:rPr>
-              <w:t xml:space="preserve">+2,2%</w:t>
+                <w:color w:val="2F8A5F"/>
+                <w:sz w:val="18"/>
+                <w:szCs w:val="18"/>
+              </w:rPr>
+              <w:t xml:space="preserve">-1,9%</w:t>
             </w:r>
           </w:p>
         </w:tc>
@@ -1177,7 +1177,7 @@
                 <w:sz w:val="17"/>
                 <w:szCs w:val="17"/>
               </w:rPr>
-              <w:t xml:space="preserve">Piora</w:t>
+              <w:t xml:space="preserve">Melhora</w:t>
             </w:r>
           </w:p>
         </w:tc>
@@ -1239,7 +1239,7 @@
                 <w:sz w:val="18"/>
                 <w:szCs w:val="18"/>
               </w:rPr>
-              <w:t xml:space="preserve">22,4 sc/t</w:t>
+              <w:t xml:space="preserve">16,2 sc/t</w:t>
             </w:r>
           </w:p>
         </w:tc>
@@ -1528,257 +1528,7 @@
                 <w:sz w:val="18"/>
                 <w:szCs w:val="18"/>
               </w:rPr>
-              <w:t xml:space="preserve">5,07</w:t>
-            </w:r>
-          </w:p>
-        </w:tc>
-        <w:tc>
-          <w:tcPr>
-            <w:tcW w:type="dxa" w:w="1980"/>
-            <w:tcBorders>
-              <w:top w:val="single" w:color="DDDDDD" w:sz="1"/>
-              <w:left w:val="single" w:color="DDDDDD" w:sz="1"/>
-              <w:bottom w:val="single" w:color="DDDDDD" w:sz="1"/>
-              <w:right w:val="single" w:color="DDDDDD" w:sz="1"/>
-            </w:tcBorders>
-            <w:tcMar>
-              <w:top w:type="dxa" w:w="55"/>
-              <w:left w:type="dxa" w:w="110"/>
-              <w:bottom w:type="dxa" w:w="55"/>
-              <w:right w:type="dxa" w:w="110"/>
-            </w:tcMar>
-            <w:vAlign w:val="center"/>
-          </w:tcPr>
-          <w:p>
-            <w:pPr>
-              <w:jc w:val="right"/>
-            </w:pPr>
-            <w:r>
-              <w:rPr>
-                <w:b/>
-                <w:bCs/>
-                <w:color w:val="2F8A5F"/>
-                <w:sz w:val="18"/>
-                <w:szCs w:val="18"/>
-              </w:rPr>
-              <w:t xml:space="preserve">-0,6%</w:t>
-            </w:r>
-          </w:p>
-        </w:tc>
-        <w:tc>
-          <w:tcPr>
-            <w:tcW w:type="dxa" w:w="2000"/>
-            <w:tcBorders>
-              <w:top w:val="single" w:color="DDDDDD" w:sz="1"/>
-              <w:left w:val="single" w:color="DDDDDD" w:sz="1"/>
-              <w:bottom w:val="single" w:color="DDDDDD" w:sz="1"/>
-              <w:right w:val="single" w:color="DDDDDD" w:sz="1"/>
-            </w:tcBorders>
-            <w:tcMar>
-              <w:top w:type="dxa" w:w="55"/>
-              <w:left w:type="dxa" w:w="110"/>
-              <w:bottom w:type="dxa" w:w="55"/>
-              <w:right w:type="dxa" w:w="110"/>
-            </w:tcMar>
-            <w:vAlign w:val="center"/>
-          </w:tcPr>
-          <w:p>
-            <w:pPr>
-              <w:jc w:val="left"/>
-            </w:pPr>
-            <w:r>
-              <w:rPr>
-                <w:sz w:val="17"/>
-                <w:szCs w:val="17"/>
-              </w:rPr>
-              <w:t xml:space="preserve">Custo de importação</w:t>
-            </w:r>
-          </w:p>
-        </w:tc>
-      </w:tr>
-      <w:tr>
-        <w:tc>
-          <w:tcPr>
-            <w:tcW w:type="dxa" w:w="3400"/>
-            <w:tcBorders>
-              <w:top w:val="single" w:color="DDDDDD" w:sz="1"/>
-              <w:left w:val="single" w:color="DDDDDD" w:sz="1"/>
-              <w:bottom w:val="single" w:color="DDDDDD" w:sz="1"/>
-              <w:right w:val="single" w:color="DDDDDD" w:sz="1"/>
-            </w:tcBorders>
-            <w:tcMar>
-              <w:top w:type="dxa" w:w="55"/>
-              <w:left w:type="dxa" w:w="110"/>
-              <w:bottom w:type="dxa" w:w="55"/>
-              <w:right w:type="dxa" w:w="110"/>
-            </w:tcMar>
-            <w:vAlign w:val="center"/>
-          </w:tcPr>
-          <w:p>
-            <w:pPr>
-              <w:jc w:val="left"/>
-            </w:pPr>
-            <w:r>
-              <w:rPr>
-                <w:sz w:val="18"/>
-                <w:szCs w:val="18"/>
-              </w:rPr>
-              <w:t xml:space="preserve">Gás Natural (Henry Hub)</w:t>
-            </w:r>
-          </w:p>
-        </w:tc>
-        <w:tc>
-          <w:tcPr>
-            <w:tcW w:type="dxa" w:w="1980"/>
-            <w:tcBorders>
-              <w:top w:val="single" w:color="DDDDDD" w:sz="1"/>
-              <w:left w:val="single" w:color="DDDDDD" w:sz="1"/>
-              <w:bottom w:val="single" w:color="DDDDDD" w:sz="1"/>
-              <w:right w:val="single" w:color="DDDDDD" w:sz="1"/>
-            </w:tcBorders>
-            <w:tcMar>
-              <w:top w:type="dxa" w:w="55"/>
-              <w:left w:type="dxa" w:w="110"/>
-              <w:bottom w:type="dxa" w:w="55"/>
-              <w:right w:type="dxa" w:w="110"/>
-            </w:tcMar>
-            <w:vAlign w:val="center"/>
-          </w:tcPr>
-          <w:p>
-            <w:pPr>
-              <w:jc w:val="right"/>
-            </w:pPr>
-            <w:r>
-              <w:rPr>
-                <w:sz w:val="18"/>
-                <w:szCs w:val="18"/>
-              </w:rPr>
-              <w:t xml:space="preserve">US$ 2,63</w:t>
-            </w:r>
-          </w:p>
-        </w:tc>
-        <w:tc>
-          <w:tcPr>
-            <w:tcW w:type="dxa" w:w="1980"/>
-            <w:tcBorders>
-              <w:top w:val="single" w:color="DDDDDD" w:sz="1"/>
-              <w:left w:val="single" w:color="DDDDDD" w:sz="1"/>
-              <w:bottom w:val="single" w:color="DDDDDD" w:sz="1"/>
-              <w:right w:val="single" w:color="DDDDDD" w:sz="1"/>
-            </w:tcBorders>
-            <w:tcMar>
-              <w:top w:type="dxa" w:w="55"/>
-              <w:left w:type="dxa" w:w="110"/>
-              <w:bottom w:type="dxa" w:w="55"/>
-              <w:right w:type="dxa" w:w="110"/>
-            </w:tcMar>
-            <w:vAlign w:val="center"/>
-          </w:tcPr>
-          <w:p>
-            <w:pPr>
-              <w:jc w:val="right"/>
-            </w:pPr>
-            <w:r>
-              <w:rPr>
-                <w:b/>
-                <w:bCs/>
-                <w:color w:val="2F8A5F"/>
-                <w:sz w:val="18"/>
-                <w:szCs w:val="18"/>
-              </w:rPr>
-              <w:t xml:space="preserve">-6,1%</w:t>
-            </w:r>
-          </w:p>
-        </w:tc>
-        <w:tc>
-          <w:tcPr>
-            <w:tcW w:type="dxa" w:w="2000"/>
-            <w:tcBorders>
-              <w:top w:val="single" w:color="DDDDDD" w:sz="1"/>
-              <w:left w:val="single" w:color="DDDDDD" w:sz="1"/>
-              <w:bottom w:val="single" w:color="DDDDDD" w:sz="1"/>
-              <w:right w:val="single" w:color="DDDDDD" w:sz="1"/>
-            </w:tcBorders>
-            <w:tcMar>
-              <w:top w:type="dxa" w:w="55"/>
-              <w:left w:type="dxa" w:w="110"/>
-              <w:bottom w:type="dxa" w:w="55"/>
-              <w:right w:type="dxa" w:w="110"/>
-            </w:tcMar>
-            <w:vAlign w:val="center"/>
-          </w:tcPr>
-          <w:p>
-            <w:pPr>
-              <w:jc w:val="left"/>
-            </w:pPr>
-            <w:r>
-              <w:rPr>
-                <w:sz w:val="17"/>
-                <w:szCs w:val="17"/>
-              </w:rPr>
-              <w:t xml:space="preserve">Pressiona ureia</w:t>
-            </w:r>
-          </w:p>
-        </w:tc>
-      </w:tr>
-      <w:tr>
-        <w:tc>
-          <w:tcPr>
-            <w:tcW w:type="dxa" w:w="3400"/>
-            <w:tcBorders>
-              <w:top w:val="single" w:color="DDDDDD" w:sz="1"/>
-              <w:left w:val="single" w:color="DDDDDD" w:sz="1"/>
-              <w:bottom w:val="single" w:color="DDDDDD" w:sz="1"/>
-              <w:right w:val="single" w:color="DDDDDD" w:sz="1"/>
-            </w:tcBorders>
-            <w:tcMar>
-              <w:top w:type="dxa" w:w="55"/>
-              <w:left w:type="dxa" w:w="110"/>
-              <w:bottom w:type="dxa" w:w="55"/>
-              <w:right w:type="dxa" w:w="110"/>
-            </w:tcMar>
-            <w:vAlign w:val="center"/>
-          </w:tcPr>
-          <w:p>
-            <w:pPr>
-              <w:jc w:val="left"/>
-            </w:pPr>
-            <w:r>
-              <w:rPr>
-                <w:sz w:val="18"/>
-                <w:szCs w:val="18"/>
-              </w:rPr>
-              <w:t xml:space="preserve">Frete Marítimo (BDI)</w:t>
-            </w:r>
-          </w:p>
-        </w:tc>
-        <w:tc>
-          <w:tcPr>
-            <w:tcW w:type="dxa" w:w="1980"/>
-            <w:tcBorders>
-              <w:top w:val="single" w:color="DDDDDD" w:sz="1"/>
-              <w:left w:val="single" w:color="DDDDDD" w:sz="1"/>
-              <w:bottom w:val="single" w:color="DDDDDD" w:sz="1"/>
-              <w:right w:val="single" w:color="DDDDDD" w:sz="1"/>
-            </w:tcBorders>
-            <w:tcMar>
-              <w:top w:type="dxa" w:w="55"/>
-              <w:left w:type="dxa" w:w="110"/>
-              <w:bottom w:type="dxa" w:w="55"/>
-              <w:right w:type="dxa" w:w="110"/>
-            </w:tcMar>
-            <w:vAlign w:val="center"/>
-          </w:tcPr>
-          <w:p>
-            <w:pPr>
-              <w:jc w:val="right"/>
-            </w:pPr>
-            <w:r>
-              <w:rPr>
-                <w:sz w:val="18"/>
-                <w:szCs w:val="18"/>
-              </w:rPr>
-              <w:t xml:space="preserve">2.843 pts</w:t>
+              <w:t xml:space="preserve">5,09</w:t>
             </w:r>
           </w:p>
         </w:tc>
@@ -1811,7 +1561,257 @@
                 <w:sz w:val="18"/>
                 <w:szCs w:val="18"/>
               </w:rPr>
-              <w:t xml:space="preserve">+5,5%</w:t>
+              <w:t xml:space="preserve">+0,4%</w:t>
+            </w:r>
+          </w:p>
+        </w:tc>
+        <w:tc>
+          <w:tcPr>
+            <w:tcW w:type="dxa" w:w="2000"/>
+            <w:tcBorders>
+              <w:top w:val="single" w:color="DDDDDD" w:sz="1"/>
+              <w:left w:val="single" w:color="DDDDDD" w:sz="1"/>
+              <w:bottom w:val="single" w:color="DDDDDD" w:sz="1"/>
+              <w:right w:val="single" w:color="DDDDDD" w:sz="1"/>
+            </w:tcBorders>
+            <w:tcMar>
+              <w:top w:type="dxa" w:w="55"/>
+              <w:left w:type="dxa" w:w="110"/>
+              <w:bottom w:type="dxa" w:w="55"/>
+              <w:right w:type="dxa" w:w="110"/>
+            </w:tcMar>
+            <w:vAlign w:val="center"/>
+          </w:tcPr>
+          <w:p>
+            <w:pPr>
+              <w:jc w:val="left"/>
+            </w:pPr>
+            <w:r>
+              <w:rPr>
+                <w:sz w:val="17"/>
+                <w:szCs w:val="17"/>
+              </w:rPr>
+              <w:t xml:space="preserve">Custo de importação</w:t>
+            </w:r>
+          </w:p>
+        </w:tc>
+      </w:tr>
+      <w:tr>
+        <w:tc>
+          <w:tcPr>
+            <w:tcW w:type="dxa" w:w="3400"/>
+            <w:tcBorders>
+              <w:top w:val="single" w:color="DDDDDD" w:sz="1"/>
+              <w:left w:val="single" w:color="DDDDDD" w:sz="1"/>
+              <w:bottom w:val="single" w:color="DDDDDD" w:sz="1"/>
+              <w:right w:val="single" w:color="DDDDDD" w:sz="1"/>
+            </w:tcBorders>
+            <w:tcMar>
+              <w:top w:type="dxa" w:w="55"/>
+              <w:left w:type="dxa" w:w="110"/>
+              <w:bottom w:type="dxa" w:w="55"/>
+              <w:right w:type="dxa" w:w="110"/>
+            </w:tcMar>
+            <w:vAlign w:val="center"/>
+          </w:tcPr>
+          <w:p>
+            <w:pPr>
+              <w:jc w:val="left"/>
+            </w:pPr>
+            <w:r>
+              <w:rPr>
+                <w:sz w:val="18"/>
+                <w:szCs w:val="18"/>
+              </w:rPr>
+              <w:t xml:space="preserve">Gás Natural (Henry Hub)</w:t>
+            </w:r>
+          </w:p>
+        </w:tc>
+        <w:tc>
+          <w:tcPr>
+            <w:tcW w:type="dxa" w:w="1980"/>
+            <w:tcBorders>
+              <w:top w:val="single" w:color="DDDDDD" w:sz="1"/>
+              <w:left w:val="single" w:color="DDDDDD" w:sz="1"/>
+              <w:bottom w:val="single" w:color="DDDDDD" w:sz="1"/>
+              <w:right w:val="single" w:color="DDDDDD" w:sz="1"/>
+            </w:tcBorders>
+            <w:tcMar>
+              <w:top w:type="dxa" w:w="55"/>
+              <w:left w:type="dxa" w:w="110"/>
+              <w:bottom w:type="dxa" w:w="55"/>
+              <w:right w:type="dxa" w:w="110"/>
+            </w:tcMar>
+            <w:vAlign w:val="center"/>
+          </w:tcPr>
+          <w:p>
+            <w:pPr>
+              <w:jc w:val="right"/>
+            </w:pPr>
+            <w:r>
+              <w:rPr>
+                <w:sz w:val="18"/>
+                <w:szCs w:val="18"/>
+              </w:rPr>
+              <w:t xml:space="preserve">US$ 2,81</w:t>
+            </w:r>
+          </w:p>
+        </w:tc>
+        <w:tc>
+          <w:tcPr>
+            <w:tcW w:type="dxa" w:w="1980"/>
+            <w:tcBorders>
+              <w:top w:val="single" w:color="DDDDDD" w:sz="1"/>
+              <w:left w:val="single" w:color="DDDDDD" w:sz="1"/>
+              <w:bottom w:val="single" w:color="DDDDDD" w:sz="1"/>
+              <w:right w:val="single" w:color="DDDDDD" w:sz="1"/>
+            </w:tcBorders>
+            <w:tcMar>
+              <w:top w:type="dxa" w:w="55"/>
+              <w:left w:type="dxa" w:w="110"/>
+              <w:bottom w:type="dxa" w:w="55"/>
+              <w:right w:type="dxa" w:w="110"/>
+            </w:tcMar>
+            <w:vAlign w:val="center"/>
+          </w:tcPr>
+          <w:p>
+            <w:pPr>
+              <w:jc w:val="right"/>
+            </w:pPr>
+            <w:r>
+              <w:rPr>
+                <w:b/>
+                <w:bCs/>
+                <w:color w:val="B23636"/>
+                <w:sz w:val="18"/>
+                <w:szCs w:val="18"/>
+              </w:rPr>
+              <w:t xml:space="preserve">+6,8%</w:t>
+            </w:r>
+          </w:p>
+        </w:tc>
+        <w:tc>
+          <w:tcPr>
+            <w:tcW w:type="dxa" w:w="2000"/>
+            <w:tcBorders>
+              <w:top w:val="single" w:color="DDDDDD" w:sz="1"/>
+              <w:left w:val="single" w:color="DDDDDD" w:sz="1"/>
+              <w:bottom w:val="single" w:color="DDDDDD" w:sz="1"/>
+              <w:right w:val="single" w:color="DDDDDD" w:sz="1"/>
+            </w:tcBorders>
+            <w:tcMar>
+              <w:top w:type="dxa" w:w="55"/>
+              <w:left w:type="dxa" w:w="110"/>
+              <w:bottom w:type="dxa" w:w="55"/>
+              <w:right w:type="dxa" w:w="110"/>
+            </w:tcMar>
+            <w:vAlign w:val="center"/>
+          </w:tcPr>
+          <w:p>
+            <w:pPr>
+              <w:jc w:val="left"/>
+            </w:pPr>
+            <w:r>
+              <w:rPr>
+                <w:sz w:val="17"/>
+                <w:szCs w:val="17"/>
+              </w:rPr>
+              <w:t xml:space="preserve">Pressiona ureia</w:t>
+            </w:r>
+          </w:p>
+        </w:tc>
+      </w:tr>
+      <w:tr>
+        <w:tc>
+          <w:tcPr>
+            <w:tcW w:type="dxa" w:w="3400"/>
+            <w:tcBorders>
+              <w:top w:val="single" w:color="DDDDDD" w:sz="1"/>
+              <w:left w:val="single" w:color="DDDDDD" w:sz="1"/>
+              <w:bottom w:val="single" w:color="DDDDDD" w:sz="1"/>
+              <w:right w:val="single" w:color="DDDDDD" w:sz="1"/>
+            </w:tcBorders>
+            <w:tcMar>
+              <w:top w:type="dxa" w:w="55"/>
+              <w:left w:type="dxa" w:w="110"/>
+              <w:bottom w:type="dxa" w:w="55"/>
+              <w:right w:type="dxa" w:w="110"/>
+            </w:tcMar>
+            <w:vAlign w:val="center"/>
+          </w:tcPr>
+          <w:p>
+            <w:pPr>
+              <w:jc w:val="left"/>
+            </w:pPr>
+            <w:r>
+              <w:rPr>
+                <w:sz w:val="18"/>
+                <w:szCs w:val="18"/>
+              </w:rPr>
+              <w:t xml:space="preserve">Frete Marítimo (BDI)</w:t>
+            </w:r>
+          </w:p>
+        </w:tc>
+        <w:tc>
+          <w:tcPr>
+            <w:tcW w:type="dxa" w:w="1980"/>
+            <w:tcBorders>
+              <w:top w:val="single" w:color="DDDDDD" w:sz="1"/>
+              <w:left w:val="single" w:color="DDDDDD" w:sz="1"/>
+              <w:bottom w:val="single" w:color="DDDDDD" w:sz="1"/>
+              <w:right w:val="single" w:color="DDDDDD" w:sz="1"/>
+            </w:tcBorders>
+            <w:tcMar>
+              <w:top w:type="dxa" w:w="55"/>
+              <w:left w:type="dxa" w:w="110"/>
+              <w:bottom w:type="dxa" w:w="55"/>
+              <w:right w:type="dxa" w:w="110"/>
+            </w:tcMar>
+            <w:vAlign w:val="center"/>
+          </w:tcPr>
+          <w:p>
+            <w:pPr>
+              <w:jc w:val="right"/>
+            </w:pPr>
+            <w:r>
+              <w:rPr>
+                <w:sz w:val="18"/>
+                <w:szCs w:val="18"/>
+              </w:rPr>
+              <w:t xml:space="preserve">3.089 pts</w:t>
+            </w:r>
+          </w:p>
+        </w:tc>
+        <w:tc>
+          <w:tcPr>
+            <w:tcW w:type="dxa" w:w="1980"/>
+            <w:tcBorders>
+              <w:top w:val="single" w:color="DDDDDD" w:sz="1"/>
+              <w:left w:val="single" w:color="DDDDDD" w:sz="1"/>
+              <w:bottom w:val="single" w:color="DDDDDD" w:sz="1"/>
+              <w:right w:val="single" w:color="DDDDDD" w:sz="1"/>
+            </w:tcBorders>
+            <w:tcMar>
+              <w:top w:type="dxa" w:w="55"/>
+              <w:left w:type="dxa" w:w="110"/>
+              <w:bottom w:type="dxa" w:w="55"/>
+              <w:right w:type="dxa" w:w="110"/>
+            </w:tcMar>
+            <w:vAlign w:val="center"/>
+          </w:tcPr>
+          <w:p>
+            <w:pPr>
+              <w:jc w:val="right"/>
+            </w:pPr>
+            <w:r>
+              <w:rPr>
+                <w:b/>
+                <w:bCs/>
+                <w:color w:val="B23636"/>
+                <w:sz w:val="18"/>
+                <w:szCs w:val="18"/>
+              </w:rPr>
+              <w:t xml:space="preserve">+8,7%</w:t>
             </w:r>
           </w:p>
         </w:tc>
@@ -2006,14 +2006,14 @@
           <w:sz w:val="18"/>
           <w:szCs w:val="18"/>
         </w:rPr>
-        <w:t xml:space="preserve">Gás Natural: </w:t>
+        <w:t xml:space="preserve">Ureia: </w:t>
       </w:r>
       <w:r>
         <w:rPr>
           <w:sz w:val="18"/>
           <w:szCs w:val="18"/>
         </w:rPr>
-        <w:t xml:space="preserve">queda de -6,1% no período.</w:t>
+        <w:t xml:space="preserve">queda de -28,4% no período.</w:t>
       </w:r>
     </w:p>
     <w:p>
@@ -2039,7 +2039,7 @@
           <w:sz w:val="18"/>
           <w:szCs w:val="18"/>
         </w:rPr>
-        <w:t xml:space="preserve">alta de +5,5% no período.</w:t>
+        <w:t xml:space="preserve">alta de +8,7% no período.</w:t>
       </w:r>
     </w:p>
     <w:p>
@@ -2058,14 +2058,40 @@
           <w:sz w:val="18"/>
           <w:szCs w:val="18"/>
         </w:rPr>
-        <w:t xml:space="preserve">Dólar: </w:t>
+        <w:t xml:space="preserve">Gás Natural: </w:t>
       </w:r>
       <w:r>
         <w:rPr>
           <w:sz w:val="18"/>
           <w:szCs w:val="18"/>
         </w:rPr>
-        <w:t xml:space="preserve">queda de -0,6% no período.</w:t>
+        <w:t xml:space="preserve">alta de +6,8% no período.</w:t>
+      </w:r>
+    </w:p>
+    <w:p>
+      <w:pPr>
+        <w:pStyle w:val="ListParagraph"/>
+        <w:numPr>
+          <w:ilvl w:val="0"/>
+          <w:numId w:val="2"/>
+        </w:numPr>
+        <w:spacing w:after="70"/>
+      </w:pPr>
+      <w:r>
+        <w:rPr>
+          <w:b/>
+          <w:bCs/>
+          <w:sz w:val="18"/>
+          <w:szCs w:val="18"/>
+        </w:rPr>
+        <w:t xml:space="preserve">KCl: </w:t>
+      </w:r>
+      <w:r>
+        <w:rPr>
+          <w:sz w:val="18"/>
+          <w:szCs w:val="18"/>
+        </w:rPr>
+        <w:t xml:space="preserve">alta de +2,3% no período.</w:t>
       </w:r>
     </w:p>
     <w:p>
@@ -2111,7 +2137,7 @@
           <w:sz w:val="15"/>
           <w:szCs w:val="15"/>
         </w:rPr>
-        <w:t xml:space="preserve">Fontes automáticas: AwesomeAPI (câmbio), CEPEA/ESALQ (soja), ANP (diesel), stooq (BDI). Fertilizantes e gás natural: override manual (fertilizers-override.json). Status desta execução: {"sojaRegional":"ok (Oeste da Bahia/BA (AIBA))","soja":"ok (Noticias Agricolas / CEPEA-PR 03/08/2026)","bdi":"ok (HANDYBULK, 03/08/2026)","cambio":"ok (BCB PTAX)","diesel":"falha: Petrobras: HTTP 403 | PortalCanaa: HTTP 403","_comexPeriodo":"com-filtro-ncm | 2026-06 | 4 linhas","_comexNcmsEncontrados":"31042090,31054000,31021010,31042010","ureia":"ok (ComexStat 2026-06)","map":"ok (ComexStat 2026-06)","kcl":"ok (ComexStat 2026-06)","gas":"ok (EIA Henry Hub)"}.</w:t>
+        <w:t xml:space="preserve">Fontes automáticas: AwesomeAPI (câmbio), CEPEA/ESALQ (soja), ANP (diesel), stooq (BDI). Fertilizantes e gás natural: override manual (fertilizers-override.json). Status desta execução: {"sojaRegional":"ok (Oeste da Bahia/BA (AIBA))","soja":"ok (Noticias Agricolas / CEPEA-PR 07/08/2026)","bdi":"ok (HANDYBULK, 07/08/2026)","cambio":"ok (BCB PTAX)","diesel":"falha: Petrobras: HTTP 403 | PortalCanaa: HTTP 403","_comexPeriodo":"com-filtro-ncm | 2026-07 | 4 linhas","_comexNcmsEncontrados":"31042090,31021010,31054000,31042010","ureia":"ok (ComexStat 2026-07)","map":"ok (ComexStat 2026-07)","kcl":"ok (ComexStat 2026-07)","gas":"ok (EIA Henry Hub)"}.</w:t>
       </w:r>
     </w:p>
     <w:p>

</xml_diff>

<commit_message>
chore: atualizacao automatica 2026-08-11
</commit_message>
<xml_diff>
--- a/relatorio_executivo.docx
+++ b/relatorio_executivo.docx
@@ -46,7 +46,7 @@
           <w:sz w:val="17"/>
           <w:szCs w:val="17"/>
         </w:rPr>
-        <w:t xml:space="preserve">Equipe de Planejamento, Controle e Pesquisa Florestal  ·  Referência: Ago/2026  ·  Gerado em 10/08/2026, 12:15:32</w:t>
+        <w:t xml:space="preserve">Equipe de Planejamento, Controle e Pesquisa Florestal  ·  Referência: Ago/2026  ·  Gerado em 11/08/2026, 12:21:52</w:t>
       </w:r>
     </w:p>
     <w:p>
@@ -84,14 +84,14 @@
           <w:sz w:val="19"/>
           <w:szCs w:val="19"/>
         </w:rPr>
-        <w:t xml:space="preserve">Ureia FOB em US$ 418/t (-28,4%), MAP US$ 828/t e KCl US$ 359/t. </w:t>
+        <w:t xml:space="preserve">Ureia FOB em US$ 418/t (fechamento jul/26), MAP US$ 828/t e KCl US$ 359/t. </w:t>
       </w:r>
       <w:r>
         <w:rPr>
           <w:sz w:val="19"/>
           <w:szCs w:val="19"/>
         </w:rPr>
-        <w:t xml:space="preserve">O dólar está em R$ 5,09 (+0,4%) e a soja CEPEA em R$ 137,33/saca. </w:t>
+        <w:t xml:space="preserve">O dólar está em R$ 5,10 (+0,2%) e a soja CEPEA em R$ 137,44/saca. </w:t>
       </w:r>
       <w:r>
         <w:rPr>
@@ -352,11 +352,11 @@
               <w:rPr>
                 <w:b/>
                 <w:bCs/>
-                <w:color w:val="2F8A5F"/>
-                <w:sz w:val="18"/>
-                <w:szCs w:val="18"/>
-              </w:rPr>
-              <w:t xml:space="preserve">-28,4%</w:t>
+                <w:color w:val="6B7585"/>
+                <w:sz w:val="18"/>
+                <w:szCs w:val="18"/>
+              </w:rPr>
+              <w:t xml:space="preserve">—</w:t>
             </w:r>
           </w:p>
         </w:tc>
@@ -386,7 +386,7 @@
                 <w:sz w:val="17"/>
                 <w:szCs w:val="17"/>
               </w:rPr>
-              <w:t xml:space="preserve">Nitrogenado · ref. jul/26</w:t>
+              <w:t xml:space="preserve">Fechamento jul/26 (sem novo dado)</w:t>
             </w:r>
           </w:p>
         </w:tc>
@@ -477,11 +477,11 @@
               <w:rPr>
                 <w:b/>
                 <w:bCs/>
-                <w:color w:val="2F8A5F"/>
-                <w:sz w:val="18"/>
-                <w:szCs w:val="18"/>
-              </w:rPr>
-              <w:t xml:space="preserve">-1,9%</w:t>
+                <w:color w:val="6B7585"/>
+                <w:sz w:val="18"/>
+                <w:szCs w:val="18"/>
+              </w:rPr>
+              <w:t xml:space="preserve">—</w:t>
             </w:r>
           </w:p>
         </w:tc>
@@ -511,7 +511,7 @@
                 <w:sz w:val="17"/>
                 <w:szCs w:val="17"/>
               </w:rPr>
-              <w:t xml:space="preserve">Fosfatado · ref. jul/26</w:t>
+              <w:t xml:space="preserve">Fechamento jul/26 (sem novo dado)</w:t>
             </w:r>
           </w:p>
         </w:tc>
@@ -602,11 +602,11 @@
               <w:rPr>
                 <w:b/>
                 <w:bCs/>
-                <w:color w:val="B23636"/>
-                <w:sz w:val="18"/>
-                <w:szCs w:val="18"/>
-              </w:rPr>
-              <w:t xml:space="preserve">+2,3%</w:t>
+                <w:color w:val="6B7585"/>
+                <w:sz w:val="18"/>
+                <w:szCs w:val="18"/>
+              </w:rPr>
+              <w:t xml:space="preserve">—</w:t>
             </w:r>
           </w:p>
         </w:tc>
@@ -636,7 +636,7 @@
                 <w:sz w:val="17"/>
                 <w:szCs w:val="17"/>
               </w:rPr>
-              <w:t xml:space="preserve">Potássico · ref. jul/26</w:t>
+              <w:t xml:space="preserve">Fechamento jul/26 (sem novo dado)</w:t>
             </w:r>
           </w:p>
         </w:tc>
@@ -864,7 +864,7 @@
                 <w:sz w:val="18"/>
                 <w:szCs w:val="18"/>
               </w:rPr>
-              <w:t xml:space="preserve">R$ 137,33/sc</w:t>
+              <w:t xml:space="preserve">R$ 137,44/sc</w:t>
             </w:r>
           </w:p>
         </w:tc>
@@ -893,11 +893,11 @@
               <w:rPr>
                 <w:b/>
                 <w:bCs/>
-                <w:color w:val="2F8A5F"/>
-                <w:sz w:val="18"/>
-                <w:szCs w:val="18"/>
-              </w:rPr>
-              <w:t xml:space="preserve">+0,5%</w:t>
+                <w:color w:val="6B7585"/>
+                <w:sz w:val="18"/>
+                <w:szCs w:val="18"/>
+              </w:rPr>
+              <w:t xml:space="preserve">+0,1%</w:t>
             </w:r>
           </w:p>
         </w:tc>
@@ -989,7 +989,7 @@
                 <w:sz w:val="18"/>
                 <w:szCs w:val="18"/>
               </w:rPr>
-              <w:t xml:space="preserve">R$ 129,25/sc</w:t>
+              <w:t xml:space="preserve">R$ 128,75/sc</w:t>
             </w:r>
           </w:p>
         </w:tc>
@@ -1018,11 +1018,11 @@
               <w:rPr>
                 <w:b/>
                 <w:bCs/>
-                <w:color w:val="2F8A5F"/>
-                <w:sz w:val="18"/>
-                <w:szCs w:val="18"/>
-              </w:rPr>
-              <w:t xml:space="preserve">+0,8%</w:t>
+                <w:color w:val="B23636"/>
+                <w:sz w:val="18"/>
+                <w:szCs w:val="18"/>
+              </w:rPr>
+              <w:t xml:space="preserve">-0,4%</w:t>
             </w:r>
           </w:p>
         </w:tc>
@@ -1143,11 +1143,11 @@
               <w:rPr>
                 <w:b/>
                 <w:bCs/>
-                <w:color w:val="2F8A5F"/>
-                <w:sz w:val="18"/>
-                <w:szCs w:val="18"/>
-              </w:rPr>
-              <w:t xml:space="preserve">-1,9%</w:t>
+                <w:color w:val="6B7585"/>
+                <w:sz w:val="18"/>
+                <w:szCs w:val="18"/>
+              </w:rPr>
+              <w:t xml:space="preserve">0,0%</w:t>
             </w:r>
           </w:p>
         </w:tc>
@@ -1177,7 +1177,7 @@
                 <w:sz w:val="17"/>
                 <w:szCs w:val="17"/>
               </w:rPr>
-              <w:t xml:space="preserve">Melhora</w:t>
+              <w:t xml:space="preserve">Piora</w:t>
             </w:r>
           </w:p>
         </w:tc>
@@ -1528,7 +1528,7 @@
                 <w:sz w:val="18"/>
                 <w:szCs w:val="18"/>
               </w:rPr>
-              <w:t xml:space="preserve">5,09</w:t>
+              <w:t xml:space="preserve">5,10</w:t>
             </w:r>
           </w:p>
         </w:tc>
@@ -1557,11 +1557,11 @@
               <w:rPr>
                 <w:b/>
                 <w:bCs/>
-                <w:color w:val="B23636"/>
-                <w:sz w:val="18"/>
-                <w:szCs w:val="18"/>
-              </w:rPr>
-              <w:t xml:space="preserve">+0,4%</w:t>
+                <w:color w:val="6B7585"/>
+                <w:sz w:val="18"/>
+                <w:szCs w:val="18"/>
+              </w:rPr>
+              <w:t xml:space="preserve">+0,2%</w:t>
             </w:r>
           </w:p>
         </w:tc>
@@ -1682,11 +1682,11 @@
               <w:rPr>
                 <w:b/>
                 <w:bCs/>
-                <w:color w:val="B23636"/>
-                <w:sz w:val="18"/>
-                <w:szCs w:val="18"/>
-              </w:rPr>
-              <w:t xml:space="preserve">+6,8%</w:t>
+                <w:color w:val="6B7585"/>
+                <w:sz w:val="18"/>
+                <w:szCs w:val="18"/>
+              </w:rPr>
+              <w:t xml:space="preserve">0,0%</w:t>
             </w:r>
           </w:p>
         </w:tc>
@@ -1778,7 +1778,7 @@
                 <w:sz w:val="18"/>
                 <w:szCs w:val="18"/>
               </w:rPr>
-              <w:t xml:space="preserve">3.089 pts</w:t>
+              <w:t xml:space="preserve">3.083 pts</w:t>
             </w:r>
           </w:p>
         </w:tc>
@@ -1807,11 +1807,11 @@
               <w:rPr>
                 <w:b/>
                 <w:bCs/>
-                <w:color w:val="B23636"/>
-                <w:sz w:val="18"/>
-                <w:szCs w:val="18"/>
-              </w:rPr>
-              <w:t xml:space="preserve">+8,7%</w:t>
+                <w:color w:val="6B7585"/>
+                <w:sz w:val="18"/>
+                <w:szCs w:val="18"/>
+              </w:rPr>
+              <w:t xml:space="preserve">-0,2%</w:t>
             </w:r>
           </w:p>
         </w:tc>
@@ -2001,19 +2001,71 @@
       </w:pPr>
       <w:r>
         <w:rPr>
+          <w:sz w:val="18"/>
+          <w:szCs w:val="18"/>
+        </w:rPr>
+        <w:t xml:space="preserve">Período sem variações relevantes (todas abaixo de 0,5%).</w:t>
+      </w:r>
+    </w:p>
+    <w:p>
+      <w:pPr>
+        <w:pBdr>
+          <w:bottom w:val="single" w:color="1E2A44" w:sz="6" w:space="2"/>
+        </w:pBdr>
+        <w:spacing w:after="100" w:before="220"/>
+      </w:pPr>
+      <w:r>
+        <w:rPr>
           <w:b/>
           <w:bCs/>
+          <w:color w:val="1E2A44"/>
+          <w:sz w:val="22"/>
+          <w:szCs w:val="22"/>
+        </w:rPr>
+        <w:t xml:space="preserve">6. Contexto de Mercado — Causas da Alta e Perspectivas</w:t>
+      </w:r>
+    </w:p>
+    <w:p>
+      <w:pPr>
+        <w:spacing w:after="60"/>
+      </w:pPr>
+      <w:r>
+        <w:rPr>
+          <w:b/>
+          <w:bCs/>
+          <w:color w:val="1E2A44"/>
           <w:sz w:val="18"/>
           <w:szCs w:val="18"/>
         </w:rPr>
-        <w:t xml:space="preserve">Ureia: </w:t>
-      </w:r>
+        <w:t xml:space="preserve">Por que os fertilizantes subiram — e o que esperar · atualizado em Agosto/2026 · revisão manual.</w:t>
+      </w:r>
+    </w:p>
+    <w:p>
+      <w:pPr>
+        <w:spacing w:after="80"/>
+        <w:jc w:val="both"/>
+      </w:pPr>
       <w:r>
         <w:rPr>
           <w:sz w:val="18"/>
           <w:szCs w:val="18"/>
         </w:rPr>
-        <w:t xml:space="preserve">queda de -28,4% no período.</w:t>
+        <w:t xml:space="preserve">A alta de 2026, concentrada nos nitrogenados (ureia), foi puxada pela combinação de conflito no Oriente Médio, gás natural mais caro e restrições de exportação de China e Rússia, sobre uma base de forte dependência brasileira de importação (~85%).</w:t>
+      </w:r>
+    </w:p>
+    <w:p>
+      <w:pPr>
+        <w:spacing w:after="40"/>
+      </w:pPr>
+      <w:r>
+        <w:rPr>
+          <w:b/>
+          <w:bCs/>
+          <w:color w:val="1E2A44"/>
+          <w:sz w:val="18"/>
+          <w:szCs w:val="18"/>
+        </w:rPr>
+        <w:t xml:space="preserve">Principais causas da alta:</w:t>
       </w:r>
     </w:p>
     <w:p>
@@ -2029,17 +2081,17 @@
         <w:rPr>
           <w:b/>
           <w:bCs/>
-          <w:sz w:val="18"/>
-          <w:szCs w:val="18"/>
-        </w:rPr>
-        <w:t xml:space="preserve">BDI: </w:t>
-      </w:r>
-      <w:r>
-        <w:rPr>
-          <w:sz w:val="18"/>
-          <w:szCs w:val="18"/>
-        </w:rPr>
-        <w:t xml:space="preserve">alta de +8,7% no período.</w:t>
+          <w:sz w:val="17"/>
+          <w:szCs w:val="17"/>
+        </w:rPr>
+        <w:t xml:space="preserve">Conflito no Oriente Médio (Irã): </w:t>
+      </w:r>
+      <w:r>
+        <w:rPr>
+          <w:sz w:val="17"/>
+          <w:szCs w:val="17"/>
+        </w:rPr>
+        <w:t xml:space="preserve">A região concentra cerca de 40% do comércio marítimo global de ureia e é fornecedora relevante de nitrogenados ao Brasil. Tensões envolvendo o Irã e a interrupção de rotas no Estreito de Ormuz elevaram o risco de desabastecimento e os custos.</w:t>
       </w:r>
     </w:p>
     <w:p>
@@ -2055,17 +2107,17 @@
         <w:rPr>
           <w:b/>
           <w:bCs/>
-          <w:sz w:val="18"/>
-          <w:szCs w:val="18"/>
-        </w:rPr>
-        <w:t xml:space="preserve">Gás Natural: </w:t>
-      </w:r>
-      <w:r>
-        <w:rPr>
-          <w:sz w:val="18"/>
-          <w:szCs w:val="18"/>
-        </w:rPr>
-        <w:t xml:space="preserve">alta de +6,8% no período.</w:t>
+          <w:sz w:val="17"/>
+          <w:szCs w:val="17"/>
+        </w:rPr>
+        <w:t xml:space="preserve">Gás natural mais caro: </w:t>
+      </w:r>
+      <w:r>
+        <w:rPr>
+          <w:sz w:val="17"/>
+          <w:szCs w:val="17"/>
+        </w:rPr>
+        <w:t xml:space="preserve">É a principal matéria-prima da amônia e da ureia. Energia mais cara encarece diretamente a produção dos nitrogenados.</w:t>
       </w:r>
     </w:p>
     <w:p>
@@ -2081,22 +2133,241 @@
         <w:rPr>
           <w:b/>
           <w:bCs/>
+          <w:sz w:val="17"/>
+          <w:szCs w:val="17"/>
+        </w:rPr>
+        <w:t xml:space="preserve">Restrições de exportação (China e Rússia): </w:t>
+      </w:r>
+      <w:r>
+        <w:rPr>
+          <w:sz w:val="17"/>
+          <w:szCs w:val="17"/>
+        </w:rPr>
+        <w:t xml:space="preserve">A China segurou vendas de fosfatados e de ureia para priorizar o abastecimento interno; a Rússia também limitou embarques. Como o Brasil importa cerca de 85% dos fertilizantes, essas restrições pressionam preço e oferta.</w:t>
+      </w:r>
+    </w:p>
+    <w:p>
+      <w:pPr>
+        <w:pStyle w:val="ListParagraph"/>
+        <w:numPr>
+          <w:ilvl w:val="0"/>
+          <w:numId w:val="2"/>
+        </w:numPr>
+        <w:spacing w:after="70"/>
+      </w:pPr>
+      <w:r>
+        <w:rPr>
+          <w:b/>
+          <w:bCs/>
+          <w:sz w:val="17"/>
+          <w:szCs w:val="17"/>
+        </w:rPr>
+        <w:t xml:space="preserve">Frete marítimo elevado: </w:t>
+      </w:r>
+      <w:r>
+        <w:rPr>
+          <w:sz w:val="17"/>
+          <w:szCs w:val="17"/>
+        </w:rPr>
+        <w:t xml:space="preserve">O desvio de rotas por conta do Estreito de Ormuz e a alta do petróleo encareceram o transporte, somando-se ao custo do produto na chegada ao Brasil.</w:t>
+      </w:r>
+    </w:p>
+    <w:p>
+      <w:pPr>
+        <w:pStyle w:val="ListParagraph"/>
+        <w:numPr>
+          <w:ilvl w:val="0"/>
+          <w:numId w:val="2"/>
+        </w:numPr>
+        <w:spacing w:after="70"/>
+      </w:pPr>
+      <w:r>
+        <w:rPr>
+          <w:b/>
+          <w:bCs/>
+          <w:sz w:val="17"/>
+          <w:szCs w:val="17"/>
+        </w:rPr>
+        <w:t xml:space="preserve">Demanda global forte na janela de compras: </w:t>
+      </w:r>
+      <w:r>
+        <w:rPr>
+          <w:sz w:val="17"/>
+          <w:szCs w:val="17"/>
+        </w:rPr>
+        <w:t xml:space="preserve">A ampliação de compras de EUA, Índia e Brasil para a safra 2026/27 sustentou as cotações internacionais no momento em que o país mais precisa importar.</w:t>
+      </w:r>
+    </w:p>
+    <w:p>
+      <w:pPr>
+        <w:pStyle w:val="ListParagraph"/>
+        <w:numPr>
+          <w:ilvl w:val="0"/>
+          <w:numId w:val="2"/>
+        </w:numPr>
+        <w:spacing w:after="70"/>
+      </w:pPr>
+      <w:r>
+        <w:rPr>
+          <w:b/>
+          <w:bCs/>
+          <w:sz w:val="17"/>
+          <w:szCs w:val="17"/>
+        </w:rPr>
+        <w:t xml:space="preserve">Fosfatados e escassez de enxofre: </w:t>
+      </w:r>
+      <w:r>
+        <w:rPr>
+          <w:sz w:val="17"/>
+          <w:szCs w:val="17"/>
+        </w:rPr>
+        <w:t xml:space="preserve">Além da retração chinesa, a oferta restrita de fosfato e a falta de enxofre no mercado internacional mantêm o MAP pressionado.</w:t>
+      </w:r>
+    </w:p>
+    <w:p>
+      <w:pPr>
+        <w:spacing w:after="80" w:before="40"/>
+        <w:jc w:val="both"/>
+      </w:pPr>
+      <w:r>
+        <w:rPr>
+          <w:sz w:val="17"/>
+          <w:szCs w:val="17"/>
+        </w:rPr>
+        <w:t xml:space="preserve">Segundo o Banco Central, a ureia granular entregue no Brasil subiu cerca de 50% em maio ante a média de jan–fev/2026; no mesmo intervalo o MAP avançou ~29,7% e o KCl ~9,7% — evidência de que a pressão foi maior nos nitrogenados. O Itaú BBA chegou a apontar ureia a US$ 710/t no porto brasileiro, alta de ~50% em 30 dias.</w:t>
+      </w:r>
+    </w:p>
+    <w:p>
+      <w:pPr>
+        <w:spacing w:after="40" w:before="40"/>
+      </w:pPr>
+      <w:r>
+        <w:rPr>
+          <w:b/>
+          <w:bCs/>
+          <w:color w:val="1E2A44"/>
           <w:sz w:val="18"/>
           <w:szCs w:val="18"/>
         </w:rPr>
-        <w:t xml:space="preserve">KCl: </w:t>
-      </w:r>
-      <w:r>
-        <w:rPr>
-          <w:sz w:val="18"/>
-          <w:szCs w:val="18"/>
-        </w:rPr>
-        <w:t xml:space="preserve">alta de +2,3% no período.</w:t>
-      </w:r>
-    </w:p>
-    <w:p>
-      <w:pPr>
-        <w:spacing w:after="40" w:before="60"/>
+        <w:t xml:space="preserve">O que esperar nos próximos meses:</w:t>
+      </w:r>
+    </w:p>
+    <w:p>
+      <w:pPr>
+        <w:pStyle w:val="ListParagraph"/>
+        <w:numPr>
+          <w:ilvl w:val="0"/>
+          <w:numId w:val="2"/>
+        </w:numPr>
+        <w:spacing w:after="70"/>
+      </w:pPr>
+      <w:r>
+        <w:rPr>
+          <w:sz w:val="17"/>
+          <w:szCs w:val="17"/>
+        </w:rPr>
+        <w:t xml:space="preserve">O cenário ficou menos turbulento a partir de julho, com a retomada das exportações de ureia pela China e a redução das tensões geopolíticas — mas o mercado segue muito sensível a qualquer mudança externa.</w:t>
+      </w:r>
+    </w:p>
+    <w:p>
+      <w:pPr>
+        <w:pStyle w:val="ListParagraph"/>
+        <w:numPr>
+          <w:ilvl w:val="0"/>
+          <w:numId w:val="2"/>
+        </w:numPr>
+        <w:spacing w:after="70"/>
+      </w:pPr>
+      <w:r>
+        <w:rPr>
+          <w:sz w:val="17"/>
+          <w:szCs w:val="17"/>
+        </w:rPr>
+        <w:t xml:space="preserve">Para o 3º trimestre de 2026, a StoneX projeta que a normalização gradual da navegação por Ormuz e o retorno das exportações chinesas melhorem o abastecimento mundial, com fundamentos distintos por segmento.</w:t>
+      </w:r>
+    </w:p>
+    <w:p>
+      <w:pPr>
+        <w:pStyle w:val="ListParagraph"/>
+        <w:numPr>
+          <w:ilvl w:val="0"/>
+          <w:numId w:val="2"/>
+        </w:numPr>
+        <w:spacing w:after="70"/>
+      </w:pPr>
+      <w:r>
+        <w:rPr>
+          <w:sz w:val="17"/>
+          <w:szCs w:val="17"/>
+        </w:rPr>
+        <w:t xml:space="preserve">Nitrogenados: podem ter recuperação de preços com a recomposição de estoques e a volta da demanda global. Fosfatados: seguem pressionados pela oferta restrita e pelo enxofre caro. Potássio (KCl): mercado relativamente equilibrado.</w:t>
+      </w:r>
+    </w:p>
+    <w:p>
+      <w:pPr>
+        <w:pStyle w:val="ListParagraph"/>
+        <w:numPr>
+          <w:ilvl w:val="0"/>
+          <w:numId w:val="2"/>
+        </w:numPr>
+        <w:spacing w:after="70"/>
+      </w:pPr>
+      <w:r>
+        <w:rPr>
+          <w:sz w:val="17"/>
+          <w:szCs w:val="17"/>
+        </w:rPr>
+        <w:t xml:space="preserve">Estratégia sugerida por analistas: escalonar as compras, avançar mais no potássio e fazer aquisições parciais de nitrogênio e fósforo, aproveitando janelas e relações de troca favoráveis, em vez de tentar acertar o menor preço.</w:t>
+      </w:r>
+    </w:p>
+    <w:p>
+      <w:pPr>
+        <w:pStyle w:val="ListParagraph"/>
+        <w:numPr>
+          <w:ilvl w:val="0"/>
+          <w:numId w:val="2"/>
+        </w:numPr>
+        <w:spacing w:after="70"/>
+      </w:pPr>
+      <w:r>
+        <w:rPr>
+          <w:sz w:val="17"/>
+          <w:szCs w:val="17"/>
+        </w:rPr>
+        <w:t xml:space="preserve">Riscos a monitorar: evolução do conflito no Oriente Médio, novas restrições da China (há rumores inclusive sobre sulfato de amônio, 100% importado do país) e a taxa de câmbio.</w:t>
+      </w:r>
+    </w:p>
+    <w:p>
+      <w:pPr>
+        <w:spacing w:after="20" w:before="60"/>
+      </w:pPr>
+      <w:r>
+        <w:rPr>
+          <w:b/>
+          <w:bCs/>
+          <w:color w:val="6B7585"/>
+          <w:sz w:val="16"/>
+          <w:szCs w:val="16"/>
+        </w:rPr>
+        <w:t xml:space="preserve">Fontes desta análise:</w:t>
+      </w:r>
+    </w:p>
+    <w:p>
+      <w:pPr>
+        <w:spacing w:after="40"/>
+      </w:pPr>
+      <w:r>
+        <w:rPr>
+          <w:color w:val="6B7585"/>
+          <w:sz w:val="15"/>
+          <w:szCs w:val="15"/>
+        </w:rPr>
+        <w:t xml:space="preserve">Itaú BBA / CNN Brasil — ureia a US$ 710/t no porto (+50% em 30 dias) (abr/2026); Banco Central, via Agrolink — ureia +50%, MAP +29,7%, KCl +9,7% em maio (ago/2026); CEPEA-Esalq/USP — Oriente Médio concentra ~40% do comércio marítimo de ureia (2026); StoneX — perspectivas de fertilizantes para o 3º trimestre de 2026 (jul/2026); Gazeta do Povo — restrições de China e Rússia e dependência brasileira (~85%) (abr/2026).</w:t>
+      </w:r>
+    </w:p>
+    <w:p>
+      <w:pPr>
+        <w:spacing w:after="40"/>
       </w:pPr>
       <w:r>
         <w:rPr>
@@ -2106,6 +2377,21 @@
           <w:sz w:val="15"/>
           <w:szCs w:val="15"/>
         </w:rPr>
+        <w:t xml:space="preserve">Análise de contexto com caráter informativo, revisada manualmente. As datas e cenários mudam; confirme com as fontes antes de decisões de compra.</w:t>
+      </w:r>
+    </w:p>
+    <w:p>
+      <w:pPr>
+        <w:spacing w:after="40" w:before="60"/>
+      </w:pPr>
+      <w:r>
+        <w:rPr>
+          <w:i/>
+          <w:iCs/>
+          <w:color w:val="6B7585"/>
+          <w:sz w:val="15"/>
+          <w:szCs w:val="15"/>
+        </w:rPr>
         <w:t xml:space="preserve">Observação: as causas qualitativas (notícias, geopolítica, safra) devem ser revisadas manualmente — este resumo é gerado a partir das variações numéricas.</w:t>
       </w:r>
     </w:p>
@@ -2124,7 +2410,7 @@
           <w:sz w:val="22"/>
           <w:szCs w:val="22"/>
         </w:rPr>
-        <w:t xml:space="preserve">6. Fontes e Notas Metodológicas</w:t>
+        <w:t xml:space="preserve">7. Fontes e Notas Metodológicas</w:t>
       </w:r>
     </w:p>
     <w:p>
@@ -2137,7 +2423,7 @@
           <w:sz w:val="15"/>
           <w:szCs w:val="15"/>
         </w:rPr>
-        <w:t xml:space="preserve">Fontes automáticas: AwesomeAPI (câmbio), CEPEA/ESALQ (soja), ANP (diesel), stooq (BDI). Fertilizantes e gás natural: override manual (fertilizers-override.json). Status desta execução: {"sojaRegional":"ok (Oeste da Bahia/BA (AIBA))","soja":"ok (Noticias Agricolas / CEPEA-PR 07/08/2026)","bdi":"ok (HANDYBULK, 07/08/2026)","cambio":"ok (BCB PTAX)","diesel":"falha: Petrobras: HTTP 403 | PortalCanaa: HTTP 403","_comexPeriodo":"com-filtro-ncm | 2026-07 | 4 linhas","_comexNcmsEncontrados":"31042090,31021010,31054000,31042010","ureia":"ok (ComexStat 2026-07)","map":"ok (ComexStat 2026-07)","kcl":"ok (ComexStat 2026-07)","gas":"ok (EIA Henry Hub)"}.</w:t>
+        <w:t xml:space="preserve">Fontes automáticas: AwesomeAPI (câmbio), CEPEA/ESALQ (soja), ANP (diesel), stooq (BDI). Fertilizantes e gás natural: override manual (fertilizers-override.json). Status desta execução: {"soja":"ok (Noticias Agricolas / CEPEA-PR 10/08/2026)","sojaRegional":"ok (Oeste da Bahia/BA (AIBA))","bdi":"ok (HANDYBULK, 10/08/2026)","diesel":"falha: Petrobras: HTTP 403 | PortalCanaa: HTTP 403","cambio":"ok (BCB PTAX)","_comexPeriodo":"com-filtro-ncm | 2026-07 | 4 linhas","_comexNcmsEncontrados":"31042090,31021010,31054000,31042010","ureia":"ok (ComexStat 2026-07)","map":"ok (ComexStat 2026-07)","kcl":"ok (ComexStat 2026-07)","gas":"ok (EIA Henry Hub)"}.</w:t>
       </w:r>
     </w:p>
     <w:p>

</xml_diff>

<commit_message>
chore: atualizacao automatica 2026-08-17
</commit_message>
<xml_diff>
--- a/relatorio_executivo.docx
+++ b/relatorio_executivo.docx
@@ -46,7 +46,7 @@
           <w:sz w:val="17"/>
           <w:szCs w:val="17"/>
         </w:rPr>
-        <w:t xml:space="preserve">Equipe de Planejamento, Controle e Pesquisa Florestal  ·  Referência: Ago/2026  ·  Gerado em 11/08/2026, 17:02:16</w:t>
+        <w:t xml:space="preserve">Equipe de Planejamento, Controle e Pesquisa Florestal  ·  Referência: Ago/2026  ·  Gerado em 17/08/2026, 10:26:40</w:t>
       </w:r>
     </w:p>
     <w:p>
@@ -84,21 +84,21 @@
           <w:sz w:val="19"/>
           <w:szCs w:val="19"/>
         </w:rPr>
-        <w:t xml:space="preserve">Ureia FOB em US$ 418/t (-14,8%), MAP US$ 828/t e KCl US$ 359/t. </w:t>
+        <w:t xml:space="preserve">Ureia FOB em US$ 418/t (fechamento jul/26), MAP US$ 828/t e KCl US$ 359/t. </w:t>
       </w:r>
       <w:r>
         <w:rPr>
           <w:sz w:val="19"/>
           <w:szCs w:val="19"/>
         </w:rPr>
-        <w:t xml:space="preserve">O dólar está em R$ 5,13 (-1,2%) e a soja CEPEA em R$ 137,44/saca. </w:t>
+        <w:t xml:space="preserve">O dólar está em R$ 5,22 (+1,8%) e a soja CEPEA em R$ 141,16/saca. </w:t>
       </w:r>
       <w:r>
         <w:rPr>
           <w:sz w:val="19"/>
           <w:szCs w:val="19"/>
         </w:rPr>
-        <w:t xml:space="preserve">A relação de troca soja/MAP é de 31,8 sacas/t.</w:t>
+        <w:t xml:space="preserve">A relação de troca soja/MAP é de 31,5 sacas/t.</w:t>
       </w:r>
     </w:p>
     <w:p>
@@ -352,11 +352,11 @@
               <w:rPr>
                 <w:b/>
                 <w:bCs/>
-                <w:color w:val="2F8A5F"/>
-                <w:sz w:val="18"/>
-                <w:szCs w:val="18"/>
-              </w:rPr>
-              <w:t xml:space="preserve">-14,8%</w:t>
+                <w:color w:val="6B7585"/>
+                <w:sz w:val="18"/>
+                <w:szCs w:val="18"/>
+              </w:rPr>
+              <w:t xml:space="preserve">—</w:t>
             </w:r>
           </w:p>
         </w:tc>
@@ -386,7 +386,7 @@
                 <w:sz w:val="17"/>
                 <w:szCs w:val="17"/>
               </w:rPr>
-              <w:t xml:space="preserve">Nitrogenado · ref. jul/26</w:t>
+              <w:t xml:space="preserve">Fechamento jul/26 (sem novo dado)</w:t>
             </w:r>
           </w:p>
         </w:tc>
@@ -477,11 +477,11 @@
               <w:rPr>
                 <w:b/>
                 <w:bCs/>
-                <w:color w:val="B23636"/>
-                <w:sz w:val="18"/>
-                <w:szCs w:val="18"/>
-              </w:rPr>
-              <w:t xml:space="preserve">+29,4%</w:t>
+                <w:color w:val="6B7585"/>
+                <w:sz w:val="18"/>
+                <w:szCs w:val="18"/>
+              </w:rPr>
+              <w:t xml:space="preserve">—</w:t>
             </w:r>
           </w:p>
         </w:tc>
@@ -511,7 +511,7 @@
                 <w:sz w:val="17"/>
                 <w:szCs w:val="17"/>
               </w:rPr>
-              <w:t xml:space="preserve">Fosfatado · ref. jul/26</w:t>
+              <w:t xml:space="preserve">Fechamento jul/26 (sem novo dado)</w:t>
             </w:r>
           </w:p>
         </w:tc>
@@ -602,11 +602,11 @@
               <w:rPr>
                 <w:b/>
                 <w:bCs/>
-                <w:color w:val="B23636"/>
-                <w:sz w:val="18"/>
-                <w:szCs w:val="18"/>
-              </w:rPr>
-              <w:t xml:space="preserve">+9,4%</w:t>
+                <w:color w:val="6B7585"/>
+                <w:sz w:val="18"/>
+                <w:szCs w:val="18"/>
+              </w:rPr>
+              <w:t xml:space="preserve">—</w:t>
             </w:r>
           </w:p>
         </w:tc>
@@ -636,7 +636,7 @@
                 <w:sz w:val="17"/>
                 <w:szCs w:val="17"/>
               </w:rPr>
-              <w:t xml:space="preserve">Potássico · ref. jul/26</w:t>
+              <w:t xml:space="preserve">Fechamento jul/26 (sem novo dado)</w:t>
             </w:r>
           </w:p>
         </w:tc>
@@ -864,7 +864,7 @@
                 <w:sz w:val="18"/>
                 <w:szCs w:val="18"/>
               </w:rPr>
-              <w:t xml:space="preserve">R$ 137,44/sc</w:t>
+              <w:t xml:space="preserve">R$ 141,16/sc</w:t>
             </w:r>
           </w:p>
         </w:tc>
@@ -897,7 +897,7 @@
                 <w:sz w:val="18"/>
                 <w:szCs w:val="18"/>
               </w:rPr>
-              <w:t xml:space="preserve">+1,3%</w:t>
+              <w:t xml:space="preserve">+2,7%</w:t>
             </w:r>
           </w:p>
         </w:tc>
@@ -989,7 +989,7 @@
                 <w:sz w:val="18"/>
                 <w:szCs w:val="18"/>
               </w:rPr>
-              <w:t xml:space="preserve">R$ 128,75/sc</w:t>
+              <w:t xml:space="preserve">R$ 133,38/sc</w:t>
             </w:r>
           </w:p>
         </w:tc>
@@ -1018,11 +1018,11 @@
               <w:rPr>
                 <w:b/>
                 <w:bCs/>
-                <w:color w:val="B23636"/>
-                <w:sz w:val="18"/>
-                <w:szCs w:val="18"/>
-              </w:rPr>
-              <w:t xml:space="preserve">-0,9%</w:t>
+                <w:color w:val="2F8A5F"/>
+                <w:sz w:val="18"/>
+                <w:szCs w:val="18"/>
+              </w:rPr>
+              <w:t xml:space="preserve">+3,6%</w:t>
             </w:r>
           </w:p>
         </w:tc>
@@ -1114,7 +1114,7 @@
                 <w:sz w:val="18"/>
                 <w:szCs w:val="18"/>
               </w:rPr>
-              <w:t xml:space="preserve">31,8 sc/t</w:t>
+              <w:t xml:space="preserve">31,5 sc/t</w:t>
             </w:r>
           </w:p>
         </w:tc>
@@ -1143,11 +1143,11 @@
               <w:rPr>
                 <w:b/>
                 <w:bCs/>
-                <w:color w:val="B23636"/>
-                <w:sz w:val="18"/>
-                <w:szCs w:val="18"/>
-              </w:rPr>
-              <w:t xml:space="preserve">+19,1%</w:t>
+                <w:color w:val="2F8A5F"/>
+                <w:sz w:val="18"/>
+                <w:szCs w:val="18"/>
+              </w:rPr>
+              <w:t xml:space="preserve">-0,9%</w:t>
             </w:r>
           </w:p>
         </w:tc>
@@ -1177,7 +1177,7 @@
                 <w:sz w:val="17"/>
                 <w:szCs w:val="17"/>
               </w:rPr>
-              <w:t xml:space="preserve">Piora</w:t>
+              <w:t xml:space="preserve">Melhora</w:t>
             </w:r>
           </w:p>
         </w:tc>
@@ -1239,7 +1239,7 @@
                 <w:sz w:val="18"/>
                 <w:szCs w:val="18"/>
               </w:rPr>
-              <w:t xml:space="preserve">16,3 sc/t</w:t>
+              <w:t xml:space="preserve">16,2 sc/t</w:t>
             </w:r>
           </w:p>
         </w:tc>
@@ -1528,7 +1528,132 @@
                 <w:sz w:val="18"/>
                 <w:szCs w:val="18"/>
               </w:rPr>
-              <w:t xml:space="preserve">5,13</w:t>
+              <w:t xml:space="preserve">5,22</w:t>
+            </w:r>
+          </w:p>
+        </w:tc>
+        <w:tc>
+          <w:tcPr>
+            <w:tcW w:type="dxa" w:w="1980"/>
+            <w:tcBorders>
+              <w:top w:val="single" w:color="DDDDDD" w:sz="1"/>
+              <w:left w:val="single" w:color="DDDDDD" w:sz="1"/>
+              <w:bottom w:val="single" w:color="DDDDDD" w:sz="1"/>
+              <w:right w:val="single" w:color="DDDDDD" w:sz="1"/>
+            </w:tcBorders>
+            <w:tcMar>
+              <w:top w:type="dxa" w:w="55"/>
+              <w:left w:type="dxa" w:w="110"/>
+              <w:bottom w:type="dxa" w:w="55"/>
+              <w:right w:type="dxa" w:w="110"/>
+            </w:tcMar>
+            <w:vAlign w:val="center"/>
+          </w:tcPr>
+          <w:p>
+            <w:pPr>
+              <w:jc w:val="right"/>
+            </w:pPr>
+            <w:r>
+              <w:rPr>
+                <w:b/>
+                <w:bCs/>
+                <w:color w:val="B23636"/>
+                <w:sz w:val="18"/>
+                <w:szCs w:val="18"/>
+              </w:rPr>
+              <w:t xml:space="preserve">+1,8%</w:t>
+            </w:r>
+          </w:p>
+        </w:tc>
+        <w:tc>
+          <w:tcPr>
+            <w:tcW w:type="dxa" w:w="2000"/>
+            <w:tcBorders>
+              <w:top w:val="single" w:color="DDDDDD" w:sz="1"/>
+              <w:left w:val="single" w:color="DDDDDD" w:sz="1"/>
+              <w:bottom w:val="single" w:color="DDDDDD" w:sz="1"/>
+              <w:right w:val="single" w:color="DDDDDD" w:sz="1"/>
+            </w:tcBorders>
+            <w:tcMar>
+              <w:top w:type="dxa" w:w="55"/>
+              <w:left w:type="dxa" w:w="110"/>
+              <w:bottom w:type="dxa" w:w="55"/>
+              <w:right w:type="dxa" w:w="110"/>
+            </w:tcMar>
+            <w:vAlign w:val="center"/>
+          </w:tcPr>
+          <w:p>
+            <w:pPr>
+              <w:jc w:val="left"/>
+            </w:pPr>
+            <w:r>
+              <w:rPr>
+                <w:sz w:val="17"/>
+                <w:szCs w:val="17"/>
+              </w:rPr>
+              <w:t xml:space="preserve">Custo de importação</w:t>
+            </w:r>
+          </w:p>
+        </w:tc>
+      </w:tr>
+      <w:tr>
+        <w:tc>
+          <w:tcPr>
+            <w:tcW w:type="dxa" w:w="3400"/>
+            <w:tcBorders>
+              <w:top w:val="single" w:color="DDDDDD" w:sz="1"/>
+              <w:left w:val="single" w:color="DDDDDD" w:sz="1"/>
+              <w:bottom w:val="single" w:color="DDDDDD" w:sz="1"/>
+              <w:right w:val="single" w:color="DDDDDD" w:sz="1"/>
+            </w:tcBorders>
+            <w:tcMar>
+              <w:top w:type="dxa" w:w="55"/>
+              <w:left w:type="dxa" w:w="110"/>
+              <w:bottom w:type="dxa" w:w="55"/>
+              <w:right w:type="dxa" w:w="110"/>
+            </w:tcMar>
+            <w:vAlign w:val="center"/>
+          </w:tcPr>
+          <w:p>
+            <w:pPr>
+              <w:jc w:val="left"/>
+            </w:pPr>
+            <w:r>
+              <w:rPr>
+                <w:sz w:val="18"/>
+                <w:szCs w:val="18"/>
+              </w:rPr>
+              <w:t xml:space="preserve">Gás Natural (Henry Hub)</w:t>
+            </w:r>
+          </w:p>
+        </w:tc>
+        <w:tc>
+          <w:tcPr>
+            <w:tcW w:type="dxa" w:w="1980"/>
+            <w:tcBorders>
+              <w:top w:val="single" w:color="DDDDDD" w:sz="1"/>
+              <w:left w:val="single" w:color="DDDDDD" w:sz="1"/>
+              <w:bottom w:val="single" w:color="DDDDDD" w:sz="1"/>
+              <w:right w:val="single" w:color="DDDDDD" w:sz="1"/>
+            </w:tcBorders>
+            <w:tcMar>
+              <w:top w:type="dxa" w:w="55"/>
+              <w:left w:type="dxa" w:w="110"/>
+              <w:bottom w:type="dxa" w:w="55"/>
+              <w:right w:type="dxa" w:w="110"/>
+            </w:tcMar>
+            <w:vAlign w:val="center"/>
+          </w:tcPr>
+          <w:p>
+            <w:pPr>
+              <w:jc w:val="right"/>
+            </w:pPr>
+            <w:r>
+              <w:rPr>
+                <w:sz w:val="18"/>
+                <w:szCs w:val="18"/>
+              </w:rPr>
+              <w:t xml:space="preserve">US$ 2,79</w:t>
             </w:r>
           </w:p>
         </w:tc>
@@ -1561,7 +1686,7 @@
                 <w:sz w:val="18"/>
                 <w:szCs w:val="18"/>
               </w:rPr>
-              <w:t xml:space="preserve">-1,2%</w:t>
+              <w:t xml:space="preserve">-0,7%</w:t>
             </w:r>
           </w:p>
         </w:tc>
@@ -1591,7 +1716,7 @@
                 <w:sz w:val="17"/>
                 <w:szCs w:val="17"/>
               </w:rPr>
-              <w:t xml:space="preserve">Custo de importação</w:t>
+              <w:t xml:space="preserve">Pressiona ureia</w:t>
             </w:r>
           </w:p>
         </w:tc>
@@ -1623,7 +1748,7 @@
                 <w:sz w:val="18"/>
                 <w:szCs w:val="18"/>
               </w:rPr>
-              <w:t xml:space="preserve">Gás Natural (Henry Hub)</w:t>
+              <w:t xml:space="preserve">Frete Marítimo (BDI)</w:t>
             </w:r>
           </w:p>
         </w:tc>
@@ -1653,7 +1778,7 @@
                 <w:sz w:val="18"/>
                 <w:szCs w:val="18"/>
               </w:rPr>
-              <w:t xml:space="preserve">US$ 2,81</w:t>
+              <w:t xml:space="preserve">2.863 pts</w:t>
             </w:r>
           </w:p>
         </w:tc>
@@ -1686,132 +1811,7 @@
                 <w:sz w:val="18"/>
                 <w:szCs w:val="18"/>
               </w:rPr>
-              <w:t xml:space="preserve">-9,4%</w:t>
-            </w:r>
-          </w:p>
-        </w:tc>
-        <w:tc>
-          <w:tcPr>
-            <w:tcW w:type="dxa" w:w="2000"/>
-            <w:tcBorders>
-              <w:top w:val="single" w:color="DDDDDD" w:sz="1"/>
-              <w:left w:val="single" w:color="DDDDDD" w:sz="1"/>
-              <w:bottom w:val="single" w:color="DDDDDD" w:sz="1"/>
-              <w:right w:val="single" w:color="DDDDDD" w:sz="1"/>
-            </w:tcBorders>
-            <w:tcMar>
-              <w:top w:type="dxa" w:w="55"/>
-              <w:left w:type="dxa" w:w="110"/>
-              <w:bottom w:type="dxa" w:w="55"/>
-              <w:right w:type="dxa" w:w="110"/>
-            </w:tcMar>
-            <w:vAlign w:val="center"/>
-          </w:tcPr>
-          <w:p>
-            <w:pPr>
-              <w:jc w:val="left"/>
-            </w:pPr>
-            <w:r>
-              <w:rPr>
-                <w:sz w:val="17"/>
-                <w:szCs w:val="17"/>
-              </w:rPr>
-              <w:t xml:space="preserve">Pressiona ureia</w:t>
-            </w:r>
-          </w:p>
-        </w:tc>
-      </w:tr>
-      <w:tr>
-        <w:tc>
-          <w:tcPr>
-            <w:tcW w:type="dxa" w:w="3400"/>
-            <w:tcBorders>
-              <w:top w:val="single" w:color="DDDDDD" w:sz="1"/>
-              <w:left w:val="single" w:color="DDDDDD" w:sz="1"/>
-              <w:bottom w:val="single" w:color="DDDDDD" w:sz="1"/>
-              <w:right w:val="single" w:color="DDDDDD" w:sz="1"/>
-            </w:tcBorders>
-            <w:tcMar>
-              <w:top w:type="dxa" w:w="55"/>
-              <w:left w:type="dxa" w:w="110"/>
-              <w:bottom w:type="dxa" w:w="55"/>
-              <w:right w:type="dxa" w:w="110"/>
-            </w:tcMar>
-            <w:vAlign w:val="center"/>
-          </w:tcPr>
-          <w:p>
-            <w:pPr>
-              <w:jc w:val="left"/>
-            </w:pPr>
-            <w:r>
-              <w:rPr>
-                <w:sz w:val="18"/>
-                <w:szCs w:val="18"/>
-              </w:rPr>
-              <w:t xml:space="preserve">Frete Marítimo (BDI)</w:t>
-            </w:r>
-          </w:p>
-        </w:tc>
-        <w:tc>
-          <w:tcPr>
-            <w:tcW w:type="dxa" w:w="1980"/>
-            <w:tcBorders>
-              <w:top w:val="single" w:color="DDDDDD" w:sz="1"/>
-              <w:left w:val="single" w:color="DDDDDD" w:sz="1"/>
-              <w:bottom w:val="single" w:color="DDDDDD" w:sz="1"/>
-              <w:right w:val="single" w:color="DDDDDD" w:sz="1"/>
-            </w:tcBorders>
-            <w:tcMar>
-              <w:top w:type="dxa" w:w="55"/>
-              <w:left w:type="dxa" w:w="110"/>
-              <w:bottom w:type="dxa" w:w="55"/>
-              <w:right w:type="dxa" w:w="110"/>
-            </w:tcMar>
-            <w:vAlign w:val="center"/>
-          </w:tcPr>
-          <w:p>
-            <w:pPr>
-              <w:jc w:val="right"/>
-            </w:pPr>
-            <w:r>
-              <w:rPr>
-                <w:sz w:val="18"/>
-                <w:szCs w:val="18"/>
-              </w:rPr>
-              <w:t xml:space="preserve">3.083 pts</w:t>
-            </w:r>
-          </w:p>
-        </w:tc>
-        <w:tc>
-          <w:tcPr>
-            <w:tcW w:type="dxa" w:w="1980"/>
-            <w:tcBorders>
-              <w:top w:val="single" w:color="DDDDDD" w:sz="1"/>
-              <w:left w:val="single" w:color="DDDDDD" w:sz="1"/>
-              <w:bottom w:val="single" w:color="DDDDDD" w:sz="1"/>
-              <w:right w:val="single" w:color="DDDDDD" w:sz="1"/>
-            </w:tcBorders>
-            <w:tcMar>
-              <w:top w:type="dxa" w:w="55"/>
-              <w:left w:type="dxa" w:w="110"/>
-              <w:bottom w:type="dxa" w:w="55"/>
-              <w:right w:type="dxa" w:w="110"/>
-            </w:tcMar>
-            <w:vAlign w:val="center"/>
-          </w:tcPr>
-          <w:p>
-            <w:pPr>
-              <w:jc w:val="right"/>
-            </w:pPr>
-            <w:r>
-              <w:rPr>
-                <w:b/>
-                <w:bCs/>
-                <w:color w:val="B23636"/>
-                <w:sz w:val="18"/>
-                <w:szCs w:val="18"/>
-              </w:rPr>
-              <w:t xml:space="preserve">+15,5%</w:t>
+              <w:t xml:space="preserve">-7,1%</w:t>
             </w:r>
           </w:p>
         </w:tc>
@@ -2006,14 +2006,14 @@
           <w:sz w:val="18"/>
           <w:szCs w:val="18"/>
         </w:rPr>
-        <w:t xml:space="preserve">MAP: </w:t>
+        <w:t xml:space="preserve">BDI: </w:t>
       </w:r>
       <w:r>
         <w:rPr>
           <w:sz w:val="18"/>
           <w:szCs w:val="18"/>
         </w:rPr>
-        <w:t xml:space="preserve">alta de +29,4% no período.</w:t>
+        <w:t xml:space="preserve">queda de -7,1% no período.</w:t>
       </w:r>
     </w:p>
     <w:p>
@@ -2032,14 +2032,14 @@
           <w:sz w:val="18"/>
           <w:szCs w:val="18"/>
         </w:rPr>
-        <w:t xml:space="preserve">BDI: </w:t>
+        <w:t xml:space="preserve">Dólar: </w:t>
       </w:r>
       <w:r>
         <w:rPr>
           <w:sz w:val="18"/>
           <w:szCs w:val="18"/>
         </w:rPr>
-        <w:t xml:space="preserve">alta de +15,5% no período.</w:t>
+        <w:t xml:space="preserve">alta de +1,8% no período.</w:t>
       </w:r>
     </w:p>
     <w:p>
@@ -2058,14 +2058,90 @@
           <w:sz w:val="18"/>
           <w:szCs w:val="18"/>
         </w:rPr>
-        <w:t xml:space="preserve">Ureia: </w:t>
+        <w:t xml:space="preserve">Gás Natural: </w:t>
       </w:r>
       <w:r>
         <w:rPr>
           <w:sz w:val="18"/>
           <w:szCs w:val="18"/>
         </w:rPr>
-        <w:t xml:space="preserve">queda de -14,8% no período.</w:t>
+        <w:t xml:space="preserve">queda de -0,7% no período.</w:t>
+      </w:r>
+    </w:p>
+    <w:p>
+      <w:pPr>
+        <w:pBdr>
+          <w:bottom w:val="single" w:color="1E2A44" w:sz="6" w:space="2"/>
+        </w:pBdr>
+        <w:spacing w:after="100" w:before="220"/>
+      </w:pPr>
+      <w:r>
+        <w:rPr>
+          <w:b/>
+          <w:bCs/>
+          <w:color w:val="1E2A44"/>
+          <w:sz w:val="22"/>
+          <w:szCs w:val="22"/>
+        </w:rPr>
+        <w:t xml:space="preserve">6. Contexto de Mercado — Causas da Alta e Perspectivas</w:t>
+      </w:r>
+    </w:p>
+    <w:p>
+      <w:pPr>
+        <w:spacing w:after="60"/>
+      </w:pPr>
+      <w:r>
+        <w:rPr>
+          <w:b/>
+          <w:bCs/>
+          <w:color w:val="1E2A44"/>
+          <w:sz w:val="18"/>
+          <w:szCs w:val="18"/>
+        </w:rPr>
+        <w:t xml:space="preserve">Por que os fertilizantes subiram — e o que esperar · atualizado em Agosto/2026 · revisão manual.</w:t>
+      </w:r>
+    </w:p>
+    <w:p>
+      <w:pPr>
+        <w:spacing w:after="60"/>
+        <w:jc w:val="both"/>
+      </w:pPr>
+      <w:r>
+        <w:rPr>
+          <w:sz w:val="18"/>
+          <w:szCs w:val="18"/>
+        </w:rPr>
+        <w:t xml:space="preserve">A alta de 2026, concentrada nos nitrogenados (ureia), foi puxada pela combinação de conflito no Oriente Médio, gás natural mais caro e restrições de exportação de China e Rússia, sobre uma base de forte dependência brasileira de importação (~85%).</w:t>
+      </w:r>
+    </w:p>
+    <w:p>
+      <w:pPr>
+        <w:spacing w:after="80"/>
+      </w:pPr>
+      <w:r>
+        <w:rPr>
+          <w:i/>
+          <w:iCs/>
+          <w:color w:val="6B7585"/>
+          <w:sz w:val="17"/>
+          <w:szCs w:val="17"/>
+        </w:rPr>
+        <w:t xml:space="preserve">Leitura automática: sem novo fechamento de fertilizantes desde a leitura anterior (jul/26).</w:t>
+      </w:r>
+    </w:p>
+    <w:p>
+      <w:pPr>
+        <w:spacing w:after="40"/>
+      </w:pPr>
+      <w:r>
+        <w:rPr>
+          <w:b/>
+          <w:bCs/>
+          <w:color w:val="1E2A44"/>
+          <w:sz w:val="18"/>
+          <w:szCs w:val="18"/>
+        </w:rPr>
+        <w:t xml:space="preserve">Principais causas da alta:</w:t>
       </w:r>
     </w:p>
     <w:p>
@@ -2081,93 +2157,17 @@
         <w:rPr>
           <w:b/>
           <w:bCs/>
-          <w:sz w:val="18"/>
-          <w:szCs w:val="18"/>
-        </w:rPr>
-        <w:t xml:space="preserve">KCl: </w:t>
-      </w:r>
-      <w:r>
-        <w:rPr>
-          <w:sz w:val="18"/>
-          <w:szCs w:val="18"/>
-        </w:rPr>
-        <w:t xml:space="preserve">alta de +9,4% no período.</w:t>
-      </w:r>
-    </w:p>
-    <w:p>
-      <w:pPr>
-        <w:pBdr>
-          <w:bottom w:val="single" w:color="1E2A44" w:sz="6" w:space="2"/>
-        </w:pBdr>
-        <w:spacing w:after="100" w:before="220"/>
-      </w:pPr>
-      <w:r>
-        <w:rPr>
-          <w:b/>
-          <w:bCs/>
-          <w:color w:val="1E2A44"/>
-          <w:sz w:val="22"/>
-          <w:szCs w:val="22"/>
-        </w:rPr>
-        <w:t xml:space="preserve">6. Contexto de Mercado — Causas da Alta e Perspectivas</w:t>
-      </w:r>
-    </w:p>
-    <w:p>
-      <w:pPr>
-        <w:spacing w:after="60"/>
-      </w:pPr>
-      <w:r>
-        <w:rPr>
-          <w:b/>
-          <w:bCs/>
-          <w:color w:val="1E2A44"/>
-          <w:sz w:val="18"/>
-          <w:szCs w:val="18"/>
-        </w:rPr>
-        <w:t xml:space="preserve">Por que os fertilizantes subiram — e o que esperar · atualizado em Agosto/2026 · revisão manual.</w:t>
-      </w:r>
-    </w:p>
-    <w:p>
-      <w:pPr>
-        <w:spacing w:after="60"/>
-        <w:jc w:val="both"/>
-      </w:pPr>
-      <w:r>
-        <w:rPr>
-          <w:sz w:val="18"/>
-          <w:szCs w:val="18"/>
-        </w:rPr>
-        <w:t xml:space="preserve">A alta de 2026, concentrada nos nitrogenados (ureia), foi puxada pela combinação de conflito no Oriente Médio, gás natural mais caro e restrições de exportação de China e Rússia, sobre uma base de forte dependência brasileira de importação (~85%).</w:t>
-      </w:r>
-    </w:p>
-    <w:p>
-      <w:pPr>
-        <w:spacing w:after="80"/>
-      </w:pPr>
-      <w:r>
-        <w:rPr>
-          <w:i/>
-          <w:iCs/>
-          <w:color w:val="6B7585"/>
           <w:sz w:val="17"/>
           <w:szCs w:val="17"/>
         </w:rPr>
-        <w:t xml:space="preserve">Leitura automática — último fechamento (jul/26): Ureia -14,8%, MAP +29,4%, KCl +9,4% ante o mês anterior.</w:t>
-      </w:r>
-    </w:p>
-    <w:p>
-      <w:pPr>
-        <w:spacing w:after="40"/>
-      </w:pPr>
-      <w:r>
-        <w:rPr>
-          <w:b/>
-          <w:bCs/>
-          <w:color w:val="1E2A44"/>
-          <w:sz w:val="18"/>
-          <w:szCs w:val="18"/>
-        </w:rPr>
-        <w:t xml:space="preserve">Principais causas da alta:</w:t>
+        <w:t xml:space="preserve">Conflito no Oriente Médio (Irã): </w:t>
+      </w:r>
+      <w:r>
+        <w:rPr>
+          <w:sz w:val="17"/>
+          <w:szCs w:val="17"/>
+        </w:rPr>
+        <w:t xml:space="preserve">A região concentra cerca de 40% do comércio marítimo global de ureia e é fornecedora relevante de nitrogenados ao Brasil. Tensões envolvendo o Irã e a interrupção de rotas no Estreito de Ormuz elevaram o risco de desabastecimento e os custos.</w:t>
       </w:r>
     </w:p>
     <w:p>
@@ -2186,14 +2186,14 @@
           <w:sz w:val="17"/>
           <w:szCs w:val="17"/>
         </w:rPr>
-        <w:t xml:space="preserve">Conflito no Oriente Médio (Irã): </w:t>
+        <w:t xml:space="preserve">Gás natural mais caro: </w:t>
       </w:r>
       <w:r>
         <w:rPr>
           <w:sz w:val="17"/>
           <w:szCs w:val="17"/>
         </w:rPr>
-        <w:t xml:space="preserve">A região concentra cerca de 40% do comércio marítimo global de ureia e é fornecedora relevante de nitrogenados ao Brasil. Tensões envolvendo o Irã e a interrupção de rotas no Estreito de Ormuz elevaram o risco de desabastecimento e os custos.</w:t>
+        <w:t xml:space="preserve">É a principal matéria-prima da amônia e da ureia. Energia mais cara encarece diretamente a produção dos nitrogenados.</w:t>
       </w:r>
     </w:p>
     <w:p>
@@ -2212,14 +2212,14 @@
           <w:sz w:val="17"/>
           <w:szCs w:val="17"/>
         </w:rPr>
-        <w:t xml:space="preserve">Gás natural mais caro: </w:t>
+        <w:t xml:space="preserve">Restrições de exportação (China e Rússia): </w:t>
       </w:r>
       <w:r>
         <w:rPr>
           <w:sz w:val="17"/>
           <w:szCs w:val="17"/>
         </w:rPr>
-        <w:t xml:space="preserve">É a principal matéria-prima da amônia e da ureia. Energia mais cara encarece diretamente a produção dos nitrogenados.</w:t>
+        <w:t xml:space="preserve">A China segurou vendas de fosfatados e de ureia para priorizar o abastecimento interno; a Rússia também limitou embarques. Como o Brasil importa cerca de 85% dos fertilizantes, essas restrições pressionam preço e oferta.</w:t>
       </w:r>
     </w:p>
     <w:p>
@@ -2238,14 +2238,14 @@
           <w:sz w:val="17"/>
           <w:szCs w:val="17"/>
         </w:rPr>
-        <w:t xml:space="preserve">Restrições de exportação (China e Rússia): </w:t>
+        <w:t xml:space="preserve">Frete marítimo elevado: </w:t>
       </w:r>
       <w:r>
         <w:rPr>
           <w:sz w:val="17"/>
           <w:szCs w:val="17"/>
         </w:rPr>
-        <w:t xml:space="preserve">A China segurou vendas de fosfatados e de ureia para priorizar o abastecimento interno; a Rússia também limitou embarques. Como o Brasil importa cerca de 85% dos fertilizantes, essas restrições pressionam preço e oferta.</w:t>
+        <w:t xml:space="preserve">O desvio de rotas por conta do Estreito de Ormuz e a alta do petróleo encareceram o transporte, somando-se ao custo do produto na chegada ao Brasil.</w:t>
       </w:r>
     </w:p>
     <w:p>
@@ -2264,14 +2264,14 @@
           <w:sz w:val="17"/>
           <w:szCs w:val="17"/>
         </w:rPr>
-        <w:t xml:space="preserve">Frete marítimo elevado: </w:t>
+        <w:t xml:space="preserve">Demanda global forte na janela de compras: </w:t>
       </w:r>
       <w:r>
         <w:rPr>
           <w:sz w:val="17"/>
           <w:szCs w:val="17"/>
         </w:rPr>
-        <w:t xml:space="preserve">O desvio de rotas por conta do Estreito de Ormuz e a alta do petróleo encareceram o transporte, somando-se ao custo do produto na chegada ao Brasil.</w:t>
+        <w:t xml:space="preserve">A ampliação de compras de EUA, Índia e Brasil para a safra 2026/27 sustentou as cotações internacionais no momento em que o país mais precisa importar.</w:t>
       </w:r>
     </w:p>
     <w:p>
@@ -2290,14 +2290,42 @@
           <w:sz w:val="17"/>
           <w:szCs w:val="17"/>
         </w:rPr>
-        <w:t xml:space="preserve">Demanda global forte na janela de compras: </w:t>
+        <w:t xml:space="preserve">Fosfatados e escassez de enxofre: </w:t>
       </w:r>
       <w:r>
         <w:rPr>
           <w:sz w:val="17"/>
           <w:szCs w:val="17"/>
         </w:rPr>
-        <w:t xml:space="preserve">A ampliação de compras de EUA, Índia e Brasil para a safra 2026/27 sustentou as cotações internacionais no momento em que o país mais precisa importar.</w:t>
+        <w:t xml:space="preserve">Além da retração chinesa, a oferta restrita de fosfato e a falta de enxofre no mercado internacional mantêm o MAP pressionado.</w:t>
+      </w:r>
+    </w:p>
+    <w:p>
+      <w:pPr>
+        <w:spacing w:after="80" w:before="40"/>
+        <w:jc w:val="both"/>
+      </w:pPr>
+      <w:r>
+        <w:rPr>
+          <w:sz w:val="17"/>
+          <w:szCs w:val="17"/>
+        </w:rPr>
+        <w:t xml:space="preserve">Segundo o Banco Central, a ureia granular entregue no Brasil subiu cerca de 50% em maio ante a média de jan–fev/2026; no mesmo intervalo o MAP avançou ~29,7% e o KCl ~9,7% — evidência de que a pressão foi maior nos nitrogenados. O Itaú BBA chegou a apontar ureia a US$ 710/t no porto brasileiro, alta de ~50% em 30 dias.</w:t>
+      </w:r>
+    </w:p>
+    <w:p>
+      <w:pPr>
+        <w:spacing w:after="40" w:before="40"/>
+      </w:pPr>
+      <w:r>
+        <w:rPr>
+          <w:b/>
+          <w:bCs/>
+          <w:color w:val="1E2A44"/>
+          <w:sz w:val="18"/>
+          <w:szCs w:val="18"/>
+        </w:rPr>
+        <w:t xml:space="preserve">O que esperar nos próximos meses:</w:t>
       </w:r>
     </w:p>
     <w:p>
@@ -2311,47 +2339,10 @@
       </w:pPr>
       <w:r>
         <w:rPr>
-          <w:b/>
-          <w:bCs/>
           <w:sz w:val="17"/>
           <w:szCs w:val="17"/>
         </w:rPr>
-        <w:t xml:space="preserve">Fosfatados e escassez de enxofre: </w:t>
-      </w:r>
-      <w:r>
-        <w:rPr>
-          <w:sz w:val="17"/>
-          <w:szCs w:val="17"/>
-        </w:rPr>
-        <w:t xml:space="preserve">Além da retração chinesa, a oferta restrita de fosfato e a falta de enxofre no mercado internacional mantêm o MAP pressionado.</w:t>
-      </w:r>
-    </w:p>
-    <w:p>
-      <w:pPr>
-        <w:spacing w:after="80" w:before="40"/>
-        <w:jc w:val="both"/>
-      </w:pPr>
-      <w:r>
-        <w:rPr>
-          <w:sz w:val="17"/>
-          <w:szCs w:val="17"/>
-        </w:rPr>
-        <w:t xml:space="preserve">Segundo o Banco Central, a ureia granular entregue no Brasil subiu cerca de 50% em maio ante a média de jan–fev/2026; no mesmo intervalo o MAP avançou ~29,7% e o KCl ~9,7% — evidência de que a pressão foi maior nos nitrogenados. O Itaú BBA chegou a apontar ureia a US$ 710/t no porto brasileiro, alta de ~50% em 30 dias.</w:t>
-      </w:r>
-    </w:p>
-    <w:p>
-      <w:pPr>
-        <w:spacing w:after="40" w:before="40"/>
-      </w:pPr>
-      <w:r>
-        <w:rPr>
-          <w:b/>
-          <w:bCs/>
-          <w:color w:val="1E2A44"/>
-          <w:sz w:val="18"/>
-          <w:szCs w:val="18"/>
-        </w:rPr>
-        <w:t xml:space="preserve">O que esperar nos próximos meses:</w:t>
+        <w:t xml:space="preserve">O cenário ficou menos turbulento a partir de julho, com a retomada das exportações de ureia pela China e a redução das tensões geopolíticas — mas o mercado segue muito sensível a qualquer mudança externa.</w:t>
       </w:r>
     </w:p>
     <w:p>
@@ -2368,7 +2359,7 @@
           <w:sz w:val="17"/>
           <w:szCs w:val="17"/>
         </w:rPr>
-        <w:t xml:space="preserve">O cenário ficou menos turbulento a partir de julho, com a retomada das exportações de ureia pela China e a redução das tensões geopolíticas — mas o mercado segue muito sensível a qualquer mudança externa.</w:t>
+        <w:t xml:space="preserve">Para o 3º trimestre de 2026, a StoneX projeta que a normalização gradual da navegação por Ormuz e o retorno das exportações chinesas melhorem o abastecimento mundial, com fundamentos distintos por segmento.</w:t>
       </w:r>
     </w:p>
     <w:p>
@@ -2385,7 +2376,7 @@
           <w:sz w:val="17"/>
           <w:szCs w:val="17"/>
         </w:rPr>
-        <w:t xml:space="preserve">Para o 3º trimestre de 2026, a StoneX projeta que a normalização gradual da navegação por Ormuz e o retorno das exportações chinesas melhorem o abastecimento mundial, com fundamentos distintos por segmento.</w:t>
+        <w:t xml:space="preserve">Nitrogenados: podem ter recuperação de preços com a recomposição de estoques e a volta da demanda global. Fosfatados: seguem pressionados pela oferta restrita e pelo enxofre caro. Potássio (KCl): mercado relativamente equilibrado.</w:t>
       </w:r>
     </w:p>
     <w:p>
@@ -2402,7 +2393,7 @@
           <w:sz w:val="17"/>
           <w:szCs w:val="17"/>
         </w:rPr>
-        <w:t xml:space="preserve">Nitrogenados: podem ter recuperação de preços com a recomposição de estoques e a volta da demanda global. Fosfatados: seguem pressionados pela oferta restrita e pelo enxofre caro. Potássio (KCl): mercado relativamente equilibrado.</w:t>
+        <w:t xml:space="preserve">Estratégia sugerida por analistas: escalonar as compras, avançar mais no potássio e fazer aquisições parciais de nitrogênio e fósforo, aproveitando janelas e relações de troca favoráveis, em vez de tentar acertar o menor preço.</w:t>
       </w:r>
     </w:p>
     <w:p>
@@ -2419,7 +2410,22 @@
           <w:sz w:val="17"/>
           <w:szCs w:val="17"/>
         </w:rPr>
-        <w:t xml:space="preserve">Estratégia sugerida por analistas: escalonar as compras, avançar mais no potássio e fazer aquisições parciais de nitrogênio e fósforo, aproveitando janelas e relações de troca favoráveis, em vez de tentar acertar o menor preço.</w:t>
+        <w:t xml:space="preserve">Riscos a monitorar: evolução do conflito no Oriente Médio, novas restrições da China (há rumores inclusive sobre sulfato de amônio, 100% importado do país) e a taxa de câmbio.</w:t>
+      </w:r>
+    </w:p>
+    <w:p>
+      <w:pPr>
+        <w:spacing w:after="20" w:before="60"/>
+      </w:pPr>
+      <w:r>
+        <w:rPr>
+          <w:b/>
+          <w:bCs/>
+          <w:color w:val="1E2A44"/>
+          <w:sz w:val="17"/>
+          <w:szCs w:val="17"/>
+        </w:rPr>
+        <w:t xml:space="preserve">Notícias recentes do mercado (atualização automática):</w:t>
       </w:r>
     </w:p>
     <w:p>
@@ -2433,25 +2439,10 @@
       </w:pPr>
       <w:r>
         <w:rPr>
-          <w:sz w:val="17"/>
-          <w:szCs w:val="17"/>
-        </w:rPr>
-        <w:t xml:space="preserve">Riscos a monitorar: evolução do conflito no Oriente Médio, novas restrições da China (há rumores inclusive sobre sulfato de amônio, 100% importado do país) e a taxa de câmbio.</w:t>
-      </w:r>
-    </w:p>
-    <w:p>
-      <w:pPr>
-        <w:spacing w:after="20" w:before="60"/>
-      </w:pPr>
-      <w:r>
-        <w:rPr>
-          <w:b/>
-          <w:bCs/>
-          <w:color w:val="1E2A44"/>
-          <w:sz w:val="17"/>
-          <w:szCs w:val="17"/>
-        </w:rPr>
-        <w:t xml:space="preserve">Notícias recentes do mercado (atualização automática):</w:t>
+          <w:sz w:val="16"/>
+          <w:szCs w:val="16"/>
+        </w:rPr>
+        <w:t xml:space="preserve">04/08/2026 — El Niño reforça importância da nutrição das plantas para reduzir perdas no campo</w:t>
       </w:r>
     </w:p>
     <w:p>
@@ -2468,7 +2459,7 @@
           <w:sz w:val="16"/>
           <w:szCs w:val="16"/>
         </w:rPr>
-        <w:t xml:space="preserve">04/08/2026 — El Niño reforça importância da nutrição das plantas para reduzir perdas no campo</w:t>
+        <w:t xml:space="preserve">30/06/2026 — Mercado de fertilizantes amplia movimento de baixa com recuo da ureia, MAP e cloreto de potássio</w:t>
       </w:r>
     </w:p>
     <w:p>
@@ -2485,7 +2476,7 @@
           <w:sz w:val="16"/>
           <w:szCs w:val="16"/>
         </w:rPr>
-        <w:t xml:space="preserve">30/06/2026 — Mercado de fertilizantes amplia movimento de baixa com recuo da ureia, MAP e cloreto de potássio</w:t>
+        <w:t xml:space="preserve">19/06/2026 — Importação dos EUA de fertilizante com origem no Oriente Médio zera em maio</w:t>
       </w:r>
     </w:p>
     <w:p>
@@ -2502,23 +2493,6 @@
           <w:sz w:val="16"/>
           <w:szCs w:val="16"/>
         </w:rPr>
-        <w:t xml:space="preserve">19/06/2026 — Importação dos EUA de fertilizante com origem no Oriente Médio zera em maio</w:t>
-      </w:r>
-    </w:p>
-    <w:p>
-      <w:pPr>
-        <w:pStyle w:val="ListParagraph"/>
-        <w:numPr>
-          <w:ilvl w:val="0"/>
-          <w:numId w:val="2"/>
-        </w:numPr>
-        <w:spacing w:after="70"/>
-      </w:pPr>
-      <w:r>
-        <w:rPr>
-          <w:sz w:val="16"/>
-          <w:szCs w:val="16"/>
-        </w:rPr>
         <w:t xml:space="preserve">16/06/2026 — Ureia cai mais de 40% e volta ao nível pré-crise com avanço de acordo entre EUA e Irã</w:t>
       </w:r>
     </w:p>
@@ -2608,7 +2582,7 @@
           <w:sz w:val="15"/>
           <w:szCs w:val="15"/>
         </w:rPr>
-        <w:t xml:space="preserve">Fontes automáticas: AwesomeAPI (câmbio), CEPEA/ESALQ (soja), ANP (diesel), stooq (BDI). Fertilizantes e gás natural: override manual (fertilizers-override.json). Status desta execução: {"bdi":"ok (HANDYBULK, 10/08/2026)","soja":"ok (Noticias Agricolas / CEPEA-PR 10/08/2026)","sojaRegional":"ok (Oeste da Bahia/BA (AIBA))","cambio":"ok (BCB PTAX)","diesel":"falha: Petrobras: HTTP 403 | PortalCanaa: HTTP 403","_comexPeriodo":"com-filtro-ncm | 2026-07 | 4 linhas","_comexNcmsEncontrados":"31042090,31021010,31054000,31042010","ureia":"ok (ComexStat 2026-07)","map":"ok (ComexStat 2026-07)","kcl":"ok (ComexStat 2026-07)","gas":"ok (EIA Henry Hub)","noticias":"ok (40 de https://www.noticiasagricolas.com.br/tags/fertilizantes/)"}.</w:t>
+        <w:t xml:space="preserve">Fontes automáticas: AwesomeAPI (câmbio), CEPEA/ESALQ (soja), ANP (diesel), stooq (BDI). Fertilizantes e gás natural: override manual (fertilizers-override.json). Status desta execução: {"bdi":"ok (HANDYBULK, 14/08/2026)","sojaRegional":"ok (Oeste da Bahia/BA (AIBA))","soja":"ok (Noticias Agricolas / CEPEA-PR 14/08/2026)","diesel":"falha: Petrobras: HTTP 403 | PortalCanaa: HTTP 403","cambio":"ok (BCB PTAX)","_comexPeriodo":"com-filtro-ncm | 2026-07 | 4 linhas","_comexNcmsEncontrados":"31042090,31021010,31054000,31042010","ureia":"ok (ComexStat 2026-07)","map":"ok (ComexStat 2026-07)","kcl":"ok (ComexStat 2026-07)","gas":"ok (EIA Henry Hub)","noticias":"ok (40 de https://www.noticiasagricolas.com.br/tags/fertilizantes/)"}.</w:t>
       </w:r>
     </w:p>
     <w:p>

</xml_diff>

<commit_message>
chore: atualizacao automatica 2026-08-18
</commit_message>
<xml_diff>
--- a/relatorio_executivo.docx
+++ b/relatorio_executivo.docx
@@ -46,7 +46,7 @@
           <w:sz w:val="17"/>
           <w:szCs w:val="17"/>
         </w:rPr>
-        <w:t xml:space="preserve">Equipe de Planejamento, Controle e Pesquisa Florestal  ·  Referência: Ago/2026  ·  Gerado em 17/08/2026, 10:26:40</w:t>
+        <w:t xml:space="preserve">Equipe de Planejamento, Controle e Pesquisa Florestal  ·  Referência: Ago/2026  ·  Gerado em 18/08/2026, 17:28:40</w:t>
       </w:r>
     </w:p>
     <w:p>
@@ -91,14 +91,14 @@
           <w:sz w:val="19"/>
           <w:szCs w:val="19"/>
         </w:rPr>
-        <w:t xml:space="preserve">O dólar está em R$ 5,22 (+1,8%) e a soja CEPEA em R$ 141,16/saca. </w:t>
+        <w:t xml:space="preserve">O dólar está em R$ 5,20 (-0,4%) e a soja CEPEA em R$ 141,69/saca. </w:t>
       </w:r>
       <w:r>
         <w:rPr>
           <w:sz w:val="19"/>
           <w:szCs w:val="19"/>
         </w:rPr>
-        <w:t xml:space="preserve">A relação de troca soja/MAP é de 31,5 sacas/t.</w:t>
+        <w:t xml:space="preserve">A relação de troca soja/MAP é de 31,2 sacas/t.</w:t>
       </w:r>
     </w:p>
     <w:p>
@@ -864,7 +864,7 @@
                 <w:sz w:val="18"/>
                 <w:szCs w:val="18"/>
               </w:rPr>
-              <w:t xml:space="preserve">R$ 141,16/sc</w:t>
+              <w:t xml:space="preserve">R$ 141,69/sc</w:t>
             </w:r>
           </w:p>
         </w:tc>
@@ -897,7 +897,7 @@
                 <w:sz w:val="18"/>
                 <w:szCs w:val="18"/>
               </w:rPr>
-              <w:t xml:space="preserve">+2,7%</w:t>
+              <w:t xml:space="preserve">+0,4%</w:t>
             </w:r>
           </w:p>
         </w:tc>
@@ -989,7 +989,7 @@
                 <w:sz w:val="18"/>
                 <w:szCs w:val="18"/>
               </w:rPr>
-              <w:t xml:space="preserve">R$ 133,38/sc</w:t>
+              <w:t xml:space="preserve">R$ 134,25/sc</w:t>
             </w:r>
           </w:p>
         </w:tc>
@@ -1022,7 +1022,7 @@
                 <w:sz w:val="18"/>
                 <w:szCs w:val="18"/>
               </w:rPr>
-              <w:t xml:space="preserve">+3,6%</w:t>
+              <w:t xml:space="preserve">+0,7%</w:t>
             </w:r>
           </w:p>
         </w:tc>
@@ -1114,7 +1114,7 @@
                 <w:sz w:val="18"/>
                 <w:szCs w:val="18"/>
               </w:rPr>
-              <w:t xml:space="preserve">31,5 sc/t</w:t>
+              <w:t xml:space="preserve">31,2 sc/t</w:t>
             </w:r>
           </w:p>
         </w:tc>
@@ -1147,7 +1147,7 @@
                 <w:sz w:val="18"/>
                 <w:szCs w:val="18"/>
               </w:rPr>
-              <w:t xml:space="preserve">-0,9%</w:t>
+              <w:t xml:space="preserve">-1,0%</w:t>
             </w:r>
           </w:p>
         </w:tc>
@@ -1239,7 +1239,7 @@
                 <w:sz w:val="18"/>
                 <w:szCs w:val="18"/>
               </w:rPr>
-              <w:t xml:space="preserve">16,2 sc/t</w:t>
+              <w:t xml:space="preserve">16,1 sc/t</w:t>
             </w:r>
           </w:p>
         </w:tc>
@@ -1528,7 +1528,257 @@
                 <w:sz w:val="18"/>
                 <w:szCs w:val="18"/>
               </w:rPr>
-              <w:t xml:space="preserve">5,22</w:t>
+              <w:t xml:space="preserve">5,20</w:t>
+            </w:r>
+          </w:p>
+        </w:tc>
+        <w:tc>
+          <w:tcPr>
+            <w:tcW w:type="dxa" w:w="1980"/>
+            <w:tcBorders>
+              <w:top w:val="single" w:color="DDDDDD" w:sz="1"/>
+              <w:left w:val="single" w:color="DDDDDD" w:sz="1"/>
+              <w:bottom w:val="single" w:color="DDDDDD" w:sz="1"/>
+              <w:right w:val="single" w:color="DDDDDD" w:sz="1"/>
+            </w:tcBorders>
+            <w:tcMar>
+              <w:top w:type="dxa" w:w="55"/>
+              <w:left w:type="dxa" w:w="110"/>
+              <w:bottom w:type="dxa" w:w="55"/>
+              <w:right w:type="dxa" w:w="110"/>
+            </w:tcMar>
+            <w:vAlign w:val="center"/>
+          </w:tcPr>
+          <w:p>
+            <w:pPr>
+              <w:jc w:val="right"/>
+            </w:pPr>
+            <w:r>
+              <w:rPr>
+                <w:b/>
+                <w:bCs/>
+                <w:color w:val="2F8A5F"/>
+                <w:sz w:val="18"/>
+                <w:szCs w:val="18"/>
+              </w:rPr>
+              <w:t xml:space="preserve">-0,4%</w:t>
+            </w:r>
+          </w:p>
+        </w:tc>
+        <w:tc>
+          <w:tcPr>
+            <w:tcW w:type="dxa" w:w="2000"/>
+            <w:tcBorders>
+              <w:top w:val="single" w:color="DDDDDD" w:sz="1"/>
+              <w:left w:val="single" w:color="DDDDDD" w:sz="1"/>
+              <w:bottom w:val="single" w:color="DDDDDD" w:sz="1"/>
+              <w:right w:val="single" w:color="DDDDDD" w:sz="1"/>
+            </w:tcBorders>
+            <w:tcMar>
+              <w:top w:type="dxa" w:w="55"/>
+              <w:left w:type="dxa" w:w="110"/>
+              <w:bottom w:type="dxa" w:w="55"/>
+              <w:right w:type="dxa" w:w="110"/>
+            </w:tcMar>
+            <w:vAlign w:val="center"/>
+          </w:tcPr>
+          <w:p>
+            <w:pPr>
+              <w:jc w:val="left"/>
+            </w:pPr>
+            <w:r>
+              <w:rPr>
+                <w:sz w:val="17"/>
+                <w:szCs w:val="17"/>
+              </w:rPr>
+              <w:t xml:space="preserve">Custo de importação</w:t>
+            </w:r>
+          </w:p>
+        </w:tc>
+      </w:tr>
+      <w:tr>
+        <w:tc>
+          <w:tcPr>
+            <w:tcW w:type="dxa" w:w="3400"/>
+            <w:tcBorders>
+              <w:top w:val="single" w:color="DDDDDD" w:sz="1"/>
+              <w:left w:val="single" w:color="DDDDDD" w:sz="1"/>
+              <w:bottom w:val="single" w:color="DDDDDD" w:sz="1"/>
+              <w:right w:val="single" w:color="DDDDDD" w:sz="1"/>
+            </w:tcBorders>
+            <w:tcMar>
+              <w:top w:type="dxa" w:w="55"/>
+              <w:left w:type="dxa" w:w="110"/>
+              <w:bottom w:type="dxa" w:w="55"/>
+              <w:right w:type="dxa" w:w="110"/>
+            </w:tcMar>
+            <w:vAlign w:val="center"/>
+          </w:tcPr>
+          <w:p>
+            <w:pPr>
+              <w:jc w:val="left"/>
+            </w:pPr>
+            <w:r>
+              <w:rPr>
+                <w:sz w:val="18"/>
+                <w:szCs w:val="18"/>
+              </w:rPr>
+              <w:t xml:space="preserve">Gás Natural (Henry Hub)</w:t>
+            </w:r>
+          </w:p>
+        </w:tc>
+        <w:tc>
+          <w:tcPr>
+            <w:tcW w:type="dxa" w:w="1980"/>
+            <w:tcBorders>
+              <w:top w:val="single" w:color="DDDDDD" w:sz="1"/>
+              <w:left w:val="single" w:color="DDDDDD" w:sz="1"/>
+              <w:bottom w:val="single" w:color="DDDDDD" w:sz="1"/>
+              <w:right w:val="single" w:color="DDDDDD" w:sz="1"/>
+            </w:tcBorders>
+            <w:tcMar>
+              <w:top w:type="dxa" w:w="55"/>
+              <w:left w:type="dxa" w:w="110"/>
+              <w:bottom w:type="dxa" w:w="55"/>
+              <w:right w:type="dxa" w:w="110"/>
+            </w:tcMar>
+            <w:vAlign w:val="center"/>
+          </w:tcPr>
+          <w:p>
+            <w:pPr>
+              <w:jc w:val="right"/>
+            </w:pPr>
+            <w:r>
+              <w:rPr>
+                <w:sz w:val="18"/>
+                <w:szCs w:val="18"/>
+              </w:rPr>
+              <w:t xml:space="preserve">US$ 2,79</w:t>
+            </w:r>
+          </w:p>
+        </w:tc>
+        <w:tc>
+          <w:tcPr>
+            <w:tcW w:type="dxa" w:w="1980"/>
+            <w:tcBorders>
+              <w:top w:val="single" w:color="DDDDDD" w:sz="1"/>
+              <w:left w:val="single" w:color="DDDDDD" w:sz="1"/>
+              <w:bottom w:val="single" w:color="DDDDDD" w:sz="1"/>
+              <w:right w:val="single" w:color="DDDDDD" w:sz="1"/>
+            </w:tcBorders>
+            <w:tcMar>
+              <w:top w:type="dxa" w:w="55"/>
+              <w:left w:type="dxa" w:w="110"/>
+              <w:bottom w:type="dxa" w:w="55"/>
+              <w:right w:type="dxa" w:w="110"/>
+            </w:tcMar>
+            <w:vAlign w:val="center"/>
+          </w:tcPr>
+          <w:p>
+            <w:pPr>
+              <w:jc w:val="right"/>
+            </w:pPr>
+            <w:r>
+              <w:rPr>
+                <w:b/>
+                <w:bCs/>
+                <w:color w:val="6B7585"/>
+                <w:sz w:val="18"/>
+                <w:szCs w:val="18"/>
+              </w:rPr>
+              <w:t xml:space="preserve">0,0%</w:t>
+            </w:r>
+          </w:p>
+        </w:tc>
+        <w:tc>
+          <w:tcPr>
+            <w:tcW w:type="dxa" w:w="2000"/>
+            <w:tcBorders>
+              <w:top w:val="single" w:color="DDDDDD" w:sz="1"/>
+              <w:left w:val="single" w:color="DDDDDD" w:sz="1"/>
+              <w:bottom w:val="single" w:color="DDDDDD" w:sz="1"/>
+              <w:right w:val="single" w:color="DDDDDD" w:sz="1"/>
+            </w:tcBorders>
+            <w:tcMar>
+              <w:top w:type="dxa" w:w="55"/>
+              <w:left w:type="dxa" w:w="110"/>
+              <w:bottom w:type="dxa" w:w="55"/>
+              <w:right w:type="dxa" w:w="110"/>
+            </w:tcMar>
+            <w:vAlign w:val="center"/>
+          </w:tcPr>
+          <w:p>
+            <w:pPr>
+              <w:jc w:val="left"/>
+            </w:pPr>
+            <w:r>
+              <w:rPr>
+                <w:sz w:val="17"/>
+                <w:szCs w:val="17"/>
+              </w:rPr>
+              <w:t xml:space="preserve">Pressiona ureia</w:t>
+            </w:r>
+          </w:p>
+        </w:tc>
+      </w:tr>
+      <w:tr>
+        <w:tc>
+          <w:tcPr>
+            <w:tcW w:type="dxa" w:w="3400"/>
+            <w:tcBorders>
+              <w:top w:val="single" w:color="DDDDDD" w:sz="1"/>
+              <w:left w:val="single" w:color="DDDDDD" w:sz="1"/>
+              <w:bottom w:val="single" w:color="DDDDDD" w:sz="1"/>
+              <w:right w:val="single" w:color="DDDDDD" w:sz="1"/>
+            </w:tcBorders>
+            <w:tcMar>
+              <w:top w:type="dxa" w:w="55"/>
+              <w:left w:type="dxa" w:w="110"/>
+              <w:bottom w:type="dxa" w:w="55"/>
+              <w:right w:type="dxa" w:w="110"/>
+            </w:tcMar>
+            <w:vAlign w:val="center"/>
+          </w:tcPr>
+          <w:p>
+            <w:pPr>
+              <w:jc w:val="left"/>
+            </w:pPr>
+            <w:r>
+              <w:rPr>
+                <w:sz w:val="18"/>
+                <w:szCs w:val="18"/>
+              </w:rPr>
+              <w:t xml:space="preserve">Frete Marítimo (BDI)</w:t>
+            </w:r>
+          </w:p>
+        </w:tc>
+        <w:tc>
+          <w:tcPr>
+            <w:tcW w:type="dxa" w:w="1980"/>
+            <w:tcBorders>
+              <w:top w:val="single" w:color="DDDDDD" w:sz="1"/>
+              <w:left w:val="single" w:color="DDDDDD" w:sz="1"/>
+              <w:bottom w:val="single" w:color="DDDDDD" w:sz="1"/>
+              <w:right w:val="single" w:color="DDDDDD" w:sz="1"/>
+            </w:tcBorders>
+            <w:tcMar>
+              <w:top w:type="dxa" w:w="55"/>
+              <w:left w:type="dxa" w:w="110"/>
+              <w:bottom w:type="dxa" w:w="55"/>
+              <w:right w:type="dxa" w:w="110"/>
+            </w:tcMar>
+            <w:vAlign w:val="center"/>
+          </w:tcPr>
+          <w:p>
+            <w:pPr>
+              <w:jc w:val="right"/>
+            </w:pPr>
+            <w:r>
+              <w:rPr>
+                <w:sz w:val="18"/>
+                <w:szCs w:val="18"/>
+              </w:rPr>
+              <w:t xml:space="preserve">2.878 pts</w:t>
             </w:r>
           </w:p>
         </w:tc>
@@ -1561,257 +1811,7 @@
                 <w:sz w:val="18"/>
                 <w:szCs w:val="18"/>
               </w:rPr>
-              <w:t xml:space="preserve">+1,8%</w:t>
-            </w:r>
-          </w:p>
-        </w:tc>
-        <w:tc>
-          <w:tcPr>
-            <w:tcW w:type="dxa" w:w="2000"/>
-            <w:tcBorders>
-              <w:top w:val="single" w:color="DDDDDD" w:sz="1"/>
-              <w:left w:val="single" w:color="DDDDDD" w:sz="1"/>
-              <w:bottom w:val="single" w:color="DDDDDD" w:sz="1"/>
-              <w:right w:val="single" w:color="DDDDDD" w:sz="1"/>
-            </w:tcBorders>
-            <w:tcMar>
-              <w:top w:type="dxa" w:w="55"/>
-              <w:left w:type="dxa" w:w="110"/>
-              <w:bottom w:type="dxa" w:w="55"/>
-              <w:right w:type="dxa" w:w="110"/>
-            </w:tcMar>
-            <w:vAlign w:val="center"/>
-          </w:tcPr>
-          <w:p>
-            <w:pPr>
-              <w:jc w:val="left"/>
-            </w:pPr>
-            <w:r>
-              <w:rPr>
-                <w:sz w:val="17"/>
-                <w:szCs w:val="17"/>
-              </w:rPr>
-              <w:t xml:space="preserve">Custo de importação</w:t>
-            </w:r>
-          </w:p>
-        </w:tc>
-      </w:tr>
-      <w:tr>
-        <w:tc>
-          <w:tcPr>
-            <w:tcW w:type="dxa" w:w="3400"/>
-            <w:tcBorders>
-              <w:top w:val="single" w:color="DDDDDD" w:sz="1"/>
-              <w:left w:val="single" w:color="DDDDDD" w:sz="1"/>
-              <w:bottom w:val="single" w:color="DDDDDD" w:sz="1"/>
-              <w:right w:val="single" w:color="DDDDDD" w:sz="1"/>
-            </w:tcBorders>
-            <w:tcMar>
-              <w:top w:type="dxa" w:w="55"/>
-              <w:left w:type="dxa" w:w="110"/>
-              <w:bottom w:type="dxa" w:w="55"/>
-              <w:right w:type="dxa" w:w="110"/>
-            </w:tcMar>
-            <w:vAlign w:val="center"/>
-          </w:tcPr>
-          <w:p>
-            <w:pPr>
-              <w:jc w:val="left"/>
-            </w:pPr>
-            <w:r>
-              <w:rPr>
-                <w:sz w:val="18"/>
-                <w:szCs w:val="18"/>
-              </w:rPr>
-              <w:t xml:space="preserve">Gás Natural (Henry Hub)</w:t>
-            </w:r>
-          </w:p>
-        </w:tc>
-        <w:tc>
-          <w:tcPr>
-            <w:tcW w:type="dxa" w:w="1980"/>
-            <w:tcBorders>
-              <w:top w:val="single" w:color="DDDDDD" w:sz="1"/>
-              <w:left w:val="single" w:color="DDDDDD" w:sz="1"/>
-              <w:bottom w:val="single" w:color="DDDDDD" w:sz="1"/>
-              <w:right w:val="single" w:color="DDDDDD" w:sz="1"/>
-            </w:tcBorders>
-            <w:tcMar>
-              <w:top w:type="dxa" w:w="55"/>
-              <w:left w:type="dxa" w:w="110"/>
-              <w:bottom w:type="dxa" w:w="55"/>
-              <w:right w:type="dxa" w:w="110"/>
-            </w:tcMar>
-            <w:vAlign w:val="center"/>
-          </w:tcPr>
-          <w:p>
-            <w:pPr>
-              <w:jc w:val="right"/>
-            </w:pPr>
-            <w:r>
-              <w:rPr>
-                <w:sz w:val="18"/>
-                <w:szCs w:val="18"/>
-              </w:rPr>
-              <w:t xml:space="preserve">US$ 2,79</w:t>
-            </w:r>
-          </w:p>
-        </w:tc>
-        <w:tc>
-          <w:tcPr>
-            <w:tcW w:type="dxa" w:w="1980"/>
-            <w:tcBorders>
-              <w:top w:val="single" w:color="DDDDDD" w:sz="1"/>
-              <w:left w:val="single" w:color="DDDDDD" w:sz="1"/>
-              <w:bottom w:val="single" w:color="DDDDDD" w:sz="1"/>
-              <w:right w:val="single" w:color="DDDDDD" w:sz="1"/>
-            </w:tcBorders>
-            <w:tcMar>
-              <w:top w:type="dxa" w:w="55"/>
-              <w:left w:type="dxa" w:w="110"/>
-              <w:bottom w:type="dxa" w:w="55"/>
-              <w:right w:type="dxa" w:w="110"/>
-            </w:tcMar>
-            <w:vAlign w:val="center"/>
-          </w:tcPr>
-          <w:p>
-            <w:pPr>
-              <w:jc w:val="right"/>
-            </w:pPr>
-            <w:r>
-              <w:rPr>
-                <w:b/>
-                <w:bCs/>
-                <w:color w:val="2F8A5F"/>
-                <w:sz w:val="18"/>
-                <w:szCs w:val="18"/>
-              </w:rPr>
-              <w:t xml:space="preserve">-0,7%</w:t>
-            </w:r>
-          </w:p>
-        </w:tc>
-        <w:tc>
-          <w:tcPr>
-            <w:tcW w:type="dxa" w:w="2000"/>
-            <w:tcBorders>
-              <w:top w:val="single" w:color="DDDDDD" w:sz="1"/>
-              <w:left w:val="single" w:color="DDDDDD" w:sz="1"/>
-              <w:bottom w:val="single" w:color="DDDDDD" w:sz="1"/>
-              <w:right w:val="single" w:color="DDDDDD" w:sz="1"/>
-            </w:tcBorders>
-            <w:tcMar>
-              <w:top w:type="dxa" w:w="55"/>
-              <w:left w:type="dxa" w:w="110"/>
-              <w:bottom w:type="dxa" w:w="55"/>
-              <w:right w:type="dxa" w:w="110"/>
-            </w:tcMar>
-            <w:vAlign w:val="center"/>
-          </w:tcPr>
-          <w:p>
-            <w:pPr>
-              <w:jc w:val="left"/>
-            </w:pPr>
-            <w:r>
-              <w:rPr>
-                <w:sz w:val="17"/>
-                <w:szCs w:val="17"/>
-              </w:rPr>
-              <w:t xml:space="preserve">Pressiona ureia</w:t>
-            </w:r>
-          </w:p>
-        </w:tc>
-      </w:tr>
-      <w:tr>
-        <w:tc>
-          <w:tcPr>
-            <w:tcW w:type="dxa" w:w="3400"/>
-            <w:tcBorders>
-              <w:top w:val="single" w:color="DDDDDD" w:sz="1"/>
-              <w:left w:val="single" w:color="DDDDDD" w:sz="1"/>
-              <w:bottom w:val="single" w:color="DDDDDD" w:sz="1"/>
-              <w:right w:val="single" w:color="DDDDDD" w:sz="1"/>
-            </w:tcBorders>
-            <w:tcMar>
-              <w:top w:type="dxa" w:w="55"/>
-              <w:left w:type="dxa" w:w="110"/>
-              <w:bottom w:type="dxa" w:w="55"/>
-              <w:right w:type="dxa" w:w="110"/>
-            </w:tcMar>
-            <w:vAlign w:val="center"/>
-          </w:tcPr>
-          <w:p>
-            <w:pPr>
-              <w:jc w:val="left"/>
-            </w:pPr>
-            <w:r>
-              <w:rPr>
-                <w:sz w:val="18"/>
-                <w:szCs w:val="18"/>
-              </w:rPr>
-              <w:t xml:space="preserve">Frete Marítimo (BDI)</w:t>
-            </w:r>
-          </w:p>
-        </w:tc>
-        <w:tc>
-          <w:tcPr>
-            <w:tcW w:type="dxa" w:w="1980"/>
-            <w:tcBorders>
-              <w:top w:val="single" w:color="DDDDDD" w:sz="1"/>
-              <w:left w:val="single" w:color="DDDDDD" w:sz="1"/>
-              <w:bottom w:val="single" w:color="DDDDDD" w:sz="1"/>
-              <w:right w:val="single" w:color="DDDDDD" w:sz="1"/>
-            </w:tcBorders>
-            <w:tcMar>
-              <w:top w:type="dxa" w:w="55"/>
-              <w:left w:type="dxa" w:w="110"/>
-              <w:bottom w:type="dxa" w:w="55"/>
-              <w:right w:type="dxa" w:w="110"/>
-            </w:tcMar>
-            <w:vAlign w:val="center"/>
-          </w:tcPr>
-          <w:p>
-            <w:pPr>
-              <w:jc w:val="right"/>
-            </w:pPr>
-            <w:r>
-              <w:rPr>
-                <w:sz w:val="18"/>
-                <w:szCs w:val="18"/>
-              </w:rPr>
-              <w:t xml:space="preserve">2.863 pts</w:t>
-            </w:r>
-          </w:p>
-        </w:tc>
-        <w:tc>
-          <w:tcPr>
-            <w:tcW w:type="dxa" w:w="1980"/>
-            <w:tcBorders>
-              <w:top w:val="single" w:color="DDDDDD" w:sz="1"/>
-              <w:left w:val="single" w:color="DDDDDD" w:sz="1"/>
-              <w:bottom w:val="single" w:color="DDDDDD" w:sz="1"/>
-              <w:right w:val="single" w:color="DDDDDD" w:sz="1"/>
-            </w:tcBorders>
-            <w:tcMar>
-              <w:top w:type="dxa" w:w="55"/>
-              <w:left w:type="dxa" w:w="110"/>
-              <w:bottom w:type="dxa" w:w="55"/>
-              <w:right w:type="dxa" w:w="110"/>
-            </w:tcMar>
-            <w:vAlign w:val="center"/>
-          </w:tcPr>
-          <w:p>
-            <w:pPr>
-              <w:jc w:val="right"/>
-            </w:pPr>
-            <w:r>
-              <w:rPr>
-                <w:b/>
-                <w:bCs/>
-                <w:color w:val="2F8A5F"/>
-                <w:sz w:val="18"/>
-                <w:szCs w:val="18"/>
-              </w:rPr>
-              <w:t xml:space="preserve">-7,1%</w:t>
+              <w:t xml:space="preserve">+0,5%</w:t>
             </w:r>
           </w:p>
         </w:tc>
@@ -2013,7 +2013,83 @@
           <w:sz w:val="18"/>
           <w:szCs w:val="18"/>
         </w:rPr>
-        <w:t xml:space="preserve">queda de -7,1% no período.</w:t>
+        <w:t xml:space="preserve">alta de +0,5% no período.</w:t>
+      </w:r>
+    </w:p>
+    <w:p>
+      <w:pPr>
+        <w:pBdr>
+          <w:bottom w:val="single" w:color="1E2A44" w:sz="6" w:space="2"/>
+        </w:pBdr>
+        <w:spacing w:after="100" w:before="220"/>
+      </w:pPr>
+      <w:r>
+        <w:rPr>
+          <w:b/>
+          <w:bCs/>
+          <w:color w:val="1E2A44"/>
+          <w:sz w:val="22"/>
+          <w:szCs w:val="22"/>
+        </w:rPr>
+        <w:t xml:space="preserve">6. Contexto de Mercado — Causas da Alta e Perspectivas</w:t>
+      </w:r>
+    </w:p>
+    <w:p>
+      <w:pPr>
+        <w:spacing w:after="60"/>
+      </w:pPr>
+      <w:r>
+        <w:rPr>
+          <w:b/>
+          <w:bCs/>
+          <w:color w:val="1E2A44"/>
+          <w:sz w:val="18"/>
+          <w:szCs w:val="18"/>
+        </w:rPr>
+        <w:t xml:space="preserve">Por que os fertilizantes subiram — e o que esperar · atualizado em Agosto/2026 · revisão manual.</w:t>
+      </w:r>
+    </w:p>
+    <w:p>
+      <w:pPr>
+        <w:spacing w:after="60"/>
+        <w:jc w:val="both"/>
+      </w:pPr>
+      <w:r>
+        <w:rPr>
+          <w:sz w:val="18"/>
+          <w:szCs w:val="18"/>
+        </w:rPr>
+        <w:t xml:space="preserve">O eixo da pressão mudou ao longo de 2026: a ureia recuou dos picos após o alívio das tensões no Oriente Médio, mas os fosfatados (MAP) tornaram-se o ponto crítico — caros e de oferta apertada — por causa das restrições da China e da escassez de enxofre, às vésperas da safra 2026/27.</w:t>
+      </w:r>
+    </w:p>
+    <w:p>
+      <w:pPr>
+        <w:spacing w:after="80"/>
+      </w:pPr>
+      <w:r>
+        <w:rPr>
+          <w:i/>
+          <w:iCs/>
+          <w:color w:val="6B7585"/>
+          <w:sz w:val="17"/>
+          <w:szCs w:val="17"/>
+        </w:rPr>
+        <w:t xml:space="preserve">Leitura automática: sem novo fechamento de fertilizantes desde a leitura anterior (jul/26).</w:t>
+      </w:r>
+    </w:p>
+    <w:p>
+      <w:pPr>
+        <w:spacing w:after="40"/>
+      </w:pPr>
+      <w:r>
+        <w:rPr>
+          <w:b/>
+          <w:bCs/>
+          <w:color w:val="1E2A44"/>
+          <w:sz w:val="18"/>
+          <w:szCs w:val="18"/>
+        </w:rPr>
+        <w:t xml:space="preserve">Principais causas da alta:</w:t>
       </w:r>
     </w:p>
     <w:p>
@@ -2029,17 +2105,17 @@
         <w:rPr>
           <w:b/>
           <w:bCs/>
-          <w:sz w:val="18"/>
-          <w:szCs w:val="18"/>
-        </w:rPr>
-        <w:t xml:space="preserve">Dólar: </w:t>
-      </w:r>
-      <w:r>
-        <w:rPr>
-          <w:sz w:val="18"/>
-          <w:szCs w:val="18"/>
-        </w:rPr>
-        <w:t xml:space="preserve">alta de +1,8% no período.</w:t>
+          <w:sz w:val="17"/>
+          <w:szCs w:val="17"/>
+        </w:rPr>
+        <w:t xml:space="preserve">Restrições da China aos fosfatados: </w:t>
+      </w:r>
+      <w:r>
+        <w:rPr>
+          <w:sz w:val="17"/>
+          <w:szCs w:val="17"/>
+        </w:rPr>
+        <w:t xml:space="preserve">A China suspendeu boa parte das exportações de fosfatados para priorizar o abastecimento interno; fontes do setor estimam que de 40% a 80% dos embarques estejam bloqueados ou sob cota, e as restrições podem durar até meados do segundo semestre de 2026.</w:t>
       </w:r>
     </w:p>
     <w:p>
@@ -2055,93 +2131,17 @@
         <w:rPr>
           <w:b/>
           <w:bCs/>
-          <w:sz w:val="18"/>
-          <w:szCs w:val="18"/>
-        </w:rPr>
-        <w:t xml:space="preserve">Gás Natural: </w:t>
-      </w:r>
-      <w:r>
-        <w:rPr>
-          <w:sz w:val="18"/>
-          <w:szCs w:val="18"/>
-        </w:rPr>
-        <w:t xml:space="preserve">queda de -0,7% no período.</w:t>
-      </w:r>
-    </w:p>
-    <w:p>
-      <w:pPr>
-        <w:pBdr>
-          <w:bottom w:val="single" w:color="1E2A44" w:sz="6" w:space="2"/>
-        </w:pBdr>
-        <w:spacing w:after="100" w:before="220"/>
-      </w:pPr>
-      <w:r>
-        <w:rPr>
-          <w:b/>
-          <w:bCs/>
-          <w:color w:val="1E2A44"/>
-          <w:sz w:val="22"/>
-          <w:szCs w:val="22"/>
-        </w:rPr>
-        <w:t xml:space="preserve">6. Contexto de Mercado — Causas da Alta e Perspectivas</w:t>
-      </w:r>
-    </w:p>
-    <w:p>
-      <w:pPr>
-        <w:spacing w:after="60"/>
-      </w:pPr>
-      <w:r>
-        <w:rPr>
-          <w:b/>
-          <w:bCs/>
-          <w:color w:val="1E2A44"/>
-          <w:sz w:val="18"/>
-          <w:szCs w:val="18"/>
-        </w:rPr>
-        <w:t xml:space="preserve">Por que os fertilizantes subiram — e o que esperar · atualizado em Agosto/2026 · revisão manual.</w:t>
-      </w:r>
-    </w:p>
-    <w:p>
-      <w:pPr>
-        <w:spacing w:after="60"/>
-        <w:jc w:val="both"/>
-      </w:pPr>
-      <w:r>
-        <w:rPr>
-          <w:sz w:val="18"/>
-          <w:szCs w:val="18"/>
-        </w:rPr>
-        <w:t xml:space="preserve">A alta de 2026, concentrada nos nitrogenados (ureia), foi puxada pela combinação de conflito no Oriente Médio, gás natural mais caro e restrições de exportação de China e Rússia, sobre uma base de forte dependência brasileira de importação (~85%).</w:t>
-      </w:r>
-    </w:p>
-    <w:p>
-      <w:pPr>
-        <w:spacing w:after="80"/>
-      </w:pPr>
-      <w:r>
-        <w:rPr>
-          <w:i/>
-          <w:iCs/>
-          <w:color w:val="6B7585"/>
           <w:sz w:val="17"/>
           <w:szCs w:val="17"/>
         </w:rPr>
-        <w:t xml:space="preserve">Leitura automática: sem novo fechamento de fertilizantes desde a leitura anterior (jul/26).</w:t>
-      </w:r>
-    </w:p>
-    <w:p>
-      <w:pPr>
-        <w:spacing w:after="40"/>
-      </w:pPr>
-      <w:r>
-        <w:rPr>
-          <w:b/>
-          <w:bCs/>
-          <w:color w:val="1E2A44"/>
-          <w:sz w:val="18"/>
-          <w:szCs w:val="18"/>
-        </w:rPr>
-        <w:t xml:space="preserve">Principais causas da alta:</w:t>
+        <w:t xml:space="preserve">Escassez de enxofre: </w:t>
+      </w:r>
+      <w:r>
+        <w:rPr>
+          <w:sz w:val="17"/>
+          <w:szCs w:val="17"/>
+        </w:rPr>
+        <w:t xml:space="preserve">Insumo essencial do MAP, o enxofre chegou a cerca de US$ 1.250/t; os desembarques no Brasil no 1º semestre ficaram ~42% abaixo de 2025 (StoneX), levando fábricas a reduzir produção e apertando ainda mais a oferta de fosfatados.</w:t>
       </w:r>
     </w:p>
     <w:p>
@@ -2160,14 +2160,14 @@
           <w:sz w:val="17"/>
           <w:szCs w:val="17"/>
         </w:rPr>
-        <w:t xml:space="preserve">Conflito no Oriente Médio (Irã): </w:t>
+        <w:t xml:space="preserve">Oferta russa e de outros polos reduzida: </w:t>
       </w:r>
       <w:r>
         <w:rPr>
           <w:sz w:val="17"/>
           <w:szCs w:val="17"/>
         </w:rPr>
-        <w:t xml:space="preserve">A região concentra cerca de 40% do comércio marítimo global de ureia e é fornecedora relevante de nitrogenados ao Brasil. Tensões envolvendo o Irã e a interrupção de rotas no Estreito de Ormuz elevaram o risco de desabastecimento e os custos.</w:t>
+        <w:t xml:space="preserve">Menor disponibilidade da Rússia, restrições no Marrocos e paralisações pontuais de produtoras limitam a oferta global de fósforo e sustentam o MAP em patamar elevado.</w:t>
       </w:r>
     </w:p>
     <w:p>
@@ -2186,14 +2186,14 @@
           <w:sz w:val="17"/>
           <w:szCs w:val="17"/>
         </w:rPr>
-        <w:t xml:space="preserve">Gás natural mais caro: </w:t>
+        <w:t xml:space="preserve">Conflito no Oriente Médio (efeito decrescente): </w:t>
       </w:r>
       <w:r>
         <w:rPr>
           <w:sz w:val="17"/>
           <w:szCs w:val="17"/>
         </w:rPr>
-        <w:t xml:space="preserve">É a principal matéria-prima da amônia e da ureia. Energia mais cara encarece diretamente a produção dos nitrogenados.</w:t>
+        <w:t xml:space="preserve">Foi o principal motor da disparada da ureia no 1º semestre. Com o avanço do acordo entre EUA e Irã, o risco arrefeceu e a ureia recuou — mas o mercado segue cauteloso a novas tensões.</w:t>
       </w:r>
     </w:p>
     <w:p>
@@ -2212,14 +2212,42 @@
           <w:sz w:val="17"/>
           <w:szCs w:val="17"/>
         </w:rPr>
-        <w:t xml:space="preserve">Restrições de exportação (China e Rússia): </w:t>
+        <w:t xml:space="preserve">Dependência de importação e compras atrasadas: </w:t>
       </w:r>
       <w:r>
         <w:rPr>
           <w:sz w:val="17"/>
           <w:szCs w:val="17"/>
         </w:rPr>
-        <w:t xml:space="preserve">A China segurou vendas de fosfatados e de ureia para priorizar o abastecimento interno; a Rússia também limitou embarques. Como o Brasil importa cerca de 85% dos fertilizantes, essas restrições pressionam preço e oferta.</w:t>
+        <w:t xml:space="preserve">O Brasil importa cerca de 85% dos fertilizantes. Em 2026 as compras da safra 2026/27 atrasaram, e o produtor ainda descoberto pode enfrentar preço e disponibilidade piores ao acelerar as aquisições.</w:t>
+      </w:r>
+    </w:p>
+    <w:p>
+      <w:pPr>
+        <w:spacing w:after="80" w:before="40"/>
+        <w:jc w:val="both"/>
+      </w:pPr>
+      <w:r>
+        <w:rPr>
+          <w:sz w:val="17"/>
+          <w:szCs w:val="17"/>
+        </w:rPr>
+        <w:t xml:space="preserve">Referências de portos no meio do ano: a ureia recuou para a faixa de US$ 410–430/t CFR após ter passado de US$ 700/t no auge; o MAP seguiu pressionado, negociado próximo de US$ 850–900/t; o KCl manteve-se relativamente estável, em torno de US$ 380–405/t (Itaú BBA / consultorias). O Ministério da Agricultura chegou a alertar para risco de déficit de 1 a 3 milhões de toneladas de fosfatados em 2026.</w:t>
+      </w:r>
+    </w:p>
+    <w:p>
+      <w:pPr>
+        <w:spacing w:after="40" w:before="40"/>
+      </w:pPr>
+      <w:r>
+        <w:rPr>
+          <w:b/>
+          <w:bCs/>
+          <w:color w:val="1E2A44"/>
+          <w:sz w:val="18"/>
+          <w:szCs w:val="18"/>
+        </w:rPr>
+        <w:t xml:space="preserve">O que esperar nos próximos meses:</w:t>
       </w:r>
     </w:p>
     <w:p>
@@ -2233,19 +2261,10 @@
       </w:pPr>
       <w:r>
         <w:rPr>
-          <w:b/>
-          <w:bCs/>
           <w:sz w:val="17"/>
           <w:szCs w:val="17"/>
         </w:rPr>
-        <w:t xml:space="preserve">Frete marítimo elevado: </w:t>
-      </w:r>
-      <w:r>
-        <w:rPr>
-          <w:sz w:val="17"/>
-          <w:szCs w:val="17"/>
-        </w:rPr>
-        <w:t xml:space="preserve">O desvio de rotas por conta do Estreito de Ormuz e a alta do petróleo encareceram o transporte, somando-se ao custo do produto na chegada ao Brasil.</w:t>
+        <w:t xml:space="preserve">Ureia (nitrogenados): cenário mais calmo após o recuo, mas ainda sensível a choques geopolíticos e ao gás natural — sem folga estrutural de oferta.</w:t>
       </w:r>
     </w:p>
     <w:p>
@@ -2259,19 +2278,10 @@
       </w:pPr>
       <w:r>
         <w:rPr>
-          <w:b/>
-          <w:bCs/>
           <w:sz w:val="17"/>
           <w:szCs w:val="17"/>
         </w:rPr>
-        <w:t xml:space="preserve">Demanda global forte na janela de compras: </w:t>
-      </w:r>
-      <w:r>
-        <w:rPr>
-          <w:sz w:val="17"/>
-          <w:szCs w:val="17"/>
-        </w:rPr>
-        <w:t xml:space="preserve">A ampliação de compras de EUA, Índia e Brasil para a safra 2026/27 sustentou as cotações internacionais no momento em que o país mais precisa importar.</w:t>
+        <w:t xml:space="preserve">MAP (fosfatados): é hoje o produto mais crítico; a pressão deve persistir enquanto durarem as restrições chinesas e a escassez de enxofre, com risco de faltar produto no pico de plantio (set–out).</w:t>
       </w:r>
     </w:p>
     <w:p>
@@ -2285,47 +2295,10 @@
       </w:pPr>
       <w:r>
         <w:rPr>
-          <w:b/>
-          <w:bCs/>
           <w:sz w:val="17"/>
           <w:szCs w:val="17"/>
         </w:rPr>
-        <w:t xml:space="preserve">Fosfatados e escassez de enxofre: </w:t>
-      </w:r>
-      <w:r>
-        <w:rPr>
-          <w:sz w:val="17"/>
-          <w:szCs w:val="17"/>
-        </w:rPr>
-        <w:t xml:space="preserve">Além da retração chinesa, a oferta restrita de fosfato e a falta de enxofre no mercado internacional mantêm o MAP pressionado.</w:t>
-      </w:r>
-    </w:p>
-    <w:p>
-      <w:pPr>
-        <w:spacing w:after="80" w:before="40"/>
-        <w:jc w:val="both"/>
-      </w:pPr>
-      <w:r>
-        <w:rPr>
-          <w:sz w:val="17"/>
-          <w:szCs w:val="17"/>
-        </w:rPr>
-        <w:t xml:space="preserve">Segundo o Banco Central, a ureia granular entregue no Brasil subiu cerca de 50% em maio ante a média de jan–fev/2026; no mesmo intervalo o MAP avançou ~29,7% e o KCl ~9,7% — evidência de que a pressão foi maior nos nitrogenados. O Itaú BBA chegou a apontar ureia a US$ 710/t no porto brasileiro, alta de ~50% em 30 dias.</w:t>
-      </w:r>
-    </w:p>
-    <w:p>
-      <w:pPr>
-        <w:spacing w:after="40" w:before="40"/>
-      </w:pPr>
-      <w:r>
-        <w:rPr>
-          <w:b/>
-          <w:bCs/>
-          <w:color w:val="1E2A44"/>
-          <w:sz w:val="18"/>
-          <w:szCs w:val="18"/>
-        </w:rPr>
-        <w:t xml:space="preserve">O que esperar nos próximos meses:</w:t>
+        <w:t xml:space="preserve">KCl (potássio): segmento mais equilibrado e com importação recorde; preços relativamente estáveis, embora manutenções industriais no 2º semestre possam alterar o equilíbrio.</w:t>
       </w:r>
     </w:p>
     <w:p>
@@ -2342,7 +2315,7 @@
           <w:sz w:val="17"/>
           <w:szCs w:val="17"/>
         </w:rPr>
-        <w:t xml:space="preserve">O cenário ficou menos turbulento a partir de julho, com a retomada das exportações de ureia pela China e a redução das tensões geopolíticas — mas o mercado segue muito sensível a qualquer mudança externa.</w:t>
+        <w:t xml:space="preserve">Estratégia sugerida por analistas: evitar ficar descoberto — garantir disponibilidade de fosfatados pode importar mais que o preço; escalonar compras, priorizar KCl (mais líquido) e avaliar substitutos de fósforo como SSP/TSP.</w:t>
       </w:r>
     </w:p>
     <w:p>
@@ -2359,7 +2332,22 @@
           <w:sz w:val="17"/>
           <w:szCs w:val="17"/>
         </w:rPr>
-        <w:t xml:space="preserve">Para o 3º trimestre de 2026, a StoneX projeta que a normalização gradual da navegação por Ormuz e o retorno das exportações chinesas melhorem o abastecimento mundial, com fundamentos distintos por segmento.</w:t>
+        <w:t xml:space="preserve">Riscos a monitorar: prazo real da suspensão das restrições chinesas, evolução do conflito no Oriente Médio, preço do enxofre e câmbio.</w:t>
+      </w:r>
+    </w:p>
+    <w:p>
+      <w:pPr>
+        <w:spacing w:after="20" w:before="60"/>
+      </w:pPr>
+      <w:r>
+        <w:rPr>
+          <w:b/>
+          <w:bCs/>
+          <w:color w:val="1E2A44"/>
+          <w:sz w:val="17"/>
+          <w:szCs w:val="17"/>
+        </w:rPr>
+        <w:t xml:space="preserve">Notícias recentes do mercado (atualização automática):</w:t>
       </w:r>
     </w:p>
     <w:p>
@@ -2373,10 +2361,10 @@
       </w:pPr>
       <w:r>
         <w:rPr>
-          <w:sz w:val="17"/>
-          <w:szCs w:val="17"/>
-        </w:rPr>
-        <w:t xml:space="preserve">Nitrogenados: podem ter recuperação de preços com a recomposição de estoques e a volta da demanda global. Fosfatados: seguem pressionados pela oferta restrita e pelo enxofre caro. Potássio (KCl): mercado relativamente equilibrado.</w:t>
+          <w:sz w:val="16"/>
+          <w:szCs w:val="16"/>
+        </w:rPr>
+        <w:t xml:space="preserve">04/08/2026 — El Niño reforça importância da nutrição das plantas para reduzir perdas no campo</w:t>
       </w:r>
     </w:p>
     <w:p>
@@ -2390,10 +2378,10 @@
       </w:pPr>
       <w:r>
         <w:rPr>
-          <w:sz w:val="17"/>
-          <w:szCs w:val="17"/>
-        </w:rPr>
-        <w:t xml:space="preserve">Estratégia sugerida por analistas: escalonar as compras, avançar mais no potássio e fazer aquisições parciais de nitrogênio e fósforo, aproveitando janelas e relações de troca favoráveis, em vez de tentar acertar o menor preço.</w:t>
+          <w:sz w:val="16"/>
+          <w:szCs w:val="16"/>
+        </w:rPr>
+        <w:t xml:space="preserve">30/06/2026 — Mercado de fertilizantes amplia movimento de baixa com recuo da ureia, MAP e cloreto de potássio</w:t>
       </w:r>
     </w:p>
     <w:p>
@@ -2407,25 +2395,10 @@
       </w:pPr>
       <w:r>
         <w:rPr>
-          <w:sz w:val="17"/>
-          <w:szCs w:val="17"/>
-        </w:rPr>
-        <w:t xml:space="preserve">Riscos a monitorar: evolução do conflito no Oriente Médio, novas restrições da China (há rumores inclusive sobre sulfato de amônio, 100% importado do país) e a taxa de câmbio.</w:t>
-      </w:r>
-    </w:p>
-    <w:p>
-      <w:pPr>
-        <w:spacing w:after="20" w:before="60"/>
-      </w:pPr>
-      <w:r>
-        <w:rPr>
-          <w:b/>
-          <w:bCs/>
-          <w:color w:val="1E2A44"/>
-          <w:sz w:val="17"/>
-          <w:szCs w:val="17"/>
-        </w:rPr>
-        <w:t xml:space="preserve">Notícias recentes do mercado (atualização automática):</w:t>
+          <w:sz w:val="16"/>
+          <w:szCs w:val="16"/>
+        </w:rPr>
+        <w:t xml:space="preserve">19/06/2026 — Importação dos EUA de fertilizante com origem no Oriente Médio zera em maio</w:t>
       </w:r>
     </w:p>
     <w:p>
@@ -2442,57 +2415,6 @@
           <w:sz w:val="16"/>
           <w:szCs w:val="16"/>
         </w:rPr>
-        <w:t xml:space="preserve">04/08/2026 — El Niño reforça importância da nutrição das plantas para reduzir perdas no campo</w:t>
-      </w:r>
-    </w:p>
-    <w:p>
-      <w:pPr>
-        <w:pStyle w:val="ListParagraph"/>
-        <w:numPr>
-          <w:ilvl w:val="0"/>
-          <w:numId w:val="2"/>
-        </w:numPr>
-        <w:spacing w:after="70"/>
-      </w:pPr>
-      <w:r>
-        <w:rPr>
-          <w:sz w:val="16"/>
-          <w:szCs w:val="16"/>
-        </w:rPr>
-        <w:t xml:space="preserve">30/06/2026 — Mercado de fertilizantes amplia movimento de baixa com recuo da ureia, MAP e cloreto de potássio</w:t>
-      </w:r>
-    </w:p>
-    <w:p>
-      <w:pPr>
-        <w:pStyle w:val="ListParagraph"/>
-        <w:numPr>
-          <w:ilvl w:val="0"/>
-          <w:numId w:val="2"/>
-        </w:numPr>
-        <w:spacing w:after="70"/>
-      </w:pPr>
-      <w:r>
-        <w:rPr>
-          <w:sz w:val="16"/>
-          <w:szCs w:val="16"/>
-        </w:rPr>
-        <w:t xml:space="preserve">19/06/2026 — Importação dos EUA de fertilizante com origem no Oriente Médio zera em maio</w:t>
-      </w:r>
-    </w:p>
-    <w:p>
-      <w:pPr>
-        <w:pStyle w:val="ListParagraph"/>
-        <w:numPr>
-          <w:ilvl w:val="0"/>
-          <w:numId w:val="2"/>
-        </w:numPr>
-        <w:spacing w:after="70"/>
-      </w:pPr>
-      <w:r>
-        <w:rPr>
-          <w:sz w:val="16"/>
-          <w:szCs w:val="16"/>
-        </w:rPr>
         <w:t xml:space="preserve">16/06/2026 — Ureia cai mais de 40% e volta ao nível pré-crise com avanço de acordo entre EUA e Irã</w:t>
       </w:r>
     </w:p>
@@ -2521,7 +2443,7 @@
           <w:sz w:val="15"/>
           <w:szCs w:val="15"/>
         </w:rPr>
-        <w:t xml:space="preserve">Itaú BBA / CNN Brasil — ureia a US$ 710/t no porto (+50% em 30 dias) (abr/2026); Banco Central, via Agrolink — ureia +50%, MAP +29,7%, KCl +9,7% em maio (ago/2026); CEPEA-Esalq/USP — Oriente Médio concentra ~40% do comércio marítimo de ureia (2026); StoneX — perspectivas de fertilizantes para o 3º trimestre de 2026 (jul/2026); Gazeta do Povo — restrições de China e Rússia e dependência brasileira (~85%) (abr/2026).</w:t>
+        <w:t xml:space="preserve">Itaú BBA (Agro Mensal), via NN Online — ureia recua; MAP ~US$ 900/t; enxofre ~US$ 1.250/t; KCl ~US$ 405/t (jun/2026); StoneX, via Minuto MT / AF News — enxofre -42% no 1º semestre e risco de abastecimento de fosfatados (jul/2026); CNA — restrições chinesas ao MAP e queda de 13,7% na importação (jan–ago) (2026); Spazio Agro — China pode manter restrições até o 2º semestre; alerta do MAPA de déficit de 1–3 Mt (abr/2026); Conecta Agro — ureia teve a maior disparada percentual de 2026, com correção posterior (ago/2026).</w:t>
       </w:r>
     </w:p>
     <w:p>
@@ -2582,7 +2504,7 @@
           <w:sz w:val="15"/>
           <w:szCs w:val="15"/>
         </w:rPr>
-        <w:t xml:space="preserve">Fontes automáticas: AwesomeAPI (câmbio), CEPEA/ESALQ (soja), ANP (diesel), stooq (BDI). Fertilizantes e gás natural: override manual (fertilizers-override.json). Status desta execução: {"bdi":"ok (HANDYBULK, 14/08/2026)","sojaRegional":"ok (Oeste da Bahia/BA (AIBA))","soja":"ok (Noticias Agricolas / CEPEA-PR 14/08/2026)","diesel":"falha: Petrobras: HTTP 403 | PortalCanaa: HTTP 403","cambio":"ok (BCB PTAX)","_comexPeriodo":"com-filtro-ncm | 2026-07 | 4 linhas","_comexNcmsEncontrados":"31042090,31021010,31054000,31042010","ureia":"ok (ComexStat 2026-07)","map":"ok (ComexStat 2026-07)","kcl":"ok (ComexStat 2026-07)","gas":"ok (EIA Henry Hub)","noticias":"ok (40 de https://www.noticiasagricolas.com.br/tags/fertilizantes/)"}.</w:t>
+        <w:t xml:space="preserve">Fontes automáticas: AwesomeAPI (câmbio), CEPEA/ESALQ (soja), ANP (diesel), stooq (BDI). Fertilizantes e gás natural: override manual (fertilizers-override.json). Status desta execução: {"soja":"ok (Noticias Agricolas / CEPEA-PR 17/08/2026)","sojaRegional":"ok (Oeste da Bahia/BA (AIBA))","bdi":"ok (HANDYBULK, 17/08/2026)","cambio":"ok (BCB PTAX)","diesel":"falha: Petrobras: HTTP 403 | PortalCanaa: HTTP 403","_comexPeriodo":"com-filtro-ncm | 2026-07 | 4 linhas","_comexNcmsEncontrados":"31042090,31021010,31054000,31042010","ureia":"ok (ComexStat 2026-07)","map":"ok (ComexStat 2026-07)","kcl":"ok (ComexStat 2026-07)","gas":"ok (EIA Henry Hub)","noticias":"ok (40 de https://www.noticiasagricolas.com.br/tags/fertilizantes/)"}.</w:t>
       </w:r>
     </w:p>
     <w:p>

</xml_diff>

<commit_message>
chore: atualizacao automatica 2026-08-24
</commit_message>
<xml_diff>
--- a/relatorio_executivo.docx
+++ b/relatorio_executivo.docx
@@ -46,7 +46,7 @@
           <w:sz w:val="17"/>
           <w:szCs w:val="17"/>
         </w:rPr>
-        <w:t xml:space="preserve">Equipe de Planejamento, Controle e Pesquisa Florestal  ·  Referência: Ago/2026  ·  Gerado em 18/08/2026, 17:28:40</w:t>
+        <w:t xml:space="preserve">Equipe de Planejamento, Controle e Pesquisa Florestal  ·  Referência: Ago/2026  ·  Gerado em 24/08/2026, 10:31:55</w:t>
       </w:r>
     </w:p>
     <w:p>
@@ -91,14 +91,14 @@
           <w:sz w:val="19"/>
           <w:szCs w:val="19"/>
         </w:rPr>
-        <w:t xml:space="preserve">O dólar está em R$ 5,20 (-0,4%) e a soja CEPEA em R$ 141,69/saca. </w:t>
+        <w:t xml:space="preserve">O dólar está em R$ 5,16 (-0,8%) e a soja CEPEA em R$ 146,70/saca. </w:t>
       </w:r>
       <w:r>
         <w:rPr>
           <w:sz w:val="19"/>
           <w:szCs w:val="19"/>
         </w:rPr>
-        <w:t xml:space="preserve">A relação de troca soja/MAP é de 31,2 sacas/t.</w:t>
+        <w:t xml:space="preserve">A relação de troca soja/MAP é de 29,9 sacas/t.</w:t>
       </w:r>
     </w:p>
     <w:p>
@@ -864,7 +864,7 @@
                 <w:sz w:val="18"/>
                 <w:szCs w:val="18"/>
               </w:rPr>
-              <w:t xml:space="preserve">R$ 141,69/sc</w:t>
+              <w:t xml:space="preserve">R$ 146,70/sc</w:t>
             </w:r>
           </w:p>
         </w:tc>
@@ -897,7 +897,7 @@
                 <w:sz w:val="18"/>
                 <w:szCs w:val="18"/>
               </w:rPr>
-              <w:t xml:space="preserve">+0,4%</w:t>
+              <w:t xml:space="preserve">+3,5%</w:t>
             </w:r>
           </w:p>
         </w:tc>
@@ -989,7 +989,7 @@
                 <w:sz w:val="18"/>
                 <w:szCs w:val="18"/>
               </w:rPr>
-              <w:t xml:space="preserve">R$ 134,25/sc</w:t>
+              <w:t xml:space="preserve">R$ 138,75/sc</w:t>
             </w:r>
           </w:p>
         </w:tc>
@@ -1022,7 +1022,7 @@
                 <w:sz w:val="18"/>
                 <w:szCs w:val="18"/>
               </w:rPr>
-              <w:t xml:space="preserve">+0,7%</w:t>
+              <w:t xml:space="preserve">+3,4%</w:t>
             </w:r>
           </w:p>
         </w:tc>
@@ -1114,7 +1114,7 @@
                 <w:sz w:val="18"/>
                 <w:szCs w:val="18"/>
               </w:rPr>
-              <w:t xml:space="preserve">31,2 sc/t</w:t>
+              <w:t xml:space="preserve">29,9 sc/t</w:t>
             </w:r>
           </w:p>
         </w:tc>
@@ -1147,7 +1147,7 @@
                 <w:sz w:val="18"/>
                 <w:szCs w:val="18"/>
               </w:rPr>
-              <w:t xml:space="preserve">-1,0%</w:t>
+              <w:t xml:space="preserve">-4,2%</w:t>
             </w:r>
           </w:p>
         </w:tc>
@@ -1239,7 +1239,7 @@
                 <w:sz w:val="18"/>
                 <w:szCs w:val="18"/>
               </w:rPr>
-              <w:t xml:space="preserve">16,1 sc/t</w:t>
+              <w:t xml:space="preserve">15,4 sc/t</w:t>
             </w:r>
           </w:p>
         </w:tc>
@@ -1528,7 +1528,7 @@
                 <w:sz w:val="18"/>
                 <w:szCs w:val="18"/>
               </w:rPr>
-              <w:t xml:space="preserve">5,20</w:t>
+              <w:t xml:space="preserve">5,16</w:t>
             </w:r>
           </w:p>
         </w:tc>
@@ -1561,7 +1561,7 @@
                 <w:sz w:val="18"/>
                 <w:szCs w:val="18"/>
               </w:rPr>
-              <w:t xml:space="preserve">-0,4%</w:t>
+              <w:t xml:space="preserve">-0,8%</w:t>
             </w:r>
           </w:p>
         </w:tc>
@@ -1653,132 +1653,7 @@
                 <w:sz w:val="18"/>
                 <w:szCs w:val="18"/>
               </w:rPr>
-              <w:t xml:space="preserve">US$ 2,79</w:t>
-            </w:r>
-          </w:p>
-        </w:tc>
-        <w:tc>
-          <w:tcPr>
-            <w:tcW w:type="dxa" w:w="1980"/>
-            <w:tcBorders>
-              <w:top w:val="single" w:color="DDDDDD" w:sz="1"/>
-              <w:left w:val="single" w:color="DDDDDD" w:sz="1"/>
-              <w:bottom w:val="single" w:color="DDDDDD" w:sz="1"/>
-              <w:right w:val="single" w:color="DDDDDD" w:sz="1"/>
-            </w:tcBorders>
-            <w:tcMar>
-              <w:top w:type="dxa" w:w="55"/>
-              <w:left w:type="dxa" w:w="110"/>
-              <w:bottom w:type="dxa" w:w="55"/>
-              <w:right w:type="dxa" w:w="110"/>
-            </w:tcMar>
-            <w:vAlign w:val="center"/>
-          </w:tcPr>
-          <w:p>
-            <w:pPr>
-              <w:jc w:val="right"/>
-            </w:pPr>
-            <w:r>
-              <w:rPr>
-                <w:b/>
-                <w:bCs/>
-                <w:color w:val="6B7585"/>
-                <w:sz w:val="18"/>
-                <w:szCs w:val="18"/>
-              </w:rPr>
-              <w:t xml:space="preserve">0,0%</w:t>
-            </w:r>
-          </w:p>
-        </w:tc>
-        <w:tc>
-          <w:tcPr>
-            <w:tcW w:type="dxa" w:w="2000"/>
-            <w:tcBorders>
-              <w:top w:val="single" w:color="DDDDDD" w:sz="1"/>
-              <w:left w:val="single" w:color="DDDDDD" w:sz="1"/>
-              <w:bottom w:val="single" w:color="DDDDDD" w:sz="1"/>
-              <w:right w:val="single" w:color="DDDDDD" w:sz="1"/>
-            </w:tcBorders>
-            <w:tcMar>
-              <w:top w:type="dxa" w:w="55"/>
-              <w:left w:type="dxa" w:w="110"/>
-              <w:bottom w:type="dxa" w:w="55"/>
-              <w:right w:type="dxa" w:w="110"/>
-            </w:tcMar>
-            <w:vAlign w:val="center"/>
-          </w:tcPr>
-          <w:p>
-            <w:pPr>
-              <w:jc w:val="left"/>
-            </w:pPr>
-            <w:r>
-              <w:rPr>
-                <w:sz w:val="17"/>
-                <w:szCs w:val="17"/>
-              </w:rPr>
-              <w:t xml:space="preserve">Pressiona ureia</w:t>
-            </w:r>
-          </w:p>
-        </w:tc>
-      </w:tr>
-      <w:tr>
-        <w:tc>
-          <w:tcPr>
-            <w:tcW w:type="dxa" w:w="3400"/>
-            <w:tcBorders>
-              <w:top w:val="single" w:color="DDDDDD" w:sz="1"/>
-              <w:left w:val="single" w:color="DDDDDD" w:sz="1"/>
-              <w:bottom w:val="single" w:color="DDDDDD" w:sz="1"/>
-              <w:right w:val="single" w:color="DDDDDD" w:sz="1"/>
-            </w:tcBorders>
-            <w:tcMar>
-              <w:top w:type="dxa" w:w="55"/>
-              <w:left w:type="dxa" w:w="110"/>
-              <w:bottom w:type="dxa" w:w="55"/>
-              <w:right w:type="dxa" w:w="110"/>
-            </w:tcMar>
-            <w:vAlign w:val="center"/>
-          </w:tcPr>
-          <w:p>
-            <w:pPr>
-              <w:jc w:val="left"/>
-            </w:pPr>
-            <w:r>
-              <w:rPr>
-                <w:sz w:val="18"/>
-                <w:szCs w:val="18"/>
-              </w:rPr>
-              <w:t xml:space="preserve">Frete Marítimo (BDI)</w:t>
-            </w:r>
-          </w:p>
-        </w:tc>
-        <w:tc>
-          <w:tcPr>
-            <w:tcW w:type="dxa" w:w="1980"/>
-            <w:tcBorders>
-              <w:top w:val="single" w:color="DDDDDD" w:sz="1"/>
-              <w:left w:val="single" w:color="DDDDDD" w:sz="1"/>
-              <w:bottom w:val="single" w:color="DDDDDD" w:sz="1"/>
-              <w:right w:val="single" w:color="DDDDDD" w:sz="1"/>
-            </w:tcBorders>
-            <w:tcMar>
-              <w:top w:type="dxa" w:w="55"/>
-              <w:left w:type="dxa" w:w="110"/>
-              <w:bottom w:type="dxa" w:w="55"/>
-              <w:right w:type="dxa" w:w="110"/>
-            </w:tcMar>
-            <w:vAlign w:val="center"/>
-          </w:tcPr>
-          <w:p>
-            <w:pPr>
-              <w:jc w:val="right"/>
-            </w:pPr>
-            <w:r>
-              <w:rPr>
-                <w:sz w:val="18"/>
-                <w:szCs w:val="18"/>
-              </w:rPr>
-              <w:t xml:space="preserve">2.878 pts</w:t>
+              <w:t xml:space="preserve">US$ 2,82</w:t>
             </w:r>
           </w:p>
         </w:tc>
@@ -1811,7 +1686,132 @@
                 <w:sz w:val="18"/>
                 <w:szCs w:val="18"/>
               </w:rPr>
-              <w:t xml:space="preserve">+0,5%</w:t>
+              <w:t xml:space="preserve">+1,1%</w:t>
+            </w:r>
+          </w:p>
+        </w:tc>
+        <w:tc>
+          <w:tcPr>
+            <w:tcW w:type="dxa" w:w="2000"/>
+            <w:tcBorders>
+              <w:top w:val="single" w:color="DDDDDD" w:sz="1"/>
+              <w:left w:val="single" w:color="DDDDDD" w:sz="1"/>
+              <w:bottom w:val="single" w:color="DDDDDD" w:sz="1"/>
+              <w:right w:val="single" w:color="DDDDDD" w:sz="1"/>
+            </w:tcBorders>
+            <w:tcMar>
+              <w:top w:type="dxa" w:w="55"/>
+              <w:left w:type="dxa" w:w="110"/>
+              <w:bottom w:type="dxa" w:w="55"/>
+              <w:right w:type="dxa" w:w="110"/>
+            </w:tcMar>
+            <w:vAlign w:val="center"/>
+          </w:tcPr>
+          <w:p>
+            <w:pPr>
+              <w:jc w:val="left"/>
+            </w:pPr>
+            <w:r>
+              <w:rPr>
+                <w:sz w:val="17"/>
+                <w:szCs w:val="17"/>
+              </w:rPr>
+              <w:t xml:space="preserve">Pressiona ureia</w:t>
+            </w:r>
+          </w:p>
+        </w:tc>
+      </w:tr>
+      <w:tr>
+        <w:tc>
+          <w:tcPr>
+            <w:tcW w:type="dxa" w:w="3400"/>
+            <w:tcBorders>
+              <w:top w:val="single" w:color="DDDDDD" w:sz="1"/>
+              <w:left w:val="single" w:color="DDDDDD" w:sz="1"/>
+              <w:bottom w:val="single" w:color="DDDDDD" w:sz="1"/>
+              <w:right w:val="single" w:color="DDDDDD" w:sz="1"/>
+            </w:tcBorders>
+            <w:tcMar>
+              <w:top w:type="dxa" w:w="55"/>
+              <w:left w:type="dxa" w:w="110"/>
+              <w:bottom w:type="dxa" w:w="55"/>
+              <w:right w:type="dxa" w:w="110"/>
+            </w:tcMar>
+            <w:vAlign w:val="center"/>
+          </w:tcPr>
+          <w:p>
+            <w:pPr>
+              <w:jc w:val="left"/>
+            </w:pPr>
+            <w:r>
+              <w:rPr>
+                <w:sz w:val="18"/>
+                <w:szCs w:val="18"/>
+              </w:rPr>
+              <w:t xml:space="preserve">Frete Marítimo (BDI)</w:t>
+            </w:r>
+          </w:p>
+        </w:tc>
+        <w:tc>
+          <w:tcPr>
+            <w:tcW w:type="dxa" w:w="1980"/>
+            <w:tcBorders>
+              <w:top w:val="single" w:color="DDDDDD" w:sz="1"/>
+              <w:left w:val="single" w:color="DDDDDD" w:sz="1"/>
+              <w:bottom w:val="single" w:color="DDDDDD" w:sz="1"/>
+              <w:right w:val="single" w:color="DDDDDD" w:sz="1"/>
+            </w:tcBorders>
+            <w:tcMar>
+              <w:top w:type="dxa" w:w="55"/>
+              <w:left w:type="dxa" w:w="110"/>
+              <w:bottom w:type="dxa" w:w="55"/>
+              <w:right w:type="dxa" w:w="110"/>
+            </w:tcMar>
+            <w:vAlign w:val="center"/>
+          </w:tcPr>
+          <w:p>
+            <w:pPr>
+              <w:jc w:val="right"/>
+            </w:pPr>
+            <w:r>
+              <w:rPr>
+                <w:sz w:val="18"/>
+                <w:szCs w:val="18"/>
+              </w:rPr>
+              <w:t xml:space="preserve">2.841 pts</w:t>
+            </w:r>
+          </w:p>
+        </w:tc>
+        <w:tc>
+          <w:tcPr>
+            <w:tcW w:type="dxa" w:w="1980"/>
+            <w:tcBorders>
+              <w:top w:val="single" w:color="DDDDDD" w:sz="1"/>
+              <w:left w:val="single" w:color="DDDDDD" w:sz="1"/>
+              <w:bottom w:val="single" w:color="DDDDDD" w:sz="1"/>
+              <w:right w:val="single" w:color="DDDDDD" w:sz="1"/>
+            </w:tcBorders>
+            <w:tcMar>
+              <w:top w:type="dxa" w:w="55"/>
+              <w:left w:type="dxa" w:w="110"/>
+              <w:bottom w:type="dxa" w:w="55"/>
+              <w:right w:type="dxa" w:w="110"/>
+            </w:tcMar>
+            <w:vAlign w:val="center"/>
+          </w:tcPr>
+          <w:p>
+            <w:pPr>
+              <w:jc w:val="right"/>
+            </w:pPr>
+            <w:r>
+              <w:rPr>
+                <w:b/>
+                <w:bCs/>
+                <w:color w:val="2F8A5F"/>
+                <w:sz w:val="18"/>
+                <w:szCs w:val="18"/>
+              </w:rPr>
+              <w:t xml:space="preserve">-1,3%</w:t>
             </w:r>
           </w:p>
         </w:tc>
@@ -2013,83 +2013,7 @@
           <w:sz w:val="18"/>
           <w:szCs w:val="18"/>
         </w:rPr>
-        <w:t xml:space="preserve">alta de +0,5% no período.</w:t>
-      </w:r>
-    </w:p>
-    <w:p>
-      <w:pPr>
-        <w:pBdr>
-          <w:bottom w:val="single" w:color="1E2A44" w:sz="6" w:space="2"/>
-        </w:pBdr>
-        <w:spacing w:after="100" w:before="220"/>
-      </w:pPr>
-      <w:r>
-        <w:rPr>
-          <w:b/>
-          <w:bCs/>
-          <w:color w:val="1E2A44"/>
-          <w:sz w:val="22"/>
-          <w:szCs w:val="22"/>
-        </w:rPr>
-        <w:t xml:space="preserve">6. Contexto de Mercado — Causas da Alta e Perspectivas</w:t>
-      </w:r>
-    </w:p>
-    <w:p>
-      <w:pPr>
-        <w:spacing w:after="60"/>
-      </w:pPr>
-      <w:r>
-        <w:rPr>
-          <w:b/>
-          <w:bCs/>
-          <w:color w:val="1E2A44"/>
-          <w:sz w:val="18"/>
-          <w:szCs w:val="18"/>
-        </w:rPr>
-        <w:t xml:space="preserve">Por que os fertilizantes subiram — e o que esperar · atualizado em Agosto/2026 · revisão manual.</w:t>
-      </w:r>
-    </w:p>
-    <w:p>
-      <w:pPr>
-        <w:spacing w:after="60"/>
-        <w:jc w:val="both"/>
-      </w:pPr>
-      <w:r>
-        <w:rPr>
-          <w:sz w:val="18"/>
-          <w:szCs w:val="18"/>
-        </w:rPr>
-        <w:t xml:space="preserve">O eixo da pressão mudou ao longo de 2026: a ureia recuou dos picos após o alívio das tensões no Oriente Médio, mas os fosfatados (MAP) tornaram-se o ponto crítico — caros e de oferta apertada — por causa das restrições da China e da escassez de enxofre, às vésperas da safra 2026/27.</w:t>
-      </w:r>
-    </w:p>
-    <w:p>
-      <w:pPr>
-        <w:spacing w:after="80"/>
-      </w:pPr>
-      <w:r>
-        <w:rPr>
-          <w:i/>
-          <w:iCs/>
-          <w:color w:val="6B7585"/>
-          <w:sz w:val="17"/>
-          <w:szCs w:val="17"/>
-        </w:rPr>
-        <w:t xml:space="preserve">Leitura automática: sem novo fechamento de fertilizantes desde a leitura anterior (jul/26).</w:t>
-      </w:r>
-    </w:p>
-    <w:p>
-      <w:pPr>
-        <w:spacing w:after="40"/>
-      </w:pPr>
-      <w:r>
-        <w:rPr>
-          <w:b/>
-          <w:bCs/>
-          <w:color w:val="1E2A44"/>
-          <w:sz w:val="18"/>
-          <w:szCs w:val="18"/>
-        </w:rPr>
-        <w:t xml:space="preserve">Principais causas da alta:</w:t>
+        <w:t xml:space="preserve">queda de -1,3% no período.</w:t>
       </w:r>
     </w:p>
     <w:p>
@@ -2105,17 +2029,17 @@
         <w:rPr>
           <w:b/>
           <w:bCs/>
-          <w:sz w:val="17"/>
-          <w:szCs w:val="17"/>
-        </w:rPr>
-        <w:t xml:space="preserve">Restrições da China aos fosfatados: </w:t>
-      </w:r>
-      <w:r>
-        <w:rPr>
-          <w:sz w:val="17"/>
-          <w:szCs w:val="17"/>
-        </w:rPr>
-        <w:t xml:space="preserve">A China suspendeu boa parte das exportações de fosfatados para priorizar o abastecimento interno; fontes do setor estimam que de 40% a 80% dos embarques estejam bloqueados ou sob cota, e as restrições podem durar até meados do segundo semestre de 2026.</w:t>
+          <w:sz w:val="18"/>
+          <w:szCs w:val="18"/>
+        </w:rPr>
+        <w:t xml:space="preserve">Gás Natural: </w:t>
+      </w:r>
+      <w:r>
+        <w:rPr>
+          <w:sz w:val="18"/>
+          <w:szCs w:val="18"/>
+        </w:rPr>
+        <w:t xml:space="preserve">alta de +1,1% no período.</w:t>
       </w:r>
     </w:p>
     <w:p>
@@ -2131,17 +2055,93 @@
         <w:rPr>
           <w:b/>
           <w:bCs/>
+          <w:sz w:val="18"/>
+          <w:szCs w:val="18"/>
+        </w:rPr>
+        <w:t xml:space="preserve">Dólar: </w:t>
+      </w:r>
+      <w:r>
+        <w:rPr>
+          <w:sz w:val="18"/>
+          <w:szCs w:val="18"/>
+        </w:rPr>
+        <w:t xml:space="preserve">queda de -0,8% no período.</w:t>
+      </w:r>
+    </w:p>
+    <w:p>
+      <w:pPr>
+        <w:pBdr>
+          <w:bottom w:val="single" w:color="1E2A44" w:sz="6" w:space="2"/>
+        </w:pBdr>
+        <w:spacing w:after="100" w:before="220"/>
+      </w:pPr>
+      <w:r>
+        <w:rPr>
+          <w:b/>
+          <w:bCs/>
+          <w:color w:val="1E2A44"/>
+          <w:sz w:val="22"/>
+          <w:szCs w:val="22"/>
+        </w:rPr>
+        <w:t xml:space="preserve">6. Contexto de Mercado — Causas da Alta e Perspectivas</w:t>
+      </w:r>
+    </w:p>
+    <w:p>
+      <w:pPr>
+        <w:spacing w:after="60"/>
+      </w:pPr>
+      <w:r>
+        <w:rPr>
+          <w:b/>
+          <w:bCs/>
+          <w:color w:val="1E2A44"/>
+          <w:sz w:val="18"/>
+          <w:szCs w:val="18"/>
+        </w:rPr>
+        <w:t xml:space="preserve">Por que os fertilizantes subiram — e o que esperar · atualizado em Agosto/2026 · revisão manual.</w:t>
+      </w:r>
+    </w:p>
+    <w:p>
+      <w:pPr>
+        <w:spacing w:after="60"/>
+        <w:jc w:val="both"/>
+      </w:pPr>
+      <w:r>
+        <w:rPr>
+          <w:sz w:val="18"/>
+          <w:szCs w:val="18"/>
+        </w:rPr>
+        <w:t xml:space="preserve">O eixo da pressão mudou ao longo de 2026: a ureia recuou dos picos após o alívio das tensões no Oriente Médio, mas os fosfatados (MAP) tornaram-se o ponto crítico — caros e de oferta apertada — por causa das restrições da China e da escassez de enxofre, às vésperas da safra 2026/27.</w:t>
+      </w:r>
+    </w:p>
+    <w:p>
+      <w:pPr>
+        <w:spacing w:after="80"/>
+      </w:pPr>
+      <w:r>
+        <w:rPr>
+          <w:i/>
+          <w:iCs/>
+          <w:color w:val="6B7585"/>
           <w:sz w:val="17"/>
           <w:szCs w:val="17"/>
         </w:rPr>
-        <w:t xml:space="preserve">Escassez de enxofre: </w:t>
-      </w:r>
-      <w:r>
-        <w:rPr>
-          <w:sz w:val="17"/>
-          <w:szCs w:val="17"/>
-        </w:rPr>
-        <w:t xml:space="preserve">Insumo essencial do MAP, o enxofre chegou a cerca de US$ 1.250/t; os desembarques no Brasil no 1º semestre ficaram ~42% abaixo de 2025 (StoneX), levando fábricas a reduzir produção e apertando ainda mais a oferta de fosfatados.</w:t>
+        <w:t xml:space="preserve">Leitura automática: sem novo fechamento de fertilizantes desde a leitura anterior (jul/26).</w:t>
+      </w:r>
+    </w:p>
+    <w:p>
+      <w:pPr>
+        <w:spacing w:after="40"/>
+      </w:pPr>
+      <w:r>
+        <w:rPr>
+          <w:b/>
+          <w:bCs/>
+          <w:color w:val="1E2A44"/>
+          <w:sz w:val="18"/>
+          <w:szCs w:val="18"/>
+        </w:rPr>
+        <w:t xml:space="preserve">Principais causas da alta:</w:t>
       </w:r>
     </w:p>
     <w:p>
@@ -2160,14 +2160,14 @@
           <w:sz w:val="17"/>
           <w:szCs w:val="17"/>
         </w:rPr>
-        <w:t xml:space="preserve">Oferta russa e de outros polos reduzida: </w:t>
+        <w:t xml:space="preserve">Restrições da China aos fosfatados: </w:t>
       </w:r>
       <w:r>
         <w:rPr>
           <w:sz w:val="17"/>
           <w:szCs w:val="17"/>
         </w:rPr>
-        <w:t xml:space="preserve">Menor disponibilidade da Rússia, restrições no Marrocos e paralisações pontuais de produtoras limitam a oferta global de fósforo e sustentam o MAP em patamar elevado.</w:t>
+        <w:t xml:space="preserve">A China suspendeu boa parte das exportações de fosfatados para priorizar o abastecimento interno; fontes do setor estimam que de 40% a 80% dos embarques estejam bloqueados ou sob cota, e as restrições podem durar até meados do segundo semestre de 2026.</w:t>
       </w:r>
     </w:p>
     <w:p>
@@ -2186,14 +2186,14 @@
           <w:sz w:val="17"/>
           <w:szCs w:val="17"/>
         </w:rPr>
-        <w:t xml:space="preserve">Conflito no Oriente Médio (efeito decrescente): </w:t>
+        <w:t xml:space="preserve">Escassez de enxofre: </w:t>
       </w:r>
       <w:r>
         <w:rPr>
           <w:sz w:val="17"/>
           <w:szCs w:val="17"/>
         </w:rPr>
-        <w:t xml:space="preserve">Foi o principal motor da disparada da ureia no 1º semestre. Com o avanço do acordo entre EUA e Irã, o risco arrefeceu e a ureia recuou — mas o mercado segue cauteloso a novas tensões.</w:t>
+        <w:t xml:space="preserve">Insumo essencial do MAP, o enxofre chegou a cerca de US$ 1.250/t; os desembarques no Brasil no 1º semestre ficaram ~42% abaixo de 2025 (StoneX), levando fábricas a reduzir produção e apertando ainda mais a oferta de fosfatados.</w:t>
       </w:r>
     </w:p>
     <w:p>
@@ -2212,42 +2212,14 @@
           <w:sz w:val="17"/>
           <w:szCs w:val="17"/>
         </w:rPr>
-        <w:t xml:space="preserve">Dependência de importação e compras atrasadas: </w:t>
+        <w:t xml:space="preserve">Oferta russa e de outros polos reduzida: </w:t>
       </w:r>
       <w:r>
         <w:rPr>
           <w:sz w:val="17"/>
           <w:szCs w:val="17"/>
         </w:rPr>
-        <w:t xml:space="preserve">O Brasil importa cerca de 85% dos fertilizantes. Em 2026 as compras da safra 2026/27 atrasaram, e o produtor ainda descoberto pode enfrentar preço e disponibilidade piores ao acelerar as aquisições.</w:t>
-      </w:r>
-    </w:p>
-    <w:p>
-      <w:pPr>
-        <w:spacing w:after="80" w:before="40"/>
-        <w:jc w:val="both"/>
-      </w:pPr>
-      <w:r>
-        <w:rPr>
-          <w:sz w:val="17"/>
-          <w:szCs w:val="17"/>
-        </w:rPr>
-        <w:t xml:space="preserve">Referências de portos no meio do ano: a ureia recuou para a faixa de US$ 410–430/t CFR após ter passado de US$ 700/t no auge; o MAP seguiu pressionado, negociado próximo de US$ 850–900/t; o KCl manteve-se relativamente estável, em torno de US$ 380–405/t (Itaú BBA / consultorias). O Ministério da Agricultura chegou a alertar para risco de déficit de 1 a 3 milhões de toneladas de fosfatados em 2026.</w:t>
-      </w:r>
-    </w:p>
-    <w:p>
-      <w:pPr>
-        <w:spacing w:after="40" w:before="40"/>
-      </w:pPr>
-      <w:r>
-        <w:rPr>
-          <w:b/>
-          <w:bCs/>
-          <w:color w:val="1E2A44"/>
-          <w:sz w:val="18"/>
-          <w:szCs w:val="18"/>
-        </w:rPr>
-        <w:t xml:space="preserve">O que esperar nos próximos meses:</w:t>
+        <w:t xml:space="preserve">Menor disponibilidade da Rússia, restrições no Marrocos e paralisações pontuais de produtoras limitam a oferta global de fósforo e sustentam o MAP em patamar elevado.</w:t>
       </w:r>
     </w:p>
     <w:p>
@@ -2261,10 +2233,19 @@
       </w:pPr>
       <w:r>
         <w:rPr>
+          <w:b/>
+          <w:bCs/>
           <w:sz w:val="17"/>
           <w:szCs w:val="17"/>
         </w:rPr>
-        <w:t xml:space="preserve">Ureia (nitrogenados): cenário mais calmo após o recuo, mas ainda sensível a choques geopolíticos e ao gás natural — sem folga estrutural de oferta.</w:t>
+        <w:t xml:space="preserve">Conflito no Oriente Médio (efeito decrescente): </w:t>
+      </w:r>
+      <w:r>
+        <w:rPr>
+          <w:sz w:val="17"/>
+          <w:szCs w:val="17"/>
+        </w:rPr>
+        <w:t xml:space="preserve">Foi o principal motor da disparada da ureia no 1º semestre. Com o avanço do acordo entre EUA e Irã, o risco arrefeceu e a ureia recuou — mas o mercado segue cauteloso a novas tensões.</w:t>
       </w:r>
     </w:p>
     <w:p>
@@ -2278,10 +2259,47 @@
       </w:pPr>
       <w:r>
         <w:rPr>
+          <w:b/>
+          <w:bCs/>
           <w:sz w:val="17"/>
           <w:szCs w:val="17"/>
         </w:rPr>
-        <w:t xml:space="preserve">MAP (fosfatados): é hoje o produto mais crítico; a pressão deve persistir enquanto durarem as restrições chinesas e a escassez de enxofre, com risco de faltar produto no pico de plantio (set–out).</w:t>
+        <w:t xml:space="preserve">Dependência de importação e compras atrasadas: </w:t>
+      </w:r>
+      <w:r>
+        <w:rPr>
+          <w:sz w:val="17"/>
+          <w:szCs w:val="17"/>
+        </w:rPr>
+        <w:t xml:space="preserve">O Brasil importa cerca de 85% dos fertilizantes. Em 2026 as compras da safra 2026/27 atrasaram, e o produtor ainda descoberto pode enfrentar preço e disponibilidade piores ao acelerar as aquisições.</w:t>
+      </w:r>
+    </w:p>
+    <w:p>
+      <w:pPr>
+        <w:spacing w:after="80" w:before="40"/>
+        <w:jc w:val="both"/>
+      </w:pPr>
+      <w:r>
+        <w:rPr>
+          <w:sz w:val="17"/>
+          <w:szCs w:val="17"/>
+        </w:rPr>
+        <w:t xml:space="preserve">Referências de portos no meio do ano: a ureia recuou para a faixa de US$ 410–430/t CFR após ter passado de US$ 700/t no auge; o MAP seguiu pressionado, negociado próximo de US$ 850–900/t; o KCl manteve-se relativamente estável, em torno de US$ 380–405/t (Itaú BBA / consultorias). O Ministério da Agricultura chegou a alertar para risco de déficit de 1 a 3 milhões de toneladas de fosfatados em 2026.</w:t>
+      </w:r>
+    </w:p>
+    <w:p>
+      <w:pPr>
+        <w:spacing w:after="40" w:before="40"/>
+      </w:pPr>
+      <w:r>
+        <w:rPr>
+          <w:b/>
+          <w:bCs/>
+          <w:color w:val="1E2A44"/>
+          <w:sz w:val="18"/>
+          <w:szCs w:val="18"/>
+        </w:rPr>
+        <w:t xml:space="preserve">O que esperar nos próximos meses:</w:t>
       </w:r>
     </w:p>
     <w:p>
@@ -2298,7 +2316,7 @@
           <w:sz w:val="17"/>
           <w:szCs w:val="17"/>
         </w:rPr>
-        <w:t xml:space="preserve">KCl (potássio): segmento mais equilibrado e com importação recorde; preços relativamente estáveis, embora manutenções industriais no 2º semestre possam alterar o equilíbrio.</w:t>
+        <w:t xml:space="preserve">Ureia (nitrogenados): cenário mais calmo após o recuo, mas ainda sensível a choques geopolíticos e ao gás natural — sem folga estrutural de oferta.</w:t>
       </w:r>
     </w:p>
     <w:p>
@@ -2315,7 +2333,7 @@
           <w:sz w:val="17"/>
           <w:szCs w:val="17"/>
         </w:rPr>
-        <w:t xml:space="preserve">Estratégia sugerida por analistas: evitar ficar descoberto — garantir disponibilidade de fosfatados pode importar mais que o preço; escalonar compras, priorizar KCl (mais líquido) e avaliar substitutos de fósforo como SSP/TSP.</w:t>
+        <w:t xml:space="preserve">MAP (fosfatados): é hoje o produto mais crítico; a pressão deve persistir enquanto durarem as restrições chinesas e a escassez de enxofre, com risco de faltar produto no pico de plantio (set–out).</w:t>
       </w:r>
     </w:p>
     <w:p>
@@ -2332,22 +2350,7 @@
           <w:sz w:val="17"/>
           <w:szCs w:val="17"/>
         </w:rPr>
-        <w:t xml:space="preserve">Riscos a monitorar: prazo real da suspensão das restrições chinesas, evolução do conflito no Oriente Médio, preço do enxofre e câmbio.</w:t>
-      </w:r>
-    </w:p>
-    <w:p>
-      <w:pPr>
-        <w:spacing w:after="20" w:before="60"/>
-      </w:pPr>
-      <w:r>
-        <w:rPr>
-          <w:b/>
-          <w:bCs/>
-          <w:color w:val="1E2A44"/>
-          <w:sz w:val="17"/>
-          <w:szCs w:val="17"/>
-        </w:rPr>
-        <w:t xml:space="preserve">Notícias recentes do mercado (atualização automática):</w:t>
+        <w:t xml:space="preserve">KCl (potássio): segmento mais equilibrado e com importação recorde; preços relativamente estáveis, embora manutenções industriais no 2º semestre possam alterar o equilíbrio.</w:t>
       </w:r>
     </w:p>
     <w:p>
@@ -2361,10 +2364,10 @@
       </w:pPr>
       <w:r>
         <w:rPr>
-          <w:sz w:val="16"/>
-          <w:szCs w:val="16"/>
-        </w:rPr>
-        <w:t xml:space="preserve">04/08/2026 — El Niño reforça importância da nutrição das plantas para reduzir perdas no campo</w:t>
+          <w:sz w:val="17"/>
+          <w:szCs w:val="17"/>
+        </w:rPr>
+        <w:t xml:space="preserve">Estratégia sugerida por analistas: evitar ficar descoberto — garantir disponibilidade de fosfatados pode importar mais que o preço; escalonar compras, priorizar KCl (mais líquido) e avaliar substitutos de fósforo como SSP/TSP.</w:t>
       </w:r>
     </w:p>
     <w:p>
@@ -2378,10 +2381,25 @@
       </w:pPr>
       <w:r>
         <w:rPr>
-          <w:sz w:val="16"/>
-          <w:szCs w:val="16"/>
-        </w:rPr>
-        <w:t xml:space="preserve">30/06/2026 — Mercado de fertilizantes amplia movimento de baixa com recuo da ureia, MAP e cloreto de potássio</w:t>
+          <w:sz w:val="17"/>
+          <w:szCs w:val="17"/>
+        </w:rPr>
+        <w:t xml:space="preserve">Riscos a monitorar: prazo real da suspensão das restrições chinesas, evolução do conflito no Oriente Médio, preço do enxofre e câmbio.</w:t>
+      </w:r>
+    </w:p>
+    <w:p>
+      <w:pPr>
+        <w:spacing w:after="20" w:before="60"/>
+      </w:pPr>
+      <w:r>
+        <w:rPr>
+          <w:b/>
+          <w:bCs/>
+          <w:color w:val="1E2A44"/>
+          <w:sz w:val="17"/>
+          <w:szCs w:val="17"/>
+        </w:rPr>
+        <w:t xml:space="preserve">Notícias recentes do mercado (atualização automática):</w:t>
       </w:r>
     </w:p>
     <w:p>
@@ -2398,7 +2416,7 @@
           <w:sz w:val="16"/>
           <w:szCs w:val="16"/>
         </w:rPr>
-        <w:t xml:space="preserve">19/06/2026 — Importação dos EUA de fertilizante com origem no Oriente Médio zera em maio</w:t>
+        <w:t xml:space="preserve">04/08/2026 — El Niño reforça importância da nutrição das plantas para reduzir perdas no campo</w:t>
       </w:r>
     </w:p>
     <w:p>
@@ -2415,6 +2433,40 @@
           <w:sz w:val="16"/>
           <w:szCs w:val="16"/>
         </w:rPr>
+        <w:t xml:space="preserve">30/06/2026 — Mercado de fertilizantes amplia movimento de baixa com recuo da ureia, MAP e cloreto de potássio</w:t>
+      </w:r>
+    </w:p>
+    <w:p>
+      <w:pPr>
+        <w:pStyle w:val="ListParagraph"/>
+        <w:numPr>
+          <w:ilvl w:val="0"/>
+          <w:numId w:val="2"/>
+        </w:numPr>
+        <w:spacing w:after="70"/>
+      </w:pPr>
+      <w:r>
+        <w:rPr>
+          <w:sz w:val="16"/>
+          <w:szCs w:val="16"/>
+        </w:rPr>
+        <w:t xml:space="preserve">19/06/2026 — Importação dos EUA de fertilizante com origem no Oriente Médio zera em maio</w:t>
+      </w:r>
+    </w:p>
+    <w:p>
+      <w:pPr>
+        <w:pStyle w:val="ListParagraph"/>
+        <w:numPr>
+          <w:ilvl w:val="0"/>
+          <w:numId w:val="2"/>
+        </w:numPr>
+        <w:spacing w:after="70"/>
+      </w:pPr>
+      <w:r>
+        <w:rPr>
+          <w:sz w:val="16"/>
+          <w:szCs w:val="16"/>
+        </w:rPr>
         <w:t xml:space="preserve">16/06/2026 — Ureia cai mais de 40% e volta ao nível pré-crise com avanço de acordo entre EUA e Irã</w:t>
       </w:r>
     </w:p>
@@ -2504,7 +2556,7 @@
           <w:sz w:val="15"/>
           <w:szCs w:val="15"/>
         </w:rPr>
-        <w:t xml:space="preserve">Fontes automáticas: AwesomeAPI (câmbio), CEPEA/ESALQ (soja), ANP (diesel), stooq (BDI). Fertilizantes e gás natural: override manual (fertilizers-override.json). Status desta execução: {"soja":"ok (Noticias Agricolas / CEPEA-PR 17/08/2026)","sojaRegional":"ok (Oeste da Bahia/BA (AIBA))","bdi":"ok (HANDYBULK, 17/08/2026)","cambio":"ok (BCB PTAX)","diesel":"falha: Petrobras: HTTP 403 | PortalCanaa: HTTP 403","_comexPeriodo":"com-filtro-ncm | 2026-07 | 4 linhas","_comexNcmsEncontrados":"31042090,31021010,31054000,31042010","ureia":"ok (ComexStat 2026-07)","map":"ok (ComexStat 2026-07)","kcl":"ok (ComexStat 2026-07)","gas":"ok (EIA Henry Hub)","noticias":"ok (40 de https://www.noticiasagricolas.com.br/tags/fertilizantes/)"}.</w:t>
+        <w:t xml:space="preserve">Fontes automáticas: AwesomeAPI (câmbio), CEPEA/ESALQ (soja), ANP (diesel), stooq (BDI). Fertilizantes e gás natural: override manual (fertilizers-override.json). Status desta execução: {"soja":"ok (Noticias Agricolas / CEPEA-PR 21/08/2026)","sojaRegional":"ok (Oeste da Bahia/BA (AIBA))","cambio":"ok (BCB PTAX)","bdi":"ok (HANDYBULK, 21/08/2026)","diesel":"falha: Petrobras: HTTP 403 | PortalCanaa: HTTP 403","_comexPeriodo":"com-filtro-ncm | 2026-07 | 4 linhas","_comexNcmsEncontrados":"31042090,31021010,31054000,31042010","ureia":"ok (ComexStat 2026-07)","map":"ok (ComexStat 2026-07)","kcl":"ok (ComexStat 2026-07)","gas":"ok (EIA Henry Hub)","noticias":"ok (40 de https://www.noticiasagricolas.com.br/tags/fertilizantes/)"}.</w:t>
       </w:r>
     </w:p>
     <w:p>

</xml_diff>

<commit_message>
chore: atualizacao automatica 2026-08-31
</commit_message>
<xml_diff>
--- a/relatorio_executivo.docx
+++ b/relatorio_executivo.docx
@@ -46,7 +46,7 @@
           <w:sz w:val="17"/>
           <w:szCs w:val="17"/>
         </w:rPr>
-        <w:t xml:space="preserve">Equipe de Planejamento, Controle e Pesquisa Florestal  ·  Referência: Ago/2026  ·  Gerado em 24/08/2026, 10:31:55</w:t>
+        <w:t xml:space="preserve">Equipe de Planejamento, Controle e Pesquisa Florestal  ·  Referência: Ago/2026  ·  Gerado em 31/08/2026, 17:22:38</w:t>
       </w:r>
     </w:p>
     <w:p>
@@ -91,14 +91,14 @@
           <w:sz w:val="19"/>
           <w:szCs w:val="19"/>
         </w:rPr>
-        <w:t xml:space="preserve">O dólar está em R$ 5,16 (-0,8%) e a soja CEPEA em R$ 146,70/saca. </w:t>
+        <w:t xml:space="preserve">O dólar está em R$ 5,18 (+0,4%) e a soja CEPEA em R$ 151,32/saca. </w:t>
       </w:r>
       <w:r>
         <w:rPr>
           <w:sz w:val="19"/>
           <w:szCs w:val="19"/>
         </w:rPr>
-        <w:t xml:space="preserve">A relação de troca soja/MAP é de 29,9 sacas/t.</w:t>
+        <w:t xml:space="preserve">A relação de troca soja/MAP é de 29,1 sacas/t.</w:t>
       </w:r>
     </w:p>
     <w:p>
@@ -864,7 +864,7 @@
                 <w:sz w:val="18"/>
                 <w:szCs w:val="18"/>
               </w:rPr>
-              <w:t xml:space="preserve">R$ 146,70/sc</w:t>
+              <w:t xml:space="preserve">R$ 151,32/sc</w:t>
             </w:r>
           </w:p>
         </w:tc>
@@ -897,7 +897,7 @@
                 <w:sz w:val="18"/>
                 <w:szCs w:val="18"/>
               </w:rPr>
-              <w:t xml:space="preserve">+3,5%</w:t>
+              <w:t xml:space="preserve">+3,1%</w:t>
             </w:r>
           </w:p>
         </w:tc>
@@ -989,7 +989,7 @@
                 <w:sz w:val="18"/>
                 <w:szCs w:val="18"/>
               </w:rPr>
-              <w:t xml:space="preserve">R$ 138,75/sc</w:t>
+              <w:t xml:space="preserve">R$ 142,00/sc</w:t>
             </w:r>
           </w:p>
         </w:tc>
@@ -1022,7 +1022,7 @@
                 <w:sz w:val="18"/>
                 <w:szCs w:val="18"/>
               </w:rPr>
-              <w:t xml:space="preserve">+3,4%</w:t>
+              <w:t xml:space="preserve">+2,3%</w:t>
             </w:r>
           </w:p>
         </w:tc>
@@ -1114,7 +1114,7 @@
                 <w:sz w:val="18"/>
                 <w:szCs w:val="18"/>
               </w:rPr>
-              <w:t xml:space="preserve">29,9 sc/t</w:t>
+              <w:t xml:space="preserve">29,1 sc/t</w:t>
             </w:r>
           </w:p>
         </w:tc>
@@ -1147,7 +1147,7 @@
                 <w:sz w:val="18"/>
                 <w:szCs w:val="18"/>
               </w:rPr>
-              <w:t xml:space="preserve">-4,2%</w:t>
+              <w:t xml:space="preserve">-2,7%</w:t>
             </w:r>
           </w:p>
         </w:tc>
@@ -1239,7 +1239,7 @@
                 <w:sz w:val="18"/>
                 <w:szCs w:val="18"/>
               </w:rPr>
-              <w:t xml:space="preserve">15,4 sc/t</w:t>
+              <w:t xml:space="preserve">15,0 sc/t</w:t>
             </w:r>
           </w:p>
         </w:tc>
@@ -1528,7 +1528,132 @@
                 <w:sz w:val="18"/>
                 <w:szCs w:val="18"/>
               </w:rPr>
-              <w:t xml:space="preserve">5,16</w:t>
+              <w:t xml:space="preserve">5,18</w:t>
+            </w:r>
+          </w:p>
+        </w:tc>
+        <w:tc>
+          <w:tcPr>
+            <w:tcW w:type="dxa" w:w="1980"/>
+            <w:tcBorders>
+              <w:top w:val="single" w:color="DDDDDD" w:sz="1"/>
+              <w:left w:val="single" w:color="DDDDDD" w:sz="1"/>
+              <w:bottom w:val="single" w:color="DDDDDD" w:sz="1"/>
+              <w:right w:val="single" w:color="DDDDDD" w:sz="1"/>
+            </w:tcBorders>
+            <w:tcMar>
+              <w:top w:type="dxa" w:w="55"/>
+              <w:left w:type="dxa" w:w="110"/>
+              <w:bottom w:type="dxa" w:w="55"/>
+              <w:right w:type="dxa" w:w="110"/>
+            </w:tcMar>
+            <w:vAlign w:val="center"/>
+          </w:tcPr>
+          <w:p>
+            <w:pPr>
+              <w:jc w:val="right"/>
+            </w:pPr>
+            <w:r>
+              <w:rPr>
+                <w:b/>
+                <w:bCs/>
+                <w:color w:val="B23636"/>
+                <w:sz w:val="18"/>
+                <w:szCs w:val="18"/>
+              </w:rPr>
+              <w:t xml:space="preserve">+0,4%</w:t>
+            </w:r>
+          </w:p>
+        </w:tc>
+        <w:tc>
+          <w:tcPr>
+            <w:tcW w:type="dxa" w:w="2000"/>
+            <w:tcBorders>
+              <w:top w:val="single" w:color="DDDDDD" w:sz="1"/>
+              <w:left w:val="single" w:color="DDDDDD" w:sz="1"/>
+              <w:bottom w:val="single" w:color="DDDDDD" w:sz="1"/>
+              <w:right w:val="single" w:color="DDDDDD" w:sz="1"/>
+            </w:tcBorders>
+            <w:tcMar>
+              <w:top w:type="dxa" w:w="55"/>
+              <w:left w:type="dxa" w:w="110"/>
+              <w:bottom w:type="dxa" w:w="55"/>
+              <w:right w:type="dxa" w:w="110"/>
+            </w:tcMar>
+            <w:vAlign w:val="center"/>
+          </w:tcPr>
+          <w:p>
+            <w:pPr>
+              <w:jc w:val="left"/>
+            </w:pPr>
+            <w:r>
+              <w:rPr>
+                <w:sz w:val="17"/>
+                <w:szCs w:val="17"/>
+              </w:rPr>
+              <w:t xml:space="preserve">Custo de importação</w:t>
+            </w:r>
+          </w:p>
+        </w:tc>
+      </w:tr>
+      <w:tr>
+        <w:tc>
+          <w:tcPr>
+            <w:tcW w:type="dxa" w:w="3400"/>
+            <w:tcBorders>
+              <w:top w:val="single" w:color="DDDDDD" w:sz="1"/>
+              <w:left w:val="single" w:color="DDDDDD" w:sz="1"/>
+              <w:bottom w:val="single" w:color="DDDDDD" w:sz="1"/>
+              <w:right w:val="single" w:color="DDDDDD" w:sz="1"/>
+            </w:tcBorders>
+            <w:tcMar>
+              <w:top w:type="dxa" w:w="55"/>
+              <w:left w:type="dxa" w:w="110"/>
+              <w:bottom w:type="dxa" w:w="55"/>
+              <w:right w:type="dxa" w:w="110"/>
+            </w:tcMar>
+            <w:vAlign w:val="center"/>
+          </w:tcPr>
+          <w:p>
+            <w:pPr>
+              <w:jc w:val="left"/>
+            </w:pPr>
+            <w:r>
+              <w:rPr>
+                <w:sz w:val="18"/>
+                <w:szCs w:val="18"/>
+              </w:rPr>
+              <w:t xml:space="preserve">Gás Natural (Henry Hub)</w:t>
+            </w:r>
+          </w:p>
+        </w:tc>
+        <w:tc>
+          <w:tcPr>
+            <w:tcW w:type="dxa" w:w="1980"/>
+            <w:tcBorders>
+              <w:top w:val="single" w:color="DDDDDD" w:sz="1"/>
+              <w:left w:val="single" w:color="DDDDDD" w:sz="1"/>
+              <w:bottom w:val="single" w:color="DDDDDD" w:sz="1"/>
+              <w:right w:val="single" w:color="DDDDDD" w:sz="1"/>
+            </w:tcBorders>
+            <w:tcMar>
+              <w:top w:type="dxa" w:w="55"/>
+              <w:left w:type="dxa" w:w="110"/>
+              <w:bottom w:type="dxa" w:w="55"/>
+              <w:right w:type="dxa" w:w="110"/>
+            </w:tcMar>
+            <w:vAlign w:val="center"/>
+          </w:tcPr>
+          <w:p>
+            <w:pPr>
+              <w:jc w:val="right"/>
+            </w:pPr>
+            <w:r>
+              <w:rPr>
+                <w:sz w:val="18"/>
+                <w:szCs w:val="18"/>
+              </w:rPr>
+              <w:t xml:space="preserve">US$ 2,70</w:t>
             </w:r>
           </w:p>
         </w:tc>
@@ -1561,7 +1686,7 @@
                 <w:sz w:val="18"/>
                 <w:szCs w:val="18"/>
               </w:rPr>
-              <w:t xml:space="preserve">-0,8%</w:t>
+              <w:t xml:space="preserve">-4,3%</w:t>
             </w:r>
           </w:p>
         </w:tc>
@@ -1591,7 +1716,7 @@
                 <w:sz w:val="17"/>
                 <w:szCs w:val="17"/>
               </w:rPr>
-              <w:t xml:space="preserve">Custo de importação</w:t>
+              <w:t xml:space="preserve">Pressiona ureia</w:t>
             </w:r>
           </w:p>
         </w:tc>
@@ -1623,7 +1748,7 @@
                 <w:sz w:val="18"/>
                 <w:szCs w:val="18"/>
               </w:rPr>
-              <w:t xml:space="preserve">Gás Natural (Henry Hub)</w:t>
+              <w:t xml:space="preserve">Frete Marítimo (BDI)</w:t>
             </w:r>
           </w:p>
         </w:tc>
@@ -1653,7 +1778,7 @@
                 <w:sz w:val="18"/>
                 <w:szCs w:val="18"/>
               </w:rPr>
-              <w:t xml:space="preserve">US$ 2,82</w:t>
+              <w:t xml:space="preserve">3.186 pts</w:t>
             </w:r>
           </w:p>
         </w:tc>
@@ -1686,132 +1811,7 @@
                 <w:sz w:val="18"/>
                 <w:szCs w:val="18"/>
               </w:rPr>
-              <w:t xml:space="preserve">+1,1%</w:t>
-            </w:r>
-          </w:p>
-        </w:tc>
-        <w:tc>
-          <w:tcPr>
-            <w:tcW w:type="dxa" w:w="2000"/>
-            <w:tcBorders>
-              <w:top w:val="single" w:color="DDDDDD" w:sz="1"/>
-              <w:left w:val="single" w:color="DDDDDD" w:sz="1"/>
-              <w:bottom w:val="single" w:color="DDDDDD" w:sz="1"/>
-              <w:right w:val="single" w:color="DDDDDD" w:sz="1"/>
-            </w:tcBorders>
-            <w:tcMar>
-              <w:top w:type="dxa" w:w="55"/>
-              <w:left w:type="dxa" w:w="110"/>
-              <w:bottom w:type="dxa" w:w="55"/>
-              <w:right w:type="dxa" w:w="110"/>
-            </w:tcMar>
-            <w:vAlign w:val="center"/>
-          </w:tcPr>
-          <w:p>
-            <w:pPr>
-              <w:jc w:val="left"/>
-            </w:pPr>
-            <w:r>
-              <w:rPr>
-                <w:sz w:val="17"/>
-                <w:szCs w:val="17"/>
-              </w:rPr>
-              <w:t xml:space="preserve">Pressiona ureia</w:t>
-            </w:r>
-          </w:p>
-        </w:tc>
-      </w:tr>
-      <w:tr>
-        <w:tc>
-          <w:tcPr>
-            <w:tcW w:type="dxa" w:w="3400"/>
-            <w:tcBorders>
-              <w:top w:val="single" w:color="DDDDDD" w:sz="1"/>
-              <w:left w:val="single" w:color="DDDDDD" w:sz="1"/>
-              <w:bottom w:val="single" w:color="DDDDDD" w:sz="1"/>
-              <w:right w:val="single" w:color="DDDDDD" w:sz="1"/>
-            </w:tcBorders>
-            <w:tcMar>
-              <w:top w:type="dxa" w:w="55"/>
-              <w:left w:type="dxa" w:w="110"/>
-              <w:bottom w:type="dxa" w:w="55"/>
-              <w:right w:type="dxa" w:w="110"/>
-            </w:tcMar>
-            <w:vAlign w:val="center"/>
-          </w:tcPr>
-          <w:p>
-            <w:pPr>
-              <w:jc w:val="left"/>
-            </w:pPr>
-            <w:r>
-              <w:rPr>
-                <w:sz w:val="18"/>
-                <w:szCs w:val="18"/>
-              </w:rPr>
-              <w:t xml:space="preserve">Frete Marítimo (BDI)</w:t>
-            </w:r>
-          </w:p>
-        </w:tc>
-        <w:tc>
-          <w:tcPr>
-            <w:tcW w:type="dxa" w:w="1980"/>
-            <w:tcBorders>
-              <w:top w:val="single" w:color="DDDDDD" w:sz="1"/>
-              <w:left w:val="single" w:color="DDDDDD" w:sz="1"/>
-              <w:bottom w:val="single" w:color="DDDDDD" w:sz="1"/>
-              <w:right w:val="single" w:color="DDDDDD" w:sz="1"/>
-            </w:tcBorders>
-            <w:tcMar>
-              <w:top w:type="dxa" w:w="55"/>
-              <w:left w:type="dxa" w:w="110"/>
-              <w:bottom w:type="dxa" w:w="55"/>
-              <w:right w:type="dxa" w:w="110"/>
-            </w:tcMar>
-            <w:vAlign w:val="center"/>
-          </w:tcPr>
-          <w:p>
-            <w:pPr>
-              <w:jc w:val="right"/>
-            </w:pPr>
-            <w:r>
-              <w:rPr>
-                <w:sz w:val="18"/>
-                <w:szCs w:val="18"/>
-              </w:rPr>
-              <w:t xml:space="preserve">2.841 pts</w:t>
-            </w:r>
-          </w:p>
-        </w:tc>
-        <w:tc>
-          <w:tcPr>
-            <w:tcW w:type="dxa" w:w="1980"/>
-            <w:tcBorders>
-              <w:top w:val="single" w:color="DDDDDD" w:sz="1"/>
-              <w:left w:val="single" w:color="DDDDDD" w:sz="1"/>
-              <w:bottom w:val="single" w:color="DDDDDD" w:sz="1"/>
-              <w:right w:val="single" w:color="DDDDDD" w:sz="1"/>
-            </w:tcBorders>
-            <w:tcMar>
-              <w:top w:type="dxa" w:w="55"/>
-              <w:left w:type="dxa" w:w="110"/>
-              <w:bottom w:type="dxa" w:w="55"/>
-              <w:right w:type="dxa" w:w="110"/>
-            </w:tcMar>
-            <w:vAlign w:val="center"/>
-          </w:tcPr>
-          <w:p>
-            <w:pPr>
-              <w:jc w:val="right"/>
-            </w:pPr>
-            <w:r>
-              <w:rPr>
-                <w:b/>
-                <w:bCs/>
-                <w:color w:val="2F8A5F"/>
-                <w:sz w:val="18"/>
-                <w:szCs w:val="18"/>
-              </w:rPr>
-              <w:t xml:space="preserve">-1,3%</w:t>
+              <w:t xml:space="preserve">+12,1%</w:t>
             </w:r>
           </w:p>
         </w:tc>
@@ -2013,7 +2013,7 @@
           <w:sz w:val="18"/>
           <w:szCs w:val="18"/>
         </w:rPr>
-        <w:t xml:space="preserve">queda de -1,3% no período.</w:t>
+        <w:t xml:space="preserve">alta de +12,1% no período.</w:t>
       </w:r>
     </w:p>
     <w:p>
@@ -2039,7 +2039,83 @@
           <w:sz w:val="18"/>
           <w:szCs w:val="18"/>
         </w:rPr>
-        <w:t xml:space="preserve">alta de +1,1% no período.</w:t>
+        <w:t xml:space="preserve">queda de -4,3% no período.</w:t>
+      </w:r>
+    </w:p>
+    <w:p>
+      <w:pPr>
+        <w:pBdr>
+          <w:bottom w:val="single" w:color="1E2A44" w:sz="6" w:space="2"/>
+        </w:pBdr>
+        <w:spacing w:after="100" w:before="220"/>
+      </w:pPr>
+      <w:r>
+        <w:rPr>
+          <w:b/>
+          <w:bCs/>
+          <w:color w:val="1E2A44"/>
+          <w:sz w:val="22"/>
+          <w:szCs w:val="22"/>
+        </w:rPr>
+        <w:t xml:space="preserve">6. Contexto de Mercado — Causas da Alta e Perspectivas</w:t>
+      </w:r>
+    </w:p>
+    <w:p>
+      <w:pPr>
+        <w:spacing w:after="60"/>
+      </w:pPr>
+      <w:r>
+        <w:rPr>
+          <w:b/>
+          <w:bCs/>
+          <w:color w:val="1E2A44"/>
+          <w:sz w:val="18"/>
+          <w:szCs w:val="18"/>
+        </w:rPr>
+        <w:t xml:space="preserve">Por que os fertilizantes subiram — e o que esperar · atualizado em Agosto/2026 · revisão manual.</w:t>
+      </w:r>
+    </w:p>
+    <w:p>
+      <w:pPr>
+        <w:spacing w:after="60"/>
+        <w:jc w:val="both"/>
+      </w:pPr>
+      <w:r>
+        <w:rPr>
+          <w:sz w:val="18"/>
+          <w:szCs w:val="18"/>
+        </w:rPr>
+        <w:t xml:space="preserve">O eixo da pressão mudou ao longo de 2026: a ureia recuou dos picos após o alívio das tensões no Oriente Médio, mas os fosfatados (MAP) tornaram-se o ponto crítico — caros e de oferta apertada — por causa das restrições da China e da escassez de enxofre, às vésperas da safra 2026/27.</w:t>
+      </w:r>
+    </w:p>
+    <w:p>
+      <w:pPr>
+        <w:spacing w:after="80"/>
+      </w:pPr>
+      <w:r>
+        <w:rPr>
+          <w:i/>
+          <w:iCs/>
+          <w:color w:val="6B7585"/>
+          <w:sz w:val="17"/>
+          <w:szCs w:val="17"/>
+        </w:rPr>
+        <w:t xml:space="preserve">Leitura automática: sem novo fechamento de fertilizantes desde a leitura anterior (jul/26).</w:t>
+      </w:r>
+    </w:p>
+    <w:p>
+      <w:pPr>
+        <w:spacing w:after="40"/>
+      </w:pPr>
+      <w:r>
+        <w:rPr>
+          <w:b/>
+          <w:bCs/>
+          <w:color w:val="1E2A44"/>
+          <w:sz w:val="18"/>
+          <w:szCs w:val="18"/>
+        </w:rPr>
+        <w:t xml:space="preserve">Principais causas da alta:</w:t>
       </w:r>
     </w:p>
     <w:p>
@@ -2055,93 +2131,17 @@
         <w:rPr>
           <w:b/>
           <w:bCs/>
-          <w:sz w:val="18"/>
-          <w:szCs w:val="18"/>
-        </w:rPr>
-        <w:t xml:space="preserve">Dólar: </w:t>
-      </w:r>
-      <w:r>
-        <w:rPr>
-          <w:sz w:val="18"/>
-          <w:szCs w:val="18"/>
-        </w:rPr>
-        <w:t xml:space="preserve">queda de -0,8% no período.</w:t>
-      </w:r>
-    </w:p>
-    <w:p>
-      <w:pPr>
-        <w:pBdr>
-          <w:bottom w:val="single" w:color="1E2A44" w:sz="6" w:space="2"/>
-        </w:pBdr>
-        <w:spacing w:after="100" w:before="220"/>
-      </w:pPr>
-      <w:r>
-        <w:rPr>
-          <w:b/>
-          <w:bCs/>
-          <w:color w:val="1E2A44"/>
-          <w:sz w:val="22"/>
-          <w:szCs w:val="22"/>
-        </w:rPr>
-        <w:t xml:space="preserve">6. Contexto de Mercado — Causas da Alta e Perspectivas</w:t>
-      </w:r>
-    </w:p>
-    <w:p>
-      <w:pPr>
-        <w:spacing w:after="60"/>
-      </w:pPr>
-      <w:r>
-        <w:rPr>
-          <w:b/>
-          <w:bCs/>
-          <w:color w:val="1E2A44"/>
-          <w:sz w:val="18"/>
-          <w:szCs w:val="18"/>
-        </w:rPr>
-        <w:t xml:space="preserve">Por que os fertilizantes subiram — e o que esperar · atualizado em Agosto/2026 · revisão manual.</w:t>
-      </w:r>
-    </w:p>
-    <w:p>
-      <w:pPr>
-        <w:spacing w:after="60"/>
-        <w:jc w:val="both"/>
-      </w:pPr>
-      <w:r>
-        <w:rPr>
-          <w:sz w:val="18"/>
-          <w:szCs w:val="18"/>
-        </w:rPr>
-        <w:t xml:space="preserve">O eixo da pressão mudou ao longo de 2026: a ureia recuou dos picos após o alívio das tensões no Oriente Médio, mas os fosfatados (MAP) tornaram-se o ponto crítico — caros e de oferta apertada — por causa das restrições da China e da escassez de enxofre, às vésperas da safra 2026/27.</w:t>
-      </w:r>
-    </w:p>
-    <w:p>
-      <w:pPr>
-        <w:spacing w:after="80"/>
-      </w:pPr>
-      <w:r>
-        <w:rPr>
-          <w:i/>
-          <w:iCs/>
-          <w:color w:val="6B7585"/>
           <w:sz w:val="17"/>
           <w:szCs w:val="17"/>
         </w:rPr>
-        <w:t xml:space="preserve">Leitura automática: sem novo fechamento de fertilizantes desde a leitura anterior (jul/26).</w:t>
-      </w:r>
-    </w:p>
-    <w:p>
-      <w:pPr>
-        <w:spacing w:after="40"/>
-      </w:pPr>
-      <w:r>
-        <w:rPr>
-          <w:b/>
-          <w:bCs/>
-          <w:color w:val="1E2A44"/>
-          <w:sz w:val="18"/>
-          <w:szCs w:val="18"/>
-        </w:rPr>
-        <w:t xml:space="preserve">Principais causas da alta:</w:t>
+        <w:t xml:space="preserve">Restrições da China aos fosfatados: </w:t>
+      </w:r>
+      <w:r>
+        <w:rPr>
+          <w:sz w:val="17"/>
+          <w:szCs w:val="17"/>
+        </w:rPr>
+        <w:t xml:space="preserve">A China suspendeu boa parte das exportações de fosfatados para priorizar o abastecimento interno; fontes do setor estimam que de 40% a 80% dos embarques estejam bloqueados ou sob cota, e as restrições podem durar até meados do segundo semestre de 2026.</w:t>
       </w:r>
     </w:p>
     <w:p>
@@ -2160,14 +2160,14 @@
           <w:sz w:val="17"/>
           <w:szCs w:val="17"/>
         </w:rPr>
-        <w:t xml:space="preserve">Restrições da China aos fosfatados: </w:t>
+        <w:t xml:space="preserve">Escassez de enxofre: </w:t>
       </w:r>
       <w:r>
         <w:rPr>
           <w:sz w:val="17"/>
           <w:szCs w:val="17"/>
         </w:rPr>
-        <w:t xml:space="preserve">A China suspendeu boa parte das exportações de fosfatados para priorizar o abastecimento interno; fontes do setor estimam que de 40% a 80% dos embarques estejam bloqueados ou sob cota, e as restrições podem durar até meados do segundo semestre de 2026.</w:t>
+        <w:t xml:space="preserve">Insumo essencial do MAP, o enxofre chegou a cerca de US$ 1.250/t; os desembarques no Brasil no 1º semestre ficaram ~42% abaixo de 2025 (StoneX), levando fábricas a reduzir produção e apertando ainda mais a oferta de fosfatados.</w:t>
       </w:r>
     </w:p>
     <w:p>
@@ -2186,14 +2186,14 @@
           <w:sz w:val="17"/>
           <w:szCs w:val="17"/>
         </w:rPr>
-        <w:t xml:space="preserve">Escassez de enxofre: </w:t>
+        <w:t xml:space="preserve">Oferta russa e de outros polos reduzida: </w:t>
       </w:r>
       <w:r>
         <w:rPr>
           <w:sz w:val="17"/>
           <w:szCs w:val="17"/>
         </w:rPr>
-        <w:t xml:space="preserve">Insumo essencial do MAP, o enxofre chegou a cerca de US$ 1.250/t; os desembarques no Brasil no 1º semestre ficaram ~42% abaixo de 2025 (StoneX), levando fábricas a reduzir produção e apertando ainda mais a oferta de fosfatados.</w:t>
+        <w:t xml:space="preserve">Menor disponibilidade da Rússia, restrições no Marrocos e paralisações pontuais de produtoras limitam a oferta global de fósforo e sustentam o MAP em patamar elevado.</w:t>
       </w:r>
     </w:p>
     <w:p>
@@ -2212,14 +2212,14 @@
           <w:sz w:val="17"/>
           <w:szCs w:val="17"/>
         </w:rPr>
-        <w:t xml:space="preserve">Oferta russa e de outros polos reduzida: </w:t>
+        <w:t xml:space="preserve">Conflito no Oriente Médio (efeito decrescente): </w:t>
       </w:r>
       <w:r>
         <w:rPr>
           <w:sz w:val="17"/>
           <w:szCs w:val="17"/>
         </w:rPr>
-        <w:t xml:space="preserve">Menor disponibilidade da Rússia, restrições no Marrocos e paralisações pontuais de produtoras limitam a oferta global de fósforo e sustentam o MAP em patamar elevado.</w:t>
+        <w:t xml:space="preserve">Foi o principal motor da disparada da ureia no 1º semestre. Com o avanço do acordo entre EUA e Irã, o risco arrefeceu e a ureia recuou — mas o mercado segue cauteloso a novas tensões.</w:t>
       </w:r>
     </w:p>
     <w:p>
@@ -2238,14 +2238,42 @@
           <w:sz w:val="17"/>
           <w:szCs w:val="17"/>
         </w:rPr>
-        <w:t xml:space="preserve">Conflito no Oriente Médio (efeito decrescente): </w:t>
+        <w:t xml:space="preserve">Dependência de importação e compras atrasadas: </w:t>
       </w:r>
       <w:r>
         <w:rPr>
           <w:sz w:val="17"/>
           <w:szCs w:val="17"/>
         </w:rPr>
-        <w:t xml:space="preserve">Foi o principal motor da disparada da ureia no 1º semestre. Com o avanço do acordo entre EUA e Irã, o risco arrefeceu e a ureia recuou — mas o mercado segue cauteloso a novas tensões.</w:t>
+        <w:t xml:space="preserve">O Brasil importa cerca de 85% dos fertilizantes. Em 2026 as compras da safra 2026/27 atrasaram, e o produtor ainda descoberto pode enfrentar preço e disponibilidade piores ao acelerar as aquisições.</w:t>
+      </w:r>
+    </w:p>
+    <w:p>
+      <w:pPr>
+        <w:spacing w:after="80" w:before="40"/>
+        <w:jc w:val="both"/>
+      </w:pPr>
+      <w:r>
+        <w:rPr>
+          <w:sz w:val="17"/>
+          <w:szCs w:val="17"/>
+        </w:rPr>
+        <w:t xml:space="preserve">Referências de portos no meio do ano: a ureia recuou para a faixa de US$ 410–430/t CFR após ter passado de US$ 700/t no auge; o MAP seguiu pressionado, negociado próximo de US$ 850–900/t; o KCl manteve-se relativamente estável, em torno de US$ 380–405/t (Itaú BBA / consultorias). O Ministério da Agricultura chegou a alertar para risco de déficit de 1 a 3 milhões de toneladas de fosfatados em 2026.</w:t>
+      </w:r>
+    </w:p>
+    <w:p>
+      <w:pPr>
+        <w:spacing w:after="40" w:before="40"/>
+      </w:pPr>
+      <w:r>
+        <w:rPr>
+          <w:b/>
+          <w:bCs/>
+          <w:color w:val="1E2A44"/>
+          <w:sz w:val="18"/>
+          <w:szCs w:val="18"/>
+        </w:rPr>
+        <w:t xml:space="preserve">O que esperar nos próximos meses:</w:t>
       </w:r>
     </w:p>
     <w:p>
@@ -2259,47 +2287,10 @@
       </w:pPr>
       <w:r>
         <w:rPr>
-          <w:b/>
-          <w:bCs/>
           <w:sz w:val="17"/>
           <w:szCs w:val="17"/>
         </w:rPr>
-        <w:t xml:space="preserve">Dependência de importação e compras atrasadas: </w:t>
-      </w:r>
-      <w:r>
-        <w:rPr>
-          <w:sz w:val="17"/>
-          <w:szCs w:val="17"/>
-        </w:rPr>
-        <w:t xml:space="preserve">O Brasil importa cerca de 85% dos fertilizantes. Em 2026 as compras da safra 2026/27 atrasaram, e o produtor ainda descoberto pode enfrentar preço e disponibilidade piores ao acelerar as aquisições.</w:t>
-      </w:r>
-    </w:p>
-    <w:p>
-      <w:pPr>
-        <w:spacing w:after="80" w:before="40"/>
-        <w:jc w:val="both"/>
-      </w:pPr>
-      <w:r>
-        <w:rPr>
-          <w:sz w:val="17"/>
-          <w:szCs w:val="17"/>
-        </w:rPr>
-        <w:t xml:space="preserve">Referências de portos no meio do ano: a ureia recuou para a faixa de US$ 410–430/t CFR após ter passado de US$ 700/t no auge; o MAP seguiu pressionado, negociado próximo de US$ 850–900/t; o KCl manteve-se relativamente estável, em torno de US$ 380–405/t (Itaú BBA / consultorias). O Ministério da Agricultura chegou a alertar para risco de déficit de 1 a 3 milhões de toneladas de fosfatados em 2026.</w:t>
-      </w:r>
-    </w:p>
-    <w:p>
-      <w:pPr>
-        <w:spacing w:after="40" w:before="40"/>
-      </w:pPr>
-      <w:r>
-        <w:rPr>
-          <w:b/>
-          <w:bCs/>
-          <w:color w:val="1E2A44"/>
-          <w:sz w:val="18"/>
-          <w:szCs w:val="18"/>
-        </w:rPr>
-        <w:t xml:space="preserve">O que esperar nos próximos meses:</w:t>
+        <w:t xml:space="preserve">Ureia (nitrogenados): cenário mais calmo após o recuo, mas ainda sensível a choques geopolíticos e ao gás natural — sem folga estrutural de oferta.</w:t>
       </w:r>
     </w:p>
     <w:p>
@@ -2316,7 +2307,7 @@
           <w:sz w:val="17"/>
           <w:szCs w:val="17"/>
         </w:rPr>
-        <w:t xml:space="preserve">Ureia (nitrogenados): cenário mais calmo após o recuo, mas ainda sensível a choques geopolíticos e ao gás natural — sem folga estrutural de oferta.</w:t>
+        <w:t xml:space="preserve">MAP (fosfatados): é hoje o produto mais crítico; a pressão deve persistir enquanto durarem as restrições chinesas e a escassez de enxofre, com risco de faltar produto no pico de plantio (set–out).</w:t>
       </w:r>
     </w:p>
     <w:p>
@@ -2333,7 +2324,7 @@
           <w:sz w:val="17"/>
           <w:szCs w:val="17"/>
         </w:rPr>
-        <w:t xml:space="preserve">MAP (fosfatados): é hoje o produto mais crítico; a pressão deve persistir enquanto durarem as restrições chinesas e a escassez de enxofre, com risco de faltar produto no pico de plantio (set–out).</w:t>
+        <w:t xml:space="preserve">KCl (potássio): segmento mais equilibrado e com importação recorde; preços relativamente estáveis, embora manutenções industriais no 2º semestre possam alterar o equilíbrio.</w:t>
       </w:r>
     </w:p>
     <w:p>
@@ -2350,7 +2341,7 @@
           <w:sz w:val="17"/>
           <w:szCs w:val="17"/>
         </w:rPr>
-        <w:t xml:space="preserve">KCl (potássio): segmento mais equilibrado e com importação recorde; preços relativamente estáveis, embora manutenções industriais no 2º semestre possam alterar o equilíbrio.</w:t>
+        <w:t xml:space="preserve">Estratégia sugerida por analistas: evitar ficar descoberto — garantir disponibilidade de fosfatados pode importar mais que o preço; escalonar compras, priorizar KCl (mais líquido) e avaliar substitutos de fósforo como SSP/TSP.</w:t>
       </w:r>
     </w:p>
     <w:p>
@@ -2367,7 +2358,22 @@
           <w:sz w:val="17"/>
           <w:szCs w:val="17"/>
         </w:rPr>
-        <w:t xml:space="preserve">Estratégia sugerida por analistas: evitar ficar descoberto — garantir disponibilidade de fosfatados pode importar mais que o preço; escalonar compras, priorizar KCl (mais líquido) e avaliar substitutos de fósforo como SSP/TSP.</w:t>
+        <w:t xml:space="preserve">Riscos a monitorar: prazo real da suspensão das restrições chinesas, evolução do conflito no Oriente Médio, preço do enxofre e câmbio.</w:t>
+      </w:r>
+    </w:p>
+    <w:p>
+      <w:pPr>
+        <w:spacing w:after="20" w:before="60"/>
+      </w:pPr>
+      <w:r>
+        <w:rPr>
+          <w:b/>
+          <w:bCs/>
+          <w:color w:val="1E2A44"/>
+          <w:sz w:val="17"/>
+          <w:szCs w:val="17"/>
+        </w:rPr>
+        <w:t xml:space="preserve">Notícias recentes do mercado (atualização automática):</w:t>
       </w:r>
     </w:p>
     <w:p>
@@ -2381,25 +2387,10 @@
       </w:pPr>
       <w:r>
         <w:rPr>
-          <w:sz w:val="17"/>
-          <w:szCs w:val="17"/>
-        </w:rPr>
-        <w:t xml:space="preserve">Riscos a monitorar: prazo real da suspensão das restrições chinesas, evolução do conflito no Oriente Médio, preço do enxofre e câmbio.</w:t>
-      </w:r>
-    </w:p>
-    <w:p>
-      <w:pPr>
-        <w:spacing w:after="20" w:before="60"/>
-      </w:pPr>
-      <w:r>
-        <w:rPr>
-          <w:b/>
-          <w:bCs/>
-          <w:color w:val="1E2A44"/>
-          <w:sz w:val="17"/>
-          <w:szCs w:val="17"/>
-        </w:rPr>
-        <w:t xml:space="preserve">Notícias recentes do mercado (atualização automática):</w:t>
+          <w:sz w:val="16"/>
+          <w:szCs w:val="16"/>
+        </w:rPr>
+        <w:t xml:space="preserve">Tempo e Clima 04/08/2026 - 12:41 El Niño reforça importância da nutrição das plantas para reduzir perdas no campo</w:t>
       </w:r>
     </w:p>
     <w:p>
@@ -2416,7 +2407,7 @@
           <w:sz w:val="16"/>
           <w:szCs w:val="16"/>
         </w:rPr>
-        <w:t xml:space="preserve">04/08/2026 — El Niño reforça importância da nutrição das plantas para reduzir perdas no campo</w:t>
+        <w:t xml:space="preserve">Agronegócio 30/06/2026 - 09:30 Mercado de fertilizantes amplia movimento de baixa com recuo da ureia, MAP e cloreto de potássio</w:t>
       </w:r>
     </w:p>
     <w:p>
@@ -2433,7 +2424,7 @@
           <w:sz w:val="16"/>
           <w:szCs w:val="16"/>
         </w:rPr>
-        <w:t xml:space="preserve">30/06/2026 — Mercado de fertilizantes amplia movimento de baixa com recuo da ureia, MAP e cloreto de potássio</w:t>
+        <w:t xml:space="preserve">Agronegócio 19/06/2026 - 11:01 Importação dos EUA de fertilizante com origem no Oriente Médio zera em maio</w:t>
       </w:r>
     </w:p>
     <w:p>
@@ -2450,24 +2441,7 @@
           <w:sz w:val="16"/>
           <w:szCs w:val="16"/>
         </w:rPr>
-        <w:t xml:space="preserve">19/06/2026 — Importação dos EUA de fertilizante com origem no Oriente Médio zera em maio</w:t>
-      </w:r>
-    </w:p>
-    <w:p>
-      <w:pPr>
-        <w:pStyle w:val="ListParagraph"/>
-        <w:numPr>
-          <w:ilvl w:val="0"/>
-          <w:numId w:val="2"/>
-        </w:numPr>
-        <w:spacing w:after="70"/>
-      </w:pPr>
-      <w:r>
-        <w:rPr>
-          <w:sz w:val="16"/>
-          <w:szCs w:val="16"/>
-        </w:rPr>
-        <w:t xml:space="preserve">16/06/2026 — Ureia cai mais de 40% e volta ao nível pré-crise com avanço de acordo entre EUA e Irã</w:t>
+        <w:t xml:space="preserve">Agronegócio 16/06/2026 - 16:30 Ureia cai mais de 40% e volta ao nível pré-crise com avanço de acordo entre EUA e Irã</w:t>
       </w:r>
     </w:p>
     <w:p>
@@ -2556,7 +2530,7 @@
           <w:sz w:val="15"/>
           <w:szCs w:val="15"/>
         </w:rPr>
-        <w:t xml:space="preserve">Fontes automáticas: AwesomeAPI (câmbio), CEPEA/ESALQ (soja), ANP (diesel), stooq (BDI). Fertilizantes e gás natural: override manual (fertilizers-override.json). Status desta execução: {"soja":"ok (Noticias Agricolas / CEPEA-PR 21/08/2026)","sojaRegional":"ok (Oeste da Bahia/BA (AIBA))","cambio":"ok (BCB PTAX)","bdi":"ok (HANDYBULK, 21/08/2026)","diesel":"falha: Petrobras: HTTP 403 | PortalCanaa: HTTP 403","_comexPeriodo":"com-filtro-ncm | 2026-07 | 4 linhas","_comexNcmsEncontrados":"31042090,31021010,31054000,31042010","ureia":"ok (ComexStat 2026-07)","map":"ok (ComexStat 2026-07)","kcl":"ok (ComexStat 2026-07)","gas":"ok (EIA Henry Hub)","noticias":"ok (40 de https://www.noticiasagricolas.com.br/tags/fertilizantes/)"}.</w:t>
+        <w:t xml:space="preserve">Fontes automáticas: AwesomeAPI (câmbio), CEPEA/ESALQ (soja), ANP (diesel), stooq (BDI). Fertilizantes e gás natural: override manual (fertilizers-override.json). Status desta execução: {"sojaRegional":"ok (Oeste da Bahia/BA (AIBA))","bdi":"ok (HANDYBULK, 28/08/2026)","soja":"ok (Noticias Agricolas / CEPEA-PR 28/08/2026)","cambio":"ok (BCB PTAX)","diesel":"falha: Petrobras: HTTP 403 | PortalCanaa: HTTP 403","_comexPeriodo":"com-filtro-ncm | 2026-07 | 4 linhas","_comexNcmsEncontrados":"31042090,31021010,31054000,31042010","ureia":"ok (ComexStat 2026-07)","map":"ok (ComexStat 2026-07)","kcl":"ok (ComexStat 2026-07)","gas":"ok (EIA Henry Hub)","noticias":"ok (40 de https://www.noticiasagricolas.com.br/tags/fertilizantes/)"}.</w:t>
       </w:r>
     </w:p>
     <w:p>

</xml_diff>

<commit_message>
chore: atualizacao automatica 2026-09-01
</commit_message>
<xml_diff>
--- a/relatorio_executivo.docx
+++ b/relatorio_executivo.docx
@@ -46,7 +46,7 @@
           <w:sz w:val="17"/>
           <w:szCs w:val="17"/>
         </w:rPr>
-        <w:t xml:space="preserve">Equipe de Planejamento, Controle e Pesquisa Florestal  ·  Referência: Ago/2026  ·  Gerado em 31/08/2026, 17:22:38</w:t>
+        <w:t xml:space="preserve">Equipe de Planejamento, Controle e Pesquisa Florestal  ·  Referência: Set/2026  ·  Gerado em 01/09/2026, 11:12:03</w:t>
       </w:r>
     </w:p>
     <w:p>
@@ -77,7 +77,7 @@
           <w:sz w:val="19"/>
           <w:szCs w:val="19"/>
         </w:rPr>
-        <w:t xml:space="preserve">Leitura de Ago/2026. </w:t>
+        <w:t xml:space="preserve">Leitura de Set/2026. </w:t>
       </w:r>
       <w:r>
         <w:rPr>
@@ -91,7 +91,7 @@
           <w:sz w:val="19"/>
           <w:szCs w:val="19"/>
         </w:rPr>
-        <w:t xml:space="preserve">O dólar está em R$ 5,18 (+0,4%) e a soja CEPEA em R$ 151,32/saca. </w:t>
+        <w:t xml:space="preserve">O dólar está em R$ 5,18 (0,0%) e a soja CEPEA em R$ 151,31/saca. </w:t>
       </w:r>
       <w:r>
         <w:rPr>
@@ -864,7 +864,7 @@
                 <w:sz w:val="18"/>
                 <w:szCs w:val="18"/>
               </w:rPr>
-              <w:t xml:space="preserve">R$ 151,32/sc</w:t>
+              <w:t xml:space="preserve">R$ 151,31/sc</w:t>
             </w:r>
           </w:p>
         </w:tc>
@@ -893,11 +893,11 @@
               <w:rPr>
                 <w:b/>
                 <w:bCs/>
-                <w:color w:val="2F8A5F"/>
-                <w:sz w:val="18"/>
-                <w:szCs w:val="18"/>
-              </w:rPr>
-              <w:t xml:space="preserve">+3,1%</w:t>
+                <w:color w:val="6B7585"/>
+                <w:sz w:val="18"/>
+                <w:szCs w:val="18"/>
+              </w:rPr>
+              <w:t xml:space="preserve">0,0%</w:t>
             </w:r>
           </w:p>
         </w:tc>
@@ -1018,11 +1018,11 @@
               <w:rPr>
                 <w:b/>
                 <w:bCs/>
-                <w:color w:val="2F8A5F"/>
-                <w:sz w:val="18"/>
-                <w:szCs w:val="18"/>
-              </w:rPr>
-              <w:t xml:space="preserve">+2,3%</w:t>
+                <w:color w:val="6B7585"/>
+                <w:sz w:val="18"/>
+                <w:szCs w:val="18"/>
+              </w:rPr>
+              <w:t xml:space="preserve">0,0%</w:t>
             </w:r>
           </w:p>
         </w:tc>
@@ -1143,11 +1143,11 @@
               <w:rPr>
                 <w:b/>
                 <w:bCs/>
-                <w:color w:val="2F8A5F"/>
-                <w:sz w:val="18"/>
-                <w:szCs w:val="18"/>
-              </w:rPr>
-              <w:t xml:space="preserve">-2,7%</w:t>
+                <w:color w:val="6B7585"/>
+                <w:sz w:val="18"/>
+                <w:szCs w:val="18"/>
+              </w:rPr>
+              <w:t xml:space="preserve">0,0%</w:t>
             </w:r>
           </w:p>
         </w:tc>
@@ -1177,7 +1177,7 @@
                 <w:sz w:val="17"/>
                 <w:szCs w:val="17"/>
               </w:rPr>
-              <w:t xml:space="preserve">Melhora</w:t>
+              <w:t xml:space="preserve">Piora</w:t>
             </w:r>
           </w:p>
         </w:tc>
@@ -1557,11 +1557,11 @@
               <w:rPr>
                 <w:b/>
                 <w:bCs/>
-                <w:color w:val="B23636"/>
-                <w:sz w:val="18"/>
-                <w:szCs w:val="18"/>
-              </w:rPr>
-              <w:t xml:space="preserve">+0,4%</w:t>
+                <w:color w:val="6B7585"/>
+                <w:sz w:val="18"/>
+                <w:szCs w:val="18"/>
+              </w:rPr>
+              <w:t xml:space="preserve">0,0%</w:t>
             </w:r>
           </w:p>
         </w:tc>
@@ -1682,11 +1682,11 @@
               <w:rPr>
                 <w:b/>
                 <w:bCs/>
-                <w:color w:val="2F8A5F"/>
-                <w:sz w:val="18"/>
-                <w:szCs w:val="18"/>
-              </w:rPr>
-              <w:t xml:space="preserve">-4,3%</w:t>
+                <w:color w:val="6B7585"/>
+                <w:sz w:val="18"/>
+                <w:szCs w:val="18"/>
+              </w:rPr>
+              <w:t xml:space="preserve">0,0%</w:t>
             </w:r>
           </w:p>
         </w:tc>
@@ -1807,11 +1807,11 @@
               <w:rPr>
                 <w:b/>
                 <w:bCs/>
-                <w:color w:val="B23636"/>
-                <w:sz w:val="18"/>
-                <w:szCs w:val="18"/>
-              </w:rPr>
-              <w:t xml:space="preserve">+12,1%</w:t>
+                <w:color w:val="6B7585"/>
+                <w:sz w:val="18"/>
+                <w:szCs w:val="18"/>
+              </w:rPr>
+              <w:t xml:space="preserve">0,0%</w:t>
             </w:r>
           </w:p>
         </w:tc>
@@ -2001,19 +2001,86 @@
       </w:pPr>
       <w:r>
         <w:rPr>
+          <w:sz w:val="18"/>
+          <w:szCs w:val="18"/>
+        </w:rPr>
+        <w:t xml:space="preserve">Período sem variações relevantes (todas abaixo de 0,5%).</w:t>
+      </w:r>
+    </w:p>
+    <w:p>
+      <w:pPr>
+        <w:pBdr>
+          <w:bottom w:val="single" w:color="1E2A44" w:sz="6" w:space="2"/>
+        </w:pBdr>
+        <w:spacing w:after="100" w:before="220"/>
+      </w:pPr>
+      <w:r>
+        <w:rPr>
           <w:b/>
           <w:bCs/>
+          <w:color w:val="1E2A44"/>
+          <w:sz w:val="22"/>
+          <w:szCs w:val="22"/>
+        </w:rPr>
+        <w:t xml:space="preserve">6. Contexto de Mercado — Causas da Alta e Perspectivas</w:t>
+      </w:r>
+    </w:p>
+    <w:p>
+      <w:pPr>
+        <w:spacing w:after="60"/>
+      </w:pPr>
+      <w:r>
+        <w:rPr>
+          <w:b/>
+          <w:bCs/>
+          <w:color w:val="1E2A44"/>
           <w:sz w:val="18"/>
           <w:szCs w:val="18"/>
         </w:rPr>
-        <w:t xml:space="preserve">BDI: </w:t>
-      </w:r>
+        <w:t xml:space="preserve">Por que os fertilizantes subiram — e o que esperar · atualizado em Agosto/2026 · revisão manual.</w:t>
+      </w:r>
+    </w:p>
+    <w:p>
+      <w:pPr>
+        <w:spacing w:after="60"/>
+        <w:jc w:val="both"/>
+      </w:pPr>
       <w:r>
         <w:rPr>
           <w:sz w:val="18"/>
           <w:szCs w:val="18"/>
         </w:rPr>
-        <w:t xml:space="preserve">alta de +12,1% no período.</w:t>
+        <w:t xml:space="preserve">O eixo da pressão mudou ao longo de 2026: a ureia recuou dos picos após o alívio das tensões no Oriente Médio, mas os fosfatados (MAP) tornaram-se o ponto crítico — caros e de oferta apertada — por causa das restrições da China e da escassez de enxofre, às vésperas da safra 2026/27.</w:t>
+      </w:r>
+    </w:p>
+    <w:p>
+      <w:pPr>
+        <w:spacing w:after="80"/>
+      </w:pPr>
+      <w:r>
+        <w:rPr>
+          <w:i/>
+          <w:iCs/>
+          <w:color w:val="6B7585"/>
+          <w:sz w:val="17"/>
+          <w:szCs w:val="17"/>
+        </w:rPr>
+        <w:t xml:space="preserve">Leitura automática: sem novo fechamento de fertilizantes desde a leitura anterior (jul/26).</w:t>
+      </w:r>
+    </w:p>
+    <w:p>
+      <w:pPr>
+        <w:spacing w:after="40"/>
+      </w:pPr>
+      <w:r>
+        <w:rPr>
+          <w:b/>
+          <w:bCs/>
+          <w:color w:val="1E2A44"/>
+          <w:sz w:val="18"/>
+          <w:szCs w:val="18"/>
+        </w:rPr>
+        <w:t xml:space="preserve">Principais causas da alta:</w:t>
       </w:r>
     </w:p>
     <w:p>
@@ -2029,93 +2096,17 @@
         <w:rPr>
           <w:b/>
           <w:bCs/>
-          <w:sz w:val="18"/>
-          <w:szCs w:val="18"/>
-        </w:rPr>
-        <w:t xml:space="preserve">Gás Natural: </w:t>
-      </w:r>
-      <w:r>
-        <w:rPr>
-          <w:sz w:val="18"/>
-          <w:szCs w:val="18"/>
-        </w:rPr>
-        <w:t xml:space="preserve">queda de -4,3% no período.</w:t>
-      </w:r>
-    </w:p>
-    <w:p>
-      <w:pPr>
-        <w:pBdr>
-          <w:bottom w:val="single" w:color="1E2A44" w:sz="6" w:space="2"/>
-        </w:pBdr>
-        <w:spacing w:after="100" w:before="220"/>
-      </w:pPr>
-      <w:r>
-        <w:rPr>
-          <w:b/>
-          <w:bCs/>
-          <w:color w:val="1E2A44"/>
-          <w:sz w:val="22"/>
-          <w:szCs w:val="22"/>
-        </w:rPr>
-        <w:t xml:space="preserve">6. Contexto de Mercado — Causas da Alta e Perspectivas</w:t>
-      </w:r>
-    </w:p>
-    <w:p>
-      <w:pPr>
-        <w:spacing w:after="60"/>
-      </w:pPr>
-      <w:r>
-        <w:rPr>
-          <w:b/>
-          <w:bCs/>
-          <w:color w:val="1E2A44"/>
-          <w:sz w:val="18"/>
-          <w:szCs w:val="18"/>
-        </w:rPr>
-        <w:t xml:space="preserve">Por que os fertilizantes subiram — e o que esperar · atualizado em Agosto/2026 · revisão manual.</w:t>
-      </w:r>
-    </w:p>
-    <w:p>
-      <w:pPr>
-        <w:spacing w:after="60"/>
-        <w:jc w:val="both"/>
-      </w:pPr>
-      <w:r>
-        <w:rPr>
-          <w:sz w:val="18"/>
-          <w:szCs w:val="18"/>
-        </w:rPr>
-        <w:t xml:space="preserve">O eixo da pressão mudou ao longo de 2026: a ureia recuou dos picos após o alívio das tensões no Oriente Médio, mas os fosfatados (MAP) tornaram-se o ponto crítico — caros e de oferta apertada — por causa das restrições da China e da escassez de enxofre, às vésperas da safra 2026/27.</w:t>
-      </w:r>
-    </w:p>
-    <w:p>
-      <w:pPr>
-        <w:spacing w:after="80"/>
-      </w:pPr>
-      <w:r>
-        <w:rPr>
-          <w:i/>
-          <w:iCs/>
-          <w:color w:val="6B7585"/>
           <w:sz w:val="17"/>
           <w:szCs w:val="17"/>
         </w:rPr>
-        <w:t xml:space="preserve">Leitura automática: sem novo fechamento de fertilizantes desde a leitura anterior (jul/26).</w:t>
-      </w:r>
-    </w:p>
-    <w:p>
-      <w:pPr>
-        <w:spacing w:after="40"/>
-      </w:pPr>
-      <w:r>
-        <w:rPr>
-          <w:b/>
-          <w:bCs/>
-          <w:color w:val="1E2A44"/>
-          <w:sz w:val="18"/>
-          <w:szCs w:val="18"/>
-        </w:rPr>
-        <w:t xml:space="preserve">Principais causas da alta:</w:t>
+        <w:t xml:space="preserve">Restrições da China aos fosfatados: </w:t>
+      </w:r>
+      <w:r>
+        <w:rPr>
+          <w:sz w:val="17"/>
+          <w:szCs w:val="17"/>
+        </w:rPr>
+        <w:t xml:space="preserve">A China suspendeu boa parte das exportações de fosfatados para priorizar o abastecimento interno; fontes do setor estimam que de 40% a 80% dos embarques estejam bloqueados ou sob cota, e as restrições podem durar até meados do segundo semestre de 2026.</w:t>
       </w:r>
     </w:p>
     <w:p>
@@ -2134,14 +2125,14 @@
           <w:sz w:val="17"/>
           <w:szCs w:val="17"/>
         </w:rPr>
-        <w:t xml:space="preserve">Restrições da China aos fosfatados: </w:t>
+        <w:t xml:space="preserve">Escassez de enxofre: </w:t>
       </w:r>
       <w:r>
         <w:rPr>
           <w:sz w:val="17"/>
           <w:szCs w:val="17"/>
         </w:rPr>
-        <w:t xml:space="preserve">A China suspendeu boa parte das exportações de fosfatados para priorizar o abastecimento interno; fontes do setor estimam que de 40% a 80% dos embarques estejam bloqueados ou sob cota, e as restrições podem durar até meados do segundo semestre de 2026.</w:t>
+        <w:t xml:space="preserve">Insumo essencial do MAP, o enxofre chegou a cerca de US$ 1.250/t; os desembarques no Brasil no 1º semestre ficaram ~42% abaixo de 2025 (StoneX), levando fábricas a reduzir produção e apertando ainda mais a oferta de fosfatados.</w:t>
       </w:r>
     </w:p>
     <w:p>
@@ -2160,14 +2151,14 @@
           <w:sz w:val="17"/>
           <w:szCs w:val="17"/>
         </w:rPr>
-        <w:t xml:space="preserve">Escassez de enxofre: </w:t>
+        <w:t xml:space="preserve">Oferta russa e de outros polos reduzida: </w:t>
       </w:r>
       <w:r>
         <w:rPr>
           <w:sz w:val="17"/>
           <w:szCs w:val="17"/>
         </w:rPr>
-        <w:t xml:space="preserve">Insumo essencial do MAP, o enxofre chegou a cerca de US$ 1.250/t; os desembarques no Brasil no 1º semestre ficaram ~42% abaixo de 2025 (StoneX), levando fábricas a reduzir produção e apertando ainda mais a oferta de fosfatados.</w:t>
+        <w:t xml:space="preserve">Menor disponibilidade da Rússia, restrições no Marrocos e paralisações pontuais de produtoras limitam a oferta global de fósforo e sustentam o MAP em patamar elevado.</w:t>
       </w:r>
     </w:p>
     <w:p>
@@ -2186,14 +2177,14 @@
           <w:sz w:val="17"/>
           <w:szCs w:val="17"/>
         </w:rPr>
-        <w:t xml:space="preserve">Oferta russa e de outros polos reduzida: </w:t>
+        <w:t xml:space="preserve">Conflito no Oriente Médio (efeito decrescente): </w:t>
       </w:r>
       <w:r>
         <w:rPr>
           <w:sz w:val="17"/>
           <w:szCs w:val="17"/>
         </w:rPr>
-        <w:t xml:space="preserve">Menor disponibilidade da Rússia, restrições no Marrocos e paralisações pontuais de produtoras limitam a oferta global de fósforo e sustentam o MAP em patamar elevado.</w:t>
+        <w:t xml:space="preserve">Foi o principal motor da disparada da ureia no 1º semestre. Com o avanço do acordo entre EUA e Irã, o risco arrefeceu e a ureia recuou — mas o mercado segue cauteloso a novas tensões.</w:t>
       </w:r>
     </w:p>
     <w:p>
@@ -2212,14 +2203,42 @@
           <w:sz w:val="17"/>
           <w:szCs w:val="17"/>
         </w:rPr>
-        <w:t xml:space="preserve">Conflito no Oriente Médio (efeito decrescente): </w:t>
+        <w:t xml:space="preserve">Dependência de importação e compras atrasadas: </w:t>
       </w:r>
       <w:r>
         <w:rPr>
           <w:sz w:val="17"/>
           <w:szCs w:val="17"/>
         </w:rPr>
-        <w:t xml:space="preserve">Foi o principal motor da disparada da ureia no 1º semestre. Com o avanço do acordo entre EUA e Irã, o risco arrefeceu e a ureia recuou — mas o mercado segue cauteloso a novas tensões.</w:t>
+        <w:t xml:space="preserve">O Brasil importa cerca de 85% dos fertilizantes. Em 2026 as compras da safra 2026/27 atrasaram, e o produtor ainda descoberto pode enfrentar preço e disponibilidade piores ao acelerar as aquisições.</w:t>
+      </w:r>
+    </w:p>
+    <w:p>
+      <w:pPr>
+        <w:spacing w:after="80" w:before="40"/>
+        <w:jc w:val="both"/>
+      </w:pPr>
+      <w:r>
+        <w:rPr>
+          <w:sz w:val="17"/>
+          <w:szCs w:val="17"/>
+        </w:rPr>
+        <w:t xml:space="preserve">Referências de portos no meio do ano: a ureia recuou para a faixa de US$ 410–430/t CFR após ter passado de US$ 700/t no auge; o MAP seguiu pressionado, negociado próximo de US$ 850–900/t; o KCl manteve-se relativamente estável, em torno de US$ 380–405/t (Itaú BBA / consultorias). O Ministério da Agricultura chegou a alertar para risco de déficit de 1 a 3 milhões de toneladas de fosfatados em 2026.</w:t>
+      </w:r>
+    </w:p>
+    <w:p>
+      <w:pPr>
+        <w:spacing w:after="40" w:before="40"/>
+      </w:pPr>
+      <w:r>
+        <w:rPr>
+          <w:b/>
+          <w:bCs/>
+          <w:color w:val="1E2A44"/>
+          <w:sz w:val="18"/>
+          <w:szCs w:val="18"/>
+        </w:rPr>
+        <w:t xml:space="preserve">O que esperar nos próximos meses:</w:t>
       </w:r>
     </w:p>
     <w:p>
@@ -2233,47 +2252,10 @@
       </w:pPr>
       <w:r>
         <w:rPr>
-          <w:b/>
-          <w:bCs/>
           <w:sz w:val="17"/>
           <w:szCs w:val="17"/>
         </w:rPr>
-        <w:t xml:space="preserve">Dependência de importação e compras atrasadas: </w:t>
-      </w:r>
-      <w:r>
-        <w:rPr>
-          <w:sz w:val="17"/>
-          <w:szCs w:val="17"/>
-        </w:rPr>
-        <w:t xml:space="preserve">O Brasil importa cerca de 85% dos fertilizantes. Em 2026 as compras da safra 2026/27 atrasaram, e o produtor ainda descoberto pode enfrentar preço e disponibilidade piores ao acelerar as aquisições.</w:t>
-      </w:r>
-    </w:p>
-    <w:p>
-      <w:pPr>
-        <w:spacing w:after="80" w:before="40"/>
-        <w:jc w:val="both"/>
-      </w:pPr>
-      <w:r>
-        <w:rPr>
-          <w:sz w:val="17"/>
-          <w:szCs w:val="17"/>
-        </w:rPr>
-        <w:t xml:space="preserve">Referências de portos no meio do ano: a ureia recuou para a faixa de US$ 410–430/t CFR após ter passado de US$ 700/t no auge; o MAP seguiu pressionado, negociado próximo de US$ 850–900/t; o KCl manteve-se relativamente estável, em torno de US$ 380–405/t (Itaú BBA / consultorias). O Ministério da Agricultura chegou a alertar para risco de déficit de 1 a 3 milhões de toneladas de fosfatados em 2026.</w:t>
-      </w:r>
-    </w:p>
-    <w:p>
-      <w:pPr>
-        <w:spacing w:after="40" w:before="40"/>
-      </w:pPr>
-      <w:r>
-        <w:rPr>
-          <w:b/>
-          <w:bCs/>
-          <w:color w:val="1E2A44"/>
-          <w:sz w:val="18"/>
-          <w:szCs w:val="18"/>
-        </w:rPr>
-        <w:t xml:space="preserve">O que esperar nos próximos meses:</w:t>
+        <w:t xml:space="preserve">Ureia (nitrogenados): cenário mais calmo após o recuo, mas ainda sensível a choques geopolíticos e ao gás natural — sem folga estrutural de oferta.</w:t>
       </w:r>
     </w:p>
     <w:p>
@@ -2290,7 +2272,7 @@
           <w:sz w:val="17"/>
           <w:szCs w:val="17"/>
         </w:rPr>
-        <w:t xml:space="preserve">Ureia (nitrogenados): cenário mais calmo após o recuo, mas ainda sensível a choques geopolíticos e ao gás natural — sem folga estrutural de oferta.</w:t>
+        <w:t xml:space="preserve">MAP (fosfatados): é hoje o produto mais crítico; a pressão deve persistir enquanto durarem as restrições chinesas e a escassez de enxofre, com risco de faltar produto no pico de plantio (set–out).</w:t>
       </w:r>
     </w:p>
     <w:p>
@@ -2307,7 +2289,7 @@
           <w:sz w:val="17"/>
           <w:szCs w:val="17"/>
         </w:rPr>
-        <w:t xml:space="preserve">MAP (fosfatados): é hoje o produto mais crítico; a pressão deve persistir enquanto durarem as restrições chinesas e a escassez de enxofre, com risco de faltar produto no pico de plantio (set–out).</w:t>
+        <w:t xml:space="preserve">KCl (potássio): segmento mais equilibrado e com importação recorde; preços relativamente estáveis, embora manutenções industriais no 2º semestre possam alterar o equilíbrio.</w:t>
       </w:r>
     </w:p>
     <w:p>
@@ -2324,7 +2306,7 @@
           <w:sz w:val="17"/>
           <w:szCs w:val="17"/>
         </w:rPr>
-        <w:t xml:space="preserve">KCl (potássio): segmento mais equilibrado e com importação recorde; preços relativamente estáveis, embora manutenções industriais no 2º semestre possam alterar o equilíbrio.</w:t>
+        <w:t xml:space="preserve">Estratégia sugerida por analistas: evitar ficar descoberto — garantir disponibilidade de fosfatados pode importar mais que o preço; escalonar compras, priorizar KCl (mais líquido) e avaliar substitutos de fósforo como SSP/TSP.</w:t>
       </w:r>
     </w:p>
     <w:p>
@@ -2341,7 +2323,22 @@
           <w:sz w:val="17"/>
           <w:szCs w:val="17"/>
         </w:rPr>
-        <w:t xml:space="preserve">Estratégia sugerida por analistas: evitar ficar descoberto — garantir disponibilidade de fosfatados pode importar mais que o preço; escalonar compras, priorizar KCl (mais líquido) e avaliar substitutos de fósforo como SSP/TSP.</w:t>
+        <w:t xml:space="preserve">Riscos a monitorar: prazo real da suspensão das restrições chinesas, evolução do conflito no Oriente Médio, preço do enxofre e câmbio.</w:t>
+      </w:r>
+    </w:p>
+    <w:p>
+      <w:pPr>
+        <w:spacing w:after="20" w:before="60"/>
+      </w:pPr>
+      <w:r>
+        <w:rPr>
+          <w:b/>
+          <w:bCs/>
+          <w:color w:val="1E2A44"/>
+          <w:sz w:val="17"/>
+          <w:szCs w:val="17"/>
+        </w:rPr>
+        <w:t xml:space="preserve">Notícias recentes do mercado (atualização automática):</w:t>
       </w:r>
     </w:p>
     <w:p>
@@ -2355,25 +2352,10 @@
       </w:pPr>
       <w:r>
         <w:rPr>
-          <w:sz w:val="17"/>
-          <w:szCs w:val="17"/>
-        </w:rPr>
-        <w:t xml:space="preserve">Riscos a monitorar: prazo real da suspensão das restrições chinesas, evolução do conflito no Oriente Médio, preço do enxofre e câmbio.</w:t>
-      </w:r>
-    </w:p>
-    <w:p>
-      <w:pPr>
-        <w:spacing w:after="20" w:before="60"/>
-      </w:pPr>
-      <w:r>
-        <w:rPr>
-          <w:b/>
-          <w:bCs/>
-          <w:color w:val="1E2A44"/>
-          <w:sz w:val="17"/>
-          <w:szCs w:val="17"/>
-        </w:rPr>
-        <w:t xml:space="preserve">Notícias recentes do mercado (atualização automática):</w:t>
+          <w:sz w:val="16"/>
+          <w:szCs w:val="16"/>
+        </w:rPr>
+        <w:t xml:space="preserve">Tempo e Clima 04/08/2026 - 12:41 El Niño reforça importância da nutrição das plantas para reduzir perdas no campo</w:t>
       </w:r>
     </w:p>
     <w:p>
@@ -2390,7 +2372,7 @@
           <w:sz w:val="16"/>
           <w:szCs w:val="16"/>
         </w:rPr>
-        <w:t xml:space="preserve">Tempo e Clima 04/08/2026 - 12:41 El Niño reforça importância da nutrição das plantas para reduzir perdas no campo</w:t>
+        <w:t xml:space="preserve">Agronegócio 30/06/2026 - 09:30 Mercado de fertilizantes amplia movimento de baixa com recuo da ureia, MAP e cloreto de potássio</w:t>
       </w:r>
     </w:p>
     <w:p>
@@ -2407,7 +2389,7 @@
           <w:sz w:val="16"/>
           <w:szCs w:val="16"/>
         </w:rPr>
-        <w:t xml:space="preserve">Agronegócio 30/06/2026 - 09:30 Mercado de fertilizantes amplia movimento de baixa com recuo da ureia, MAP e cloreto de potássio</w:t>
+        <w:t xml:space="preserve">Agronegócio 19/06/2026 - 11:01 Importação dos EUA de fertilizante com origem no Oriente Médio zera em maio</w:t>
       </w:r>
     </w:p>
     <w:p>
@@ -2424,23 +2406,6 @@
           <w:sz w:val="16"/>
           <w:szCs w:val="16"/>
         </w:rPr>
-        <w:t xml:space="preserve">Agronegócio 19/06/2026 - 11:01 Importação dos EUA de fertilizante com origem no Oriente Médio zera em maio</w:t>
-      </w:r>
-    </w:p>
-    <w:p>
-      <w:pPr>
-        <w:pStyle w:val="ListParagraph"/>
-        <w:numPr>
-          <w:ilvl w:val="0"/>
-          <w:numId w:val="2"/>
-        </w:numPr>
-        <w:spacing w:after="70"/>
-      </w:pPr>
-      <w:r>
-        <w:rPr>
-          <w:sz w:val="16"/>
-          <w:szCs w:val="16"/>
-        </w:rPr>
         <w:t xml:space="preserve">Agronegócio 16/06/2026 - 16:30 Ureia cai mais de 40% e volta ao nível pré-crise com avanço de acordo entre EUA e Irã</w:t>
       </w:r>
     </w:p>
@@ -2530,7 +2495,7 @@
           <w:sz w:val="15"/>
           <w:szCs w:val="15"/>
         </w:rPr>
-        <w:t xml:space="preserve">Fontes automáticas: AwesomeAPI (câmbio), CEPEA/ESALQ (soja), ANP (diesel), stooq (BDI). Fertilizantes e gás natural: override manual (fertilizers-override.json). Status desta execução: {"sojaRegional":"ok (Oeste da Bahia/BA (AIBA))","bdi":"ok (HANDYBULK, 28/08/2026)","soja":"ok (Noticias Agricolas / CEPEA-PR 28/08/2026)","cambio":"ok (BCB PTAX)","diesel":"falha: Petrobras: HTTP 403 | PortalCanaa: HTTP 403","_comexPeriodo":"com-filtro-ncm | 2026-07 | 4 linhas","_comexNcmsEncontrados":"31042090,31021010,31054000,31042010","ureia":"ok (ComexStat 2026-07)","map":"ok (ComexStat 2026-07)","kcl":"ok (ComexStat 2026-07)","gas":"ok (EIA Henry Hub)","noticias":"ok (40 de https://www.noticiasagricolas.com.br/tags/fertilizantes/)"}.</w:t>
+        <w:t xml:space="preserve">Fontes automáticas: AwesomeAPI (câmbio), CEPEA/ESALQ (soja), ANP (diesel), stooq (BDI). Fertilizantes e gás natural: override manual (fertilizers-override.json). Status desta execução: {"sojaRegional":"ok (Oeste da Bahia/BA (AIBA))","bdi":"ok (HANDYBULK, 28/08/2026)","soja":"ok (Noticias Agricolas / CEPEA-PR 31/08/2026)","cambio":"ok (BCB PTAX)","diesel":"falha: Petrobras: HTTP 403 | PortalCanaa: HTTP 403","_comexRetry":"aguardando 15s apos 429 (com-filtro-ncm 2026-07, tentativa 2)","_comexPeriodo":"com-filtro-ncm | 2026-07 | 4 linhas","_comexNcmsEncontrados":"31042090,31021010,31054000,31042010","ureia":"ok (ComexStat 2026-07)","map":"ok (ComexStat 2026-07)","kcl":"ok (ComexStat 2026-07)","gas":"ok (EIA Henry Hub)","noticias":"ok (40 de https://www.noticiasagricolas.com.br/tags/fertilizantes/)"}.</w:t>
       </w:r>
     </w:p>
     <w:p>
@@ -2611,7 +2576,7 @@
         <w:sz w:val="15"/>
         <w:szCs w:val="15"/>
       </w:rPr>
-      <w:t xml:space="preserve">Inteligência de Mercado · Ago/2026  ·  Página </w:t>
+      <w:t xml:space="preserve">Inteligência de Mercado · Set/2026  ·  Página </w:t>
     </w:r>
     <w:r>
       <w:rPr>

</xml_diff>

<commit_message>
chore: atualizacao automatica 2026-09-07
</commit_message>
<xml_diff>
--- a/relatorio_executivo.docx
+++ b/relatorio_executivo.docx
@@ -46,7 +46,7 @@
           <w:sz w:val="17"/>
           <w:szCs w:val="17"/>
         </w:rPr>
-        <w:t xml:space="preserve">Equipe de Planejamento, Controle e Pesquisa Florestal  ·  Referência: Set/2026  ·  Gerado em 01/09/2026, 11:12:03</w:t>
+        <w:t xml:space="preserve">Equipe de Planejamento, Controle e Pesquisa Florestal  ·  Referência: Set/2026  ·  Gerado em 07/09/2026, 15:27:16</w:t>
       </w:r>
     </w:p>
     <w:p>
@@ -84,21 +84,21 @@
           <w:sz w:val="19"/>
           <w:szCs w:val="19"/>
         </w:rPr>
-        <w:t xml:space="preserve">Ureia FOB em US$ 418/t (fechamento jul/26), MAP US$ 828/t e KCl US$ 359/t. </w:t>
+        <w:t xml:space="preserve">Ureia FOB em US$ 413/t (-1,3%), MAP US$ 834/t e KCl US$ 352/t. </w:t>
       </w:r>
       <w:r>
         <w:rPr>
           <w:sz w:val="19"/>
           <w:szCs w:val="19"/>
         </w:rPr>
-        <w:t xml:space="preserve">O dólar está em R$ 5,18 (0,0%) e a soja CEPEA em R$ 151,31/saca. </w:t>
+        <w:t xml:space="preserve">O dólar está em R$ 5,13 (-1,0%) e a soja CEPEA em R$ 152,10/saca. </w:t>
       </w:r>
       <w:r>
         <w:rPr>
           <w:sz w:val="19"/>
           <w:szCs w:val="19"/>
         </w:rPr>
-        <w:t xml:space="preserve">A relação de troca soja/MAP é de 29,1 sacas/t.</w:t>
+        <w:t xml:space="preserve">A relação de troca soja/MAP é de 28,9 sacas/t.</w:t>
       </w:r>
     </w:p>
     <w:p>
@@ -323,7 +323,7 @@
                 <w:sz w:val="18"/>
                 <w:szCs w:val="18"/>
               </w:rPr>
-              <w:t xml:space="preserve">US$ 418/t</w:t>
+              <w:t xml:space="preserve">US$ 413/t</w:t>
             </w:r>
           </w:p>
         </w:tc>
@@ -352,11 +352,11 @@
               <w:rPr>
                 <w:b/>
                 <w:bCs/>
-                <w:color w:val="6B7585"/>
-                <w:sz w:val="18"/>
-                <w:szCs w:val="18"/>
-              </w:rPr>
-              <w:t xml:space="preserve">—</w:t>
+                <w:color w:val="2F8A5F"/>
+                <w:sz w:val="18"/>
+                <w:szCs w:val="18"/>
+              </w:rPr>
+              <w:t xml:space="preserve">-1,3%</w:t>
             </w:r>
           </w:p>
         </w:tc>
@@ -386,7 +386,7 @@
                 <w:sz w:val="17"/>
                 <w:szCs w:val="17"/>
               </w:rPr>
-              <w:t xml:space="preserve">Fechamento jul/26 (sem novo dado)</w:t>
+              <w:t xml:space="preserve">Nitrogenado · ref. ago/26</w:t>
             </w:r>
           </w:p>
         </w:tc>
@@ -448,7 +448,7 @@
                 <w:sz w:val="18"/>
                 <w:szCs w:val="18"/>
               </w:rPr>
-              <w:t xml:space="preserve">US$ 828/t</w:t>
+              <w:t xml:space="preserve">US$ 834/t</w:t>
             </w:r>
           </w:p>
         </w:tc>
@@ -477,11 +477,11 @@
               <w:rPr>
                 <w:b/>
                 <w:bCs/>
-                <w:color w:val="6B7585"/>
-                <w:sz w:val="18"/>
-                <w:szCs w:val="18"/>
-              </w:rPr>
-              <w:t xml:space="preserve">—</w:t>
+                <w:color w:val="B23636"/>
+                <w:sz w:val="18"/>
+                <w:szCs w:val="18"/>
+              </w:rPr>
+              <w:t xml:space="preserve">+0,8%</w:t>
             </w:r>
           </w:p>
         </w:tc>
@@ -511,7 +511,7 @@
                 <w:sz w:val="17"/>
                 <w:szCs w:val="17"/>
               </w:rPr>
-              <w:t xml:space="preserve">Fechamento jul/26 (sem novo dado)</w:t>
+              <w:t xml:space="preserve">Fosfatado · ref. ago/26</w:t>
             </w:r>
           </w:p>
         </w:tc>
@@ -573,7 +573,7 @@
                 <w:sz w:val="18"/>
                 <w:szCs w:val="18"/>
               </w:rPr>
-              <w:t xml:space="preserve">US$ 359/t</w:t>
+              <w:t xml:space="preserve">US$ 352/t</w:t>
             </w:r>
           </w:p>
         </w:tc>
@@ -602,11 +602,11 @@
               <w:rPr>
                 <w:b/>
                 <w:bCs/>
-                <w:color w:val="6B7585"/>
-                <w:sz w:val="18"/>
-                <w:szCs w:val="18"/>
-              </w:rPr>
-              <w:t xml:space="preserve">—</w:t>
+                <w:color w:val="2F8A5F"/>
+                <w:sz w:val="18"/>
+                <w:szCs w:val="18"/>
+              </w:rPr>
+              <w:t xml:space="preserve">-1,9%</w:t>
             </w:r>
           </w:p>
         </w:tc>
@@ -636,7 +636,7 @@
                 <w:sz w:val="17"/>
                 <w:szCs w:val="17"/>
               </w:rPr>
-              <w:t xml:space="preserve">Fechamento jul/26 (sem novo dado)</w:t>
+              <w:t xml:space="preserve">Potássico · ref. ago/26</w:t>
             </w:r>
           </w:p>
         </w:tc>
@@ -864,7 +864,7 @@
                 <w:sz w:val="18"/>
                 <w:szCs w:val="18"/>
               </w:rPr>
-              <w:t xml:space="preserve">R$ 151,31/sc</w:t>
+              <w:t xml:space="preserve">R$ 152,10/sc</w:t>
             </w:r>
           </w:p>
         </w:tc>
@@ -893,11 +893,11 @@
               <w:rPr>
                 <w:b/>
                 <w:bCs/>
-                <w:color w:val="6B7585"/>
-                <w:sz w:val="18"/>
-                <w:szCs w:val="18"/>
-              </w:rPr>
-              <w:t xml:space="preserve">0,0%</w:t>
+                <w:color w:val="2F8A5F"/>
+                <w:sz w:val="18"/>
+                <w:szCs w:val="18"/>
+              </w:rPr>
+              <w:t xml:space="preserve">+0,5%</w:t>
             </w:r>
           </w:p>
         </w:tc>
@@ -989,7 +989,7 @@
                 <w:sz w:val="18"/>
                 <w:szCs w:val="18"/>
               </w:rPr>
-              <w:t xml:space="preserve">R$ 142,00/sc</w:t>
+              <w:t xml:space="preserve">R$ 144,75/sc</w:t>
             </w:r>
           </w:p>
         </w:tc>
@@ -1018,11 +1018,11 @@
               <w:rPr>
                 <w:b/>
                 <w:bCs/>
-                <w:color w:val="6B7585"/>
-                <w:sz w:val="18"/>
-                <w:szCs w:val="18"/>
-              </w:rPr>
-              <w:t xml:space="preserve">0,0%</w:t>
+                <w:color w:val="2F8A5F"/>
+                <w:sz w:val="18"/>
+                <w:szCs w:val="18"/>
+              </w:rPr>
+              <w:t xml:space="preserve">+1,9%</w:t>
             </w:r>
           </w:p>
         </w:tc>
@@ -1114,7 +1114,7 @@
                 <w:sz w:val="18"/>
                 <w:szCs w:val="18"/>
               </w:rPr>
-              <w:t xml:space="preserve">29,1 sc/t</w:t>
+              <w:t xml:space="preserve">28,9 sc/t</w:t>
             </w:r>
           </w:p>
         </w:tc>
@@ -1143,11 +1143,11 @@
               <w:rPr>
                 <w:b/>
                 <w:bCs/>
-                <w:color w:val="6B7585"/>
-                <w:sz w:val="18"/>
-                <w:szCs w:val="18"/>
-              </w:rPr>
-              <w:t xml:space="preserve">0,0%</w:t>
+                <w:color w:val="2F8A5F"/>
+                <w:sz w:val="18"/>
+                <w:szCs w:val="18"/>
+              </w:rPr>
+              <w:t xml:space="preserve">-0,7%</w:t>
             </w:r>
           </w:p>
         </w:tc>
@@ -1177,7 +1177,7 @@
                 <w:sz w:val="17"/>
                 <w:szCs w:val="17"/>
               </w:rPr>
-              <w:t xml:space="preserve">Piora</w:t>
+              <w:t xml:space="preserve">Melhora</w:t>
             </w:r>
           </w:p>
         </w:tc>
@@ -1239,7 +1239,7 @@
                 <w:sz w:val="18"/>
                 <w:szCs w:val="18"/>
               </w:rPr>
-              <w:t xml:space="preserve">15,0 sc/t</w:t>
+              <w:t xml:space="preserve">14,6 sc/t</w:t>
             </w:r>
           </w:p>
         </w:tc>
@@ -1528,7 +1528,7 @@
                 <w:sz w:val="18"/>
                 <w:szCs w:val="18"/>
               </w:rPr>
-              <w:t xml:space="preserve">5,18</w:t>
+              <w:t xml:space="preserve">5,13</w:t>
             </w:r>
           </w:p>
         </w:tc>
@@ -1557,11 +1557,11 @@
               <w:rPr>
                 <w:b/>
                 <w:bCs/>
-                <w:color w:val="6B7585"/>
-                <w:sz w:val="18"/>
-                <w:szCs w:val="18"/>
-              </w:rPr>
-              <w:t xml:space="preserve">0,0%</w:t>
+                <w:color w:val="2F8A5F"/>
+                <w:sz w:val="18"/>
+                <w:szCs w:val="18"/>
+              </w:rPr>
+              <w:t xml:space="preserve">-1,0%</w:t>
             </w:r>
           </w:p>
         </w:tc>
@@ -1653,7 +1653,7 @@
                 <w:sz w:val="18"/>
                 <w:szCs w:val="18"/>
               </w:rPr>
-              <w:t xml:space="preserve">US$ 2,70</w:t>
+              <w:t xml:space="preserve">US$ 2,90</w:t>
             </w:r>
           </w:p>
         </w:tc>
@@ -1682,11 +1682,11 @@
               <w:rPr>
                 <w:b/>
                 <w:bCs/>
-                <w:color w:val="6B7585"/>
-                <w:sz w:val="18"/>
-                <w:szCs w:val="18"/>
-              </w:rPr>
-              <w:t xml:space="preserve">0,0%</w:t>
+                <w:color w:val="B23636"/>
+                <w:sz w:val="18"/>
+                <w:szCs w:val="18"/>
+              </w:rPr>
+              <w:t xml:space="preserve">+7,4%</w:t>
             </w:r>
           </w:p>
         </w:tc>
@@ -1778,7 +1778,7 @@
                 <w:sz w:val="18"/>
                 <w:szCs w:val="18"/>
               </w:rPr>
-              <w:t xml:space="preserve">3.186 pts</w:t>
+              <w:t xml:space="preserve">3.628 pts</w:t>
             </w:r>
           </w:p>
         </w:tc>
@@ -1807,11 +1807,11 @@
               <w:rPr>
                 <w:b/>
                 <w:bCs/>
-                <w:color w:val="6B7585"/>
-                <w:sz w:val="18"/>
-                <w:szCs w:val="18"/>
-              </w:rPr>
-              <w:t xml:space="preserve">0,0%</w:t>
+                <w:color w:val="B23636"/>
+                <w:sz w:val="18"/>
+                <w:szCs w:val="18"/>
+              </w:rPr>
+              <w:t xml:space="preserve">+13,9%</w:t>
             </w:r>
           </w:p>
         </w:tc>
@@ -2001,86 +2001,19 @@
       </w:pPr>
       <w:r>
         <w:rPr>
+          <w:b/>
+          <w:bCs/>
           <w:sz w:val="18"/>
           <w:szCs w:val="18"/>
         </w:rPr>
-        <w:t xml:space="preserve">Período sem variações relevantes (todas abaixo de 0,5%).</w:t>
-      </w:r>
-    </w:p>
-    <w:p>
-      <w:pPr>
-        <w:pBdr>
-          <w:bottom w:val="single" w:color="1E2A44" w:sz="6" w:space="2"/>
-        </w:pBdr>
-        <w:spacing w:after="100" w:before="220"/>
-      </w:pPr>
-      <w:r>
-        <w:rPr>
-          <w:b/>
-          <w:bCs/>
-          <w:color w:val="1E2A44"/>
-          <w:sz w:val="22"/>
-          <w:szCs w:val="22"/>
-        </w:rPr>
-        <w:t xml:space="preserve">6. Contexto de Mercado — Causas da Alta e Perspectivas</w:t>
-      </w:r>
-    </w:p>
-    <w:p>
-      <w:pPr>
-        <w:spacing w:after="60"/>
-      </w:pPr>
-      <w:r>
-        <w:rPr>
-          <w:b/>
-          <w:bCs/>
-          <w:color w:val="1E2A44"/>
+        <w:t xml:space="preserve">BDI: </w:t>
+      </w:r>
+      <w:r>
+        <w:rPr>
           <w:sz w:val="18"/>
           <w:szCs w:val="18"/>
         </w:rPr>
-        <w:t xml:space="preserve">Por que os fertilizantes subiram — e o que esperar · atualizado em Agosto/2026 · revisão manual.</w:t>
-      </w:r>
-    </w:p>
-    <w:p>
-      <w:pPr>
-        <w:spacing w:after="60"/>
-        <w:jc w:val="both"/>
-      </w:pPr>
-      <w:r>
-        <w:rPr>
-          <w:sz w:val="18"/>
-          <w:szCs w:val="18"/>
-        </w:rPr>
-        <w:t xml:space="preserve">O eixo da pressão mudou ao longo de 2026: a ureia recuou dos picos após o alívio das tensões no Oriente Médio, mas os fosfatados (MAP) tornaram-se o ponto crítico — caros e de oferta apertada — por causa das restrições da China e da escassez de enxofre, às vésperas da safra 2026/27.</w:t>
-      </w:r>
-    </w:p>
-    <w:p>
-      <w:pPr>
-        <w:spacing w:after="80"/>
-      </w:pPr>
-      <w:r>
-        <w:rPr>
-          <w:i/>
-          <w:iCs/>
-          <w:color w:val="6B7585"/>
-          <w:sz w:val="17"/>
-          <w:szCs w:val="17"/>
-        </w:rPr>
-        <w:t xml:space="preserve">Leitura automática: sem novo fechamento de fertilizantes desde a leitura anterior (jul/26).</w:t>
-      </w:r>
-    </w:p>
-    <w:p>
-      <w:pPr>
-        <w:spacing w:after="40"/>
-      </w:pPr>
-      <w:r>
-        <w:rPr>
-          <w:b/>
-          <w:bCs/>
-          <w:color w:val="1E2A44"/>
-          <w:sz w:val="18"/>
-          <w:szCs w:val="18"/>
-        </w:rPr>
-        <w:t xml:space="preserve">Principais causas da alta:</w:t>
+        <w:t xml:space="preserve">alta de +13,9% no período.</w:t>
       </w:r>
     </w:p>
     <w:p>
@@ -2096,17 +2029,17 @@
         <w:rPr>
           <w:b/>
           <w:bCs/>
-          <w:sz w:val="17"/>
-          <w:szCs w:val="17"/>
-        </w:rPr>
-        <w:t xml:space="preserve">Restrições da China aos fosfatados: </w:t>
-      </w:r>
-      <w:r>
-        <w:rPr>
-          <w:sz w:val="17"/>
-          <w:szCs w:val="17"/>
-        </w:rPr>
-        <w:t xml:space="preserve">A China suspendeu boa parte das exportações de fosfatados para priorizar o abastecimento interno; fontes do setor estimam que de 40% a 80% dos embarques estejam bloqueados ou sob cota, e as restrições podem durar até meados do segundo semestre de 2026.</w:t>
+          <w:sz w:val="18"/>
+          <w:szCs w:val="18"/>
+        </w:rPr>
+        <w:t xml:space="preserve">Gás Natural: </w:t>
+      </w:r>
+      <w:r>
+        <w:rPr>
+          <w:sz w:val="18"/>
+          <w:szCs w:val="18"/>
+        </w:rPr>
+        <w:t xml:space="preserve">alta de +7,4% no período.</w:t>
       </w:r>
     </w:p>
     <w:p>
@@ -2122,17 +2055,17 @@
         <w:rPr>
           <w:b/>
           <w:bCs/>
-          <w:sz w:val="17"/>
-          <w:szCs w:val="17"/>
-        </w:rPr>
-        <w:t xml:space="preserve">Escassez de enxofre: </w:t>
-      </w:r>
-      <w:r>
-        <w:rPr>
-          <w:sz w:val="17"/>
-          <w:szCs w:val="17"/>
-        </w:rPr>
-        <w:t xml:space="preserve">Insumo essencial do MAP, o enxofre chegou a cerca de US$ 1.250/t; os desembarques no Brasil no 1º semestre ficaram ~42% abaixo de 2025 (StoneX), levando fábricas a reduzir produção e apertando ainda mais a oferta de fosfatados.</w:t>
+          <w:sz w:val="18"/>
+          <w:szCs w:val="18"/>
+        </w:rPr>
+        <w:t xml:space="preserve">KCl: </w:t>
+      </w:r>
+      <w:r>
+        <w:rPr>
+          <w:sz w:val="18"/>
+          <w:szCs w:val="18"/>
+        </w:rPr>
+        <w:t xml:space="preserve">queda de -1,9% no período.</w:t>
       </w:r>
     </w:p>
     <w:p>
@@ -2148,17 +2081,93 @@
         <w:rPr>
           <w:b/>
           <w:bCs/>
+          <w:sz w:val="18"/>
+          <w:szCs w:val="18"/>
+        </w:rPr>
+        <w:t xml:space="preserve">Ureia: </w:t>
+      </w:r>
+      <w:r>
+        <w:rPr>
+          <w:sz w:val="18"/>
+          <w:szCs w:val="18"/>
+        </w:rPr>
+        <w:t xml:space="preserve">queda de -1,3% no período.</w:t>
+      </w:r>
+    </w:p>
+    <w:p>
+      <w:pPr>
+        <w:pBdr>
+          <w:bottom w:val="single" w:color="1E2A44" w:sz="6" w:space="2"/>
+        </w:pBdr>
+        <w:spacing w:after="100" w:before="220"/>
+      </w:pPr>
+      <w:r>
+        <w:rPr>
+          <w:b/>
+          <w:bCs/>
+          <w:color w:val="1E2A44"/>
+          <w:sz w:val="22"/>
+          <w:szCs w:val="22"/>
+        </w:rPr>
+        <w:t xml:space="preserve">6. Contexto de Mercado — Causas da Alta e Perspectivas</w:t>
+      </w:r>
+    </w:p>
+    <w:p>
+      <w:pPr>
+        <w:spacing w:after="60"/>
+      </w:pPr>
+      <w:r>
+        <w:rPr>
+          <w:b/>
+          <w:bCs/>
+          <w:color w:val="1E2A44"/>
+          <w:sz w:val="18"/>
+          <w:szCs w:val="18"/>
+        </w:rPr>
+        <w:t xml:space="preserve">Por que os fertilizantes subiram — e o que esperar · atualizado em Agosto/2026 · revisão manual.</w:t>
+      </w:r>
+    </w:p>
+    <w:p>
+      <w:pPr>
+        <w:spacing w:after="60"/>
+        <w:jc w:val="both"/>
+      </w:pPr>
+      <w:r>
+        <w:rPr>
+          <w:sz w:val="18"/>
+          <w:szCs w:val="18"/>
+        </w:rPr>
+        <w:t xml:space="preserve">O eixo da pressão mudou ao longo de 2026: a ureia recuou dos picos após o alívio das tensões no Oriente Médio, mas os fosfatados (MAP) tornaram-se o ponto crítico — caros e de oferta apertada — por causa das restrições da China e da escassez de enxofre, às vésperas da safra 2026/27.</w:t>
+      </w:r>
+    </w:p>
+    <w:p>
+      <w:pPr>
+        <w:spacing w:after="80"/>
+      </w:pPr>
+      <w:r>
+        <w:rPr>
+          <w:i/>
+          <w:iCs/>
+          <w:color w:val="6B7585"/>
           <w:sz w:val="17"/>
           <w:szCs w:val="17"/>
         </w:rPr>
-        <w:t xml:space="preserve">Oferta russa e de outros polos reduzida: </w:t>
-      </w:r>
-      <w:r>
-        <w:rPr>
-          <w:sz w:val="17"/>
-          <w:szCs w:val="17"/>
-        </w:rPr>
-        <w:t xml:space="preserve">Menor disponibilidade da Rússia, restrições no Marrocos e paralisações pontuais de produtoras limitam a oferta global de fósforo e sustentam o MAP em patamar elevado.</w:t>
+        <w:t xml:space="preserve">Leitura automática — último fechamento (ago/26): Ureia -1,3%, MAP +0,8%, KCl -1,9% ante o mês anterior.</w:t>
+      </w:r>
+    </w:p>
+    <w:p>
+      <w:pPr>
+        <w:spacing w:after="40"/>
+      </w:pPr>
+      <w:r>
+        <w:rPr>
+          <w:b/>
+          <w:bCs/>
+          <w:color w:val="1E2A44"/>
+          <w:sz w:val="18"/>
+          <w:szCs w:val="18"/>
+        </w:rPr>
+        <w:t xml:space="preserve">Principais causas da alta:</w:t>
       </w:r>
     </w:p>
     <w:p>
@@ -2177,14 +2186,14 @@
           <w:sz w:val="17"/>
           <w:szCs w:val="17"/>
         </w:rPr>
-        <w:t xml:space="preserve">Conflito no Oriente Médio (efeito decrescente): </w:t>
+        <w:t xml:space="preserve">Restrições da China aos fosfatados: </w:t>
       </w:r>
       <w:r>
         <w:rPr>
           <w:sz w:val="17"/>
           <w:szCs w:val="17"/>
         </w:rPr>
-        <w:t xml:space="preserve">Foi o principal motor da disparada da ureia no 1º semestre. Com o avanço do acordo entre EUA e Irã, o risco arrefeceu e a ureia recuou — mas o mercado segue cauteloso a novas tensões.</w:t>
+        <w:t xml:space="preserve">A China suspendeu boa parte das exportações de fosfatados para priorizar o abastecimento interno; fontes do setor estimam que de 40% a 80% dos embarques estejam bloqueados ou sob cota, e as restrições podem durar até meados do segundo semestre de 2026.</w:t>
       </w:r>
     </w:p>
     <w:p>
@@ -2203,42 +2212,14 @@
           <w:sz w:val="17"/>
           <w:szCs w:val="17"/>
         </w:rPr>
-        <w:t xml:space="preserve">Dependência de importação e compras atrasadas: </w:t>
+        <w:t xml:space="preserve">Escassez de enxofre: </w:t>
       </w:r>
       <w:r>
         <w:rPr>
           <w:sz w:val="17"/>
           <w:szCs w:val="17"/>
         </w:rPr>
-        <w:t xml:space="preserve">O Brasil importa cerca de 85% dos fertilizantes. Em 2026 as compras da safra 2026/27 atrasaram, e o produtor ainda descoberto pode enfrentar preço e disponibilidade piores ao acelerar as aquisições.</w:t>
-      </w:r>
-    </w:p>
-    <w:p>
-      <w:pPr>
-        <w:spacing w:after="80" w:before="40"/>
-        <w:jc w:val="both"/>
-      </w:pPr>
-      <w:r>
-        <w:rPr>
-          <w:sz w:val="17"/>
-          <w:szCs w:val="17"/>
-        </w:rPr>
-        <w:t xml:space="preserve">Referências de portos no meio do ano: a ureia recuou para a faixa de US$ 410–430/t CFR após ter passado de US$ 700/t no auge; o MAP seguiu pressionado, negociado próximo de US$ 850–900/t; o KCl manteve-se relativamente estável, em torno de US$ 380–405/t (Itaú BBA / consultorias). O Ministério da Agricultura chegou a alertar para risco de déficit de 1 a 3 milhões de toneladas de fosfatados em 2026.</w:t>
-      </w:r>
-    </w:p>
-    <w:p>
-      <w:pPr>
-        <w:spacing w:after="40" w:before="40"/>
-      </w:pPr>
-      <w:r>
-        <w:rPr>
-          <w:b/>
-          <w:bCs/>
-          <w:color w:val="1E2A44"/>
-          <w:sz w:val="18"/>
-          <w:szCs w:val="18"/>
-        </w:rPr>
-        <w:t xml:space="preserve">O que esperar nos próximos meses:</w:t>
+        <w:t xml:space="preserve">Insumo essencial do MAP, o enxofre chegou a cerca de US$ 1.250/t; os desembarques no Brasil no 1º semestre ficaram ~42% abaixo de 2025 (StoneX), levando fábricas a reduzir produção e apertando ainda mais a oferta de fosfatados.</w:t>
       </w:r>
     </w:p>
     <w:p>
@@ -2252,10 +2233,19 @@
       </w:pPr>
       <w:r>
         <w:rPr>
+          <w:b/>
+          <w:bCs/>
           <w:sz w:val="17"/>
           <w:szCs w:val="17"/>
         </w:rPr>
-        <w:t xml:space="preserve">Ureia (nitrogenados): cenário mais calmo após o recuo, mas ainda sensível a choques geopolíticos e ao gás natural — sem folga estrutural de oferta.</w:t>
+        <w:t xml:space="preserve">Oferta russa e de outros polos reduzida: </w:t>
+      </w:r>
+      <w:r>
+        <w:rPr>
+          <w:sz w:val="17"/>
+          <w:szCs w:val="17"/>
+        </w:rPr>
+        <w:t xml:space="preserve">Menor disponibilidade da Rússia, restrições no Marrocos e paralisações pontuais de produtoras limitam a oferta global de fósforo e sustentam o MAP em patamar elevado.</w:t>
       </w:r>
     </w:p>
     <w:p>
@@ -2269,10 +2259,19 @@
       </w:pPr>
       <w:r>
         <w:rPr>
+          <w:b/>
+          <w:bCs/>
           <w:sz w:val="17"/>
           <w:szCs w:val="17"/>
         </w:rPr>
-        <w:t xml:space="preserve">MAP (fosfatados): é hoje o produto mais crítico; a pressão deve persistir enquanto durarem as restrições chinesas e a escassez de enxofre, com risco de faltar produto no pico de plantio (set–out).</w:t>
+        <w:t xml:space="preserve">Conflito no Oriente Médio (efeito decrescente): </w:t>
+      </w:r>
+      <w:r>
+        <w:rPr>
+          <w:sz w:val="17"/>
+          <w:szCs w:val="17"/>
+        </w:rPr>
+        <w:t xml:space="preserve">Foi o principal motor da disparada da ureia no 1º semestre. Com o avanço do acordo entre EUA e Irã, o risco arrefeceu e a ureia recuou — mas o mercado segue cauteloso a novas tensões.</w:t>
       </w:r>
     </w:p>
     <w:p>
@@ -2286,10 +2285,47 @@
       </w:pPr>
       <w:r>
         <w:rPr>
+          <w:b/>
+          <w:bCs/>
           <w:sz w:val="17"/>
           <w:szCs w:val="17"/>
         </w:rPr>
-        <w:t xml:space="preserve">KCl (potássio): segmento mais equilibrado e com importação recorde; preços relativamente estáveis, embora manutenções industriais no 2º semestre possam alterar o equilíbrio.</w:t>
+        <w:t xml:space="preserve">Dependência de importação e compras atrasadas: </w:t>
+      </w:r>
+      <w:r>
+        <w:rPr>
+          <w:sz w:val="17"/>
+          <w:szCs w:val="17"/>
+        </w:rPr>
+        <w:t xml:space="preserve">O Brasil importa cerca de 85% dos fertilizantes. Em 2026 as compras da safra 2026/27 atrasaram, e o produtor ainda descoberto pode enfrentar preço e disponibilidade piores ao acelerar as aquisições.</w:t>
+      </w:r>
+    </w:p>
+    <w:p>
+      <w:pPr>
+        <w:spacing w:after="80" w:before="40"/>
+        <w:jc w:val="both"/>
+      </w:pPr>
+      <w:r>
+        <w:rPr>
+          <w:sz w:val="17"/>
+          <w:szCs w:val="17"/>
+        </w:rPr>
+        <w:t xml:space="preserve">Referências de portos no meio do ano: a ureia recuou para a faixa de US$ 410–430/t CFR após ter passado de US$ 700/t no auge; o MAP seguiu pressionado, negociado próximo de US$ 850–900/t; o KCl manteve-se relativamente estável, em torno de US$ 380–405/t (Itaú BBA / consultorias). O Ministério da Agricultura chegou a alertar para risco de déficit de 1 a 3 milhões de toneladas de fosfatados em 2026.</w:t>
+      </w:r>
+    </w:p>
+    <w:p>
+      <w:pPr>
+        <w:spacing w:after="40" w:before="40"/>
+      </w:pPr>
+      <w:r>
+        <w:rPr>
+          <w:b/>
+          <w:bCs/>
+          <w:color w:val="1E2A44"/>
+          <w:sz w:val="18"/>
+          <w:szCs w:val="18"/>
+        </w:rPr>
+        <w:t xml:space="preserve">O que esperar nos próximos meses:</w:t>
       </w:r>
     </w:p>
     <w:p>
@@ -2306,7 +2342,7 @@
           <w:sz w:val="17"/>
           <w:szCs w:val="17"/>
         </w:rPr>
-        <w:t xml:space="preserve">Estratégia sugerida por analistas: evitar ficar descoberto — garantir disponibilidade de fosfatados pode importar mais que o preço; escalonar compras, priorizar KCl (mais líquido) e avaliar substitutos de fósforo como SSP/TSP.</w:t>
+        <w:t xml:space="preserve">Ureia (nitrogenados): cenário mais calmo após o recuo, mas ainda sensível a choques geopolíticos e ao gás natural — sem folga estrutural de oferta.</w:t>
       </w:r>
     </w:p>
     <w:p>
@@ -2323,22 +2359,7 @@
           <w:sz w:val="17"/>
           <w:szCs w:val="17"/>
         </w:rPr>
-        <w:t xml:space="preserve">Riscos a monitorar: prazo real da suspensão das restrições chinesas, evolução do conflito no Oriente Médio, preço do enxofre e câmbio.</w:t>
-      </w:r>
-    </w:p>
-    <w:p>
-      <w:pPr>
-        <w:spacing w:after="20" w:before="60"/>
-      </w:pPr>
-      <w:r>
-        <w:rPr>
-          <w:b/>
-          <w:bCs/>
-          <w:color w:val="1E2A44"/>
-          <w:sz w:val="17"/>
-          <w:szCs w:val="17"/>
-        </w:rPr>
-        <w:t xml:space="preserve">Notícias recentes do mercado (atualização automática):</w:t>
+        <w:t xml:space="preserve">MAP (fosfatados): é hoje o produto mais crítico; a pressão deve persistir enquanto durarem as restrições chinesas e a escassez de enxofre, com risco de faltar produto no pico de plantio (set–out).</w:t>
       </w:r>
     </w:p>
     <w:p>
@@ -2352,10 +2373,10 @@
       </w:pPr>
       <w:r>
         <w:rPr>
-          <w:sz w:val="16"/>
-          <w:szCs w:val="16"/>
-        </w:rPr>
-        <w:t xml:space="preserve">Tempo e Clima 04/08/2026 - 12:41 El Niño reforça importância da nutrição das plantas para reduzir perdas no campo</w:t>
+          <w:sz w:val="17"/>
+          <w:szCs w:val="17"/>
+        </w:rPr>
+        <w:t xml:space="preserve">KCl (potássio): segmento mais equilibrado e com importação recorde; preços relativamente estáveis, embora manutenções industriais no 2º semestre possam alterar o equilíbrio.</w:t>
       </w:r>
     </w:p>
     <w:p>
@@ -2369,10 +2390,10 @@
       </w:pPr>
       <w:r>
         <w:rPr>
-          <w:sz w:val="16"/>
-          <w:szCs w:val="16"/>
-        </w:rPr>
-        <w:t xml:space="preserve">Agronegócio 30/06/2026 - 09:30 Mercado de fertilizantes amplia movimento de baixa com recuo da ureia, MAP e cloreto de potássio</w:t>
+          <w:sz w:val="17"/>
+          <w:szCs w:val="17"/>
+        </w:rPr>
+        <w:t xml:space="preserve">Estratégia sugerida por analistas: evitar ficar descoberto — garantir disponibilidade de fosfatados pode importar mais que o preço; escalonar compras, priorizar KCl (mais líquido) e avaliar substitutos de fósforo como SSP/TSP.</w:t>
       </w:r>
     </w:p>
     <w:p>
@@ -2386,10 +2407,25 @@
       </w:pPr>
       <w:r>
         <w:rPr>
-          <w:sz w:val="16"/>
-          <w:szCs w:val="16"/>
-        </w:rPr>
-        <w:t xml:space="preserve">Agronegócio 19/06/2026 - 11:01 Importação dos EUA de fertilizante com origem no Oriente Médio zera em maio</w:t>
+          <w:sz w:val="17"/>
+          <w:szCs w:val="17"/>
+        </w:rPr>
+        <w:t xml:space="preserve">Riscos a monitorar: prazo real da suspensão das restrições chinesas, evolução do conflito no Oriente Médio, preço do enxofre e câmbio.</w:t>
+      </w:r>
+    </w:p>
+    <w:p>
+      <w:pPr>
+        <w:spacing w:after="20" w:before="60"/>
+      </w:pPr>
+      <w:r>
+        <w:rPr>
+          <w:b/>
+          <w:bCs/>
+          <w:color w:val="1E2A44"/>
+          <w:sz w:val="17"/>
+          <w:szCs w:val="17"/>
+        </w:rPr>
+        <w:t xml:space="preserve">Notícias recentes do mercado (atualização automática):</w:t>
       </w:r>
     </w:p>
     <w:p>
@@ -2406,6 +2442,57 @@
           <w:sz w:val="16"/>
           <w:szCs w:val="16"/>
         </w:rPr>
+        <w:t xml:space="preserve">Tempo e Clima 04/08/2026 - 12:41 El Niño reforça importância da nutrição das plantas para reduzir perdas no campo</w:t>
+      </w:r>
+    </w:p>
+    <w:p>
+      <w:pPr>
+        <w:pStyle w:val="ListParagraph"/>
+        <w:numPr>
+          <w:ilvl w:val="0"/>
+          <w:numId w:val="2"/>
+        </w:numPr>
+        <w:spacing w:after="70"/>
+      </w:pPr>
+      <w:r>
+        <w:rPr>
+          <w:sz w:val="16"/>
+          <w:szCs w:val="16"/>
+        </w:rPr>
+        <w:t xml:space="preserve">Agronegócio 30/06/2026 - 09:30 Mercado de fertilizantes amplia movimento de baixa com recuo da ureia, MAP e cloreto de potássio</w:t>
+      </w:r>
+    </w:p>
+    <w:p>
+      <w:pPr>
+        <w:pStyle w:val="ListParagraph"/>
+        <w:numPr>
+          <w:ilvl w:val="0"/>
+          <w:numId w:val="2"/>
+        </w:numPr>
+        <w:spacing w:after="70"/>
+      </w:pPr>
+      <w:r>
+        <w:rPr>
+          <w:sz w:val="16"/>
+          <w:szCs w:val="16"/>
+        </w:rPr>
+        <w:t xml:space="preserve">Agronegócio 19/06/2026 - 11:01 Importação dos EUA de fertilizante com origem no Oriente Médio zera em maio</w:t>
+      </w:r>
+    </w:p>
+    <w:p>
+      <w:pPr>
+        <w:pStyle w:val="ListParagraph"/>
+        <w:numPr>
+          <w:ilvl w:val="0"/>
+          <w:numId w:val="2"/>
+        </w:numPr>
+        <w:spacing w:after="70"/>
+      </w:pPr>
+      <w:r>
+        <w:rPr>
+          <w:sz w:val="16"/>
+          <w:szCs w:val="16"/>
+        </w:rPr>
         <w:t xml:space="preserve">Agronegócio 16/06/2026 - 16:30 Ureia cai mais de 40% e volta ao nível pré-crise com avanço de acordo entre EUA e Irã</w:t>
       </w:r>
     </w:p>
@@ -2495,7 +2582,7 @@
           <w:sz w:val="15"/>
           <w:szCs w:val="15"/>
         </w:rPr>
-        <w:t xml:space="preserve">Fontes automáticas: AwesomeAPI (câmbio), CEPEA/ESALQ (soja), ANP (diesel), stooq (BDI). Fertilizantes e gás natural: override manual (fertilizers-override.json). Status desta execução: {"sojaRegional":"ok (Oeste da Bahia/BA (AIBA))","bdi":"ok (HANDYBULK, 28/08/2026)","soja":"ok (Noticias Agricolas / CEPEA-PR 31/08/2026)","cambio":"ok (BCB PTAX)","diesel":"falha: Petrobras: HTTP 403 | PortalCanaa: HTTP 403","_comexRetry":"aguardando 15s apos 429 (com-filtro-ncm 2026-07, tentativa 2)","_comexPeriodo":"com-filtro-ncm | 2026-07 | 4 linhas","_comexNcmsEncontrados":"31042090,31021010,31054000,31042010","ureia":"ok (ComexStat 2026-07)","map":"ok (ComexStat 2026-07)","kcl":"ok (ComexStat 2026-07)","gas":"ok (EIA Henry Hub)","noticias":"ok (40 de https://www.noticiasagricolas.com.br/tags/fertilizantes/)"}.</w:t>
+        <w:t xml:space="preserve">Fontes automáticas: AwesomeAPI (câmbio), CEPEA/ESALQ (soja), ANP (diesel), stooq (BDI). Fertilizantes e gás natural: override manual (fertilizers-override.json). Status desta execução: {"sojaRegional":"ok (Oeste da Bahia/BA (AIBA))","cambio":"ok (BCB PTAX)","soja":"ok (Noticias Agricolas / CEPEA-PR 04/09/2026)","bdi":"ok (HANDYBULK, 04/09/2026)","diesel":"falha: Petrobras: HTTP 403 | PortalCanaa: HTTP 403","_comexPeriodo":"com-filtro-ncm | 2026-08 | 4 linhas","_comexNcmsEncontrados":"31042090,31021010,31054000,31042010","ureia":"ok (ComexStat 2026-08)","map":"ok (ComexStat 2026-08)","kcl":"ok (ComexStat 2026-08)","gas":"ok (EIA Henry Hub)","noticias":"ok (40 de https://www.noticiasagricolas.com.br/tags/fertilizantes/)"}.</w:t>
       </w:r>
     </w:p>
     <w:p>

</xml_diff>

<commit_message>
chore: atualizacao automatica 2026-09-08
</commit_message>
<xml_diff>
--- a/relatorio_executivo.docx
+++ b/relatorio_executivo.docx
@@ -46,7 +46,7 @@
           <w:sz w:val="17"/>
           <w:szCs w:val="17"/>
         </w:rPr>
-        <w:t xml:space="preserve">Equipe de Planejamento, Controle e Pesquisa Florestal  ·  Referência: Set/2026  ·  Gerado em 07/09/2026, 15:27:16</w:t>
+        <w:t xml:space="preserve">Equipe de Planejamento, Controle e Pesquisa Florestal  ·  Referência: Set/2026  ·  Gerado em 08/09/2026, 11:48:32</w:t>
       </w:r>
     </w:p>
     <w:p>
@@ -84,14 +84,14 @@
           <w:sz w:val="19"/>
           <w:szCs w:val="19"/>
         </w:rPr>
-        <w:t xml:space="preserve">Ureia FOB em US$ 413/t (-1,3%), MAP US$ 834/t e KCl US$ 352/t. </w:t>
+        <w:t xml:space="preserve">Ureia FOB em US$ 413/t (fechamento ago/26), MAP US$ 834/t e KCl US$ 352/t. </w:t>
       </w:r>
       <w:r>
         <w:rPr>
           <w:sz w:val="19"/>
           <w:szCs w:val="19"/>
         </w:rPr>
-        <w:t xml:space="preserve">O dólar está em R$ 5,13 (-1,0%) e a soja CEPEA em R$ 152,10/saca. </w:t>
+        <w:t xml:space="preserve">O dólar está em R$ 5,13 (0,0%) e a soja CEPEA em R$ 152,10/saca. </w:t>
       </w:r>
       <w:r>
         <w:rPr>
@@ -352,11 +352,11 @@
               <w:rPr>
                 <w:b/>
                 <w:bCs/>
-                <w:color w:val="2F8A5F"/>
-                <w:sz w:val="18"/>
-                <w:szCs w:val="18"/>
-              </w:rPr>
-              <w:t xml:space="preserve">-1,3%</w:t>
+                <w:color w:val="6B7585"/>
+                <w:sz w:val="18"/>
+                <w:szCs w:val="18"/>
+              </w:rPr>
+              <w:t xml:space="preserve">—</w:t>
             </w:r>
           </w:p>
         </w:tc>
@@ -386,7 +386,7 @@
                 <w:sz w:val="17"/>
                 <w:szCs w:val="17"/>
               </w:rPr>
-              <w:t xml:space="preserve">Nitrogenado · ref. ago/26</w:t>
+              <w:t xml:space="preserve">Fechamento ago/26 (sem novo dado)</w:t>
             </w:r>
           </w:p>
         </w:tc>
@@ -477,11 +477,11 @@
               <w:rPr>
                 <w:b/>
                 <w:bCs/>
-                <w:color w:val="B23636"/>
-                <w:sz w:val="18"/>
-                <w:szCs w:val="18"/>
-              </w:rPr>
-              <w:t xml:space="preserve">+0,8%</w:t>
+                <w:color w:val="6B7585"/>
+                <w:sz w:val="18"/>
+                <w:szCs w:val="18"/>
+              </w:rPr>
+              <w:t xml:space="preserve">—</w:t>
             </w:r>
           </w:p>
         </w:tc>
@@ -511,7 +511,7 @@
                 <w:sz w:val="17"/>
                 <w:szCs w:val="17"/>
               </w:rPr>
-              <w:t xml:space="preserve">Fosfatado · ref. ago/26</w:t>
+              <w:t xml:space="preserve">Fechamento ago/26 (sem novo dado)</w:t>
             </w:r>
           </w:p>
         </w:tc>
@@ -602,11 +602,11 @@
               <w:rPr>
                 <w:b/>
                 <w:bCs/>
-                <w:color w:val="2F8A5F"/>
-                <w:sz w:val="18"/>
-                <w:szCs w:val="18"/>
-              </w:rPr>
-              <w:t xml:space="preserve">-1,9%</w:t>
+                <w:color w:val="6B7585"/>
+                <w:sz w:val="18"/>
+                <w:szCs w:val="18"/>
+              </w:rPr>
+              <w:t xml:space="preserve">—</w:t>
             </w:r>
           </w:p>
         </w:tc>
@@ -636,7 +636,7 @@
                 <w:sz w:val="17"/>
                 <w:szCs w:val="17"/>
               </w:rPr>
-              <w:t xml:space="preserve">Potássico · ref. ago/26</w:t>
+              <w:t xml:space="preserve">Fechamento ago/26 (sem novo dado)</w:t>
             </w:r>
           </w:p>
         </w:tc>
@@ -893,11 +893,11 @@
               <w:rPr>
                 <w:b/>
                 <w:bCs/>
-                <w:color w:val="2F8A5F"/>
-                <w:sz w:val="18"/>
-                <w:szCs w:val="18"/>
-              </w:rPr>
-              <w:t xml:space="preserve">+0,5%</w:t>
+                <w:color w:val="6B7585"/>
+                <w:sz w:val="18"/>
+                <w:szCs w:val="18"/>
+              </w:rPr>
+              <w:t xml:space="preserve">0,0%</w:t>
             </w:r>
           </w:p>
         </w:tc>
@@ -1018,11 +1018,11 @@
               <w:rPr>
                 <w:b/>
                 <w:bCs/>
-                <w:color w:val="2F8A5F"/>
-                <w:sz w:val="18"/>
-                <w:szCs w:val="18"/>
-              </w:rPr>
-              <w:t xml:space="preserve">+1,9%</w:t>
+                <w:color w:val="6B7585"/>
+                <w:sz w:val="18"/>
+                <w:szCs w:val="18"/>
+              </w:rPr>
+              <w:t xml:space="preserve">0,0%</w:t>
             </w:r>
           </w:p>
         </w:tc>
@@ -1143,11 +1143,11 @@
               <w:rPr>
                 <w:b/>
                 <w:bCs/>
-                <w:color w:val="2F8A5F"/>
-                <w:sz w:val="18"/>
-                <w:szCs w:val="18"/>
-              </w:rPr>
-              <w:t xml:space="preserve">-0,7%</w:t>
+                <w:color w:val="6B7585"/>
+                <w:sz w:val="18"/>
+                <w:szCs w:val="18"/>
+              </w:rPr>
+              <w:t xml:space="preserve">0,0%</w:t>
             </w:r>
           </w:p>
         </w:tc>
@@ -1177,7 +1177,7 @@
                 <w:sz w:val="17"/>
                 <w:szCs w:val="17"/>
               </w:rPr>
-              <w:t xml:space="preserve">Melhora</w:t>
+              <w:t xml:space="preserve">Piora</w:t>
             </w:r>
           </w:p>
         </w:tc>
@@ -1557,11 +1557,11 @@
               <w:rPr>
                 <w:b/>
                 <w:bCs/>
-                <w:color w:val="2F8A5F"/>
-                <w:sz w:val="18"/>
-                <w:szCs w:val="18"/>
-              </w:rPr>
-              <w:t xml:space="preserve">-1,0%</w:t>
+                <w:color w:val="6B7585"/>
+                <w:sz w:val="18"/>
+                <w:szCs w:val="18"/>
+              </w:rPr>
+              <w:t xml:space="preserve">0,0%</w:t>
             </w:r>
           </w:p>
         </w:tc>
@@ -1682,11 +1682,11 @@
               <w:rPr>
                 <w:b/>
                 <w:bCs/>
-                <w:color w:val="B23636"/>
-                <w:sz w:val="18"/>
-                <w:szCs w:val="18"/>
-              </w:rPr>
-              <w:t xml:space="preserve">+7,4%</w:t>
+                <w:color w:val="6B7585"/>
+                <w:sz w:val="18"/>
+                <w:szCs w:val="18"/>
+              </w:rPr>
+              <w:t xml:space="preserve">0,0%</w:t>
             </w:r>
           </w:p>
         </w:tc>
@@ -1778,7 +1778,7 @@
                 <w:sz w:val="18"/>
                 <w:szCs w:val="18"/>
               </w:rPr>
-              <w:t xml:space="preserve">3.628 pts</w:t>
+              <w:t xml:space="preserve">3.575 pts</w:t>
             </w:r>
           </w:p>
         </w:tc>
@@ -1807,11 +1807,11 @@
               <w:rPr>
                 <w:b/>
                 <w:bCs/>
-                <w:color w:val="B23636"/>
-                <w:sz w:val="18"/>
-                <w:szCs w:val="18"/>
-              </w:rPr>
-              <w:t xml:space="preserve">+13,9%</w:t>
+                <w:color w:val="2F8A5F"/>
+                <w:sz w:val="18"/>
+                <w:szCs w:val="18"/>
+              </w:rPr>
+              <w:t xml:space="preserve">-1,5%</w:t>
             </w:r>
           </w:p>
         </w:tc>
@@ -2013,7 +2013,83 @@
           <w:sz w:val="18"/>
           <w:szCs w:val="18"/>
         </w:rPr>
-        <w:t xml:space="preserve">alta de +13,9% no período.</w:t>
+        <w:t xml:space="preserve">queda de -1,5% no período.</w:t>
+      </w:r>
+    </w:p>
+    <w:p>
+      <w:pPr>
+        <w:pBdr>
+          <w:bottom w:val="single" w:color="1E2A44" w:sz="6" w:space="2"/>
+        </w:pBdr>
+        <w:spacing w:after="100" w:before="220"/>
+      </w:pPr>
+      <w:r>
+        <w:rPr>
+          <w:b/>
+          <w:bCs/>
+          <w:color w:val="1E2A44"/>
+          <w:sz w:val="22"/>
+          <w:szCs w:val="22"/>
+        </w:rPr>
+        <w:t xml:space="preserve">6. Contexto de Mercado — Causas da Alta e Perspectivas</w:t>
+      </w:r>
+    </w:p>
+    <w:p>
+      <w:pPr>
+        <w:spacing w:after="60"/>
+      </w:pPr>
+      <w:r>
+        <w:rPr>
+          <w:b/>
+          <w:bCs/>
+          <w:color w:val="1E2A44"/>
+          <w:sz w:val="18"/>
+          <w:szCs w:val="18"/>
+        </w:rPr>
+        <w:t xml:space="preserve">Por que os fertilizantes subiram — e o que esperar · atualizado em Setembro/2026 · revisão manual.</w:t>
+      </w:r>
+    </w:p>
+    <w:p>
+      <w:pPr>
+        <w:spacing w:after="60"/>
+        <w:jc w:val="both"/>
+      </w:pPr>
+      <w:r>
+        <w:rPr>
+          <w:sz w:val="18"/>
+          <w:szCs w:val="18"/>
+        </w:rPr>
+        <w:t xml:space="preserve">Em setembro o quadro é de alívio parcial, não de normalização: os preços recuaram dos picos e a China voltou a exportar, mas a oferta segue apertada — sobretudo nos fosfatados (MAP) — e o abastecimento da safra 2026/27 virou a principal preocupação, com importações atrasadas e o governo atuando na logística dos portos.</w:t>
+      </w:r>
+    </w:p>
+    <w:p>
+      <w:pPr>
+        <w:spacing w:after="80"/>
+      </w:pPr>
+      <w:r>
+        <w:rPr>
+          <w:i/>
+          <w:iCs/>
+          <w:color w:val="6B7585"/>
+          <w:sz w:val="17"/>
+          <w:szCs w:val="17"/>
+        </w:rPr>
+        <w:t xml:space="preserve">Leitura automática: sem novo fechamento de fertilizantes desde a leitura anterior (ago/26).</w:t>
+      </w:r>
+    </w:p>
+    <w:p>
+      <w:pPr>
+        <w:spacing w:after="40"/>
+      </w:pPr>
+      <w:r>
+        <w:rPr>
+          <w:b/>
+          <w:bCs/>
+          <w:color w:val="1E2A44"/>
+          <w:sz w:val="18"/>
+          <w:szCs w:val="18"/>
+        </w:rPr>
+        <w:t xml:space="preserve">Principais causas da alta:</w:t>
       </w:r>
     </w:p>
     <w:p>
@@ -2029,17 +2105,17 @@
         <w:rPr>
           <w:b/>
           <w:bCs/>
-          <w:sz w:val="18"/>
-          <w:szCs w:val="18"/>
-        </w:rPr>
-        <w:t xml:space="preserve">Gás Natural: </w:t>
-      </w:r>
-      <w:r>
-        <w:rPr>
-          <w:sz w:val="18"/>
-          <w:szCs w:val="18"/>
-        </w:rPr>
-        <w:t xml:space="preserve">alta de +7,4% no período.</w:t>
+          <w:sz w:val="17"/>
+          <w:szCs w:val="17"/>
+        </w:rPr>
+        <w:t xml:space="preserve">Fosfatados (MAP) ainda pressionados: </w:t>
+      </w:r>
+      <w:r>
+        <w:rPr>
+          <w:sz w:val="17"/>
+          <w:szCs w:val="17"/>
+        </w:rPr>
+        <w:t xml:space="preserve">É o segmento mais crítico. As importações brasileiras de MAP caíram cerca de 24% no 1º semestre; a oferta chinesa, mesmo com retomada parcial, ainda é limitada, e a escassez de enxofre (matéria-prima do MAP) mantém o custo alto.</w:t>
       </w:r>
     </w:p>
     <w:p>
@@ -2055,17 +2131,17 @@
         <w:rPr>
           <w:b/>
           <w:bCs/>
-          <w:sz w:val="18"/>
-          <w:szCs w:val="18"/>
-        </w:rPr>
-        <w:t xml:space="preserve">KCl: </w:t>
-      </w:r>
-      <w:r>
-        <w:rPr>
-          <w:sz w:val="18"/>
-          <w:szCs w:val="18"/>
-        </w:rPr>
-        <w:t xml:space="preserve">queda de -1,9% no período.</w:t>
+          <w:sz w:val="17"/>
+          <w:szCs w:val="17"/>
+        </w:rPr>
+        <w:t xml:space="preserve">Escassez de enxofre: </w:t>
+      </w:r>
+      <w:r>
+        <w:rPr>
+          <w:sz w:val="17"/>
+          <w:szCs w:val="17"/>
+        </w:rPr>
+        <w:t xml:space="preserve">Insumo essencial dos fosfatados, o enxofre saltou de cerca de US$ 100/t no pré-guerra para a faixa de US$ 1.200/t, levando fábricas a reduzir produção e apertando ainda mais a oferta de MAP.</w:t>
       </w:r>
     </w:p>
     <w:p>
@@ -2081,93 +2157,17 @@
         <w:rPr>
           <w:b/>
           <w:bCs/>
-          <w:sz w:val="18"/>
-          <w:szCs w:val="18"/>
-        </w:rPr>
-        <w:t xml:space="preserve">Ureia: </w:t>
-      </w:r>
-      <w:r>
-        <w:rPr>
-          <w:sz w:val="18"/>
-          <w:szCs w:val="18"/>
-        </w:rPr>
-        <w:t xml:space="preserve">queda de -1,3% no período.</w:t>
-      </w:r>
-    </w:p>
-    <w:p>
-      <w:pPr>
-        <w:pBdr>
-          <w:bottom w:val="single" w:color="1E2A44" w:sz="6" w:space="2"/>
-        </w:pBdr>
-        <w:spacing w:after="100" w:before="220"/>
-      </w:pPr>
-      <w:r>
-        <w:rPr>
-          <w:b/>
-          <w:bCs/>
-          <w:color w:val="1E2A44"/>
-          <w:sz w:val="22"/>
-          <w:szCs w:val="22"/>
-        </w:rPr>
-        <w:t xml:space="preserve">6. Contexto de Mercado — Causas da Alta e Perspectivas</w:t>
-      </w:r>
-    </w:p>
-    <w:p>
-      <w:pPr>
-        <w:spacing w:after="60"/>
-      </w:pPr>
-      <w:r>
-        <w:rPr>
-          <w:b/>
-          <w:bCs/>
-          <w:color w:val="1E2A44"/>
-          <w:sz w:val="18"/>
-          <w:szCs w:val="18"/>
-        </w:rPr>
-        <w:t xml:space="preserve">Por que os fertilizantes subiram — e o que esperar · atualizado em Agosto/2026 · revisão manual.</w:t>
-      </w:r>
-    </w:p>
-    <w:p>
-      <w:pPr>
-        <w:spacing w:after="60"/>
-        <w:jc w:val="both"/>
-      </w:pPr>
-      <w:r>
-        <w:rPr>
-          <w:sz w:val="18"/>
-          <w:szCs w:val="18"/>
-        </w:rPr>
-        <w:t xml:space="preserve">O eixo da pressão mudou ao longo de 2026: a ureia recuou dos picos após o alívio das tensões no Oriente Médio, mas os fosfatados (MAP) tornaram-se o ponto crítico — caros e de oferta apertada — por causa das restrições da China e da escassez de enxofre, às vésperas da safra 2026/27.</w:t>
-      </w:r>
-    </w:p>
-    <w:p>
-      <w:pPr>
-        <w:spacing w:after="80"/>
-      </w:pPr>
-      <w:r>
-        <w:rPr>
-          <w:i/>
-          <w:iCs/>
-          <w:color w:val="6B7585"/>
           <w:sz w:val="17"/>
           <w:szCs w:val="17"/>
         </w:rPr>
-        <w:t xml:space="preserve">Leitura automática — último fechamento (ago/26): Ureia -1,3%, MAP +0,8%, KCl -1,9% ante o mês anterior.</w:t>
-      </w:r>
-    </w:p>
-    <w:p>
-      <w:pPr>
-        <w:spacing w:after="40"/>
-      </w:pPr>
-      <w:r>
-        <w:rPr>
-          <w:b/>
-          <w:bCs/>
-          <w:color w:val="1E2A44"/>
-          <w:sz w:val="18"/>
-          <w:szCs w:val="18"/>
-        </w:rPr>
-        <w:t xml:space="preserve">Principais causas da alta:</w:t>
+        <w:t xml:space="preserve">China retomou exportações (alívio parcial): </w:t>
+      </w:r>
+      <w:r>
+        <w:rPr>
+          <w:sz w:val="17"/>
+          <w:szCs w:val="17"/>
+        </w:rPr>
+        <w:t xml:space="preserve">A volta gradual dos embarques chineses trouxe algum alívio a nitrogenados e fosfatados, mas ainda não elimina o risco de desabastecimento para a safra 2026/27.</w:t>
       </w:r>
     </w:p>
     <w:p>
@@ -2186,14 +2186,14 @@
           <w:sz w:val="17"/>
           <w:szCs w:val="17"/>
         </w:rPr>
-        <w:t xml:space="preserve">Restrições da China aos fosfatados: </w:t>
+        <w:t xml:space="preserve">Importações atrasadas e cautelosas: </w:t>
       </w:r>
       <w:r>
         <w:rPr>
           <w:sz w:val="17"/>
           <w:szCs w:val="17"/>
         </w:rPr>
-        <w:t xml:space="preserve">A China suspendeu boa parte das exportações de fosfatados para priorizar o abastecimento interno; fontes do setor estimam que de 40% a 80% dos embarques estejam bloqueados ou sob cota, e as restrições podem durar até meados do segundo semestre de 2026.</w:t>
+        <w:t xml:space="preserve">No 1º semestre os desembarques totais caíram ~8,6% (ureia −32%, MAP −24%), com compradores adiando negócios diante da volatilidade e da relação de troca ruim. O tempo para garantir o abastecimento do plantio (set–out) ficou curto.</w:t>
       </w:r>
     </w:p>
     <w:p>
@@ -2212,14 +2212,42 @@
           <w:sz w:val="17"/>
           <w:szCs w:val="17"/>
         </w:rPr>
-        <w:t xml:space="preserve">Escassez de enxofre: </w:t>
+        <w:t xml:space="preserve">Oriente Médio e logística: </w:t>
       </w:r>
       <w:r>
         <w:rPr>
           <w:sz w:val="17"/>
           <w:szCs w:val="17"/>
         </w:rPr>
-        <w:t xml:space="preserve">Insumo essencial do MAP, o enxofre chegou a cerca de US$ 1.250/t; os desembarques no Brasil no 1º semestre ficaram ~42% abaixo de 2025 (StoneX), levando fábricas a reduzir produção e apertando ainda mais a oferta de fosfatados.</w:t>
+        <w:t xml:space="preserve">As tensões e a disrupção de rotas ligadas ao Estreito de Ormuz afetaram ureia, amônia, enxofre e fosfatos, e ainda pesam sobre o frete e a previsibilidade das entregas.</w:t>
+      </w:r>
+    </w:p>
+    <w:p>
+      <w:pPr>
+        <w:spacing w:after="80" w:before="40"/>
+        <w:jc w:val="both"/>
+      </w:pPr>
+      <w:r>
+        <w:rPr>
+          <w:sz w:val="17"/>
+          <w:szCs w:val="17"/>
+        </w:rPr>
+        <w:t xml:space="preserve">No 1º semestre de 2026 as importações brasileiras das principais matérias-primas caíram ~8,6%, com ureia −32%, MAP −24% e enxofre −42% (StoneX). A ureia recuou dos picos do meio do ano, mas a relação de troca segue desfavorável — o Brasil importou cerca de 7% menos fertilizante e ainda assim o produtor gastou mais. A RaboResearch reduziu a projeção de entregas no país para ~45,1 milhões de toneladas em 2026, abaixo do recorde de 2025.</w:t>
+      </w:r>
+    </w:p>
+    <w:p>
+      <w:pPr>
+        <w:spacing w:after="40" w:before="40"/>
+      </w:pPr>
+      <w:r>
+        <w:rPr>
+          <w:b/>
+          <w:bCs/>
+          <w:color w:val="1E2A44"/>
+          <w:sz w:val="18"/>
+          <w:szCs w:val="18"/>
+        </w:rPr>
+        <w:t xml:space="preserve">O que esperar nos próximos meses:</w:t>
       </w:r>
     </w:p>
     <w:p>
@@ -2233,19 +2261,10 @@
       </w:pPr>
       <w:r>
         <w:rPr>
-          <w:b/>
-          <w:bCs/>
           <w:sz w:val="17"/>
           <w:szCs w:val="17"/>
         </w:rPr>
-        <w:t xml:space="preserve">Oferta russa e de outros polos reduzida: </w:t>
-      </w:r>
-      <w:r>
-        <w:rPr>
-          <w:sz w:val="17"/>
-          <w:szCs w:val="17"/>
-        </w:rPr>
-        <w:t xml:space="preserve">Menor disponibilidade da Rússia, restrições no Marrocos e paralisações pontuais de produtoras limitam a oferta global de fósforo e sustentam o MAP em patamar elevado.</w:t>
+        <w:t xml:space="preserve">Ureia (nitrogenados): preços fora dos extremos e acessibilidade em recuperação desde julho; espera-se retomada gradual das compras até o fim do ano, mas atrasos podem pressionar a 2ª safra de milho (plantio em jan/2027).</w:t>
       </w:r>
     </w:p>
     <w:p>
@@ -2259,19 +2278,10 @@
       </w:pPr>
       <w:r>
         <w:rPr>
-          <w:b/>
-          <w:bCs/>
           <w:sz w:val="17"/>
           <w:szCs w:val="17"/>
         </w:rPr>
-        <w:t xml:space="preserve">Conflito no Oriente Médio (efeito decrescente): </w:t>
-      </w:r>
-      <w:r>
-        <w:rPr>
-          <w:sz w:val="17"/>
-          <w:szCs w:val="17"/>
-        </w:rPr>
-        <w:t xml:space="preserve">Foi o principal motor da disparada da ureia no 1º semestre. Com o avanço do acordo entre EUA e Irã, o risco arrefeceu e a ureia recuou — mas o mercado segue cauteloso a novas tensões.</w:t>
+        <w:t xml:space="preserve">MAP (fosfatados): segue o ponto mais delicado; oferta apertada e enxofre caro limitam quedas, com risco de faltar produto no pico de plantio (set–out).</w:t>
       </w:r>
     </w:p>
     <w:p>
@@ -2285,47 +2295,10 @@
       </w:pPr>
       <w:r>
         <w:rPr>
-          <w:b/>
-          <w:bCs/>
           <w:sz w:val="17"/>
           <w:szCs w:val="17"/>
         </w:rPr>
-        <w:t xml:space="preserve">Dependência de importação e compras atrasadas: </w:t>
-      </w:r>
-      <w:r>
-        <w:rPr>
-          <w:sz w:val="17"/>
-          <w:szCs w:val="17"/>
-        </w:rPr>
-        <w:t xml:space="preserve">O Brasil importa cerca de 85% dos fertilizantes. Em 2026 as compras da safra 2026/27 atrasaram, e o produtor ainda descoberto pode enfrentar preço e disponibilidade piores ao acelerar as aquisições.</w:t>
-      </w:r>
-    </w:p>
-    <w:p>
-      <w:pPr>
-        <w:spacing w:after="80" w:before="40"/>
-        <w:jc w:val="both"/>
-      </w:pPr>
-      <w:r>
-        <w:rPr>
-          <w:sz w:val="17"/>
-          <w:szCs w:val="17"/>
-        </w:rPr>
-        <w:t xml:space="preserve">Referências de portos no meio do ano: a ureia recuou para a faixa de US$ 410–430/t CFR após ter passado de US$ 700/t no auge; o MAP seguiu pressionado, negociado próximo de US$ 850–900/t; o KCl manteve-se relativamente estável, em torno de US$ 380–405/t (Itaú BBA / consultorias). O Ministério da Agricultura chegou a alertar para risco de déficit de 1 a 3 milhões de toneladas de fosfatados em 2026.</w:t>
-      </w:r>
-    </w:p>
-    <w:p>
-      <w:pPr>
-        <w:spacing w:after="40" w:before="40"/>
-      </w:pPr>
-      <w:r>
-        <w:rPr>
-          <w:b/>
-          <w:bCs/>
-          <w:color w:val="1E2A44"/>
-          <w:sz w:val="18"/>
-          <w:szCs w:val="18"/>
-        </w:rPr>
-        <w:t xml:space="preserve">O que esperar nos próximos meses:</w:t>
+        <w:t xml:space="preserve">KCl (potássio): segmento mais confortável e com preços entre os mais favoráveis em anos; boa janela de reposição.</w:t>
       </w:r>
     </w:p>
     <w:p>
@@ -2342,7 +2315,7 @@
           <w:sz w:val="17"/>
           <w:szCs w:val="17"/>
         </w:rPr>
-        <w:t xml:space="preserve">Ureia (nitrogenados): cenário mais calmo após o recuo, mas ainda sensível a choques geopolíticos e ao gás natural — sem folga estrutural de oferta.</w:t>
+        <w:t xml:space="preserve">Ação do governo: a Casa Civil mantém a Sala de Situação sobre Fertilizantes, e foi publicada resolução (ago/2026, validade de 6 meses) priorizando o desembarque de fertilizantes nos portos públicos para garantir o abastecimento da safra 2026/27.</w:t>
       </w:r>
     </w:p>
     <w:p>
@@ -2359,7 +2332,22 @@
           <w:sz w:val="17"/>
           <w:szCs w:val="17"/>
         </w:rPr>
-        <w:t xml:space="preserve">MAP (fosfatados): é hoje o produto mais crítico; a pressão deve persistir enquanto durarem as restrições chinesas e a escassez de enxofre, com risco de faltar produto no pico de plantio (set–out).</w:t>
+        <w:t xml:space="preserve">Riscos a monitorar: duração do conflito e normalização do Estreito de Ormuz, ritmo real da oferta chinesa, preço do enxofre, câmbio, crédito rural apertado e clima (risco de El Niño forte).</w:t>
+      </w:r>
+    </w:p>
+    <w:p>
+      <w:pPr>
+        <w:spacing w:after="20" w:before="60"/>
+      </w:pPr>
+      <w:r>
+        <w:rPr>
+          <w:b/>
+          <w:bCs/>
+          <w:color w:val="1E2A44"/>
+          <w:sz w:val="17"/>
+          <w:szCs w:val="17"/>
+        </w:rPr>
+        <w:t xml:space="preserve">Notícias recentes do mercado (atualização automática):</w:t>
       </w:r>
     </w:p>
     <w:p>
@@ -2373,10 +2361,10 @@
       </w:pPr>
       <w:r>
         <w:rPr>
-          <w:sz w:val="17"/>
-          <w:szCs w:val="17"/>
-        </w:rPr>
-        <w:t xml:space="preserve">KCl (potássio): segmento mais equilibrado e com importação recorde; preços relativamente estáveis, embora manutenções industriais no 2º semestre possam alterar o equilíbrio.</w:t>
+          <w:sz w:val="16"/>
+          <w:szCs w:val="16"/>
+        </w:rPr>
+        <w:t xml:space="preserve">Tempo e Clima 04/08/2026 - 12:41 El Niño reforça importância da nutrição das plantas para reduzir perdas no campo</w:t>
       </w:r>
     </w:p>
     <w:p>
@@ -2390,10 +2378,10 @@
       </w:pPr>
       <w:r>
         <w:rPr>
-          <w:sz w:val="17"/>
-          <w:szCs w:val="17"/>
-        </w:rPr>
-        <w:t xml:space="preserve">Estratégia sugerida por analistas: evitar ficar descoberto — garantir disponibilidade de fosfatados pode importar mais que o preço; escalonar compras, priorizar KCl (mais líquido) e avaliar substitutos de fósforo como SSP/TSP.</w:t>
+          <w:sz w:val="16"/>
+          <w:szCs w:val="16"/>
+        </w:rPr>
+        <w:t xml:space="preserve">Agronegócio 30/06/2026 - 09:30 Mercado de fertilizantes amplia movimento de baixa com recuo da ureia, MAP e cloreto de potássio</w:t>
       </w:r>
     </w:p>
     <w:p>
@@ -2407,25 +2395,10 @@
       </w:pPr>
       <w:r>
         <w:rPr>
-          <w:sz w:val="17"/>
-          <w:szCs w:val="17"/>
-        </w:rPr>
-        <w:t xml:space="preserve">Riscos a monitorar: prazo real da suspensão das restrições chinesas, evolução do conflito no Oriente Médio, preço do enxofre e câmbio.</w:t>
-      </w:r>
-    </w:p>
-    <w:p>
-      <w:pPr>
-        <w:spacing w:after="20" w:before="60"/>
-      </w:pPr>
-      <w:r>
-        <w:rPr>
-          <w:b/>
-          <w:bCs/>
-          <w:color w:val="1E2A44"/>
-          <w:sz w:val="17"/>
-          <w:szCs w:val="17"/>
-        </w:rPr>
-        <w:t xml:space="preserve">Notícias recentes do mercado (atualização automática):</w:t>
+          <w:sz w:val="16"/>
+          <w:szCs w:val="16"/>
+        </w:rPr>
+        <w:t xml:space="preserve">Agronegócio 19/06/2026 - 11:01 Importação dos EUA de fertilizante com origem no Oriente Médio zera em maio</w:t>
       </w:r>
     </w:p>
     <w:p>
@@ -2442,57 +2415,6 @@
           <w:sz w:val="16"/>
           <w:szCs w:val="16"/>
         </w:rPr>
-        <w:t xml:space="preserve">Tempo e Clima 04/08/2026 - 12:41 El Niño reforça importância da nutrição das plantas para reduzir perdas no campo</w:t>
-      </w:r>
-    </w:p>
-    <w:p>
-      <w:pPr>
-        <w:pStyle w:val="ListParagraph"/>
-        <w:numPr>
-          <w:ilvl w:val="0"/>
-          <w:numId w:val="2"/>
-        </w:numPr>
-        <w:spacing w:after="70"/>
-      </w:pPr>
-      <w:r>
-        <w:rPr>
-          <w:sz w:val="16"/>
-          <w:szCs w:val="16"/>
-        </w:rPr>
-        <w:t xml:space="preserve">Agronegócio 30/06/2026 - 09:30 Mercado de fertilizantes amplia movimento de baixa com recuo da ureia, MAP e cloreto de potássio</w:t>
-      </w:r>
-    </w:p>
-    <w:p>
-      <w:pPr>
-        <w:pStyle w:val="ListParagraph"/>
-        <w:numPr>
-          <w:ilvl w:val="0"/>
-          <w:numId w:val="2"/>
-        </w:numPr>
-        <w:spacing w:after="70"/>
-      </w:pPr>
-      <w:r>
-        <w:rPr>
-          <w:sz w:val="16"/>
-          <w:szCs w:val="16"/>
-        </w:rPr>
-        <w:t xml:space="preserve">Agronegócio 19/06/2026 - 11:01 Importação dos EUA de fertilizante com origem no Oriente Médio zera em maio</w:t>
-      </w:r>
-    </w:p>
-    <w:p>
-      <w:pPr>
-        <w:pStyle w:val="ListParagraph"/>
-        <w:numPr>
-          <w:ilvl w:val="0"/>
-          <w:numId w:val="2"/>
-        </w:numPr>
-        <w:spacing w:after="70"/>
-      </w:pPr>
-      <w:r>
-        <w:rPr>
-          <w:sz w:val="16"/>
-          <w:szCs w:val="16"/>
-        </w:rPr>
         <w:t xml:space="preserve">Agronegócio 16/06/2026 - 16:30 Ureia cai mais de 40% e volta ao nível pré-crise com avanço de acordo entre EUA e Irã</w:t>
       </w:r>
     </w:p>
@@ -2521,7 +2443,7 @@
           <w:sz w:val="15"/>
           <w:szCs w:val="15"/>
         </w:rPr>
-        <w:t xml:space="preserve">Itaú BBA (Agro Mensal), via NN Online — ureia recua; MAP ~US$ 900/t; enxofre ~US$ 1.250/t; KCl ~US$ 405/t (jun/2026); StoneX, via Minuto MT / AF News — enxofre -42% no 1º semestre e risco de abastecimento de fosfatados (jul/2026); CNA — restrições chinesas ao MAP e queda de 13,7% na importação (jan–ago) (2026); Spazio Agro — China pode manter restrições até o 2º semestre; alerta do MAPA de déficit de 1–3 Mt (abr/2026); Conecta Agro — ureia teve a maior disparada percentual de 2026, com correção posterior (ago/2026).</w:t>
+        <w:t xml:space="preserve">RaboResearch, via AF News — entregas revisadas para ~45,1 Mt; China retoma exportações (alívio parcial); MAP −24% no 1º sem. (set/2026); nx1 — Brasil importa ~7% menos fertilizante, mas produtor gasta ~7% mais; quedas são 1º sinal de alívio, não fim da crise (set/2026); AF News — governo prioriza desembarque de fertilizantes nos portos (resolução no DOU, 6 meses); Sala de Situação/Casa Civil (ago/2026); StoneX, via Minuto MT — importações −8,6% no 1º sem. (ureia −32%, enxofre −42%); prazo curto para abastecer a safra (jul/2026); AgFeed — Sala de Situação e pleito de subsídio ao enxofre (de US$ 100 para ~US$ 1,2 mil/t) (jul/2026).</w:t>
       </w:r>
     </w:p>
     <w:p>
@@ -2582,7 +2504,7 @@
           <w:sz w:val="15"/>
           <w:szCs w:val="15"/>
         </w:rPr>
-        <w:t xml:space="preserve">Fontes automáticas: AwesomeAPI (câmbio), CEPEA/ESALQ (soja), ANP (diesel), stooq (BDI). Fertilizantes e gás natural: override manual (fertilizers-override.json). Status desta execução: {"sojaRegional":"ok (Oeste da Bahia/BA (AIBA))","cambio":"ok (BCB PTAX)","soja":"ok (Noticias Agricolas / CEPEA-PR 04/09/2026)","bdi":"ok (HANDYBULK, 04/09/2026)","diesel":"falha: Petrobras: HTTP 403 | PortalCanaa: HTTP 403","_comexPeriodo":"com-filtro-ncm | 2026-08 | 4 linhas","_comexNcmsEncontrados":"31042090,31021010,31054000,31042010","ureia":"ok (ComexStat 2026-08)","map":"ok (ComexStat 2026-08)","kcl":"ok (ComexStat 2026-08)","gas":"ok (EIA Henry Hub)","noticias":"ok (40 de https://www.noticiasagricolas.com.br/tags/fertilizantes/)"}.</w:t>
+        <w:t xml:space="preserve">Fontes automáticas: AwesomeAPI (câmbio), CEPEA/ESALQ (soja), ANP (diesel), stooq (BDI). Fertilizantes e gás natural: override manual (fertilizers-override.json). Status desta execução: {"bdi":"ok (HANDYBULK, 07/09/2026)","soja":"ok (Noticias Agricolas / CEPEA-PR 04/09/2026)","sojaRegional":"ok (Oeste da Bahia/BA (AIBA))","cambio":"ok (BCB PTAX)","diesel":"falha: Petrobras: HTTP 403 | PortalCanaa: HTTP 403","_comexPeriodo":"com-filtro-ncm | 2026-08 | 4 linhas","_comexNcmsEncontrados":"31042090,31021010,31054000,31042010","ureia":"ok (ComexStat 2026-08)","map":"ok (ComexStat 2026-08)","kcl":"ok (ComexStat 2026-08)","gas":"ok (EIA Henry Hub)","noticias":"ok (40 de https://www.noticiasagricolas.com.br/tags/fertilizantes/)"}.</w:t>
       </w:r>
     </w:p>
     <w:p>

</xml_diff>